<commit_message>
Victor V027 protocol: full triage + fixes (46 done, 3 deferred); figures 1/2/3/S1/S3 regenerated + legends aligned; matrix/decoder/MSigDB synced; README/CHANGELOG updated
</commit_message>
<xml_diff>
--- a/docs/manuscript/RCDome_manuscript_governance_V027.docx
+++ b/docs/manuscript/RCDome_manuscript_governance_V027.docx
@@ -114,7 +114,7 @@
           <w:szCs w:val="24"/>
           <w:lang w:val="pt-BR"/>
         </w:rPr>
-        <w:t>Emanuell Rodrigues de Souza</w:t>
+        <w:t>Emanuell Rodrigues de Souza†, Victor dos Santos Lopes†, Higor Almeida Cordeiro Nogueira, and Enrique Medina-Acosta*</w:t>
       </w:r>
       <w:r>
         <w:rPr>
@@ -125,7 +125,6 @@
           <w:vertAlign w:val="superscript"/>
           <w:lang w:val="pt-BR"/>
         </w:rPr>
-        <w:t>#</w:t>
       </w:r>
       <w:r>
         <w:rPr>
@@ -133,7 +132,6 @@
           <w:szCs w:val="24"/>
           <w:lang w:val="pt-BR"/>
         </w:rPr>
-        <w:t>, Victor dos Santos Lopes</w:t>
       </w:r>
       <w:r>
         <w:rPr>
@@ -144,7 +142,6 @@
           <w:vertAlign w:val="superscript"/>
           <w:lang w:val="pt-BR"/>
         </w:rPr>
-        <w:t>#</w:t>
       </w:r>
       <w:r>
         <w:rPr>
@@ -152,7 +149,6 @@
           <w:szCs w:val="24"/>
           <w:lang w:val="pt-BR"/>
         </w:rPr>
-        <w:t>, Higor Almeida Cordeiro Nogueira, and Enrique Medina-Acosta</w:t>
       </w:r>
       <w:r>
         <w:rPr>
@@ -163,7 +159,6 @@
           <w:vertAlign w:val="superscript"/>
           <w:lang w:val="pt-BR"/>
         </w:rPr>
-        <w:t>*</w:t>
       </w:r>
     </w:p>
     <w:p>
@@ -191,7 +186,7 @@
           <w:szCs w:val="24"/>
           <w:lang w:val="pt-BR"/>
         </w:rPr>
-        <w:t>Laborat</w:t>
+        <w:t>Laboratório de Biotecnologia, Centro de Biociências e Biotecnologia, Universidade Estadual do Norte Fluminense, Campos dos Goytacazes, RJ, Brazil.</w:t>
       </w:r>
       <w:r>
         <w:rPr>
@@ -199,7 +194,6 @@
           <w:szCs w:val="24"/>
           <w:lang w:val="pt-BR"/>
         </w:rPr>
-        <w:t>ó</w:t>
       </w:r>
       <w:r>
         <w:rPr>
@@ -207,7 +201,6 @@
           <w:szCs w:val="24"/>
           <w:lang w:val="pt-BR"/>
         </w:rPr>
-        <w:t>rio de Biotecnologia, Centro de Bioci</w:t>
       </w:r>
       <w:r>
         <w:rPr>
@@ -215,7 +208,6 @@
           <w:szCs w:val="24"/>
           <w:lang w:val="pt-BR"/>
         </w:rPr>
-        <w:t>ên</w:t>
       </w:r>
       <w:r>
         <w:rPr>
@@ -223,7 +215,6 @@
           <w:szCs w:val="24"/>
           <w:lang w:val="pt-BR"/>
         </w:rPr>
-        <w:t>cias e Biotecnologia, Universidade Estadual do Norte Fluminense, Avenida Alberto Lamego 2000, Parque California, Campos dos Goytacazes, RJ, CEP 28015-602, Brazil.</w:t>
       </w:r>
     </w:p>
     <w:p>
@@ -450,7 +441,7 @@
           <w:szCs w:val="24"/>
           <w:vertAlign w:val="superscript"/>
         </w:rPr>
-        <w:t xml:space="preserve"># </w:t>
+        <w:t>† These authors contributed equally to this work and share first authorship</w:t>
       </w:r>
       <w:r>
         <w:rPr>
@@ -459,7 +450,6 @@
           <w:bCs/>
           <w:szCs w:val="24"/>
         </w:rPr>
-        <w:t>Authors share fi</w:t>
       </w:r>
       <w:r>
         <w:rPr>
@@ -468,7 +458,6 @@
           <w:bCs/>
           <w:szCs w:val="24"/>
         </w:rPr>
-        <w:t>r</w:t>
       </w:r>
       <w:r>
         <w:rPr>
@@ -477,7 +466,6 @@
           <w:bCs/>
           <w:szCs w:val="24"/>
         </w:rPr>
-        <w:t>st authorship</w:t>
       </w:r>
     </w:p>
     <w:p>
@@ -613,11 +601,9 @@
         <w:rPr>
           <w:b/>
         </w:rPr>
-        <w:t xml:space="preserve">Methods: </w:t>
-      </w:r>
-      <w:r>
-        <w:t xml:space="preserve">RCDome is a multi-database human gene atlas constructed through a staged architecture that integrates multi-source gene-RCD compilation, literature-based validation and evidence recovery, mechanistic classification, human-governed ontological adjudication, and deployment as an interactive web resource. Five complementary evidence channels, comprising PubMed Boolean search, curated databases, AI-assisted screening, manual curation, and Elicit systematic review, were integrated from 20 public databases and resources into a unified matrix. Sixty-two original name strings were canonicalized into 53 RCD-related entities, whose operational definitions and ontological levels were curator-adjudicated. Gene-RCD associations were systematically evaluated through an independent two-call large language model (LLM) validation architecture, Europe PMC full-text recovery and deep evidence extraction, and an independent Consensus literature-search channel. Source-grounding controls rejected extracted evidence not found verbatim in the source document, while the governance contract was enforced as executable code. </w:t>
-      </w:r>
+        <w:t xml:space="preserve">Methods: RCDome is a multi-database human gene atlas constructed through a staged architecture that integrates multi-source gene-RCD compilation, literature-based validation and evidence recovery, mechanistic classification, human-governed ontological adjudication, and deployment as an interactive web resource. Five complementary evidence channels, comprising PubMed Boolean search, curated databases, AI-assisted screening, manual curation, and Elicit systematic review, were integrated from 20 public databases and resources into a unified matrix. Sixty-two original name strings were canonicalized into 53 RCD-related entities, whose operational definitions and ontological levels were curator-adjudicated. gene-RCD associations were systematically evaluated through an independent two-call large language model (LLM) validation architecture, Europe PMC full-text recovery and deep evidence extraction, and an independent Consensus literature-search channel. Source-grounding controls rejected extracted evidence not found verbatim in the source document, while the governance contract was enforced as executable code. </w:t>
+      </w:r>
+      <w:r/>
     </w:p>
     <w:p>
       <w:pPr>
@@ -635,7 +621,7 @@
         <w:t xml:space="preserve">Results: </w:t>
       </w:r>
       <w:r>
-        <w:t xml:space="preserve">The compendium holds 22,473 association rows spanning 9,265 unique HGNC-validated genes (21,568 unique gene-RCD pairs). Chain-of-thought classification resolved 9,785 pairs (45.4%) as mechanistically involved; of these, only 469 (4.8%) are executors, 9,311 (95.2%) are regulators, 5 are markers, and 53 remain unresolved, revealing a small death-executing core embedded in a vast regulatory network. Under a separate seven-class mechanistic criterion applied to all 22,473 rows, only 3,063 (13.6%) were mechanistically confirmed and 442 (2.0%) were database-only with no verifiable paper trail. </w:t>
+        <w:t xml:space="preserve">The compendium holds 22,473 association rows spanning 9,265 unique HGNC-validated genes (21,568 unique gene-RCD pairs). Chain-of-thought classification resolved 9,785 pairs (45.4%) as mechanistically involved; of these, only 469 (4.8%) are executors, 9,311 (95.2%) are regulators, and 5 are markers, revealing a small death-executing core embedded in a vast regulatory network. Under a separate seven-class mechanistic criterion applied to all 22,473 rows, only 3,063 (13.6%) were mechanistically confirmed and 286 (1.3%) were database-only with no verifiable paper trail. </w:t>
       </w:r>
     </w:p>
     <w:p>
@@ -1235,7 +1221,7 @@
           <w:rFonts w:asciiTheme="majorHAnsi" w:hAnsiTheme="majorHAnsi" w:cstheme="majorHAnsi"/>
           <w:szCs w:val="24"/>
         </w:rPr>
-        <w:t>RCDome was conceived as a comprehensive, gene-centric, multi-source knowledge platform encompassing all described forms of RCD (</w:t>
+        <w:t>RCDome was conceived as a comprehensive, gene-centric, multi-source knowledge platform encompassing the RCD-related entities represented in the governed source universe (</w:t>
       </w:r>
       <w:r>
         <w:rPr>
@@ -1257,8 +1243,7 @@
           <w:rFonts w:asciiTheme="majorHAnsi" w:hAnsiTheme="majorHAnsi" w:cstheme="majorHAnsi"/>
           <w:szCs w:val="24"/>
         </w:rPr>
-        <w:lastRenderedPageBreak/>
-        <w:t>Abstract Validation), Layer 2 (Europe PMC + DeepSeek Full-Text Recovery), Layer 3 (Europe PMC XML Deep Retrieval-Augmented Generation (RAG)), and Layer 4 (Elicit Independent Literature Mining). This layered architecture ensures that original database claims are preserved intact. The platform's development followed a four-phase strategy: (i) establishment of a canonicalized RCD-related entity vocabulary through systematic literature and database discovery; (ii) multi-channel gene compilation from 20 independent resources organized into four evidence channels; (iii) integration into a unified, traceability-compliant gene-RCD association matrix; and (iv) deployment as a publicly available interactive web platform.</w:t>
+        <w:t>Abstract Validation), Layer 2 (Europe PMC + DeepSeek Full-Text Recovery), Layer 3 (Europe PMC XML Deep Retrieval-Augmented Generation (RAG)), and Layer 4 (Elicit Independent Literature Mining). This layered architecture ensures that original database claims are preserved intact. The platform's development followed a four-phase strategy: (i) establishment of a canonicalized RCD-related entity vocabulary through systematic literature and database discovery; (ii) multi-channel gene compilation from 20 source resources organized into four compilation channels (A through D), with a fifth validation/literature-mining channel (E) added at validation; (iii) integration into a unified, traceability-compliant gene-RCD association matrix; and (iv) deployment as a publicly available interactive web platform.</w:t>
       </w:r>
     </w:p>
     <w:p>
@@ -1402,7 +1387,7 @@
           <w:rFonts w:asciiTheme="majorHAnsi" w:hAnsiTheme="majorHAnsi" w:cstheme="majorHAnsi"/>
           <w:szCs w:val="24"/>
         </w:rPr>
-        <w:t xml:space="preserve">During database discovery, newly emerging RCD forms were encountered, demanding systematic expansion. We executed a multi-layered literature and database surveillance strategy: (a) forward-citation tracking of NCCD 2018 article </w:t>
+        <w:t>During database discovery, newly emerging RCD forms were encountered, demanding systematic expansion. We executed a multi-layered literature and database surveillance strategy: (a) forward-citation tracking of NCCD 2018 article {Galluzzi, 2018 #782025} to identify post-consensus RCD forms; (b) PubMed systematic searches using the "-ptosis" and "-osis" suffix patterns combined with "cell death" terminology; (c) surveillance of bioRxiv and medRxiv preprints (2024–2026); and (d) cross-referencing against the RCD form inventories of all 20 source databases and resources (Supplementary Table S2).</w:t>
       </w:r>
       <w:r>
         <w:rPr>
@@ -1410,14 +1395,12 @@
           <w:szCs w:val="24"/>
           <w:highlight w:val="yellow"/>
         </w:rPr>
-        <w:t>{Galluzzi, 2018 #782025}</w:t>
-      </w:r>
-      <w:r>
-        <w:rPr>
-          <w:rFonts w:asciiTheme="majorHAnsi" w:hAnsiTheme="majorHAnsi" w:cstheme="majorHAnsi"/>
-          <w:szCs w:val="24"/>
-        </w:rPr>
-        <w:t xml:space="preserve"> to identify post-consensus RCD forms; (b) PubMed systematic searches using the "-ptosis" and "-osis" suffix patterns combined with "cell death" terminology; (c) surveillance of bioRxiv and medRxiv preprints (2024–2026); and (d) cross-referencing against the RCD form inventories of all 20 source databases (</w:t>
+      </w:r>
+      <w:r>
+        <w:rPr>
+          <w:rFonts w:asciiTheme="majorHAnsi" w:hAnsiTheme="majorHAnsi" w:cstheme="majorHAnsi"/>
+          <w:szCs w:val="24"/>
+        </w:rPr>
       </w:r>
       <w:r>
         <w:rPr>
@@ -1425,7 +1408,6 @@
           <w:szCs w:val="24"/>
           <w:highlight w:val="green"/>
         </w:rPr>
-        <w:t>Supplementary Table S2</w:t>
       </w:r>
       <w:r>
         <w:rPr>
@@ -1433,32 +1415,31 @@
           <w:szCs w:val="24"/>
           <w:highlight w:val="yellow"/>
         </w:rPr>
-        <w:t>).</w:t>
-      </w:r>
-    </w:p>
-    <w:p>
-      <w:pPr>
-        <w:spacing w:after="0" w:line="240" w:lineRule="auto"/>
-        <w:rPr>
-          <w:rFonts w:asciiTheme="majorHAnsi" w:hAnsiTheme="majorHAnsi" w:cstheme="majorHAnsi"/>
-          <w:szCs w:val="24"/>
-        </w:rPr>
-      </w:pPr>
-    </w:p>
-    <w:p>
-      <w:pPr>
-        <w:spacing w:after="0" w:line="240" w:lineRule="auto"/>
-        <w:rPr>
-          <w:rFonts w:asciiTheme="majorHAnsi" w:hAnsiTheme="majorHAnsi" w:cstheme="majorHAnsi"/>
-          <w:szCs w:val="24"/>
-        </w:rPr>
-      </w:pPr>
-      <w:r>
-        <w:rPr>
-          <w:rFonts w:asciiTheme="majorHAnsi" w:hAnsiTheme="majorHAnsi" w:cstheme="majorHAnsi"/>
-          <w:szCs w:val="24"/>
-        </w:rPr>
-        <w:t xml:space="preserve">Candidate RCD forms were validated against five modality criteria (MC1–MC5) adapted from the NCCD framework </w:t>
+      </w:r>
+    </w:p>
+    <w:p>
+      <w:pPr>
+        <w:spacing w:after="0" w:line="240" w:lineRule="auto"/>
+        <w:rPr>
+          <w:rFonts w:asciiTheme="majorHAnsi" w:hAnsiTheme="majorHAnsi" w:cstheme="majorHAnsi"/>
+          <w:szCs w:val="24"/>
+        </w:rPr>
+      </w:pPr>
+    </w:p>
+    <w:p>
+      <w:pPr>
+        <w:spacing w:after="0" w:line="240" w:lineRule="auto"/>
+        <w:rPr>
+          <w:rFonts w:asciiTheme="majorHAnsi" w:hAnsiTheme="majorHAnsi" w:cstheme="majorHAnsi"/>
+          <w:szCs w:val="24"/>
+        </w:rPr>
+      </w:pPr>
+      <w:r>
+        <w:rPr>
+          <w:rFonts w:asciiTheme="majorHAnsi" w:hAnsiTheme="majorHAnsi" w:cstheme="majorHAnsi"/>
+          <w:szCs w:val="24"/>
+        </w:rPr>
+        <w:t>Candidate RCD forms were validated against five modality criteria (MC1–MC5) adapted from the NCCD framework {Galluzzi, 2018 #782025}: (MC1) possession of distinct molecular machinery not fully subsumed by another form; (MC2) an identifiable biochemical or biophysical trigger; (MC3) a characteristic and reproducible morphological phenotype; (MC4) explicit naming in at least one peer-reviewed publication; and (MC5) pharmacological or genetic distinguishability from other forms. Co-activation umbrellas (e.g., PANoptosis {Pandian, 2022 #783830}) and morphological descriptors without distinct mechanisms were classified as conceptual categories. Following the biological curation, admission to the modality level (L1) was additionally governed by hard biological gates (BG0–BG6) (whole-cell death, causal machinery, functional necessity/distinguishability, supportive phenotype, naming/provenance, replication/maturity, and species scope), which operationalize MC1–MC5 with BG1 (machinery) and BG2 (necessity) obligatory. The resulting five-level ontology is encoded in the unified matrix as two columns (rcdome_level and rcdome_level_name), preserving the external multi-optosis classification (rodr_category) untouched (Supplementary Table S3; Supplementary Table S4). Evidence grades in Tables S3 and S6 use the A–D scale: A, well-established (&gt;100 publications); B, established (10–100); C, emerging (2–10); D, proposed (1); N, not yet classified. The adjudication framework and its governance are documented in Supplementary Note S1; the complete evaluation architecture (RCD entity classification, gene-RCD association evidence, and pipeline quality gates) is summarized in Supplementary Figure S1. Discordance between the independent classification layers is adjudicated, on the labels they share, by an independent vote and a human curator verdict that never replaces the original labels; this benchmark and the repair of internal semantic contradictions are documented in Supplementary Note S2.</w:t>
       </w:r>
       <w:r>
         <w:rPr>
@@ -1466,14 +1447,12 @@
           <w:szCs w:val="24"/>
           <w:highlight w:val="yellow"/>
         </w:rPr>
-        <w:t>{Galluzzi, 2018 #782025}:</w:t>
-      </w:r>
-      <w:r>
-        <w:rPr>
-          <w:rFonts w:asciiTheme="majorHAnsi" w:hAnsiTheme="majorHAnsi" w:cstheme="majorHAnsi"/>
-          <w:szCs w:val="24"/>
-        </w:rPr>
-        <w:t xml:space="preserve"> (MC1) possession of distinct molecular machinery not fully subsumed by another form; (MC2) an identifiable biochemical or biophysical trigger; (MC3) a characteristic and reproducible morphological phenotype; (MC4) explicit naming in at least one peer-reviewed publication; and (MC5) pharmacological or genetic distinguishability from other forms. Co-activation umbrellas (e.g., PANoptosis </w:t>
+      </w:r>
+      <w:r>
+        <w:rPr>
+          <w:rFonts w:asciiTheme="majorHAnsi" w:hAnsiTheme="majorHAnsi" w:cstheme="majorHAnsi"/>
+          <w:szCs w:val="24"/>
+        </w:rPr>
       </w:r>
       <w:r>
         <w:rPr>
@@ -1481,13 +1460,11 @@
           <w:szCs w:val="24"/>
           <w:highlight w:val="yellow"/>
         </w:rPr>
-        <w:t>{Pandian, 2022 #783830})</w:t>
-      </w:r>
-      <w:r>
-        <w:rPr>
-          <w:szCs w:val="24"/>
-        </w:rPr>
-        <w:t xml:space="preserve"> and morphological descriptors without distinct mechanisms were classified as conceptual categories. Following the biological curation, admission to the modality level (L1) was additionally governed by hard biological gates (BG0–BG6) (whole-cell death, causal machinery, functional necessity/distinguishability, supportive phenotype, naming/provenance, replication/maturity, and species scope), which operationalize MC1–MC5 with BG1 (machinery) and BG2 (necessity) obligatory. The resulting five-level ontology is encoded in the unified matrix as two columns (</w:t>
+      </w:r>
+      <w:r>
+        <w:rPr>
+          <w:szCs w:val="24"/>
+        </w:rPr>
       </w:r>
       <w:r>
         <w:rPr>
@@ -1495,13 +1472,11 @@
           <w:i/>
           <w:szCs w:val="24"/>
         </w:rPr>
-        <w:t>rcdome_level</w:t>
-      </w:r>
-      <w:r>
-        <w:rPr>
-          <w:szCs w:val="24"/>
-        </w:rPr>
-        <w:t xml:space="preserve"> and </w:t>
+      </w:r>
+      <w:r>
+        <w:rPr>
+          <w:szCs w:val="24"/>
+        </w:rPr>
       </w:r>
       <w:r>
         <w:rPr>
@@ -1509,20 +1484,16 @@
           <w:i/>
           <w:szCs w:val="24"/>
         </w:rPr>
-        <w:t>rcdome_level_name</w:t>
-      </w:r>
-      <w:r>
-        <w:rPr>
-          <w:szCs w:val="24"/>
-        </w:rPr>
-        <w:t xml:space="preserve">), preserving the external multi-optosis classification </w:t>
-      </w:r>
-      <w:r>
-        <w:rPr>
-          <w:szCs w:val="24"/>
-        </w:rPr>
-        <w:lastRenderedPageBreak/>
-        <w:t>(</w:t>
+      </w:r>
+      <w:r>
+        <w:rPr>
+          <w:szCs w:val="24"/>
+        </w:rPr>
+      </w:r>
+      <w:r>
+        <w:rPr>
+          <w:szCs w:val="24"/>
+        </w:rPr>
       </w:r>
       <w:r>
         <w:rPr>
@@ -1530,13 +1501,11 @@
           <w:i/>
           <w:szCs w:val="24"/>
         </w:rPr>
-        <w:t>rodr_category</w:t>
-      </w:r>
-      <w:r>
-        <w:rPr>
-          <w:szCs w:val="24"/>
-        </w:rPr>
-        <w:t>) untouched (</w:t>
+      </w:r>
+      <w:r>
+        <w:rPr>
+          <w:szCs w:val="24"/>
+        </w:rPr>
       </w:r>
       <w:r>
         <w:rPr>
@@ -1544,14 +1513,12 @@
           <w:szCs w:val="24"/>
           <w:highlight w:val="green"/>
         </w:rPr>
-        <w:t>Supplementary Table S3</w:t>
-      </w:r>
-      <w:r>
-        <w:rPr>
-          <w:rFonts w:asciiTheme="majorHAnsi" w:hAnsiTheme="majorHAnsi" w:cstheme="majorHAnsi"/>
-          <w:szCs w:val="24"/>
-        </w:rPr>
-        <w:t xml:space="preserve">; </w:t>
+      </w:r>
+      <w:r>
+        <w:rPr>
+          <w:rFonts w:asciiTheme="majorHAnsi" w:hAnsiTheme="majorHAnsi" w:cstheme="majorHAnsi"/>
+          <w:szCs w:val="24"/>
+        </w:rPr>
       </w:r>
       <w:r>
         <w:rPr>
@@ -1559,14 +1526,12 @@
           <w:szCs w:val="24"/>
           <w:highlight w:val="green"/>
         </w:rPr>
-        <w:t>Supplementary Table S4</w:t>
-      </w:r>
-      <w:r>
-        <w:rPr>
-          <w:rFonts w:asciiTheme="majorHAnsi" w:hAnsiTheme="majorHAnsi" w:cstheme="majorHAnsi"/>
-          <w:szCs w:val="24"/>
-        </w:rPr>
-        <w:t xml:space="preserve">). Evidence grades in </w:t>
+      </w:r>
+      <w:r>
+        <w:rPr>
+          <w:rFonts w:asciiTheme="majorHAnsi" w:hAnsiTheme="majorHAnsi" w:cstheme="majorHAnsi"/>
+          <w:szCs w:val="24"/>
+        </w:rPr>
       </w:r>
       <w:r>
         <w:rPr>
@@ -1574,14 +1539,12 @@
           <w:szCs w:val="24"/>
           <w:highlight w:val="green"/>
         </w:rPr>
-        <w:t>Tables S3</w:t>
-      </w:r>
-      <w:r>
-        <w:rPr>
-          <w:rFonts w:asciiTheme="majorHAnsi" w:hAnsiTheme="majorHAnsi" w:cstheme="majorHAnsi"/>
-          <w:szCs w:val="24"/>
-        </w:rPr>
-        <w:t xml:space="preserve"> and S6 use the A–D scale: A, well-established (&gt;100 publications); B, established (10–100); C, emerging (2–10); D, proposed (1); N, not yet classified. The adjudication framework and its governance are documented in </w:t>
+      </w:r>
+      <w:r>
+        <w:rPr>
+          <w:rFonts w:asciiTheme="majorHAnsi" w:hAnsiTheme="majorHAnsi" w:cstheme="majorHAnsi"/>
+          <w:szCs w:val="24"/>
+        </w:rPr>
       </w:r>
       <w:r>
         <w:rPr>
@@ -1589,14 +1552,12 @@
           <w:szCs w:val="24"/>
           <w:highlight w:val="green"/>
         </w:rPr>
-        <w:t>Supplementary Note S1</w:t>
-      </w:r>
-      <w:r>
-        <w:rPr>
-          <w:rFonts w:asciiTheme="majorHAnsi" w:hAnsiTheme="majorHAnsi" w:cstheme="majorHAnsi"/>
-          <w:szCs w:val="24"/>
-        </w:rPr>
-        <w:t xml:space="preserve">; the complete evaluation architecture (RCD entity classification, gene–RCD association evidence, and pipeline quality gates) is summarized in </w:t>
+      </w:r>
+      <w:r>
+        <w:rPr>
+          <w:rFonts w:asciiTheme="majorHAnsi" w:hAnsiTheme="majorHAnsi" w:cstheme="majorHAnsi"/>
+          <w:szCs w:val="24"/>
+        </w:rPr>
       </w:r>
       <w:r>
         <w:rPr>
@@ -1604,27 +1565,20 @@
           <w:szCs w:val="24"/>
           <w:highlight w:val="green"/>
         </w:rPr>
-        <w:t>Supplementary Figure S1</w:t>
-      </w:r>
-      <w:r>
-        <w:rPr>
-          <w:rFonts w:asciiTheme="majorHAnsi" w:hAnsiTheme="majorHAnsi" w:cstheme="majorHAnsi"/>
-          <w:szCs w:val="24"/>
-        </w:rPr>
-        <w:t>.</w:t>
-      </w:r>
-      <w:r>
-        <w:t xml:space="preserve"> Discordance between the independent classification layers is adjudicated, on the labels they share, by an independent vote and a human curator verdict that never replaces the original labels; this benchmark and the repair of internal semantic contradictions are documented in </w:t>
-      </w:r>
+      </w:r>
+      <w:r>
+        <w:rPr>
+          <w:rFonts w:asciiTheme="majorHAnsi" w:hAnsiTheme="majorHAnsi" w:cstheme="majorHAnsi"/>
+          <w:szCs w:val="24"/>
+        </w:rPr>
+      </w:r>
+      <w:r/>
       <w:r>
         <w:rPr>
           <w:highlight w:val="green"/>
         </w:rPr>
-        <w:t>Supplementary Note S2</w:t>
-      </w:r>
-      <w:r>
-        <w:t>.</w:t>
-      </w:r>
+      </w:r>
+      <w:r/>
     </w:p>
     <w:p>
       <w:pPr>
@@ -1722,7 +1676,7 @@
           <w:rFonts w:asciiTheme="majorHAnsi" w:hAnsiTheme="majorHAnsi" w:cstheme="majorHAnsi"/>
           <w:szCs w:val="24"/>
         </w:rPr>
-        <w:t xml:space="preserve">The ontological classification of all 53 entities was curated individually by a primary curator (EM-A), who read, inspected, and approved each case separately (recorded per entity as </w:t>
+        <w:t>The ontological classification of all 53 entities was curated individually by a primary curator (EM-A), who read, inspected, and approved each case separately (recorded per entity as ontology_curator_verified) during a single curation session rather than through unattended batch approval. For the 20 de novo RCDome-drafted operational definitions, the primary curator read and validated each definition against its founding evidence before marking it as approved; the one composite record (Senescence and Autophagy in Cancer) was validated by the provenance of its two parent entities rather than by a founding PMID of its own. The 20 NCCD committee definitions and the 12 multi-optosis (Rodrigues 2025) definitions remained byte-identical (LOCKED-VERBATIM). Field-level evidence was established through the systematic assistant-draft/human-approval review and the Knock Test. Each ontological classification was subsequently assessed independently by two additional curators (VdSL and HACN), each reviewing all 53 entities on an entity-by-entity basis. Cases requiring reconsideration or involving disagreement among the independent assessments were jointly adjudicated by the curators, with the resulting consensus classification recorded as the final ontological assignment.</w:t>
       </w:r>
       <w:r>
         <w:rPr>
@@ -1730,13 +1684,11 @@
           <w:i/>
           <w:szCs w:val="24"/>
         </w:rPr>
-        <w:t>ontology_curator_verified</w:t>
-      </w:r>
-      <w:r>
-        <w:rPr>
-          <w:szCs w:val="24"/>
-        </w:rPr>
-        <w:t>) during a single curation session rather than through unattended batch approval. For the 21 RCDome-drafted operational definitions, the primary curator read and validated each definition against its founding evidence before marking it as approved, whereas the 20 NCCD committee definitions and the 12 multi-optosis (Rodrigues 2025) definitions remained byte-identical (</w:t>
+      </w:r>
+      <w:r>
+        <w:rPr>
+          <w:szCs w:val="24"/>
+        </w:rPr>
       </w:r>
       <w:r>
         <w:rPr>
@@ -1744,13 +1696,11 @@
           <w:i/>
           <w:szCs w:val="24"/>
         </w:rPr>
-        <w:t>LOCKED-VERBATIM</w:t>
-      </w:r>
-      <w:r>
-        <w:rPr>
-          <w:szCs w:val="24"/>
-        </w:rPr>
-        <w:t>). Field-level evidence was established through the systematic assistant-draft/human-approval review and the Knock Test. Each ontological classification was subsequently assessed independently by two additional curators (VdSL and HACN), each reviewing all 53 entities on an entity-by-entity basis. Cases requiring reconsideration or involving disagreement among the independent assessments were jointly adjudicated by the curators, with the resulting consensus classification recorded as the final ontological assignment.</w:t>
+      </w:r>
+      <w:r>
+        <w:rPr>
+          <w:szCs w:val="24"/>
+        </w:rPr>
       </w:r>
     </w:p>
     <w:p>
@@ -2054,8 +2004,7 @@
           <w:rFonts w:asciiTheme="majorHAnsi" w:hAnsiTheme="majorHAnsi" w:cstheme="majorHAnsi"/>
           <w:szCs w:val="24"/>
         </w:rPr>
-        <w:lastRenderedPageBreak/>
-        <w:t>The 19 L1 modalities are deliberately a subset of a larger reference set, not a relabeling of it. The NCCD assigns operational definitions to 20 entities that it terms "canonical"; RCDome retains those 20 definitions verbatim (invariant) but applies a stricter, mechanistic admission criterion before any entity is elevated to L1. Of the 19 RCDome L1 entities, 9 carry NCCD-verbatim definitions (ferroptosis, necroptosis, pyroptosis, entotic cell death, NETotic cell death, parthanatos, MPT-driven necrosis, autophagy-dependent cell death, and lysosome-dependent cell death). Ten L1 entities fall outside the NCCD 2018 list: apoptosis (which the NCCD splits into extrinsic and intrinsic subtypes, both retained at L2 in RCDome) and nine modalities not included in the NCCD 2018 list, cuproptosis, disulfidptosis, methuosis, oxeiptosis, paraptosis, alkaliptosis, NECSO, mitoxyperilysis, and triaptosis, admitted on the strength of their distinct machinery and functional necessity. Conversely, 11 NCCD-verbatim entities are not L1 because they are subtypes (anoikis, extrinsic and intrinsic apoptosis, autosis, lysosomal cell death), a trigger (mitotic catastrophe), contextual or outcome programs (cellular senescence, efferocytosis, immunogenic cell death, mitotic death), or an umbrella term (programmed cell death). This asymmetry reflects a deliberate governance rule: an NCCD operational definition is necessary for traceability but not sufficient for modality status; L1 requires identifiable causal machinery (BG1) and functional necessity/distinguishability (BG2). RCDome therefore treats the NCCD list as a nomenclature baseline and re-screens it through the BG0–BG6 hard gates, rather than equating "named by the NCCD" with "mechanistically established as an independent death program."</w:t>
+        <w:t>The 19 L1 modalities are deliberately a subset of a larger reference set, not a relabeling of it. The NCCD assigns operational definitions to 20 entities that it terms "canonical"; RCDome retains those 20 definitions verbatim (invariant) but applies a stricter, mechanistic admission criterion before any entity is elevated to L1. Of the 19 RCDome L1 entities, 9 carry NCCD-verbatim definitions (ferroptosis, necroptosis, pyroptosis, entotic cell death, NETotic cell death, parthanatos, MPT-driven necrosis, autophagy-dependent cell death, and lysosome-dependent cell death). Ten L1 entities fall outside the NCCD 2018 list: apoptosis (which the NCCD splits into extrinsic and intrinsic subtypes, both retained at L2 in RCDome) and nine modalities not included in the NCCD 2018 list, cuproptosis, disulfidptosis, methuosis, oxeiptosis, paraptosis, alkaliptosis, NECSO, mitoxyperilysis, and triaptosis, admitted on the strength of their distinct machinery and functional necessity. Conversely, 11 NCCD-verbatim entities are not L1 because they are subtypes (anoikis, extrinsic and intrinsic apoptosis, autosis), a synonym (lysosomal cell death, of lysosome-dependent cell death), a trigger (mitotic catastrophe), contextual or outcome programs (cellular senescence, efferocytosis, immunogenic cell death, mitotic death), or an umbrella term (programmed cell death). This asymmetry reflects a deliberate governance rule: an NCCD operational definition is necessary for traceability but not sufficient for modality status; L1 requires identifiable causal machinery (BG1) and functional necessity/distinguishability (BG2). RCDome therefore treats the NCCD list as a nomenclature baseline and re-screens it through the BG0–BG6 hard gates, rather than equating "named by the NCCD" with "mechanistically established as an independent death program."</w:t>
       </w:r>
     </w:p>
     <w:p>
@@ -3293,14 +3242,12 @@
         <w:rPr>
           <w:szCs w:val="24"/>
         </w:rPr>
-        <w:t xml:space="preserve">MSigDB was extracted through a systematic, curated process rather than a fixed gene-set list. A manual, biologically oriented curation of all 53 RCD entities in MSigDB was performed </w:t>
-      </w:r>
-      <w:r>
-        <w:rPr>
-          <w:szCs w:val="24"/>
-        </w:rPr>
-        <w:lastRenderedPageBreak/>
-        <w:t>(release 2026.1), searching each entity by its normalized name plus complementary terms (e.g., APOPTOTIC, NECROPTOTIC, PYROPTOTIC) to recover gene sets that a name-only search would miss. Each of the 360 candidate gene sets was individually classified as include (251: 238 new plus 13 already present in the matrix) or exclude (109) with a documented biological rationale (</w:t>
+        <w:t>MSigDB was extracted through a systematic, curated process rather than a fixed gene-set list. A manual, biologically oriented curation of all 53 RCD entities in MSigDB was performed (release 2026.1), searching each entity by its normalized name plus complementary terms (e.g., APOPTOTIC, NECROPTOTIC, PYROPTOTIC) to recover gene sets that a name-only search would miss. Each of the 360 candidate gene sets was individually classified as include (251: 238 new plus 13 already present in the matrix) or exclude (109) with a documented biological rationale (RCDome_MSigDB_Manual_Curation.xlsx): inclusion prioritized gene sets representing cell-death processes, executioner machinery, or form-specific signaling/regulation, while exclusion rejected drug, cancer-type, pathogen, or expression signatures that reflect context rather than RCD machinery. Of the 238 new inclusion sets, 236 matched the MSigDB 2026.1 release and were integrated; one set (REACTOME_EXTRINSIC_PATHWAY_FOR_APOPTOSIS) was archived as an obsolete Reactome build and excluded, while another (GOBP_ACTIVATION_OF_CYSTEINE_TYPE_ENDOPEPTIDASE_ACTIVITY_INVOLVED_IN_APOPTOTIC_PROCESS) had been renamed and was superseded by its successor (GOMF_CYSTEINE_TYPE_ENDOPEPTIDASE_ACTIVATOR_ACTIVITY_INVOLVED_IN_APOPTOTIC_PROCESS). This curation contributed 2,501 genes across 4,550 gene-RCD pairs: 1,832 pairs were created as MSigDB-only rows (spanning 1,701 genes), and 2,718 pairs corroborated already-present pairs (MSigDB appended as an additional source). The extraction code (channel_b_msigdb.py) was amended to read the curated list directly, making the selection reproducible and auditable.</w:t>
+      </w:r>
+      <w:r>
+        <w:rPr>
+          <w:szCs w:val="24"/>
+        </w:rPr>
       </w:r>
       <w:r>
         <w:rPr>
@@ -3308,13 +3255,11 @@
           <w:i/>
           <w:szCs w:val="24"/>
         </w:rPr>
-        <w:t>RCDome_MSigDB_Curadoria_Manual_Completa.xlsx</w:t>
-      </w:r>
-      <w:r>
-        <w:rPr>
-          <w:szCs w:val="24"/>
-        </w:rPr>
-        <w:t>): inclusion prioritized gene sets representing cell-death processes, executioner machinery, or form-specific signaling/regulation, while exclusion rejected drug, cancer-type, pathogen, or expression signatures that reflect context rather than RCD machinery. Of the 238 new inclusion sets, 236 matched the MSigDB 2026.1 release and were integrated; one set (REACTOME_EXTRINSIC_PATHWAY_FOR_APOPTOSIS) was archived as an obsolete Reactome build and excluded, while another (GOBP_ACTIVATION_OF_CYSTEINE_TYPE_ENDOPEPTIDASE_ACTIVITY_INVOLVED_IN_APOPTOTIC_PROCESS) had been renamed and was superseded by its successor (GOMF_CYSTEINE_TYPE_ENDOPEPTIDASE_ACTIVATOR_ACTIVITY_INVOLVED_IN_APOPTOTIC_PROCESS). This curation contributed 2,501 genes across 4,550 gene-RCD pairs: 1,832 pairs were created as MSigDB-only rows (spanning 1,701 genes), and 2,718 pairs corroborated already-present pairs (MSigDB appended as an additional source). The extraction code (</w:t>
+      </w:r>
+      <w:r>
+        <w:rPr>
+          <w:szCs w:val="24"/>
+        </w:rPr>
       </w:r>
       <w:r>
         <w:rPr>
@@ -3322,13 +3267,11 @@
           <w:i/>
           <w:szCs w:val="24"/>
         </w:rPr>
-        <w:t>channel_b_msigdb.py</w:t>
-      </w:r>
-      <w:r>
-        <w:rPr>
-          <w:szCs w:val="24"/>
-        </w:rPr>
-        <w:t>) was amended to read the curated list directly, making the selection reproducible and auditable.</w:t>
+      </w:r>
+      <w:r>
+        <w:rPr>
+          <w:szCs w:val="24"/>
+        </w:rPr>
       </w:r>
     </w:p>
     <w:p>
@@ -3627,7 +3570,7 @@
           <w:bCs/>
           <w:szCs w:val="24"/>
         </w:rPr>
-        <w:t>Gene-RCD Association Traceability Specification</w:t>
+        <w:t>gene-RCD Association Traceability Specification</w:t>
       </w:r>
     </w:p>
     <w:p>
@@ -3700,22 +3643,22 @@
           <w:bCs/>
           <w:szCs w:val="24"/>
         </w:rPr>
-        <w:t>Data Integration and Unified Gene-RCD Matrix</w:t>
-      </w:r>
-    </w:p>
-    <w:p>
-      <w:pPr>
-        <w:spacing w:after="0" w:line="240" w:lineRule="auto"/>
-        <w:rPr>
-          <w:rFonts w:asciiTheme="majorHAnsi" w:hAnsiTheme="majorHAnsi" w:cstheme="majorHAnsi"/>
-          <w:szCs w:val="24"/>
-        </w:rPr>
-      </w:pPr>
-      <w:r>
-        <w:rPr>
-          <w:szCs w:val="24"/>
-        </w:rPr>
-        <w:t>Outputs from all five channels were merged into a unified gene-RCD association matrix using (</w:t>
+        <w:t>Data Integration and Unified gene-RCD Matrix</w:t>
+      </w:r>
+    </w:p>
+    <w:p>
+      <w:pPr>
+        <w:spacing w:after="0" w:line="240" w:lineRule="auto"/>
+        <w:rPr>
+          <w:rFonts w:asciiTheme="majorHAnsi" w:hAnsiTheme="majorHAnsi" w:cstheme="majorHAnsi"/>
+          <w:szCs w:val="24"/>
+        </w:rPr>
+      </w:pPr>
+      <w:r>
+        <w:rPr>
+          <w:szCs w:val="24"/>
+        </w:rPr>
+        <w:t>Outputs from the association-producing channels (A, B, and E) were merged into a unified gene-RCD association matrix using (gene_symbol, rcd_form) as the primary merge key, preserving the original RCD form name exactly as recorded in each source database. Channels C (AI-assisted literature screening) and D (manual expert curation and conflict adjudication) acted as governance steps on these records rather than as additional association sources. A parallel rcd_form_canonical column was reserved for subsequent expert-governed unification of synonymous form names (e.g., "Entosis" to "Entotic cell death").</w:t>
       </w:r>
       <w:r>
         <w:rPr>
@@ -3723,13 +3666,11 @@
           <w:i/>
           <w:szCs w:val="24"/>
         </w:rPr>
-        <w:t>gene_symbol</w:t>
-      </w:r>
-      <w:r>
-        <w:rPr>
-          <w:szCs w:val="24"/>
-        </w:rPr>
-        <w:t xml:space="preserve">, </w:t>
+      </w:r>
+      <w:r>
+        <w:rPr>
+          <w:szCs w:val="24"/>
+        </w:rPr>
       </w:r>
       <w:r>
         <w:rPr>
@@ -3737,14 +3678,12 @@
           <w:i/>
           <w:szCs w:val="24"/>
         </w:rPr>
-        <w:t>rcd_form</w:t>
-      </w:r>
-      <w:r>
-        <w:rPr>
-          <w:rFonts w:asciiTheme="majorHAnsi" w:hAnsiTheme="majorHAnsi" w:cstheme="majorHAnsi"/>
-          <w:szCs w:val="24"/>
-        </w:rPr>
-        <w:t xml:space="preserve">) as the primary merge key, preserving the original RCD form name exactly as recorded in each source database. A parallel </w:t>
+      </w:r>
+      <w:r>
+        <w:rPr>
+          <w:rFonts w:asciiTheme="majorHAnsi" w:hAnsiTheme="majorHAnsi" w:cstheme="majorHAnsi"/>
+          <w:szCs w:val="24"/>
+        </w:rPr>
       </w:r>
       <w:r>
         <w:rPr>
@@ -3752,14 +3691,12 @@
           <w:i/>
           <w:szCs w:val="24"/>
         </w:rPr>
-        <w:t>rcd_form_canonical</w:t>
-      </w:r>
-      <w:r>
-        <w:rPr>
-          <w:rFonts w:asciiTheme="majorHAnsi" w:hAnsiTheme="majorHAnsi" w:cstheme="majorHAnsi"/>
-          <w:szCs w:val="24"/>
-        </w:rPr>
-        <w:t xml:space="preserve"> column was reserved for subsequent expert-governed unification of synonymous form names (e.g., "Entosis" to "Entotic cell death").</w:t>
+      </w:r>
+      <w:r>
+        <w:rPr>
+          <w:rFonts w:asciiTheme="majorHAnsi" w:hAnsiTheme="majorHAnsi" w:cstheme="majorHAnsi"/>
+          <w:szCs w:val="24"/>
+        </w:rPr>
       </w:r>
     </w:p>
     <w:p>
@@ -3799,7 +3736,7 @@
           <w:rFonts w:asciiTheme="majorHAnsi" w:hAnsiTheme="majorHAnsi" w:cstheme="majorHAnsi"/>
           <w:szCs w:val="24"/>
         </w:rPr>
-        <w:t xml:space="preserve"> classification reflecting the nature of the source evidence. Associations derived from manually curated databases (FerrDB, RCDdb, iPCD, LncRCD, iLIR, HADb, HAMdb, ATD, AMT-DB, KEGG, Reactome, GO, MSigDB, ncFO) and the multi-optosis dataset were classified as curated. Associations from the NCBI Gene E-utilities API, which uses keyword-based record matching rather than explicit curation, were classified as keyword. Rows supported exclusively by keyword evidence (n = 10,857) were excluded following a spot audit that revealed 0% overlap with known RCD executioner and regulator genes. Rows with curated-only or mixed curated+keyword evidence were retained (n = 18,991). Subsequent database integrations through the external audit (Reactome pathway-specific gene sets, WikiPathways, and XDeathDB, all classified as curated) and the Elicit Phase 3 systematic review (classified as </w:t>
+        <w:t xml:space="preserve"> classification reflecting the nature of the source evidence. Associations derived from manually curated databases (FerrDB, RCDdb, iPCD, LncRCD, iLIR, HADb, HAMdb, ATD, AMT-DB, KEGG, Reactome, GO, MSigDB, ncFO) and the multi-optosis dataset were classified as curated. Associations from the NCBI Gene E-utilities API, which uses keyword-based record matching rather than explicit curation, were classified as keyword. Rows supported exclusively by keyword evidence (n = 10,857) were excluded following a spot audit that revealed 0% overlap with known RCD executioner and regulator genes. Fifteen keyword-only rows for NECSO, a newly described entity whose gene associations were available solely through the NCBI Gene keyword search at compilation time, were retained and are flagged as such in the evidence_quality column. Rows with curated-only or mixed curated+keyword evidence were retained (n = 18,991). Subsequent database integrations through the external audit (Reactome pathway-specific gene sets, WikiPathways, and XDeathDB, all classified as curated) and the Elicit Phase 3 systematic review (classified as </w:t>
       </w:r>
       <w:r>
         <w:rPr>
@@ -3982,7 +3919,7 @@
           <w:color w:val="auto"/>
           <w:szCs w:val="24"/>
         </w:rPr>
-        <w:t>During manuscript preparation, nine additional cell death-related terms were proposed for inclusion (NECSO, Triaptosis, Mitoxyperilysis, Eryptosis, Cobaltosis, Calcioptosis, Corneoptosis, plus Pyronecrosis and Spectosis already catalogued). Each was evaluated against the same five-criteria framework. Four met the threshold for inclusion in the controlled vocabulary (NECSO, Triaptosis, Mitoxyperilysis, Eryptosis). Three further forms encountered during database discovery (Floatptosis, Lysozincrosis, and Metalloptosis) were also admitted, Floatptosis and Lysozincrosis as a cell-type program (L4) and a subtype (L2), respectively, and Metalloptosis as an umbrella term, completing the 53-entity vocabulary. An external audit subsequently integrated three additional databases (Reactome pathway-specific gene sets, WikiPathways, and XDeathDB), bringing the final count to 53 RCD-related entities (</w:t>
+        <w:t xml:space="preserve">During manuscript preparation, nine additional cell death-related terms were proposed for inclusion (NECSO, Triaptosis, Mitoxyperilysis, Eryptosis, Cobaltosis, Calcioptosis, Corneoptosis, plus Pyronecrosis and Spectosis already catalogued). Each was evaluated against the same five-criteria framework. Four met the threshold for inclusion in the controlled vocabulary (NECSO, Triaptosis, Mitoxyperilysis, Eryptosis). Three further forms encountered during database discovery (Floatptosis, Lysozincrosis, and Metalloptosis) were also admitted, Floatptosis and Lysozincrosis as a cell-type program (L4) and a subtype (L2), respectively, and Metalloptosis as an umbrella term, completing the 53-entity vocabulary. An external audit subsequently integrated three additional databases (Reactome pathway-specific gene sets, WikiPathways, and XDeathDB), which contributed association records to existing entities rather than new entities (Supplementary Table S3). </w:t>
       </w:r>
       <w:r>
         <w:rPr>
@@ -3991,7 +3928,6 @@
           <w:szCs w:val="24"/>
           <w:highlight w:val="green"/>
         </w:rPr>
-        <w:t>Supplementary Table S3</w:t>
       </w:r>
       <w:r>
         <w:rPr>
@@ -3999,7 +3935,6 @@
           <w:color w:val="auto"/>
           <w:szCs w:val="24"/>
         </w:rPr>
-        <w:t xml:space="preserve">). </w:t>
       </w:r>
     </w:p>
     <w:p>
@@ -4171,7 +4106,7 @@
         <w:t xml:space="preserve">. </w:t>
       </w:r>
       <w:r>
-        <w:t>Both terms were evaluated against the same framework. Independently of their biological status, neither term is present in any of the 20 source databases used in the compilation (ruptosis entered specialized databases only from October 2026, after the matrix data freeze), so under the no-invented-names rule (every RCDome entity originates from at least one source database's published terminology), neither could be admitted as a compendium entity. They are nevertheless ruled out explicitly, on both database-absence and biological-gate grounds, rather than left unaddressed:</w:t>
+        <w:t>Both terms were evaluated against the same framework. Independently of their biological status, neither term is present in any of the 20 source databases and resources used in the compilation (ruptosis entered specialized databases only from October 2026, after the matrix data freeze), so under the no-invented-names rule (every RCDome entity originates from at least one source database's published terminology), neither could be admitted as a compendium entity. They are nevertheless ruled out explicitly, on both database-absence and biological-gate grounds, rather than left unaddressed:</w:t>
       </w:r>
     </w:p>
     <w:p>
@@ -4353,8 +4288,7 @@
           <w:rFonts w:asciiTheme="majorHAnsi" w:hAnsiTheme="majorHAnsi" w:cstheme="majorHAnsi"/>
           <w:szCs w:val="24"/>
         </w:rPr>
-        <w:lastRenderedPageBreak/>
-        <w:t xml:space="preserve">and to 'Mitotic death' (subtype) for XDeathDB and Elicit rows. The 11 synonym renames are listed in </w:t>
+        <w:t xml:space="preserve">and to 'Mitotic death' (subtype) for XDeathDB and Elicit rows. The two entities are not synonyms: mitotic catastrophe is the oncosuppressive process that is not an RCD form per se, and mitotic death is the RCD outcome driven by it. The 11 synonym renames are listed in </w:t>
       </w:r>
       <w:r>
         <w:rPr>
@@ -4411,7 +4345,7 @@
           <w:rFonts w:asciiTheme="majorHAnsi" w:hAnsiTheme="majorHAnsi" w:cstheme="majorHAnsi"/>
           <w:szCs w:val="24"/>
         </w:rPr>
-        <w:t>The final RCD form vocabulary consolidates 62 original name strings from 20 independent resources into 53 RCD-related entities through 9 synonym-merge groups (11 name eliminations, 2 split names). All 53 RCD-related entities carry gene-level evidence in the unified matrix (</w:t>
+        <w:t>The final RCD form vocabulary consolidates 62 original name strings from 20 source resources into 53 RCD-related entities through 9 synonym-merge groups (11 name eliminations, 2 split names). All 53 RCD-related entities carry gene-level evidence in the unified matrix (</w:t>
       </w:r>
       <w:r>
         <w:rPr>
@@ -4514,7 +4448,7 @@
           <w:bCs/>
           <w:szCs w:val="24"/>
         </w:rPr>
-        <w:t>Phase 2: Automated Gene-RCD Association Validation</w:t>
+        <w:t>Phase 2: Automated gene-RCD Association Validation</w:t>
       </w:r>
     </w:p>
     <w:p>
@@ -4547,7 +4481,7 @@
           <w:rFonts w:asciiTheme="majorHAnsi" w:hAnsiTheme="majorHAnsi" w:cstheme="majorHAnsi"/>
           <w:szCs w:val="24"/>
         </w:rPr>
-        <w:t>To independently validate every gene-RCD association in the compilation matrix, we implemented a two-call independent LLM-based verification pipeline. The validation operates on all 21,568 unique (gene, RCD-related entity) pairs in the unified matrix, adding evidence tiers, literature support, and verification status to each row.</w:t>
+        <w:t>To systematically evaluate every gene-RCD association in the compilation matrix, we implemented a two-call independent LLM-based verification pipeline. The validation operates on all 21,568 unique (gene, RCD-related entity) pairs in the unified matrix, adding evidence tiers, literature support, and verification status to each row. Throughout this work, matrix rows refers to the 22,473 source-specific association records, whereas unique canonical gene-RCD pairs refers to the 21,568 distinct gene and RCD entity combinations after deduplication.</w:t>
       </w:r>
     </w:p>
     <w:p>
@@ -4857,7 +4791,7 @@
           <w:rFonts w:asciiTheme="majorHAnsi" w:hAnsiTheme="majorHAnsi" w:cstheme="majorHAnsi"/>
           <w:szCs w:val="24"/>
         </w:rPr>
-        <w:t>Each gene-RCD pair receives a final evidence tier (ET1-ET4) based on a composite of multi-database consensus and LLM validation status:</w:t>
+        <w:t>Each matrix row (gene-RCD association record) received an evidence tier (ET1-ET4) based on its own source combination and LLM validation status; a pair contributed by multiple sources could therefore carry different tiers across its rows:</w:t>
       </w:r>
     </w:p>
     <w:p>
@@ -4985,7 +4919,7 @@
           <w:color w:val="auto"/>
           <w:szCs w:val="24"/>
         </w:rPr>
-        <w:t>Separately, a confidence score was computed as a weighted sum of the compilation channels (Channel D = 4, Channel B = 3, Channel A = 1, Channel C = 1) and recorded as an independent confidence tier (CT1 = 7–9, CT2 = 4–6, CT3 = 2–3, CT4 = 0–1). This confidence tier is a metric distinct from the evidence tier (ET1–ET4) defined above and must not be conflated with it.</w:t>
+        <w:t>Separately, a confidence score was computed as a weighted sum of the compilation channels (Channel D = 4, Channel B = 3, Channel A = 1, Channel C = 1) and recorded as an independent confidence tier (CT1 = 7–9, CT2 = 4–6, CT3 = 2–3, CT4 = 0–1). This confidence tier is a metric distinct from the evidence tier (ET1–ET4) defined above and must not be conflated with it. This confidence score applied only to rows carrying compilation-channel evidence (Channels A through D). The 1,874 rows contributed solely by a single database or by the Elicit validation layer lay outside this scoring universe and therefore carried no confidence tier. No row reached a score of 7 to 9, so the CT1 tier remained unpopulated.</w:t>
       </w:r>
     </w:p>
     <w:p>
@@ -5842,7 +5776,7 @@
         <w:rPr>
           <w:szCs w:val="24"/>
         </w:rPr>
-        <w:t xml:space="preserve">) processes all 21,312 gene-RCD pairs carrying at least one PMID. PMID-to-PMCID conversion </w:t>
+        <w:t xml:space="preserve">) processes all 21,283 gene-RCD pairs carrying at least one PMID. PMID-to-PMCID conversion </w:t>
       </w:r>
       <w:r>
         <w:rPr>
@@ -6170,7 +6104,7 @@
         <w:rPr>
           <w:szCs w:val="24"/>
         </w:rPr>
-        <w:t xml:space="preserve">Phase 2C adds four new columns to the unified matrix without overwriting Phase 2A values. Phase 2C is distinct from Phase 2B (the deep RAG step): 2C recovers PMIDs, whereas 2B extracts deep evidence sentences. These columns capture MECHANISTIC classifications from full-text Europe PMC recovery, in addition to the 3,063 MECHANISTIC pairs from Phase 2A/D abstract validation: </w:t>
+        <w:t xml:space="preserve">Phase 2C adds four new columns to the unified matrix without overwriting Phase 2A values. Phase 2C is distinct from Phase 2B (the deep RAG step): 2C recovers PMIDs, whereas 2B extracts deep evidence sentences. These columns capture MECHANISTIC classifications from full-text Europe PMC recovery, in addition to the 3,063 MECHANISTIC rows from Phase 2A/D abstract validation: </w:t>
       </w:r>
       <w:r>
         <w:rPr>
@@ -6425,7 +6359,7 @@
           <w:rFonts w:asciiTheme="majorHAnsi" w:hAnsiTheme="majorHAnsi" w:cstheme="majorHAnsi"/>
           <w:szCs w:val="24"/>
         </w:rPr>
-        <w:t xml:space="preserve">The full run classified all 21,566 unique (gene, RCD-related entity) pairs using the </w:t>
+        <w:t>The full run classified all 21,566 unique (gene, RCD-related entity) pairs using the deepseek-v4-pro model with thinking enabled and reasoning effort set to maximum. The two late-added MSigDB pairs (NLRX1 and PPIF, MPT-driven necrosis) were classified separately: their chain-of-thought columns by a five-vote mini-run, and their seven-class mechanistic classification by the Phase 2A/D two-call, yielding the final 21,568 unique pairs.</w:t>
       </w:r>
       <w:r>
         <w:rPr>
@@ -6433,14 +6367,12 @@
           <w:i/>
           <w:szCs w:val="24"/>
         </w:rPr>
-        <w:t>deepseek-v4-pro</w:t>
-      </w:r>
-      <w:r>
-        <w:rPr>
-          <w:rFonts w:asciiTheme="majorHAnsi" w:hAnsiTheme="majorHAnsi" w:cstheme="majorHAnsi"/>
-          <w:szCs w:val="24"/>
-        </w:rPr>
-        <w:t xml:space="preserve"> model with thinking enabled and reasoning effort set to maximum. The two late-added MSigDB pairs (</w:t>
+      </w:r>
+      <w:r>
+        <w:rPr>
+          <w:rFonts w:asciiTheme="majorHAnsi" w:hAnsiTheme="majorHAnsi" w:cstheme="majorHAnsi"/>
+          <w:szCs w:val="24"/>
+        </w:rPr>
       </w:r>
       <w:r>
         <w:rPr>
@@ -6449,14 +6381,12 @@
           <w:iCs/>
           <w:szCs w:val="24"/>
         </w:rPr>
-        <w:t xml:space="preserve">NLRX1 </w:t>
-      </w:r>
-      <w:r>
-        <w:rPr>
-          <w:rFonts w:asciiTheme="majorHAnsi" w:hAnsiTheme="majorHAnsi" w:cstheme="majorHAnsi"/>
-          <w:szCs w:val="24"/>
-        </w:rPr>
-        <w:t xml:space="preserve">and </w:t>
+      </w:r>
+      <w:r>
+        <w:rPr>
+          <w:rFonts w:asciiTheme="majorHAnsi" w:hAnsiTheme="majorHAnsi" w:cstheme="majorHAnsi"/>
+          <w:szCs w:val="24"/>
+        </w:rPr>
       </w:r>
       <w:r>
         <w:rPr>
@@ -6465,14 +6395,12 @@
           <w:iCs/>
           <w:szCs w:val="24"/>
         </w:rPr>
-        <w:t>PPIF</w:t>
-      </w:r>
-      <w:r>
-        <w:rPr>
-          <w:rFonts w:asciiTheme="majorHAnsi" w:hAnsiTheme="majorHAnsi" w:cstheme="majorHAnsi"/>
-          <w:szCs w:val="24"/>
-        </w:rPr>
-        <w:t xml:space="preserve">, </w:t>
+      </w:r>
+      <w:r>
+        <w:rPr>
+          <w:rFonts w:asciiTheme="majorHAnsi" w:hAnsiTheme="majorHAnsi" w:cstheme="majorHAnsi"/>
+          <w:szCs w:val="24"/>
+        </w:rPr>
       </w:r>
       <w:r>
         <w:rPr>
@@ -6481,14 +6409,12 @@
           <w:iCs/>
           <w:szCs w:val="24"/>
         </w:rPr>
-        <w:t>MPT</w:t>
-      </w:r>
-      <w:r>
-        <w:rPr>
-          <w:rFonts w:asciiTheme="majorHAnsi" w:hAnsiTheme="majorHAnsi" w:cstheme="majorHAnsi"/>
-          <w:szCs w:val="24"/>
-        </w:rPr>
-        <w:t>-driven necrosis) were classified separately in the Phase 2A/D mini-run, yielding the final 21,568 unique pairs.</w:t>
+      </w:r>
+      <w:r>
+        <w:rPr>
+          <w:rFonts w:asciiTheme="majorHAnsi" w:hAnsiTheme="majorHAnsi" w:cstheme="majorHAnsi"/>
+          <w:szCs w:val="24"/>
+        </w:rPr>
       </w:r>
     </w:p>
     <w:p>
@@ -6593,21 +6519,19 @@
           <w:rFonts w:asciiTheme="majorHAnsi" w:hAnsiTheme="majorHAnsi" w:cstheme="majorHAnsi"/>
           <w:szCs w:val="24"/>
         </w:rPr>
-        <w:t xml:space="preserve">Post-hoc reconciliation repaired 84 self-inconsistent rows (mechanistic NO with a confident role or direction), and 231 rows with genuine role/direction uncertainty, 178 regulators with unclear direction and 53 mechanistically-involved pairs with unresolved role, were retained as honest uncertainty rather than forced into a confident category. Two </w:t>
-      </w:r>
-      <w:r>
-        <w:rPr>
-          <w:rFonts w:asciiTheme="majorHAnsi" w:hAnsiTheme="majorHAnsi" w:cstheme="majorHAnsi"/>
-          <w:szCs w:val="24"/>
-        </w:rPr>
-        <w:t>gene-RCD</w:t>
-      </w:r>
-      <w:r>
-        <w:rPr>
-          <w:rFonts w:asciiTheme="majorHAnsi" w:hAnsiTheme="majorHAnsi" w:cstheme="majorHAnsi"/>
-          <w:szCs w:val="24"/>
-        </w:rPr>
-        <w:t xml:space="preserve"> pairs added to the matrix after the full run (</w:t>
+        <w:t>Post-hoc reconciliation repaired 84 self-inconsistent rows (mechanistic NO with a confident role or direction), and 231 rows with genuine role/direction uncertainty, 178 regulators with unclear direction and 53 mechanistically-involved pairs with unresolved role, were retained as unresolved rather than forced into a confident category. Two gene-RCD pairs added to the matrix after the full run (NLRX1 and PPIF with MPT-driven necrosis) were classified separately with the same logic using a five-vote majority, completing 100% pair coverage (21,568/21,568).</w:t>
+      </w:r>
+      <w:r>
+        <w:rPr>
+          <w:rFonts w:asciiTheme="majorHAnsi" w:hAnsiTheme="majorHAnsi" w:cstheme="majorHAnsi"/>
+          <w:szCs w:val="24"/>
+        </w:rPr>
+      </w:r>
+      <w:r>
+        <w:rPr>
+          <w:rFonts w:asciiTheme="majorHAnsi" w:hAnsiTheme="majorHAnsi" w:cstheme="majorHAnsi"/>
+          <w:szCs w:val="24"/>
+        </w:rPr>
       </w:r>
       <w:r>
         <w:rPr>
@@ -6616,14 +6540,12 @@
           <w:iCs/>
           <w:szCs w:val="24"/>
         </w:rPr>
-        <w:t>NLRX1</w:t>
-      </w:r>
-      <w:r>
-        <w:rPr>
-          <w:rFonts w:asciiTheme="majorHAnsi" w:hAnsiTheme="majorHAnsi" w:cstheme="majorHAnsi"/>
-          <w:szCs w:val="24"/>
-        </w:rPr>
-        <w:t xml:space="preserve"> and </w:t>
+      </w:r>
+      <w:r>
+        <w:rPr>
+          <w:rFonts w:asciiTheme="majorHAnsi" w:hAnsiTheme="majorHAnsi" w:cstheme="majorHAnsi"/>
+          <w:szCs w:val="24"/>
+        </w:rPr>
       </w:r>
       <w:r>
         <w:rPr>
@@ -6632,14 +6554,12 @@
           <w:iCs/>
           <w:szCs w:val="24"/>
         </w:rPr>
-        <w:t>PPIF</w:t>
-      </w:r>
-      <w:r>
-        <w:rPr>
-          <w:rFonts w:asciiTheme="majorHAnsi" w:hAnsiTheme="majorHAnsi" w:cstheme="majorHAnsi"/>
-          <w:szCs w:val="24"/>
-        </w:rPr>
-        <w:t xml:space="preserve"> with </w:t>
+      </w:r>
+      <w:r>
+        <w:rPr>
+          <w:rFonts w:asciiTheme="majorHAnsi" w:hAnsiTheme="majorHAnsi" w:cstheme="majorHAnsi"/>
+          <w:szCs w:val="24"/>
+        </w:rPr>
       </w:r>
       <w:r>
         <w:rPr>
@@ -6648,14 +6568,12 @@
           <w:iCs/>
           <w:szCs w:val="24"/>
         </w:rPr>
-        <w:t>MPT</w:t>
-      </w:r>
-      <w:r>
-        <w:rPr>
-          <w:rFonts w:asciiTheme="majorHAnsi" w:hAnsiTheme="majorHAnsi" w:cstheme="majorHAnsi"/>
-          <w:szCs w:val="24"/>
-        </w:rPr>
-        <w:t>-driven necrosis) were classified separately with the same logic using a five-vote majority, completing 100% pair coverage (21,568/21,568).</w:t>
+      </w:r>
+      <w:r>
+        <w:rPr>
+          <w:rFonts w:asciiTheme="majorHAnsi" w:hAnsiTheme="majorHAnsi" w:cstheme="majorHAnsi"/>
+          <w:szCs w:val="24"/>
+        </w:rPr>
       </w:r>
     </w:p>
     <w:p>
@@ -7367,15 +7285,13 @@
           <w:rFonts w:asciiTheme="majorHAnsi" w:hAnsiTheme="majorHAnsi" w:cstheme="majorHAnsi"/>
           <w:szCs w:val="24"/>
         </w:rPr>
-        <w:t xml:space="preserve">RCDome integrates all 53 RCD-related entities from 20 independent resources into a single, queryable resource encompassing 9,265 HGNC-validated human genes and 22,473 individual gene-RCD claimed associations. Every association is traceable to its source database and verified against the published literature through an automated evidence-scoring framework that assigns confidence tiers (CT1–CT4). At its core lies a curated controlled vocabulary of 53 RCD-related entities, consolidated from 62 original name strings across 20 independent </w:t>
-      </w:r>
-      <w:r>
-        <w:rPr>
-          <w:rFonts w:asciiTheme="majorHAnsi" w:hAnsiTheme="majorHAnsi" w:cstheme="majorHAnsi"/>
-          <w:szCs w:val="24"/>
-        </w:rPr>
-        <w:lastRenderedPageBreak/>
-        <w:t xml:space="preserve">resources through systematic literature and database surveillance. </w:t>
+        <w:t>RCDome integrates all 53 RCD-related entities from 20 source resources into a single, queryable resource encompassing 9,265 HGNC-validated human genes and 22,473 individual gene-RCD claimed associations. Every association is traceable to its source database and verified against the published literature through an automated evidence-scoring framework that assigns confidence tiers (CT1–CT4). At its core lies a curated controlled vocabulary of 53 RCD-related entities, consolidated from 62 original name strings across 20 source resources through systematic literature and database surveillance. Supplementary Table S9 compares RCDome against FerrDB v3 and RCDdb across the resources' key features. The complete codebase is available for reproducibility and independent audit of every step from database extraction to evidence verification.</w:t>
+      </w:r>
+      <w:r>
+        <w:rPr>
+          <w:rFonts w:asciiTheme="majorHAnsi" w:hAnsiTheme="majorHAnsi" w:cstheme="majorHAnsi"/>
+          <w:szCs w:val="24"/>
+        </w:rPr>
       </w:r>
       <w:r>
         <w:rPr>
@@ -7383,14 +7299,12 @@
           <w:szCs w:val="24"/>
           <w:highlight w:val="green"/>
         </w:rPr>
-        <w:t>Supplementary Table S9</w:t>
-      </w:r>
-      <w:r>
-        <w:rPr>
-          <w:rFonts w:asciiTheme="majorHAnsi" w:hAnsiTheme="majorHAnsi" w:cstheme="majorHAnsi"/>
-          <w:szCs w:val="24"/>
-        </w:rPr>
-        <w:t xml:space="preserve"> compares RCDome against FerrDB v3 and RCDdb across the resources' key features. The complete codebase is available for reproducibility and independent audit of every step from database extraction to evidence verification.</w:t>
+      </w:r>
+      <w:r>
+        <w:rPr>
+          <w:rFonts w:asciiTheme="majorHAnsi" w:hAnsiTheme="majorHAnsi" w:cstheme="majorHAnsi"/>
+          <w:szCs w:val="24"/>
+        </w:rPr>
       </w:r>
     </w:p>
     <w:p>
@@ -7878,15 +7792,14 @@
           <w:rFonts w:asciiTheme="majorHAnsi" w:hAnsiTheme="majorHAnsi" w:cstheme="majorHAnsi"/>
           <w:szCs w:val="24"/>
         </w:rPr>
-        <w:t xml:space="preserve">Among the 53 RCD-related entities, gene coverage is highly heterogeneous: the largest forms, Apoptosis (6,229 association rows; 5,897 unique genes) and Autophagy (4,790 association rows), contain the most gene associations, followed by Ferroptosis (1,811) and Programmed cell death (1,710), while niche forms such as Mitoxyperilysis (13), Triaptosis (3), Pyronecrosis (1), Methuosis (2), and Spectosis (2) have fewer than 20. The median form contains 61 gene entries. Three forms contributed by the external audit (Reactome pathway-specific gene sets: Regulated Necrosis, 108; WikiPathways: Senescence and Autophagy in Cancer, 105; and XDeathDB: Mitotic death, 239) represent newly integrated categories not present in the original NCCD 2018-derived vocabulary. Every gene-RCD association carries full provenance to its source database, ten RCD-specific curated databases (FerrDB v3, RCDdb, iPCD, LncRCD, iLIR, HADb, HAMdb, ATD, AMT-DB, ncFO), five pathway and molecular databases (KEGG, Reactome, Gene Ontology, MSigDB/GSEA, WikiPathways), NCBI Gene, and </w:t>
-      </w:r>
-      <w:r>
-        <w:rPr>
-          <w:rFonts w:asciiTheme="majorHAnsi" w:hAnsiTheme="majorHAnsi" w:cstheme="majorHAnsi"/>
-          <w:szCs w:val="24"/>
-        </w:rPr>
-        <w:lastRenderedPageBreak/>
-        <w:t xml:space="preserve">six omic-annotation resources (TCGA, GEO, CPTAC, CCLE, GDSC, DepMap), supplemented by the AI-assisted Elicit extraction (20 independent resources, </w:t>
+        <w:t xml:space="preserve">Among the 53 RCD-related entities, gene coverage is highly heterogeneous: the largest forms, Apoptosis (6,229 association rows; 5,897 unique genes) and Autophagy (4,790 association rows), contain the most gene associations, followed by Ferroptosis (1,811) and Programmed cell death (1,710), while niche forms such as Mitoxyperilysis (13), Triaptosis (3), Pyronecrosis (1), Methuosis (2), and Spectosis (2) have fewer than 20. The median form contains 61 gene entries. Three forms contributed by the external audit (Reactome pathway-specific gene sets: Regulated Necrosis, 59; WikiPathways: Senescence and Autophagy in Cancer, 105; and XDeathDB: Mitotic death, 216) represent newly integrated categories not present in the original NCCD 2018-derived vocabulary. Every gene-RCD association carries full provenance to its source database, ten RCD-specific curated databases (FerrDB v3, RCDdb, iPCD, LncRCD, iLIR, HADb, HAMdb, ATD, AMT-DB, ncFO), five pathway and molecular databases (KEGG, Reactome, Gene Ontology, MSigDB/GSEA, WikiPathways), NCBI Gene, and </w:t>
+      </w:r>
+      <w:r>
+        <w:rPr>
+          <w:rFonts w:asciiTheme="majorHAnsi" w:hAnsiTheme="majorHAnsi" w:cstheme="majorHAnsi"/>
+          <w:szCs w:val="24"/>
+        </w:rPr>
+        <w:t xml:space="preserve">six omic-annotation resources (TCGA, GEO, CPTAC, CCLE, GDSC, DepMap), supplemented by the AI-assisted Elicit extraction (20 source resources, </w:t>
       </w:r>
       <w:r>
         <w:rPr>
@@ -7942,7 +7855,7 @@
           <w:rFonts w:asciiTheme="majorHAnsi" w:hAnsiTheme="majorHAnsi" w:cstheme="majorHAnsi"/>
           <w:szCs w:val="24"/>
         </w:rPr>
-        <w:t>Read at the level of mechanism, the compendium reveals a remarkably small execution core: only 469 gene-RCD pairs (4.8% of the mechanistically-involved set) are executors, genes that directly pore, cleave, or permeabilize to kill the cell, while 9,311 pairs (95.2%) are regulators that promote or inhibit death without executing it (</w:t>
+        <w:t>Read at the level of mechanism, the compendium reveals a remarkably small execution core: only 469 gene-RCD pairs (4.8% of the mechanistically-involved set) are executors, genes that directly pore, cleave, or permeabilize to kill the cell, while 9,311 pairs (95.2%) are regulators that promote or inhibit death without executing it (Figure 3A). Within the compiled RCDome association universe and under the CoT classification, the mechanistically involved set is dominated by regulatory associations surrounding a comparatively small executor subset.</w:t>
       </w:r>
       <w:r>
         <w:rPr>
@@ -7950,14 +7863,12 @@
           <w:szCs w:val="24"/>
           <w:highlight w:val="green"/>
         </w:rPr>
-        <w:t>Figure 3A</w:t>
-      </w:r>
-      <w:r>
-        <w:rPr>
-          <w:rFonts w:asciiTheme="majorHAnsi" w:hAnsiTheme="majorHAnsi" w:cstheme="majorHAnsi"/>
-          <w:szCs w:val="24"/>
-        </w:rPr>
-        <w:t>). Regulated cell death, therefore, is not a collection of lethal machines but a vast regulatory network built around a small core of executioners.</w:t>
+      </w:r>
+      <w:r>
+        <w:rPr>
+          <w:rFonts w:asciiTheme="majorHAnsi" w:hAnsiTheme="majorHAnsi" w:cstheme="majorHAnsi"/>
+          <w:szCs w:val="24"/>
+        </w:rPr>
       </w:r>
     </w:p>
     <w:p>
@@ -8164,7 +8075,7 @@
           <w:rFonts w:asciiTheme="majorHAnsi" w:hAnsiTheme="majorHAnsi" w:cstheme="majorHAnsi"/>
           <w:szCs w:val="24"/>
         </w:rPr>
-        <w:t>All 53 entities were anchored to a reference PMID. All 52 verifiable founding PMIDs resolved in PubMed (Knock Test). Verbatim integrity was confirmed for 20/20 NCCD terms and 25/25 multi-optosis records. Consensus cross-validation corroborated each de novo definition against coinage, mechanism, and PubMed-consensus evidence streams, yielding 13 fully corroborated, 13 partially corroborated (subtypes, umbrellas, and legacy terms without a single coining paper), and one NCCD-locked definition whose draft complement only was unscored. DeepSeek full-text validation of the 33 non-NCCD entities, using PMC full text where available and Consensus full-text-derived takeaways otherwise, returned 6 fully validated and 26 with minor wording gaps. Eight entities were initially flagged, of which six were verbatim NCCD/Rodrigues definitions flagged only by a source-mismatch (the committee text had been checked against the founding paper rather than the committee source) and were therefore reclassified as verbatim-invariant; the remaining genuine flags are the criterion-pending and umbrella-scope drafts described below.</w:t>
+        <w:t>All 53 entities were anchored to a reference PMID. All 52 verifiable founding PMIDs resolved in PubMed (Knock Test). Verbatim integrity was confirmed for 20/20 NCCD terms and 25/25 multi-optosis records. Consensus cross-validation corroborated each de novo definition against coinage, mechanism, and PubMed-consensus evidence streams, yielding 13 fully corroborated and 13 partially corroborated de novo definitions (subtypes, umbrellas, and legacy terms without a single coining paper), plus one NCCD-locked definition whose draft complement only was unscored, for 27 of the 53 entities. DeepSeek full-text validation of the 33 non-NCCD entities (32 not in the 2018 NCCD plus the composite pathway label), using PMC full text where available and Consensus full-text-derived takeaways otherwise, returned 6 fully validated, 9 with minor wording gaps, 4 criterion-pending, 1 umbrella-scope, and 1 abstract-limited (the composite pathway label); the remaining 12 were verbatim-locked Rodrigues definitions. Eight entities were initially flagged, of which six were verbatim NCCD/Rodrigues definitions flagged only by a source-mismatch (the committee text had been checked against the founding paper rather than the committee source) and were therefore reclassified as verbatim-invariant; the remaining genuine flags are the criterion-pending and umbrella-scope drafts described below.</w:t>
       </w:r>
     </w:p>
     <w:p>
@@ -8275,7 +8186,7 @@
         <w:rPr>
           <w:szCs w:val="24"/>
         </w:rPr>
-        <w:t xml:space="preserve">Following the consolidation, 31 of 71 matrix columns are 100% populated with traceable data. Gene biotypes, Ensembl IDs, and UniProt IDs were filled via HGNC REST API mapping. Eight Elicit-derived ontology columns (rcd type, parent relationship, operational notes) classify all 53 RCD-related entities into an evidence-anchored taxonomy with literature-justified operational notes. Five multi-optosis operational definition columns provide PMID-referenced definitions for the 25 forms for all 9,265 unique genes. Ancillary annotation columns use the sentinel value </w:t>
+        <w:t>Following the consolidation, 35 of 82 matrix columns are 100% populated with traceable data. This completeness profile reflects the multi-source architecture rather than a compilation gap: the fully populated columns are those applicable to every association (gene identity, ontological placement, and classification), whereas the remaining columns are source-specific evidence fields that were filled only where the corresponding source contributed evidence. Gene biotypes, Ensembl IDs, and UniProt IDs were filled via HGNC REST API mapping. Eight Elicit-derived ontology columns (rcd type, parent relationship, operational notes) classify all 53 RCD-related entities into an evidence-anchored taxonomy with literature-justified operational notes. Five multi-optosis operational definition columns provide PMID-referenced definitions for the 25 forms for all 9,265 unique genes. Ancillary annotation columns use the sentinel value NOT_AVAILABLE for non-protein-coding genes. The Europe PMC recovery pipeline (see Material and Methods) populated 22,187 of 22,473 rows (98.7%) with at least one traceable PMID across four evidence channels (pmid_list, llm_pmids, epmc_pmids, elicit_pmids). A targeted Phase 2E extension searched Europe PMC full-text with DeepSeek LLM for all pairs lacking a co-occurrence PMID; none showed additional evidence, confirming these 286 DATABASE_ONLY (1.3%) represent the irreducible uncertainty of RCD knowledge: gene-RCD associations from curated databases with no independent verification in the indexed literature. rcd_gene_type and pmid_list remain empty only for database-only rows outside the Elicit and deep-RAG layers (17,576 and 20,102 of 22,473, respectively). No critical analytical column is empty. A formal governance contract with matrix provenance protocol ensures traceability, reproducibility, and auditability of the compendium. Separately, 19,410 rows (86.4%) were classified as non-MECHANISTIC by Phase 2A/D, prompting the development of a full-text recovery pipeline to identify hidden evidence in the literature. As a refinement of the retrieval strategy, this pipeline replaces PubMed's gene-indexed search with Europe PMC's full-text search engine.</w:t>
       </w:r>
       <w:r>
         <w:rPr>
@@ -8283,20 +8194,16 @@
           <w:i/>
           <w:szCs w:val="24"/>
         </w:rPr>
-        <w:t>NOT_AVAILABLE</w:t>
-      </w:r>
-      <w:r>
-        <w:rPr>
-          <w:szCs w:val="24"/>
-        </w:rPr>
-        <w:t xml:space="preserve"> for non-protein-coding genes. The Europe </w:t>
-      </w:r>
-      <w:r>
-        <w:rPr>
-          <w:szCs w:val="24"/>
-        </w:rPr>
-        <w:lastRenderedPageBreak/>
-        <w:t>PMC recovery pipeline (see Material and Methods) populated 22,217 of 22,473 rows (98.9%) with at least one traceable PMID across four evidence channels (</w:t>
+      </w:r>
+      <w:r>
+        <w:rPr>
+          <w:szCs w:val="24"/>
+        </w:rPr>
+      </w:r>
+      <w:r>
+        <w:rPr>
+          <w:szCs w:val="24"/>
+        </w:rPr>
       </w:r>
       <w:r>
         <w:rPr>
@@ -8304,13 +8211,11 @@
           <w:i/>
           <w:szCs w:val="24"/>
         </w:rPr>
-        <w:t>pmid_list</w:t>
-      </w:r>
-      <w:r>
-        <w:rPr>
-          <w:szCs w:val="24"/>
-        </w:rPr>
-        <w:t xml:space="preserve">, </w:t>
+      </w:r>
+      <w:r>
+        <w:rPr>
+          <w:szCs w:val="24"/>
+        </w:rPr>
       </w:r>
       <w:r>
         <w:rPr>
@@ -8318,13 +8223,11 @@
           <w:i/>
           <w:szCs w:val="24"/>
         </w:rPr>
-        <w:t>llm_pmids</w:t>
-      </w:r>
-      <w:r>
-        <w:rPr>
-          <w:szCs w:val="24"/>
-        </w:rPr>
-        <w:t xml:space="preserve">, </w:t>
+      </w:r>
+      <w:r>
+        <w:rPr>
+          <w:szCs w:val="24"/>
+        </w:rPr>
       </w:r>
       <w:r>
         <w:rPr>
@@ -8332,13 +8235,11 @@
           <w:i/>
           <w:szCs w:val="24"/>
         </w:rPr>
-        <w:t>epmc_pmids</w:t>
-      </w:r>
-      <w:r>
-        <w:rPr>
-          <w:szCs w:val="24"/>
-        </w:rPr>
-        <w:t xml:space="preserve">, </w:t>
+      </w:r>
+      <w:r>
+        <w:rPr>
+          <w:szCs w:val="24"/>
+        </w:rPr>
       </w:r>
       <w:r>
         <w:rPr>
@@ -8346,13 +8247,11 @@
           <w:i/>
           <w:szCs w:val="24"/>
         </w:rPr>
-        <w:t>elicit_pmids</w:t>
-      </w:r>
-      <w:r>
-        <w:rPr>
-          <w:szCs w:val="24"/>
-        </w:rPr>
-        <w:t xml:space="preserve">). A targeted Phase 2E extension searched Europe PMC full-text with DeepSeek LLM for all pairs lacking a co-occurrence PMID; none showed additional evidence, confirming these 442 DATABASE_ONLY (2.0%) represent the irreducible uncertainty of RCD knowledge: gene-RCD associations from curated databases with no independent verification in the indexed literature. </w:t>
+      </w:r>
+      <w:r>
+        <w:rPr>
+          <w:szCs w:val="24"/>
+        </w:rPr>
       </w:r>
       <w:r>
         <w:rPr>
@@ -8360,13 +8259,11 @@
           <w:i/>
           <w:szCs w:val="24"/>
         </w:rPr>
-        <w:t>rcd_gene_type</w:t>
-      </w:r>
-      <w:r>
-        <w:rPr>
-          <w:szCs w:val="24"/>
-        </w:rPr>
-        <w:t xml:space="preserve"> and </w:t>
+      </w:r>
+      <w:r>
+        <w:rPr>
+          <w:szCs w:val="24"/>
+        </w:rPr>
       </w:r>
       <w:r>
         <w:rPr>
@@ -8374,13 +8271,11 @@
           <w:i/>
           <w:szCs w:val="24"/>
         </w:rPr>
-        <w:t>pmid_list</w:t>
-      </w:r>
-      <w:r>
-        <w:rPr>
-          <w:szCs w:val="24"/>
-        </w:rPr>
-        <w:t xml:space="preserve"> remain empty only for database-only rows outside the Elicit and deep-RAG layers (17,576 and 20,102 of 22,473, respectively). No critical analytical column is empty. A formal governance contract with matrix versioning protocol ensures traceability, reproducibility, and auditability of the compendium. Separately, 19,410 rows (86.4%) were classified as non-MECHANISTIC by Phase 2A/D, prompting the development of a full-text recovery pipeline to identify hidden evidence in the literature. As a refinement of the retrieval strategy, this pipeline replaces PubMed's gene-indexed search with Europe PMC's full-text search engine.</w:t>
+      </w:r>
+      <w:r>
+        <w:rPr>
+          <w:szCs w:val="24"/>
+        </w:rPr>
       </w:r>
     </w:p>
     <w:p>
@@ -8422,7 +8317,7 @@
           <w:rFonts w:asciiTheme="majorHAnsi" w:hAnsiTheme="majorHAnsi" w:cstheme="majorHAnsi"/>
           <w:szCs w:val="24"/>
         </w:rPr>
-        <w:t>Validation was performed on all 21,568 unique gene-RCD combinations. Of the compendium's 22,473 total rows, 22,217 carry PMIDs (98.9%), corresponding to 21,312 of these 21,568 unique combinations. Each was independently validated through a two-call LLM architecture against PubMed abstracts.</w:t>
+        <w:t>Validation was performed on all 21,568 unique gene-RCD combinations. Of the compendium's 22,473 total rows, 22,187 carry PMIDs (98.7%), corresponding to 21,283 of these 21,568 unique combinations. Each was independently validated through a two-call LLM architecture against PubMed abstracts.</w:t>
       </w:r>
     </w:p>
     <w:p>
@@ -8491,7 +8386,7 @@
         <w:rPr>
           <w:szCs w:val="24"/>
         </w:rPr>
-        <w:t xml:space="preserve"> concordance was 79.2%. The resulting tier distribution is reported below. All 100 PMIDs retrieved per pair are stored in the unified matrix.</w:t>
+        <w:t xml:space="preserve"> concordance was 79.2%. The resulting tier distribution is reported below. Up to the first 100 retrieved PMIDs per pair used for content verification are retained in the unified matrix, and the full retrieved paper count is stored separately as the evidence force.</w:t>
       </w:r>
     </w:p>
     <w:p>
@@ -8550,55 +8445,55 @@
           <w:rFonts w:asciiTheme="majorHAnsi" w:hAnsiTheme="majorHAnsi" w:cstheme="majorHAnsi"/>
           <w:szCs w:val="24"/>
         </w:rPr>
-        <w:t>ET1 (Gold Standard), 2,864 pairs (12.7%), reflects multi-database consensus with RCDdb PMID support</w:t>
-      </w:r>
-    </w:p>
-    <w:p>
-      <w:pPr>
-        <w:spacing w:after="0" w:line="240" w:lineRule="auto"/>
-        <w:rPr>
-          <w:rFonts w:asciiTheme="majorHAnsi" w:hAnsiTheme="majorHAnsi" w:cstheme="majorHAnsi"/>
-          <w:szCs w:val="24"/>
-        </w:rPr>
-      </w:pPr>
-      <w:r>
-        <w:rPr>
-          <w:rFonts w:asciiTheme="majorHAnsi" w:hAnsiTheme="majorHAnsi" w:cstheme="majorHAnsi"/>
-          <w:szCs w:val="24"/>
-        </w:rPr>
-        <w:t>ET2 (Strong Evidence), 5,686 pairs (25.3%), reflects three or more independent sources or LLM-confirmed</w:t>
-      </w:r>
-    </w:p>
-    <w:p>
-      <w:pPr>
-        <w:spacing w:after="0" w:line="240" w:lineRule="auto"/>
-        <w:rPr>
-          <w:rFonts w:asciiTheme="majorHAnsi" w:hAnsiTheme="majorHAnsi" w:cstheme="majorHAnsi"/>
-          <w:szCs w:val="24"/>
-        </w:rPr>
-      </w:pPr>
-      <w:r>
-        <w:rPr>
-          <w:rFonts w:asciiTheme="majorHAnsi" w:hAnsiTheme="majorHAnsi" w:cstheme="majorHAnsi"/>
-          <w:szCs w:val="24"/>
-        </w:rPr>
-        <w:t>ET3 (Moderate Evidence), 8,212 pairs (36.5%), reflects two sources with LLM partial confirmation</w:t>
-      </w:r>
-    </w:p>
-    <w:p>
-      <w:pPr>
-        <w:spacing w:after="0" w:line="240" w:lineRule="auto"/>
-        <w:rPr>
-          <w:rFonts w:asciiTheme="majorHAnsi" w:hAnsiTheme="majorHAnsi" w:cstheme="majorHAnsi"/>
-          <w:szCs w:val="24"/>
-        </w:rPr>
-      </w:pPr>
-      <w:r>
-        <w:rPr>
-          <w:rFonts w:asciiTheme="majorHAnsi" w:hAnsiTheme="majorHAnsi" w:cstheme="majorHAnsi"/>
-          <w:szCs w:val="24"/>
-        </w:rPr>
-        <w:t>ET4 (Weak Evidence), 5,711 pairs (25.4%), reflects single source without LLM confirmation, or LLM unable to verify</w:t>
+        <w:t>ET1 (Gold Standard), 2,864 rows (12.7%), reflects multi-database consensus with RCDdb PMID support</w:t>
+      </w:r>
+    </w:p>
+    <w:p>
+      <w:pPr>
+        <w:spacing w:after="0" w:line="240" w:lineRule="auto"/>
+        <w:rPr>
+          <w:rFonts w:asciiTheme="majorHAnsi" w:hAnsiTheme="majorHAnsi" w:cstheme="majorHAnsi"/>
+          <w:szCs w:val="24"/>
+        </w:rPr>
+      </w:pPr>
+      <w:r>
+        <w:rPr>
+          <w:rFonts w:asciiTheme="majorHAnsi" w:hAnsiTheme="majorHAnsi" w:cstheme="majorHAnsi"/>
+          <w:szCs w:val="24"/>
+        </w:rPr>
+        <w:t>ET2 (Strong Evidence), 5,686 rows (25.3%), reflects three or more independent sources or LLM-confirmed</w:t>
+      </w:r>
+    </w:p>
+    <w:p>
+      <w:pPr>
+        <w:spacing w:after="0" w:line="240" w:lineRule="auto"/>
+        <w:rPr>
+          <w:rFonts w:asciiTheme="majorHAnsi" w:hAnsiTheme="majorHAnsi" w:cstheme="majorHAnsi"/>
+          <w:szCs w:val="24"/>
+        </w:rPr>
+      </w:pPr>
+      <w:r>
+        <w:rPr>
+          <w:rFonts w:asciiTheme="majorHAnsi" w:hAnsiTheme="majorHAnsi" w:cstheme="majorHAnsi"/>
+          <w:szCs w:val="24"/>
+        </w:rPr>
+        <w:t>ET3 (Moderate Evidence), 8,212 rows (36.5%), reflects two sources with LLM partial confirmation</w:t>
+      </w:r>
+    </w:p>
+    <w:p>
+      <w:pPr>
+        <w:spacing w:after="0" w:line="240" w:lineRule="auto"/>
+        <w:rPr>
+          <w:rFonts w:asciiTheme="majorHAnsi" w:hAnsiTheme="majorHAnsi" w:cstheme="majorHAnsi"/>
+          <w:szCs w:val="24"/>
+        </w:rPr>
+      </w:pPr>
+      <w:r>
+        <w:rPr>
+          <w:rFonts w:asciiTheme="majorHAnsi" w:hAnsiTheme="majorHAnsi" w:cstheme="majorHAnsi"/>
+          <w:szCs w:val="24"/>
+        </w:rPr>
+        <w:t>ET4 (Weak Evidence), 5,711 rows (25.4%), reflects single source without LLM confirmation, or LLM unable to verify</w:t>
       </w:r>
     </w:p>
     <w:p>
@@ -8649,7 +8544,7 @@
         <w:spacing w:after="0" w:line="240" w:lineRule="auto"/>
       </w:pPr>
       <w:r>
-        <w:t xml:space="preserve">Two numbers describe mechanism and are not interchangeable. The chain-of-thought classification labels a pair mechanistically involved when the model and the evidence agree, giving 45.4%. The stricter seven-class scheme reserves the label MECHANISTIC for pairs </w:t>
+        <w:t xml:space="preserve">Two numbers describe mechanism and are not interchangeable. The chain-of-thought classification labels a pair mechanistically involved when the model and the evidence agree, giving 45.4%. The stricter seven-class scheme reserves the label MECHANISTIC for rows </w:t>
       </w:r>
       <w:r>
         <w:lastRenderedPageBreak/>
@@ -8669,23 +8564,23 @@
           <w:rFonts w:asciiTheme="majorHAnsi" w:hAnsiTheme="majorHAnsi" w:cstheme="majorHAnsi"/>
           <w:szCs w:val="24"/>
         </w:rPr>
-        <w:t>MECHANISTIC, 3,063 pairs (13.6%), validated by both LLM knowledge and PubMed abstracts</w:t>
-      </w:r>
-    </w:p>
-    <w:p>
-      <w:pPr>
-        <w:spacing w:after="0" w:line="240" w:lineRule="auto"/>
-        <w:rPr>
-          <w:rFonts w:asciiTheme="majorHAnsi" w:hAnsiTheme="majorHAnsi" w:cstheme="majorHAnsi"/>
-          <w:szCs w:val="24"/>
-        </w:rPr>
-      </w:pPr>
-      <w:r>
-        <w:rPr>
-          <w:rFonts w:asciiTheme="majorHAnsi" w:hAnsiTheme="majorHAnsi" w:cstheme="majorHAnsi"/>
-          <w:szCs w:val="24"/>
-        </w:rPr>
-        <w:t>LITERATURE_GAP, 1,519 pairs (6.8%), LLM training recognizes but abstracts lack explicit statements; CONTEXT_GAP, 6,170 pairs (27.5%), PubMed confirms but LLM training does not recognize; CO_OCCURRENCE, 2,416 pairs (10.8%), high paper counts but no mechanistic evidence; INSUFFICIENT_DATA, 8,863 pairs (39.4%), few papers; LLM cannot determine involvement; DATABASE_ONLY, 442 pairs (2.0%), gene and RCD term never co-occur in PubMed; TECHNICAL_FAILURE, 0 pairs (0%), no API failures in the final run</w:t>
+        <w:t>MECHANISTIC, 3,063 rows (13.6%), validated by both LLM knowledge and PubMed abstracts</w:t>
+      </w:r>
+    </w:p>
+    <w:p>
+      <w:pPr>
+        <w:spacing w:after="0" w:line="240" w:lineRule="auto"/>
+        <w:rPr>
+          <w:rFonts w:asciiTheme="majorHAnsi" w:hAnsiTheme="majorHAnsi" w:cstheme="majorHAnsi"/>
+          <w:szCs w:val="24"/>
+        </w:rPr>
+      </w:pPr>
+      <w:r>
+        <w:rPr>
+          <w:rFonts w:asciiTheme="majorHAnsi" w:hAnsiTheme="majorHAnsi" w:cstheme="majorHAnsi"/>
+          <w:szCs w:val="24"/>
+        </w:rPr>
+        <w:t>LITERATURE_GAP, 1,519 rows (6.8%), LLM training recognizes but abstracts lack explicit statements; CONTEXT_GAP, 6,170 rows (27.5%), PubMed confirms but LLM training does not recognize; CO_OCCURRENCE, 2,416 rows (10.8%), high paper counts but no mechanistic evidence; INSUFFICIENT_DATA, 9,019 rows (40.1%), few papers; LLM cannot determine involvement; DATABASE_ONLY, 286 rows (1.3%), gene and RCD term never co-occur in PubMed; TECHNICAL_FAILURE, 0 pairs (0%), no API failures in the final run</w:t>
       </w:r>
     </w:p>
     <w:p>
@@ -8945,13 +8840,12 @@
           <w:b/>
           <w:szCs w:val="24"/>
         </w:rPr>
-        <w:t>Governance Impact.</w:t>
-      </w:r>
-      <w:r>
-        <w:rPr>
-          <w:szCs w:val="24"/>
-        </w:rPr>
-        <w:t xml:space="preserve"> The 192 EXECUTOR downgrades (88 Ferroptosis, 104 Cuproptosis) represent the single most impactful governance action. Without the `</w:t>
+        <w:t>Governance Impact. The 192 EXECUTOR downgrades (88 Ferroptosis, 104 Cuproptosis) represent the single most high-impact governance action. Without the `required_for_death` validation rule, the benchmark would have reported 192 EXECUTOR claims, none of which met the NCCD criterion of demonstrable necessity for the death process. This finding is consistent with the Cuproptosis pilot audit, where 53% of EXECUTOR classifications were inflated, and validates the utility of embedding NCCD-compliant definitions directly into the extraction governance layer rather than relying on post hoc expert review.</w:t>
+      </w:r>
+      <w:r>
+        <w:rPr>
+          <w:szCs w:val="24"/>
+        </w:rPr>
       </w:r>
       <w:r>
         <w:rPr>
@@ -8959,20 +8853,17 @@
           <w:i/>
           <w:szCs w:val="24"/>
         </w:rPr>
-        <w:t>required_for_death</w:t>
-      </w:r>
-      <w:r>
-        <w:rPr>
-          <w:szCs w:val="24"/>
-        </w:rPr>
-        <w:t xml:space="preserve">` validation rule, the benchmark would have reported 192 EXECUTOR claims, none of which met the NCCD criterion of demonstrable necessity for the death process. This finding is consistent with the Cuproptosis pilot audit, where 53% of EXECUTOR classifications were </w:t>
-      </w:r>
-      <w:r>
-        <w:rPr>
-          <w:rFonts w:asciiTheme="majorHAnsi" w:hAnsiTheme="majorHAnsi" w:cstheme="majorHAnsi"/>
-          <w:szCs w:val="24"/>
-        </w:rPr>
-        <w:t>inflated, and validates the utility of embedding NCCD-compliant definitions directly into the extraction governance layer rather than relying on post hoc expert review.</w:t>
+      </w:r>
+      <w:r>
+        <w:rPr>
+          <w:szCs w:val="24"/>
+        </w:rPr>
+      </w:r>
+      <w:r>
+        <w:rPr>
+          <w:rFonts w:asciiTheme="majorHAnsi" w:hAnsiTheme="majorHAnsi" w:cstheme="majorHAnsi"/>
+          <w:szCs w:val="24"/>
+        </w:rPr>
       </w:r>
     </w:p>
     <w:p>
@@ -9072,7 +8963,7 @@
           <w:bCs/>
           <w:szCs w:val="24"/>
         </w:rPr>
-        <w:t xml:space="preserve"> evidence, and only 24% of records had traceable PMIDs. The benchmark demonstrates that post-export governance eliminates all three failure modes simultaneously: allow-list compliance from 75.4% to 100% (a +33% relative increase), EXECUTOR precision from 47% to 100% (a +113% relative increase), and traceability from 24% to 98% (a +310% relative increase) (</w:t>
+        <w:t xml:space="preserve"> evidence, and only 24% of records had traceable PMIDs. The benchmark demonstrates that post-export governance eliminates all three failure modes simultaneously: allow-list compliance rose from 75.4% to 100%; the unsupported EXECUTOR rate fell from 53% to 0%; and traceability rose from 24% (PMID) in the baseline to 98.3% (DOI) in the governed benchmark (</w:t>
       </w:r>
       <w:r>
         <w:rPr>
@@ -9089,7 +8980,7 @@
           <w:bCs/>
           <w:szCs w:val="24"/>
         </w:rPr>
-        <w:t>). The governance framework does not merely improve extraction quality -- it transforms an unreliable AI extraction into a verifiable, auditable evidence pipeline.</w:t>
+        <w:t>). The governance framework does not merely improve extraction quality; it transforms an unreliable AI extraction into a verifiable, auditable evidence pipeline.</w:t>
       </w:r>
     </w:p>
     <w:p>
@@ -9181,7 +9072,7 @@
         <w:rPr>
           <w:szCs w:val="24"/>
         </w:rPr>
-        <w:t xml:space="preserve">The Elicit literature-mining layer yielded 4,602 gene-RCD associations across 50 RCD forms, triaged into three evidence statuses: 3,803 genuine (each carrying a body-level verbatim sentence and a DOI, with a PMID in 98.3% of cases), 798 </w:t>
+        <w:t>The Elicit literature-mining layer yielded 4,601 gene-RCD associations across 50 RCD forms, triaged into 3,803 genuine (each carrying a body-level verbatim sentence and a DOI, with a PMID in 98.3% of cases) and 798 association_only (database-backed associations whose Elicit classification was not retained). The three forms without Elicit results were out of scope by design: Erebosis (Drosophila), Hypersensitive response (plant), and Regulated Necrosis (an umbrella term). Among the 3,803 genuine rows, the functional classification was dominated by regulators: REGULATOR 3,347; EXECUTOR 323; MARKER 119; UNCERTAIN 10; CANDIDATE_MODULE 3; and 1 unassigned. Direction of effect was predominantly PROMOTES (2,397) versus PROTECTS (963), with 1,392 genes required for death. Evidence type: GENETIC_PERTURBATION 2,079; EXPRESSION_CORRELATION 801; PHARMACOLOGICAL 670; CITATION_ONLY 3; and 250 (6.6%) unassigned, where the extraction model left the field blank because no clean evidence type was determinable from the source abstract.</w:t>
       </w:r>
       <w:r>
         <w:rPr>
@@ -9189,13 +9080,11 @@
           <w:i/>
           <w:szCs w:val="24"/>
         </w:rPr>
-        <w:t>association_only</w:t>
-      </w:r>
-      <w:r>
-        <w:rPr>
-          <w:szCs w:val="24"/>
-        </w:rPr>
-        <w:t xml:space="preserve"> (database-backed associations whose Elicit classification was not retained), and 1 retracted (an Elicit-only association for which full-text search found no supporting paper). Among the 3,803 genuine rows, the functional classification was dominated by regulators: REGULATOR 3,347; EXECUTOR 323; MARKER 119; UNCERTAIN 10; </w:t>
+      </w:r>
+      <w:r>
+        <w:rPr>
+          <w:szCs w:val="24"/>
+        </w:rPr>
       </w:r>
       <w:r>
         <w:rPr>
@@ -9203,63 +9092,61 @@
           <w:i/>
           <w:szCs w:val="24"/>
         </w:rPr>
-        <w:t>CANDIDATE_MODULE</w:t>
-      </w:r>
-      <w:r>
-        <w:rPr>
-          <w:szCs w:val="24"/>
-        </w:rPr>
-        <w:t xml:space="preserve"> 3. Direction of effect was predominantly PROMOTES (2,397) versus PROTECTS (963), with 1,392 genes required for death. Evidence type: GENETIC_PERTURBATION 2,079; EXPRESSION_CORRELATION 801; PHARMACOLOGICAL 670; CITATION_ONLY 3.</w:t>
-      </w:r>
-    </w:p>
-    <w:p>
-      <w:pPr>
-        <w:spacing w:after="0" w:line="240" w:lineRule="auto"/>
-        <w:rPr>
-          <w:rFonts w:asciiTheme="majorHAnsi" w:hAnsiTheme="majorHAnsi" w:cstheme="majorHAnsi"/>
-          <w:szCs w:val="24"/>
-        </w:rPr>
-      </w:pPr>
-    </w:p>
-    <w:p>
-      <w:pPr>
-        <w:spacing w:after="0" w:line="240" w:lineRule="auto"/>
-        <w:rPr>
-          <w:rFonts w:asciiTheme="majorHAnsi" w:hAnsiTheme="majorHAnsi" w:cstheme="majorHAnsi"/>
-          <w:szCs w:val="24"/>
-        </w:rPr>
-      </w:pPr>
-      <w:r>
-        <w:rPr>
-          <w:rFonts w:asciiTheme="majorHAnsi" w:hAnsiTheme="majorHAnsi" w:cstheme="majorHAnsi"/>
-          <w:szCs w:val="24"/>
-        </w:rPr>
-        <w:t>Phase 2B processed 167,868 free PMC full-text articles across 21,312 gene-RCD pairs carrying at least one PMID, yielding deep evidence for 1,383 rows (1,118 unique pairs). Deep evidence is full-text, sentence-level support: for each pair, the pipeline recorded the papers examined (open-access versus paywalled), the strongest verbatim body sentence, the functional role, the evidence type, the direction of effect, a multi-paper confidence tier, and the proportion of papers with direct experimental support. Functional roles were dominated by regulators (878), followed by markers (297), interactors (88), executors (78), and substrates (42). Evidence strength was expression-correlation (529), genetic intervention (371), citation-only (304), direct experimental (139), and pharmacological (40). Confidence was low for 821 pairs, medium for 366, and high for 196. Direction was promoting (492) versus inhibiting (390), with 430 unknown, 70 context-dependent, and one row without a recorded direction. Because deep evidence only upgrades or confirms, never downgrades, it promoted 142 gene-RCD pairs from a moderate to a strong evidence tier and elevated 131 pairs from a literature-gap to a mechanistic classification. These promotions are conservative by design: the deep layer strengthens a claim only when the full-text body independently supports it, leaving all weaker or uncertain classifications untouched.</w:t>
-      </w:r>
-    </w:p>
-    <w:p>
-      <w:pPr>
-        <w:spacing w:after="0" w:line="240" w:lineRule="auto"/>
-        <w:rPr>
-          <w:rFonts w:asciiTheme="majorHAnsi" w:hAnsiTheme="majorHAnsi" w:cstheme="majorHAnsi"/>
-          <w:szCs w:val="24"/>
-        </w:rPr>
-      </w:pPr>
-    </w:p>
-    <w:p>
-      <w:pPr>
-        <w:spacing w:after="0" w:line="240" w:lineRule="auto"/>
-        <w:rPr>
-          <w:rFonts w:asciiTheme="majorHAnsi" w:hAnsiTheme="majorHAnsi" w:cstheme="majorHAnsi"/>
-          <w:szCs w:val="24"/>
-        </w:rPr>
-      </w:pPr>
-      <w:r>
-        <w:rPr>
-          <w:rFonts w:asciiTheme="majorHAnsi" w:hAnsiTheme="majorHAnsi" w:cstheme="majorHAnsi"/>
-          <w:szCs w:val="24"/>
-        </w:rPr>
-        <w:t>Phase 2C full-text Europe PMC recovery added 3,058 MECHANISTIC classifications, in addition to the 3,063 MECHANISTIC pairs from Phase 2A/D abstract validation.</w:t>
+      </w:r>
+      <w:r>
+        <w:rPr>
+          <w:szCs w:val="24"/>
+        </w:rPr>
+      </w:r>
+    </w:p>
+    <w:p>
+      <w:pPr>
+        <w:spacing w:after="0" w:line="240" w:lineRule="auto"/>
+        <w:rPr>
+          <w:rFonts w:asciiTheme="majorHAnsi" w:hAnsiTheme="majorHAnsi" w:cstheme="majorHAnsi"/>
+          <w:szCs w:val="24"/>
+        </w:rPr>
+      </w:pPr>
+    </w:p>
+    <w:p>
+      <w:pPr>
+        <w:spacing w:after="0" w:line="240" w:lineRule="auto"/>
+        <w:rPr>
+          <w:rFonts w:asciiTheme="majorHAnsi" w:hAnsiTheme="majorHAnsi" w:cstheme="majorHAnsi"/>
+          <w:szCs w:val="24"/>
+        </w:rPr>
+      </w:pPr>
+      <w:r>
+        <w:rPr>
+          <w:rFonts w:asciiTheme="majorHAnsi" w:hAnsiTheme="majorHAnsi" w:cstheme="majorHAnsi"/>
+          <w:szCs w:val="24"/>
+        </w:rPr>
+        <w:t>Phase 2B processed 167,868 free PMC full-text articles across 21,283 gene-RCD pairs carrying at least one PMID, yielding deep evidence for 1,383 rows (1,118 unique pairs). Deep evidence is full-text, sentence-level support: for each pair, the pipeline recorded the papers examined (open-access versus paywalled), the strongest verbatim body sentence, the functional role, the evidence type, the direction of effect, a multi-paper confidence tier, and the proportion of papers with direct experimental support. Functional roles were dominated by regulators (878), followed by markers (297), interactors (88), executors (78), and substrates (42). Evidence strength was expression-correlation (529), genetic intervention (371), citation-only (304), direct experimental (139), and pharmacological (40). Confidence was low for 821 pairs, medium for 366, and high for 196. Direction was promoting (492) versus inhibiting (390), with 430 unknown, 70 context-dependent, and one row without a recorded direction. Because deep evidence only upgrades or confirms, never downgrades, it promoted 142 gene-RCD pairs from a moderate to a strong evidence tier and elevated 131 pairs from a literature-gap to a mechanistic classification. These promotions are conservative by design: the deep layer strengthens a claim only when the full-text body independently supports it, leaving all weaker or uncertain classifications untouched.</w:t>
+      </w:r>
+    </w:p>
+    <w:p>
+      <w:pPr>
+        <w:spacing w:after="0" w:line="240" w:lineRule="auto"/>
+        <w:rPr>
+          <w:rFonts w:asciiTheme="majorHAnsi" w:hAnsiTheme="majorHAnsi" w:cstheme="majorHAnsi"/>
+          <w:szCs w:val="24"/>
+        </w:rPr>
+      </w:pPr>
+    </w:p>
+    <w:p>
+      <w:pPr>
+        <w:spacing w:after="0" w:line="240" w:lineRule="auto"/>
+        <w:rPr>
+          <w:rFonts w:asciiTheme="majorHAnsi" w:hAnsiTheme="majorHAnsi" w:cstheme="majorHAnsi"/>
+          <w:szCs w:val="24"/>
+        </w:rPr>
+      </w:pPr>
+      <w:r>
+        <w:rPr>
+          <w:rFonts w:asciiTheme="majorHAnsi" w:hAnsiTheme="majorHAnsi" w:cstheme="majorHAnsi"/>
+          <w:szCs w:val="24"/>
+        </w:rPr>
+        <w:t>Phase 2C full-text Europe PMC recovery added 3,058 MECHANISTIC classifications, in addition to the 3,063 MECHANISTIC rows from Phase 2A/D abstract validation.</w:t>
       </w:r>
     </w:p>
     <w:p>
@@ -9308,7 +9195,7 @@
           <w:rFonts w:asciiTheme="majorHAnsi" w:hAnsiTheme="majorHAnsi" w:cstheme="majorHAnsi"/>
           <w:szCs w:val="24"/>
         </w:rPr>
-        <w:t>The 387 jointly corroborated pairs were strongly enriched for high confidence: 211 (54.5%) carried the strongest evidence tier and 235 (60.7%) were classified as mechanistic, with 145 (37.5%) meeting both criteria simultaneously. Functional roles were dominated by regulators (243; 62.8%), followed by markers (79), executors (33), interactors (23), and substrates (9). Most (334; 86.3%) were genuine Elicit findings, with 53 (13.7%) association-only. Dual-layer agreement therefore concentrates the highest-confidence, mechanistically characterized links: a four-fold enrichment of strong-tier and a two-fold enrichment of mechanistic pairs relative to the compendium as a whole.</w:t>
+        <w:t>The 387 jointly corroborated pairs were strongly enriched for high confidence: 211 (54.5%) carried the strongest evidence tier and 235 (60.7%) were classified as mechanistic, with 145 (37.5%) meeting both criteria simultaneously. Functional roles were dominated by regulators (243; 62.8%), followed by markers (79), executors (33), interactors (23), and substrates (9). Most (334; 86.3%) were genuine Elicit findings, with 53 (13.7%) association-only. Dual-layer agreement therefore concentrates the highest-confidence, mechanistically characterized links: a 4.3-fold enrichment of strong-tier and a 4.5-fold enrichment of mechanistic pairs relative to the compendium as a whole.</w:t>
       </w:r>
     </w:p>
     <w:p>
@@ -9432,7 +9319,7 @@
         <w:spacing w:after="0" w:line="240" w:lineRule="auto"/>
       </w:pPr>
       <w:r>
-        <w:t>This benchmark selects the classifier against well-established associations; it is not an estimate of the error rate of the full 21,568-pair classification, whose quality control rests on the per-row verbatim check and the governance gates.</w:t>
+        <w:t>This benchmark selects the classifier against well-established associations; it is not an estimate of the error rate of the full 21,568-pair classification, whose quality control rests on the self-consistency majority vote, the semantic-contradiction audit, and the governance gates, with exact-string verbatim verification applied to the full-text extracted sentences where available.</w:t>
       </w:r>
     </w:p>
     <w:p>
@@ -9460,7 +9347,7 @@
           <w:b/>
           <w:szCs w:val="24"/>
         </w:rPr>
-        <w:t>Chain-of-Thought Classification of the Full Matrix</w:t>
+        <w:t>Chain-of-Thought Classification of the Full Matrix. Chain-of-thought (CoT) classification was applied to the complete matrix to add a mechanistic verdict, functional role, and direction to every gene-RCD pair, information the two-call binary validation (Phase 2A/D) and the full-text recovery phases did not capture uniformly. Rather than a single model answer, each pair received three separately sampled chain-of-thought runs of the same production classifier with a self-governance check (verify-role), merged by majority vote, so that one inconsistent sample could not dominate the final verdict.</w:t>
       </w:r>
       <w:r>
         <w:rPr>
@@ -9468,75 +9355,67 @@
           <w:b/>
           <w:szCs w:val="24"/>
         </w:rPr>
-        <w:t xml:space="preserve">. </w:t>
-      </w:r>
-      <w:r>
-        <w:rPr>
-          <w:rFonts w:asciiTheme="majorHAnsi" w:hAnsiTheme="majorHAnsi" w:cstheme="majorHAnsi"/>
-          <w:szCs w:val="24"/>
-        </w:rPr>
-        <w:t xml:space="preserve">Chain-of-thought </w:t>
-      </w:r>
-      <w:r>
-        <w:rPr>
-          <w:rFonts w:asciiTheme="majorHAnsi" w:hAnsiTheme="majorHAnsi" w:cstheme="majorHAnsi"/>
-          <w:szCs w:val="24"/>
-        </w:rPr>
-        <w:t xml:space="preserve">(CoT) </w:t>
-      </w:r>
-      <w:r>
-        <w:rPr>
-          <w:rFonts w:asciiTheme="majorHAnsi" w:hAnsiTheme="majorHAnsi" w:cstheme="majorHAnsi"/>
-          <w:szCs w:val="24"/>
-        </w:rPr>
-        <w:t xml:space="preserve">classification was applied to the complete matrix to add a mechanistic verdict, functional role, and direction to </w:t>
-      </w:r>
-      <w:r>
-        <w:rPr>
-          <w:rFonts w:asciiTheme="majorHAnsi" w:hAnsiTheme="majorHAnsi" w:cstheme="majorHAnsi"/>
-          <w:szCs w:val="24"/>
-        </w:rPr>
-        <w:lastRenderedPageBreak/>
-        <w:t xml:space="preserve">every </w:t>
-      </w:r>
-      <w:r>
-        <w:rPr>
-          <w:rFonts w:asciiTheme="majorHAnsi" w:hAnsiTheme="majorHAnsi" w:cstheme="majorHAnsi"/>
-          <w:szCs w:val="24"/>
-        </w:rPr>
-        <w:t>gene-RCD</w:t>
-      </w:r>
-      <w:r>
-        <w:rPr>
-          <w:rFonts w:asciiTheme="majorHAnsi" w:hAnsiTheme="majorHAnsi" w:cstheme="majorHAnsi"/>
-          <w:szCs w:val="24"/>
-        </w:rPr>
-        <w:t xml:space="preserve"> pair, information the two-call binary validation (Phase 2A/D) and the full-text recovery phases did not capture uniformly. Rather than a single model answer, each pair received three independent chain-of-thought classifications with a self-governance check (verify-role), merged by majority vote, so that one inconsistent sample could not dominate the final verdict.</w:t>
-      </w:r>
-    </w:p>
-    <w:p>
-      <w:pPr>
-        <w:spacing w:after="0" w:line="240" w:lineRule="auto"/>
-        <w:rPr>
-          <w:rFonts w:asciiTheme="majorHAnsi" w:hAnsiTheme="majorHAnsi" w:cstheme="majorHAnsi"/>
-          <w:szCs w:val="24"/>
-        </w:rPr>
-      </w:pPr>
-    </w:p>
-    <w:p>
-      <w:pPr>
-        <w:spacing w:after="0" w:line="240" w:lineRule="auto"/>
-        <w:rPr>
-          <w:rFonts w:asciiTheme="majorHAnsi" w:hAnsiTheme="majorHAnsi" w:cstheme="majorHAnsi"/>
-          <w:szCs w:val="24"/>
-        </w:rPr>
-      </w:pPr>
-      <w:r>
-        <w:rPr>
-          <w:rFonts w:asciiTheme="majorHAnsi" w:hAnsiTheme="majorHAnsi" w:cstheme="majorHAnsi"/>
-          <w:szCs w:val="24"/>
-        </w:rPr>
-        <w:t>Of the 21,568 unique gene-RCD pairs, 9,785 (45.4%) were classified as mechanistically involved (YES) and 11,783 (54.6%) as not mechanistically involved (NO). Among the mechanistically-involved pairs, 469 (4.8%) were executors, genes that directly execute the death pathway, and 9,311 (95.2%) were regulators that promote or inhibit it. Across the 21,568 unique gene-RCD pairs, roles resolved as 9,311 regulators, 469 executors, 5 markers, and 11,783 with an unresolved role; direction (across all role-resolved associations) resolved as PROMOTES for 5,070, PROTECTS for 4,755, and UNCLEAR for 11,743, a near-even pro-death versus anti-death balance. Overall, 5,928 of 9,265 genes (64.0%) had at least one mechanistically-involved association. Classification yield varied markedly by source database: the fraction of associations classified as mechanistically involved ranged from 21.7% (XDeathDB) to 90.0% (ncFO) (</w:t>
+      </w:r>
+      <w:r>
+        <w:rPr>
+          <w:rFonts w:asciiTheme="majorHAnsi" w:hAnsiTheme="majorHAnsi" w:cstheme="majorHAnsi"/>
+          <w:szCs w:val="24"/>
+        </w:rPr>
+      </w:r>
+      <w:r>
+        <w:rPr>
+          <w:rFonts w:asciiTheme="majorHAnsi" w:hAnsiTheme="majorHAnsi" w:cstheme="majorHAnsi"/>
+          <w:szCs w:val="24"/>
+        </w:rPr>
+      </w:r>
+      <w:r>
+        <w:rPr>
+          <w:rFonts w:asciiTheme="majorHAnsi" w:hAnsiTheme="majorHAnsi" w:cstheme="majorHAnsi"/>
+          <w:szCs w:val="24"/>
+        </w:rPr>
+      </w:r>
+      <w:r>
+        <w:rPr>
+          <w:rFonts w:asciiTheme="majorHAnsi" w:hAnsiTheme="majorHAnsi" w:cstheme="majorHAnsi"/>
+          <w:szCs w:val="24"/>
+        </w:rPr>
+      </w:r>
+      <w:r>
+        <w:rPr>
+          <w:rFonts w:asciiTheme="majorHAnsi" w:hAnsiTheme="majorHAnsi" w:cstheme="majorHAnsi"/>
+          <w:szCs w:val="24"/>
+        </w:rPr>
+      </w:r>
+      <w:r>
+        <w:rPr>
+          <w:rFonts w:asciiTheme="majorHAnsi" w:hAnsiTheme="majorHAnsi" w:cstheme="majorHAnsi"/>
+          <w:szCs w:val="24"/>
+        </w:rPr>
+      </w:r>
+    </w:p>
+    <w:p>
+      <w:pPr>
+        <w:spacing w:after="0" w:line="240" w:lineRule="auto"/>
+        <w:rPr>
+          <w:rFonts w:asciiTheme="majorHAnsi" w:hAnsiTheme="majorHAnsi" w:cstheme="majorHAnsi"/>
+          <w:szCs w:val="24"/>
+        </w:rPr>
+      </w:pPr>
+    </w:p>
+    <w:p>
+      <w:pPr>
+        <w:spacing w:after="0" w:line="240" w:lineRule="auto"/>
+        <w:rPr>
+          <w:rFonts w:asciiTheme="majorHAnsi" w:hAnsiTheme="majorHAnsi" w:cstheme="majorHAnsi"/>
+          <w:szCs w:val="24"/>
+        </w:rPr>
+      </w:pPr>
+      <w:r>
+        <w:rPr>
+          <w:rFonts w:asciiTheme="majorHAnsi" w:hAnsiTheme="majorHAnsi" w:cstheme="majorHAnsi"/>
+          <w:szCs w:val="24"/>
+        </w:rPr>
+        <w:t>Of the 21,568 unique gene-RCD pairs, 9,785 (45.4%) were classified as mechanistically involved (YES) and 11,783 (54.6%) as not mechanistically involved (NO). Among the mechanistically-involved pairs, 469 (4.8%) were executors, genes that directly execute the death pathway, and 9,311 (95.2%) were regulators that promote or inhibit it. Across the 21,568 unique gene-RCD pairs, roles resolved as 9,311 regulators, 469 executors, 5 markers, and 11,783 with an unresolved role; direction (across all role-resolved associations) resolved as PROMOTES for 5,025, PROTECTS for 4,755, and UNCLEAR for 5, a near-even pro-death versus anti-death balance. Overall, 5,826 of the 9,265 genes represented in RCDome (62.9%) had at least one mechanistically involved association. Classification yield varied markedly by source database: the fraction of associations classified as mechanistically involved ranged from 21.6% (XDeathDB) to 86.5% (WikiPathways) (Supplementary Figure S3).</w:t>
       </w:r>
       <w:r>
         <w:rPr>
@@ -9544,53 +9423,49 @@
           <w:szCs w:val="24"/>
           <w:highlight w:val="green"/>
         </w:rPr>
-        <w:t>Supplementary Figure S3</w:t>
-      </w:r>
-      <w:r>
-        <w:rPr>
-          <w:rFonts w:asciiTheme="majorHAnsi" w:hAnsiTheme="majorHAnsi" w:cstheme="majorHAnsi"/>
-          <w:szCs w:val="24"/>
-        </w:rPr>
-        <w:t>).</w:t>
-      </w:r>
-    </w:p>
-    <w:p>
-      <w:pPr>
-        <w:spacing w:after="0" w:line="240" w:lineRule="auto"/>
-        <w:rPr>
-          <w:rFonts w:asciiTheme="majorHAnsi" w:hAnsiTheme="majorHAnsi" w:cstheme="majorHAnsi"/>
-          <w:szCs w:val="24"/>
-        </w:rPr>
-      </w:pPr>
-    </w:p>
-    <w:p>
-      <w:pPr>
-        <w:spacing w:after="0" w:line="240" w:lineRule="auto"/>
-        <w:rPr>
-          <w:rFonts w:asciiTheme="majorHAnsi" w:hAnsiTheme="majorHAnsi" w:cstheme="majorHAnsi"/>
-          <w:szCs w:val="24"/>
-        </w:rPr>
-      </w:pPr>
-      <w:r>
-        <w:rPr>
-          <w:rFonts w:asciiTheme="majorHAnsi" w:hAnsiTheme="majorHAnsi" w:cstheme="majorHAnsi"/>
-          <w:szCs w:val="24"/>
-        </w:rPr>
-        <w:t xml:space="preserve">The classification was internally audited: 84 self-inconsistent rows (mechanistic NO with a confident role or direction) were repaired, and 231 rows with genuine uncertainty, 178 regulators with unclear direction and 53 mechanistically-involved pairs with unresolved role, were retained as honest uncertainty rather than forced into a confident category. Two </w:t>
-      </w:r>
-      <w:r>
-        <w:rPr>
-          <w:rFonts w:asciiTheme="majorHAnsi" w:hAnsiTheme="majorHAnsi" w:cstheme="majorHAnsi"/>
-          <w:szCs w:val="24"/>
-        </w:rPr>
-        <w:t>gene-RCD</w:t>
-      </w:r>
-      <w:r>
-        <w:rPr>
-          <w:rFonts w:asciiTheme="majorHAnsi" w:hAnsiTheme="majorHAnsi" w:cstheme="majorHAnsi"/>
-          <w:szCs w:val="24"/>
-        </w:rPr>
-        <w:t xml:space="preserve"> pairs (</w:t>
+      </w:r>
+      <w:r>
+        <w:rPr>
+          <w:rFonts w:asciiTheme="majorHAnsi" w:hAnsiTheme="majorHAnsi" w:cstheme="majorHAnsi"/>
+          <w:szCs w:val="24"/>
+        </w:rPr>
+      </w:r>
+    </w:p>
+    <w:p>
+      <w:pPr>
+        <w:spacing w:after="0" w:line="240" w:lineRule="auto"/>
+        <w:rPr>
+          <w:rFonts w:asciiTheme="majorHAnsi" w:hAnsiTheme="majorHAnsi" w:cstheme="majorHAnsi"/>
+          <w:szCs w:val="24"/>
+        </w:rPr>
+      </w:pPr>
+    </w:p>
+    <w:p>
+      <w:pPr>
+        <w:spacing w:after="0" w:line="240" w:lineRule="auto"/>
+        <w:rPr>
+          <w:rFonts w:asciiTheme="majorHAnsi" w:hAnsiTheme="majorHAnsi" w:cstheme="majorHAnsi"/>
+          <w:szCs w:val="24"/>
+        </w:rPr>
+      </w:pPr>
+      <w:r>
+        <w:rPr>
+          <w:rFonts w:asciiTheme="majorHAnsi" w:hAnsiTheme="majorHAnsi" w:cstheme="majorHAnsi"/>
+          <w:szCs w:val="24"/>
+        </w:rPr>
+        <w:t>The classification was internally audited: 84 self-inconsistent rows (mechanistic NO with a confident role or direction) were repaired, and 231 rows with genuine uncertainty, 178 regulators with unclear direction and 53 mechanistically-involved pairs with unresolved role, were retained as unresolved rather than forced into a confident category. Two gene-RCD pairs (NLRX1 and PPIF with MPT-driven necrosis) were classified separately with a five-vote majority, completing full pair coverage (21,568/21,568).</w:t>
+      </w:r>
+      <w:r>
+        <w:rPr>
+          <w:rFonts w:asciiTheme="majorHAnsi" w:hAnsiTheme="majorHAnsi" w:cstheme="majorHAnsi"/>
+          <w:szCs w:val="24"/>
+        </w:rPr>
+      </w:r>
+      <w:r>
+        <w:rPr>
+          <w:rFonts w:asciiTheme="majorHAnsi" w:hAnsiTheme="majorHAnsi" w:cstheme="majorHAnsi"/>
+          <w:szCs w:val="24"/>
+        </w:rPr>
       </w:r>
       <w:r>
         <w:rPr>
@@ -9599,14 +9474,12 @@
           <w:iCs/>
           <w:szCs w:val="24"/>
         </w:rPr>
-        <w:t>NLRX1</w:t>
-      </w:r>
-      <w:r>
-        <w:rPr>
-          <w:rFonts w:asciiTheme="majorHAnsi" w:hAnsiTheme="majorHAnsi" w:cstheme="majorHAnsi"/>
-          <w:szCs w:val="24"/>
-        </w:rPr>
-        <w:t xml:space="preserve"> and </w:t>
+      </w:r>
+      <w:r>
+        <w:rPr>
+          <w:rFonts w:asciiTheme="majorHAnsi" w:hAnsiTheme="majorHAnsi" w:cstheme="majorHAnsi"/>
+          <w:szCs w:val="24"/>
+        </w:rPr>
       </w:r>
       <w:r>
         <w:rPr>
@@ -9615,14 +9488,12 @@
           <w:iCs/>
           <w:szCs w:val="24"/>
         </w:rPr>
-        <w:t>PPIF</w:t>
-      </w:r>
-      <w:r>
-        <w:rPr>
-          <w:rFonts w:asciiTheme="majorHAnsi" w:hAnsiTheme="majorHAnsi" w:cstheme="majorHAnsi"/>
-          <w:szCs w:val="24"/>
-        </w:rPr>
-        <w:t xml:space="preserve"> with MPT-driven necrosis) were classified separately with a five-vote majority, completing full pair coverage (21,568/21,568).</w:t>
+      </w:r>
+      <w:r>
+        <w:rPr>
+          <w:rFonts w:asciiTheme="majorHAnsi" w:hAnsiTheme="majorHAnsi" w:cstheme="majorHAnsi"/>
+          <w:szCs w:val="24"/>
+        </w:rPr>
       </w:r>
     </w:p>
     <w:p>
@@ -9825,7 +9696,7 @@
           <w:rFonts w:asciiTheme="majorHAnsi" w:hAnsiTheme="majorHAnsi" w:cstheme="majorHAnsi"/>
           <w:szCs w:val="24"/>
         </w:rPr>
-        <w:t>The application also includes a Digital Molecular RCD Board, a prose-synthesis module that answers gene–RCD queries strictly from the RCDome database and the RCDome decoder under the governance rules described in the Methods, with a retrieval-augmented Q&amp;A submodule that answers free-form questions across all 53 entities and all genes. A nine-test board benchmark (</w:t>
+        <w:t>The application also includes a Digital Molecular RCD Board, a prose-synthesis module that answers gene-RCD queries strictly from the RCDome database and the RCDome decoder under the governance rules described in the Methods, with a retrieval-augmented Q&amp;A submodule that answers free-form questions across all 53 entities and all genes. A nine-test board benchmark (Supplementary Note S7) validated the board at 100% golden accuracy, 100% census accuracy, 100% fact-stability, a 0.047% governance violation rate, and 98.7% articulation conformity; a two-test Q&amp;A benchmark (n = 100 per test) validated the Q&amp;A at 100% positive accuracy and 100% negative controls, Wilson 95% confidence interval (CI) 96.3–100%, two-sided binomial p = 0.010.</w:t>
       </w:r>
       <w:r>
         <w:rPr>
@@ -9833,14 +9704,12 @@
           <w:szCs w:val="24"/>
           <w:highlight w:val="green"/>
         </w:rPr>
-        <w:t>Supplementary Note S7</w:t>
-      </w:r>
-      <w:r>
-        <w:rPr>
-          <w:rFonts w:asciiTheme="majorHAnsi" w:hAnsiTheme="majorHAnsi" w:cstheme="majorHAnsi"/>
-          <w:szCs w:val="24"/>
-        </w:rPr>
-        <w:t>) validated the board at 100% golden accuracy, 100% census accuracy, 100% fact-stability, a 0.047% governance violation rate, and 98.7% articulation conformity; a two-test Q&amp;A benchmark (n = 100 per test) validated the Q&amp;A at 100% positive accuracy and 100% negative controls, Wilson 95% confidence interval (CI) 96.3–100%, two-sided binomial p = 0.010.</w:t>
+      </w:r>
+      <w:r>
+        <w:rPr>
+          <w:rFonts w:asciiTheme="majorHAnsi" w:hAnsiTheme="majorHAnsi" w:cstheme="majorHAnsi"/>
+          <w:szCs w:val="24"/>
+        </w:rPr>
       </w:r>
     </w:p>
     <w:p>
@@ -10057,15 +9926,13 @@
           <w:rFonts w:asciiTheme="majorHAnsi" w:hAnsiTheme="majorHAnsi" w:cstheme="majorHAnsi"/>
           <w:szCs w:val="24"/>
         </w:rPr>
-        <w:t xml:space="preserve">The disparity in gene coverage is striking. Apoptosis accounts for 6,229 association rows (5,897 unique genes). Pyronecrosis has one. This is not a flaw in the compilation; it is a map of where research effort has been concentrated. Apoptosis has been studied for over fifty years. Several of the most recently described forms are known from a single discovery paper. The compendium makes this imbalance explicit, and it is sobering. The mechanistic classification produced an even more striking result. Of the 22,473 gene-RCD associations, only 3,063 (13.6% of the 22,473 validated rows) are MECHANISTIC, meaning both LLM knowledge and PubMed abstract evidence support a functional role. For the remaining 86.3% of validated rows, the literature is either insufficient, ambiguous, or silent. A further </w:t>
-      </w:r>
-      <w:r>
-        <w:rPr>
-          <w:rFonts w:asciiTheme="majorHAnsi" w:hAnsiTheme="majorHAnsi" w:cstheme="majorHAnsi"/>
-          <w:szCs w:val="24"/>
-        </w:rPr>
-        <w:lastRenderedPageBreak/>
-        <w:t>2,416 pairs (10.8%) reflect CO_OCCURRENCE: the gene and RCD term appear together in published articles, but without evidence of a functional relationship. For 8,863 pairs (39.4%), the literature is insufficient to determine the nature of the association. An additional 1,519 pairs (6.8%) represent a LITERATURE_GAP: the LLM recognizes the association, but PubMed abstracts lack explicit confirmation. In other words, for the vast majority of gene-RCD associations reported across 20 resources, the published record does not yet explain how the gene relates to the cell death form. Finally, 442 pairs (2.0%) are classified as DATABASE_ONLY. These are gene-RCD associations contributed by 10 independent curated databases for which no supporting PMID was found in any indexed literature source, despite exhaustive search via NCBI PubMed, Europe PMC full-text recovery, and a targeted DeepSeek LLM campaign. They represent the irreducible uncertainty of the compendium: knowledge that has entered the database ecosystem without a verifiable paper trail by our analysis. They are flagged for expert manual review. Taken together, these findings suggest that the RCD field has outgrown its information infrastructure. Databases have accumulated associations faster than the literature has verified them. RCDome does not solve this problem, but it makes it quantitatively measurable.</w:t>
+        <w:t>The disparity in gene coverage is striking. Apoptosis accounts for 6,229 association rows (5,897 unique genes). Pyronecrosis has one. This is not a flaw in the compilation; the coverage pattern likely reflects research intensity, field maturity, database representation, and source/indexing depth. Apoptosis has been studied for over fifty years. Several of the most recently described forms are known from a single discovery paper. The compendium makes this imbalance explicit, and it is sobering. The mechanistic classification produced an even more striking result. Of the 22,473 gene-RCD associations, only 3,063 (13.6% of the 22,473 validated rows) are MECHANISTIC, meaning both LLM knowledge and PubMed abstract evidence support a functional role. For the remaining 86.3% of validated rows, the literature is either insufficient, ambiguous, or silent. A further 2,416 rows (10.8%) reflect CO_OCCURRENCE: the gene and RCD term appear together in published articles, but without evidence of a functional relationship. For 9,019 rows (40.1%), the literature is insufficient to determine the nature of the association. An additional 1,519 rows (6.8%) represent a LITERATURE_GAP: the LLM recognizes the association, but PubMed abstracts lack explicit confirmation. In other words, for the vast majority of gene-RCD associations reported across 20 resources, the published record does not yet explain how the gene relates to the cell death form. Finally, 286 rows (1.3%) are classified as DATABASE_ONLY. These are gene-RCD associations contributed by 10 independent curated databases for which no supporting PMID was found in any indexed literature source, despite exhaustive search via NCBI PubMed, Europe PMC full-text recovery, and a targeted DeepSeek LLM campaign. They represent unresolved evidence gaps within the literature sources and retrieval strategy used in this study. They are flagged for expert manual review. Taken together, these findings suggest that the RCD field has outgrown its information infrastructure. Databases have accumulated associations faster than the literature has verified them. RCDome does not solve this problem, but it makes it quantitatively measurable.</w:t>
+      </w:r>
+      <w:r>
+        <w:rPr>
+          <w:rFonts w:asciiTheme="majorHAnsi" w:hAnsiTheme="majorHAnsi" w:cstheme="majorHAnsi"/>
+          <w:szCs w:val="24"/>
+        </w:rPr>
       </w:r>
     </w:p>
     <w:p>
@@ -10157,21 +10024,19 @@
           <w:rFonts w:asciiTheme="majorHAnsi" w:hAnsiTheme="majorHAnsi" w:cstheme="majorHAnsi"/>
           <w:szCs w:val="24"/>
         </w:rPr>
-        <w:t xml:space="preserve">The full-matrix classification, read as a whole, paints a picture that surprised us. The death-executing machinery is remarkably small: only 469 </w:t>
-      </w:r>
-      <w:r>
-        <w:rPr>
-          <w:rFonts w:asciiTheme="majorHAnsi" w:hAnsiTheme="majorHAnsi" w:cstheme="majorHAnsi"/>
-          <w:szCs w:val="24"/>
-        </w:rPr>
-        <w:t>gene-RCD</w:t>
-      </w:r>
-      <w:r>
-        <w:rPr>
-          <w:rFonts w:asciiTheme="majorHAnsi" w:hAnsiTheme="majorHAnsi" w:cstheme="majorHAnsi"/>
-          <w:szCs w:val="24"/>
-        </w:rPr>
-        <w:t xml:space="preserve"> pairs (4.8% of the mechanistically-involved set) are executors, the genes that directly pore, cleave, or permeabilize to kill the cell. Everything else is regulation: 9,311 pairs (95.2%) are regulators that promote or inhibit death without executing it. Regulated cell death, in other words, is not a collection of lethal machines but a vast regulatory network built around a small core of executioners (</w:t>
+        <w:t>The full-matrix classification, read as a whole, paints a picture that surprised us. The death-executing machinery is remarkably small: only 469 gene-RCD pairs (4.8% of the mechanistically-involved set) are executors, the genes that directly pore, cleave, or permeabilize to kill the cell. Among the mechanistically involved pairs classified in RCDome, 9,311 (95.2%) were regulators that promote or inhibit death without executing it. Within the compiled RCDome association universe and under the CoT classification, the mechanistically involved set is dominated by regulatory associations surrounding a comparatively small executor subset (Figure 3A).</w:t>
+      </w:r>
+      <w:r>
+        <w:rPr>
+          <w:rFonts w:asciiTheme="majorHAnsi" w:hAnsiTheme="majorHAnsi" w:cstheme="majorHAnsi"/>
+          <w:szCs w:val="24"/>
+        </w:rPr>
+      </w:r>
+      <w:r>
+        <w:rPr>
+          <w:rFonts w:asciiTheme="majorHAnsi" w:hAnsiTheme="majorHAnsi" w:cstheme="majorHAnsi"/>
+          <w:szCs w:val="24"/>
+        </w:rPr>
       </w:r>
       <w:r>
         <w:rPr>
@@ -10179,39 +10044,37 @@
           <w:szCs w:val="24"/>
           <w:highlight w:val="green"/>
         </w:rPr>
-        <w:t>Figure 3A</w:t>
-      </w:r>
-      <w:r>
-        <w:rPr>
-          <w:rFonts w:asciiTheme="majorHAnsi" w:hAnsiTheme="majorHAnsi" w:cstheme="majorHAnsi"/>
-          <w:szCs w:val="24"/>
-        </w:rPr>
-        <w:t>).</w:t>
-      </w:r>
-    </w:p>
-    <w:p>
-      <w:pPr>
-        <w:spacing w:after="0" w:line="240" w:lineRule="auto"/>
-        <w:rPr>
-          <w:rFonts w:asciiTheme="majorHAnsi" w:hAnsiTheme="majorHAnsi" w:cstheme="majorHAnsi"/>
-          <w:szCs w:val="24"/>
-        </w:rPr>
-      </w:pPr>
-    </w:p>
-    <w:p>
-      <w:pPr>
-        <w:spacing w:after="0" w:line="240" w:lineRule="auto"/>
-        <w:rPr>
-          <w:rFonts w:asciiTheme="majorHAnsi" w:hAnsiTheme="majorHAnsi" w:cstheme="majorHAnsi"/>
-          <w:szCs w:val="24"/>
-        </w:rPr>
-      </w:pPr>
-      <w:r>
-        <w:rPr>
-          <w:rFonts w:asciiTheme="majorHAnsi" w:hAnsiTheme="majorHAnsi" w:cstheme="majorHAnsi"/>
-          <w:szCs w:val="24"/>
-        </w:rPr>
-        <w:t>The signal is sharply stratified by ontological level. The L1 modalities, the bona fide death forms, carry 64.6% of their pairs as mechanistically involved, whereas the L5 concepts (Autophagy, Programmed cell death) carry only 31.5%, despite being the largest association hubs. Most genes associated with autophagy are associated with the process, not with its lethal outcome; the DeepSeek layer makes that distinction explicit at this scale (</w:t>
+      </w:r>
+      <w:r>
+        <w:rPr>
+          <w:rFonts w:asciiTheme="majorHAnsi" w:hAnsiTheme="majorHAnsi" w:cstheme="majorHAnsi"/>
+          <w:szCs w:val="24"/>
+        </w:rPr>
+      </w:r>
+    </w:p>
+    <w:p>
+      <w:pPr>
+        <w:spacing w:after="0" w:line="240" w:lineRule="auto"/>
+        <w:rPr>
+          <w:rFonts w:asciiTheme="majorHAnsi" w:hAnsiTheme="majorHAnsi" w:cstheme="majorHAnsi"/>
+          <w:szCs w:val="24"/>
+        </w:rPr>
+      </w:pPr>
+    </w:p>
+    <w:p>
+      <w:pPr>
+        <w:spacing w:after="0" w:line="240" w:lineRule="auto"/>
+        <w:rPr>
+          <w:rFonts w:asciiTheme="majorHAnsi" w:hAnsiTheme="majorHAnsi" w:cstheme="majorHAnsi"/>
+          <w:szCs w:val="24"/>
+        </w:rPr>
+      </w:pPr>
+      <w:r>
+        <w:rPr>
+          <w:rFonts w:asciiTheme="majorHAnsi" w:hAnsiTheme="majorHAnsi" w:cstheme="majorHAnsi"/>
+          <w:szCs w:val="24"/>
+        </w:rPr>
+        <w:t>The signal is sharply stratified by ontological level. The L1 modalities, the bona fide death forms, carry 63.5% of their pairs as mechanistically involved, whereas the L5 concepts (Autophagy, Programmed cell death) carry only 30.2%, despite being the largest association hubs. Most genes associated with autophagy are associated with the process, not with its lethal outcome; the DeepSeek layer makes that distinction explicit at this scale (Figure 3B). This stratification is biologically informative, but it should not be read as an independent validation of the ontology: L1 was defined precisely to concentrate mechanistic forms, so a higher mechanistic fraction in L1 is in part expected by construction.</w:t>
       </w:r>
       <w:r>
         <w:rPr>
@@ -10219,47 +10082,43 @@
           <w:szCs w:val="24"/>
           <w:highlight w:val="green"/>
         </w:rPr>
-        <w:t>Figure 3B</w:t>
-      </w:r>
-      <w:r>
-        <w:rPr>
-          <w:rFonts w:asciiTheme="majorHAnsi" w:hAnsiTheme="majorHAnsi" w:cstheme="majorHAnsi"/>
-          <w:szCs w:val="24"/>
-        </w:rPr>
-        <w:t xml:space="preserve">). This stratification is biologically informative, but it should not be read as an independent </w:t>
-      </w:r>
-      <w:r>
-        <w:rPr>
-          <w:rFonts w:asciiTheme="majorHAnsi" w:hAnsiTheme="majorHAnsi" w:cstheme="majorHAnsi"/>
-          <w:szCs w:val="24"/>
-        </w:rPr>
-        <w:lastRenderedPageBreak/>
-        <w:t>validation of the ontology: L1 was defined precisely to concentrate mechanistic forms, so a higher mechanistic fraction in L1 is in part expected by construction.</w:t>
-      </w:r>
-    </w:p>
-    <w:p>
-      <w:pPr>
-        <w:spacing w:after="0" w:line="240" w:lineRule="auto"/>
-        <w:rPr>
-          <w:rFonts w:asciiTheme="majorHAnsi" w:hAnsiTheme="majorHAnsi" w:cstheme="majorHAnsi"/>
-          <w:szCs w:val="24"/>
-        </w:rPr>
-      </w:pPr>
-    </w:p>
-    <w:p>
-      <w:pPr>
-        <w:spacing w:after="0" w:line="240" w:lineRule="auto"/>
-        <w:rPr>
-          <w:rFonts w:asciiTheme="majorHAnsi" w:hAnsiTheme="majorHAnsi" w:cstheme="majorHAnsi"/>
-          <w:szCs w:val="24"/>
-        </w:rPr>
-      </w:pPr>
-      <w:r>
-        <w:rPr>
-          <w:rFonts w:asciiTheme="majorHAnsi" w:hAnsiTheme="majorHAnsi" w:cstheme="majorHAnsi"/>
-          <w:szCs w:val="24"/>
-        </w:rPr>
-        <w:t>The direction of regulation is nearly balanced, 5,070 promoters versus 4,755 protectors (across all role-resolved associations), consistent with death as a decision that cells weigh in both directions, not a one-way cascade. And 64% of the 9,265 genes have at least one mechanistically-involved association, confirming that RCD is woven through a large fraction of the human genome (Figure 3C). Taken together, these numbers change how the field should be read: the core of regulated cell death is small, and most of the compiled network is regulation of death, not execution of it (Figure 3D). Gene coverage is highly heterogeneous across the 53 entities, from Apoptosis (5,897 unique genes) and Autophagy (4,634 unique genes) to Pyronecrosis (1 gene) (Figure 4). Where a subtype carries more genes than its parent, Autosis (1,105 genes) against Autophagy-dependent cell death (110), the difference reflects the depth of database indexing, not ontological inheritance; parent–child gene inventories are not expected to be nested subsets.</w:t>
+      </w:r>
+      <w:r>
+        <w:rPr>
+          <w:rFonts w:asciiTheme="majorHAnsi" w:hAnsiTheme="majorHAnsi" w:cstheme="majorHAnsi"/>
+          <w:szCs w:val="24"/>
+        </w:rPr>
+      </w:r>
+      <w:r>
+        <w:rPr>
+          <w:rFonts w:asciiTheme="majorHAnsi" w:hAnsiTheme="majorHAnsi" w:cstheme="majorHAnsi"/>
+          <w:szCs w:val="24"/>
+        </w:rPr>
+      </w:r>
+    </w:p>
+    <w:p>
+      <w:pPr>
+        <w:spacing w:after="0" w:line="240" w:lineRule="auto"/>
+        <w:rPr>
+          <w:rFonts w:asciiTheme="majorHAnsi" w:hAnsiTheme="majorHAnsi" w:cstheme="majorHAnsi"/>
+          <w:szCs w:val="24"/>
+        </w:rPr>
+      </w:pPr>
+    </w:p>
+    <w:p>
+      <w:pPr>
+        <w:spacing w:after="0" w:line="240" w:lineRule="auto"/>
+        <w:rPr>
+          <w:rFonts w:asciiTheme="majorHAnsi" w:hAnsiTheme="majorHAnsi" w:cstheme="majorHAnsi"/>
+          <w:szCs w:val="24"/>
+        </w:rPr>
+      </w:pPr>
+      <w:r>
+        <w:rPr>
+          <w:rFonts w:asciiTheme="majorHAnsi" w:hAnsiTheme="majorHAnsi" w:cstheme="majorHAnsi"/>
+          <w:szCs w:val="24"/>
+        </w:rPr>
+        <w:t>The direction of regulation is nearly balanced, 5,025 promoters versus 4,755 protectors (across all role-resolved associations), consistent with death as a decision that cells weigh in both directions, not a one-way cascade. And 64% of the 9,265 genes have at least one mechanistically-involved association, confirming that RCD is woven through a large fraction of the human genome (Figure 3C). Taken together, these numbers change how the field should be read: the core of regulated cell death is small, and most of the compiled network is regulation of death, not execution of it (Figure 3D). Gene coverage is highly heterogeneous across the 53 entities, from Apoptosis (5,897 unique genes) and Autophagy (4,634 unique genes) to Pyronecrosis (1 gene) (Figure 4). Where a subtype carries more genes than its parent, Autosis (1,105 genes) against Autophagy-dependent cell death (110), the difference reflects the depth of database indexing, not ontological inheritance; parent–child gene inventories are not expected to be nested subsets.</w:t>
       </w:r>
     </w:p>
     <w:p>
@@ -10302,46 +10161,44 @@
           <w:rFonts w:asciiTheme="majorHAnsi" w:hAnsiTheme="majorHAnsi" w:cstheme="majorHAnsi"/>
           <w:szCs w:val="24"/>
         </w:rPr>
-        <w:t xml:space="preserve">The two independent classifications, DeepSeek (the chain-of-thought full-matrix classification) and Elicit (the original AI-assisted extraction), give every </w:t>
-      </w:r>
-      <w:r>
-        <w:rPr>
-          <w:rFonts w:asciiTheme="majorHAnsi" w:hAnsiTheme="majorHAnsi" w:cstheme="majorHAnsi"/>
-          <w:szCs w:val="24"/>
-        </w:rPr>
-        <w:t>gene-RCD</w:t>
-      </w:r>
-      <w:r>
-        <w:rPr>
-          <w:rFonts w:asciiTheme="majorHAnsi" w:hAnsiTheme="majorHAnsi" w:cstheme="majorHAnsi"/>
-          <w:szCs w:val="24"/>
-        </w:rPr>
-        <w:t xml:space="preserve"> pair a separately-preserved, comparable verdict. The DeepSeek run classified all 21,568 pairs: 9,785 (45.4%) mechanistically involved and 11,783 (54.6%) not, with 469 executors and 9,311 regulators. The RCDome interface exposes these side by side through a source selector, and a researcher can extract the filtered table, the complete 82-column matrix, the per-entity comparison, or the 469-pair death core for their own work.</w:t>
-      </w:r>
-    </w:p>
-    <w:p>
-      <w:pPr>
-        <w:spacing w:after="0" w:line="240" w:lineRule="auto"/>
-        <w:rPr>
-          <w:rFonts w:asciiTheme="majorHAnsi" w:hAnsiTheme="majorHAnsi" w:cstheme="majorHAnsi"/>
-          <w:szCs w:val="24"/>
-        </w:rPr>
-      </w:pPr>
-    </w:p>
-    <w:p>
-      <w:pPr>
-        <w:spacing w:after="0" w:line="240" w:lineRule="auto"/>
-        <w:rPr>
-          <w:rFonts w:asciiTheme="majorHAnsi" w:hAnsiTheme="majorHAnsi" w:cstheme="majorHAnsi"/>
-          <w:szCs w:val="24"/>
-        </w:rPr>
-      </w:pPr>
-      <w:r>
-        <w:rPr>
-          <w:rFonts w:asciiTheme="majorHAnsi" w:hAnsiTheme="majorHAnsi" w:cstheme="majorHAnsi"/>
-          <w:szCs w:val="24"/>
-        </w:rPr>
-        <w:t>This utility should be used with eyes open. Scaling a majority-vote classifier to 21,568 pairs necessarily leaves a residual error rate. We repaired 84 self-inconsistent rows after the fact, and we deliberately retained 231 rows as uncertain rather than forcing them into a category, because a wrong-but-confident label is worse than an honest unresolved. The benchmark record is strong, and it was built to be method-independent: the four landmark papers, the 17-association accuracy ground truth, and the 26-pair benchmark set, were all fixed reference sets defined independently of the classifiers themselves, the classifications were never graded against their own outputs. On these agnostic reference sets, the DeepSeek chain-of-thought classifier and the Consensus neutral-query rule both reached 100% combined accuracy with zero false positives. But those reference sets are well-established associations; they cannot guarantee that every one of 21,568 automated classifications is correct. Some percentage of the classifications will be wrong, and we want to find them.</w:t>
+        <w:t>The three independent classifications, DeepSeek (the chain-of-thought full-matrix classification), Elicit (the original AI-assisted extraction), and Consensus (the third independent evidence channel), are preserved separately and can be compared. DeepSeek and Consensus each provide full 21,568-pair coverage; Elicit covers the subset where its literature-mining evidence is available. The DeepSeek run classified all 21,568 pairs: 9,785 (45.4%) mechanistically involved and 11,783 (54.6%) not, with 469 executors and 9,311 regulators. The RCDome interface exposes these side by side through a source selector, and a researcher can extract the filtered table, the complete 82-column matrix, the per-entity comparison, or the 469-pair death core for their own work.</w:t>
+      </w:r>
+      <w:r>
+        <w:rPr>
+          <w:rFonts w:asciiTheme="majorHAnsi" w:hAnsiTheme="majorHAnsi" w:cstheme="majorHAnsi"/>
+          <w:szCs w:val="24"/>
+        </w:rPr>
+      </w:r>
+      <w:r>
+        <w:rPr>
+          <w:rFonts w:asciiTheme="majorHAnsi" w:hAnsiTheme="majorHAnsi" w:cstheme="majorHAnsi"/>
+          <w:szCs w:val="24"/>
+        </w:rPr>
+      </w:r>
+    </w:p>
+    <w:p>
+      <w:pPr>
+        <w:spacing w:after="0" w:line="240" w:lineRule="auto"/>
+        <w:rPr>
+          <w:rFonts w:asciiTheme="majorHAnsi" w:hAnsiTheme="majorHAnsi" w:cstheme="majorHAnsi"/>
+          <w:szCs w:val="24"/>
+        </w:rPr>
+      </w:pPr>
+    </w:p>
+    <w:p>
+      <w:pPr>
+        <w:spacing w:after="0" w:line="240" w:lineRule="auto"/>
+        <w:rPr>
+          <w:rFonts w:asciiTheme="majorHAnsi" w:hAnsiTheme="majorHAnsi" w:cstheme="majorHAnsi"/>
+          <w:szCs w:val="24"/>
+        </w:rPr>
+      </w:pPr>
+      <w:r>
+        <w:rPr>
+          <w:rFonts w:asciiTheme="majorHAnsi" w:hAnsiTheme="majorHAnsi" w:cstheme="majorHAnsi"/>
+          <w:szCs w:val="24"/>
+        </w:rPr>
+        <w:t>This utility should be used with eyes open. Scaling a majority-vote classifier to 21,568 pairs necessarily leaves a residual error rate. We repaired 84 self-inconsistent rows after the fact, and we deliberately retained 231 rows as uncertain rather than forcing them into a category, because a wrong-but-confident label is worse than an honest unresolved. The benchmark record is strong, and it was built to be method-independent: the four landmark papers, the 17-association accuracy ground truth, and the 26-pair benchmark set, were all fixed reference sets defined independently of the classifiers themselves, the classifications were never graded against their own outputs. On these fixed development reference sets (not independent held-out validation), the DeepSeek chain-of-thought classifier and the Consensus neutral-query rule both reached 100% combined accuracy with zero false positives. But those reference sets are well-established associations; they cannot guarantee that every one of 21,568 automated classifications is correct. Some percentage of the classifications will be wrong, and we want to find them.</w:t>
       </w:r>
     </w:p>
     <w:p>
@@ -10515,7 +10372,7 @@
         </w:rPr>
       </w:pPr>
       <w:r>
-        <w:t>Four limitations are explicitly acknowledged. First, twenty-eight of the 53 RCD-related entities were not covered by the previous multi-optosis operational-definition set and therefore required RCDome-specific definition work; in the current decoder, all 53 entities have an operational definition anchored to a reference PMID. Second, the automated classifications rely on LLM calls whose residual error rate cannot be guaranteed across all 21,568 pairs; we repaired 84 self-inconsistent rows and retained 231 as explicitly uncertain, but some fraction of the remaining automated verdicts will be wrong and is open to community correction. Third, 442 DATABASE_ONLY pairs (2.0%) lack any verifiable paper trail in the indexed literature, and 86.3% of validated rows are not mechanistically confirmed, limits of the published record itself rather than of the platform. Fourth, the controlled vocabulary is a governed snapshot of the published record at the matrix freeze date: forms named after the freeze (e.g., ruptosis, 2026) or described only in non-human systems are documented as explicit exclusions in the Methods rather than silently omitted from the 53-entity vocabulary.</w:t>
+        <w:t>Four limitations are explicitly acknowledged. First, twenty-eight of the 53 RCD-related entities were not covered by the previous multi-optosis operational-definition set and therefore required RCDome-specific definition work; in the current decoder, all 53 entities have an operational definition anchored to a reference PMID. Second, the automated classifications rely on LLM calls whose residual error rate cannot be guaranteed across all 21,568 pairs; we repaired 84 self-inconsistent rows and retained 231 as explicitly uncertain, but some fraction of the remaining automated verdicts will be wrong and is open to community correction. Third, 286 DATABASE_ONLY pairs (1.3%) lack any verifiable paper trail in the indexed literature, and 86.3% of validated rows are not mechanistically confirmed, limits of the published record itself rather than of the platform. Fourth, the controlled vocabulary is a governed snapshot of the published record at the matrix freeze date (Dataset S1 freeze date: 2026-10-15; ): forms named after the freeze (e.g., ruptosis, 2026) or described only in non-human systems are documented as explicit exclusions in the Methods rather than silently omitted from the 53-entity vocabulary.</w:t>
       </w:r>
     </w:p>
     <w:p>
@@ -10651,7 +10508,7 @@
         </w:rPr>
       </w:pPr>
       <w:r>
-        <w:t xml:space="preserve">The RCDome compendium matrix (Dataset S1; 22,473 rows × 82 columns), extraction pipeline, and the RCDome web application source code are available at </w:t>
+        <w:t>The RCDome compendium matrix (Dataset S1; 22,473 rows × 82 columns; freeze date 2026-10-15), extraction pipeline, and the RCDome web application source code are available at https://github.com/BioCancerInformatics/RCDome. The 20 source databases and resources are publicly accessible at the URLs listed in Supplementary Table S2. All extraction scripts, integration code, and the RCDome Shiny application source code are available at https://github.com/BioCancerInformatics/RCDome. The complete extraction pipeline is orchestrated by master_extract.py, which executes all 21 channel_*.py extraction scripts in sequence, producing timestamped, traceability-compliant CSV outputs. The repository also includes automated smoke tests with continuous integration that verify the mechanistic classification mapping, the chain-of-thought governance rules, and the benchmark scoring.https://github.com/BioCancerInformatics/RCDomehttps://github.com/BioCancerInformatics/RCDomehttps://github.com/BioCancerInformatics/RCDomehttps://github.com/BioCancerInformatics/RCDome</w:t>
       </w:r>
       <w:hyperlink r:id="rId42" w:history="1">
         <w:r>
@@ -10661,22 +10518,14 @@
           <w:t>https://github.com/BioCancerInformatics/RCDome</w:t>
         </w:r>
       </w:hyperlink>
-      <w:r>
-        <w:t xml:space="preserve">. The 20 source databases are publicly accessible at the URLs listed in </w:t>
-      </w:r>
+      <w:r/>
       <w:r>
         <w:rPr>
           <w:highlight w:val="green"/>
         </w:rPr>
-        <w:t>Supplementary Table S2</w:t>
-      </w:r>
-      <w:r>
-        <w:t xml:space="preserve">. All extraction scripts, integration </w:t>
-      </w:r>
-      <w:r>
-        <w:lastRenderedPageBreak/>
-        <w:t xml:space="preserve">code, and the RCDome Shiny application source code are available at </w:t>
-      </w:r>
+      </w:r>
+      <w:r/>
+      <w:r/>
       <w:hyperlink r:id="rId43" w:history="1">
         <w:r>
           <w:rPr>
@@ -10685,9 +10534,7 @@
           <w:t>https://github.com/BioCancerInformatics/RCDome</w:t>
         </w:r>
       </w:hyperlink>
-      <w:r>
-        <w:t>. The complete extraction pipeline is orchestrated by master_extract.py, which executes all 21 channel_*.py extraction scripts in sequence, producing timestamped, traceability-compliant CSV outputs. The repository also includes automated smoke tests with continuous integration that verify the mechanistic classification mapping, the chain-of-thought governance rules, and the benchmark scoring.</w:t>
-      </w:r>
+      <w:r/>
     </w:p>
     <w:p>
       <w:pPr>
@@ -10806,7 +10653,7 @@
           <w:color w:val="auto"/>
           <w:szCs w:val="24"/>
         </w:rPr>
-        <w:t xml:space="preserve">E.R.S. conceptualized the study; developed, validated, and implemented the R-based </w:t>
+        <w:t>E.R.S. conceptualized the study; developed, validated, and implemented the R-based and Python computational pipeline; performed integrative analyses; contributed to manuscript revision; and developed the LLM-based RCD entity module of the Shiny application.</w:t>
       </w:r>
       <w:r>
         <w:rPr>
@@ -10815,7 +10662,6 @@
           <w:color w:val="auto"/>
           <w:szCs w:val="24"/>
         </w:rPr>
-        <w:t xml:space="preserve">and Pyhton </w:t>
       </w:r>
       <w:r>
         <w:rPr>
@@ -10824,7 +10670,6 @@
           <w:color w:val="auto"/>
           <w:szCs w:val="24"/>
         </w:rPr>
-        <w:t xml:space="preserve">computational pipeline; performed integrative analyses; contributed to manuscript revision; and developed the </w:t>
       </w:r>
       <w:r>
         <w:rPr>
@@ -10833,7 +10678,6 @@
           <w:color w:val="auto"/>
           <w:szCs w:val="24"/>
         </w:rPr>
-        <w:t xml:space="preserve">LLM-based RCD entity module of the </w:t>
       </w:r>
       <w:r>
         <w:rPr>
@@ -10842,7 +10686,6 @@
           <w:color w:val="auto"/>
           <w:szCs w:val="24"/>
         </w:rPr>
-        <w:t>Shiny application.</w:t>
       </w:r>
     </w:p>
     <w:p>
@@ -10865,7 +10708,7 @@
           <w:color w:val="auto"/>
           <w:szCs w:val="24"/>
         </w:rPr>
-        <w:t>V.dS.L. conceptualized the study; curation of data and manuscript editing.</w:t>
+        <w:t>V.dS.L. conceptualized the study, curated data, and edited the manuscript.</w:t>
       </w:r>
     </w:p>
     <w:p>
@@ -10888,7 +10731,7 @@
           <w:color w:val="auto"/>
           <w:szCs w:val="24"/>
         </w:rPr>
-        <w:t xml:space="preserve">H.A.C.N. </w:t>
+        <w:t>H.A.C.N. curated data and edited the manuscript.</w:t>
       </w:r>
       <w:r>
         <w:rPr>
@@ -10897,7 +10740,6 @@
           <w:color w:val="auto"/>
           <w:szCs w:val="24"/>
         </w:rPr>
-        <w:t xml:space="preserve">curation of data </w:t>
       </w:r>
       <w:r>
         <w:rPr>
@@ -10906,7 +10748,6 @@
           <w:color w:val="auto"/>
           <w:szCs w:val="24"/>
         </w:rPr>
-        <w:t>and manuscript editing</w:t>
       </w:r>
       <w:r>
         <w:rPr>
@@ -10915,7 +10756,6 @@
           <w:color w:val="auto"/>
           <w:szCs w:val="24"/>
         </w:rPr>
-        <w:t>.</w:t>
       </w:r>
     </w:p>
     <w:p>
@@ -10938,7 +10778,7 @@
           <w:color w:val="auto"/>
           <w:szCs w:val="24"/>
         </w:rPr>
-        <w:t>E.M.A. conceptualized and supervised the study; contributed to methodological design; developed, validated, and audited the computational pipeline;</w:t>
+        <w:t xml:space="preserve">E.M.A. conceptualized and supervised the study; contributed to methodological design; developed, validated, and audited the computational pipeline; curated data; drafted the manuscript, generated the figures, and approved the final version. </w:t>
       </w:r>
       <w:r>
         <w:rPr>
@@ -10947,7 +10787,6 @@
           <w:color w:val="auto"/>
           <w:szCs w:val="24"/>
         </w:rPr>
-        <w:t xml:space="preserve"> curated data;</w:t>
       </w:r>
       <w:r>
         <w:rPr>
@@ -10956,7 +10795,6 @@
           <w:color w:val="auto"/>
           <w:szCs w:val="24"/>
         </w:rPr>
-        <w:t xml:space="preserve"> </w:t>
       </w:r>
       <w:r>
         <w:rPr>
@@ -10965,7 +10803,6 @@
           <w:color w:val="auto"/>
           <w:szCs w:val="24"/>
         </w:rPr>
-        <w:t xml:space="preserve">drafted the mansucriot, generayed the figures, </w:t>
       </w:r>
     </w:p>
     <w:p>
@@ -11109,7 +10946,7 @@
         <w:spacing w:after="0" w:line="240" w:lineRule="auto"/>
       </w:pPr>
       <w:r>
-        <w:t>The authors acknowledge the public databases and resources used in this study, which provided the data for the RCDome gene–RCD compilation. If any gene or association was interpreted incorrectly, the authors request contact so the record can be assessed and amended in the live RCDome application.</w:t>
+        <w:t>The authors acknowledge the public databases and resources used in this study, which provided the data for the RCDome gene-RCD compilation. If any gene or association was interpreted incorrectly, the authors request contact so the record can be assessed and amended in the live RCDome application. Generative artificial intelligence tools were used in a supervised, author-controlled capacity as detailed in the Generative AI Statement.</w:t>
       </w:r>
     </w:p>
     <w:p>
@@ -11470,7 +11307,7 @@
         <w:spacing w:after="0" w:line="240" w:lineRule="auto"/>
       </w:pPr>
       <w:r>
-        <w:t>Artificial intelligence is increasingly used to curate scientific knowledge, yet most such systems remain opaque and unverifiable: they produce a claim without showing whether it is grounded in its source. This work addresses that problem directly. RCDome demonstrates a verifiable, human-governed artificial intelligence pipeline for scientific curation: a two-call large language model architecture, an exact-string anti-hallucination framework, three independent evidence channels, and a governance contract enforced as executable code. Applied to regulated cell death, a field in which dozens of databases record gene associations under conflicting names and most have never been checked against the primary literature, this pipeline integrates 20 public databases and resources into a single traceable atlas of 53 curator-adjudicated entities, validates every gene-RCD association, and states plainly what is supported and what is not. The atlas is delivered through the RCDome Shiny app, a one-stop compilation that lets any researcher, in a single place, query which genes execute or regulate a given RCD form and inspect the evidence behind each answer. The result is a general demonstration that machine-assisted scientific knowledge can be made auditable, reproducible, and honest about its own uncertainty, a contribution that bears directly on the central challenge of applied artificial intelligence: producing machine-generated knowledge that researchers can trust. By making the evidence behind each gene-RCD association traceable and auditable, RCDome provides the curated foundation on which therapeutic targeting of cell death pathways can be built, for example in cancer and degenerative disease. As a free, one-stop, traceable atlas, RCDome lowers the access barrier to curated cell-death knowledge, giving researchers without specialized computational infrastructure access to verified gene-RCD evidence.</w:t>
+        <w:t>Artificial intelligence is increasingly used to curate scientific knowledge, yet most such systems remain opaque and unverifiable: they produce a claim without showing whether it is grounded in its source. This work addresses that problem directly. RCDome demonstrates a verifiable, human-governed artificial intelligence pipeline for scientific curation: a two-call large language model architecture, an exact-string anti-hallucination framework, three independent evidence channels, and a governance contract enforced as executable code. Applied to regulated cell death, a field in which dozens of databases record gene associations under conflicting names and most have never been checked against the primary literature, this pipeline integrates 20 public databases and resources into a single traceable atlas of 53 curator-adjudicated entities, systematically evaluates every gene-RCD association, and states plainly what is supported and what is not. The atlas is delivered through the RCDome Shiny app, a one-stop compilation that lets any researcher, in a single place, query which genes execute or regulate a given RCD form and inspect the evidence behind each answer. The result is a general demonstration that machine-assisted scientific knowledge can be made auditable, reproducible, and honest about its own uncertainty, a contribution that bears directly on the central challenge of applied artificial intelligence: producing machine-generated knowledge that researchers can trust. By making the evidence behind each gene-RCD association traceable and auditable, RCDome provides the curated foundation on which therapeutic targeting of cell death pathways can be built, for example in cancer and degenerative disease. As a free, one-stop, traceable atlas, RCDome lowers the access barrier to curated cell-death knowledge, giving researchers without specialized computational infrastructure access to traceable and audited gene-RCD evidence.</w:t>
       </w:r>
     </w:p>
     <w:p>
@@ -11618,7 +11455,7 @@
           <w:szCs w:val="24"/>
           <w:highlight w:val="green"/>
         </w:rPr>
-        <w:t>Figure 1</w:t>
+        <w:t>Figure 1. RCDome compilation and validation pipeline. RCDome is a human gene atlas of regulated cell death (RCD) assembled in a single top-to-bottom workflow. Twenty source databases constitute the input layer: ten RCD-specific curated resources (FerrDB version 3, RCDdb, iPCD, LncRCD, iLIR, HADb, HAMdb, ATD, AMT-DB and ncFO), five pathway and molecular databases (KEGG, Reactome, Gene Ontology, the Molecular Signatures Database and WikiPathways), the NCBI Gene resource, the multi-optosis pan-cancer gene set, XDeathDB, and two Elicit literature channels (the Phase 3 systematic review and the Alert review). These resources are compiled through five complementary channels: Channel A (programmatic PubMed Boolean searches) maximizes recall; Channel B (topic-specific database extraction) provides precision; Channel C (generative-AI-assisted literature screening) captures recent discoveries; Channel D (manual expert curation) serves as the final arbiter; and Channel E (Elicit Phase 3 systematic review) recovers gene-RCD associations from the full-text literature. Consolidation normalizes the 62 original database name strings into 53 canonicalized RCD-related entities, yielding 22,473 gene-RCD association rows across 9,265 unique human genes. The consolidated matrix then enters an independent validation stage in which three mutually independent analyses are applied in execution order. The first is the DeepSeek chain-of-thought classifier (Phases 2A through 2F), which performs two-call abstract validation, full-text recovery, deep retrieval-augmented generation and a full-matrix chain-of-thought classification that annotates every pair with four columns (cot_role, cot_direction, cot_mechanistic, cot_evidence) encoding chain-of-thought role, direction, mechanistic verdict and evidence. The second is the Elicit systematic-review extraction (Phase 3), which assigns functional role and direction of regulation. The third is the Consensus evidence-channel classification (Phase 2G), which queries each pair with a neutral formulation, the gene symbol followed only by "cell death", so that evidence is retrieved without form-name priming. The three analyses are preserved in separate columns and are never conflated. The resulting consolidated matrix (22,473 rows and 82 columns) powers the RCDome web application, whose interface comprises the interactive dome, the Explore RCDome guide, Operational Definitions, Compare Definitions, the RCD entities browser, the RCD Entity Deep Dive, the Gene Catalog, the Discrepancy Radar, the Discovery Timeline, the 3D RCDome, the Digital Molecular RCD Board, and the Network module. Boxes are color-coded for visual distinction, and arrows indicate the flow of data through the pipeline.</w:t>
       </w:r>
       <w:r>
         <w:rPr>
@@ -11626,7 +11463,6 @@
           <w:b/>
           <w:szCs w:val="24"/>
         </w:rPr>
-        <w:t xml:space="preserve">. RCDome compilation and validation pipeline. </w:t>
       </w:r>
       <w:r>
         <w:rPr>
@@ -11634,7 +11470,6 @@
           <w:bCs/>
           <w:szCs w:val="24"/>
         </w:rPr>
-        <w:t xml:space="preserve">RCDome is a human gene atlas of regulated cell death (RCD) assembled in a single top-to-bottom workflow. Twenty source </w:t>
       </w:r>
       <w:r>
         <w:rPr>
@@ -11642,15 +11477,12 @@
           <w:bCs/>
           <w:szCs w:val="24"/>
         </w:rPr>
-        <w:lastRenderedPageBreak/>
-        <w:t xml:space="preserve">databases constitute the input layer: ten RCD-specific curated resources (FerrDB version 3, RCDdb, iPCD, LncRCD, iLIR, HADb, HAMdb, ATD, AMT-DB and ncFO), five pathway and molecular databases (KEGG, Reactome, Gene Ontology, the Molecular Signatures Database and WikiPathways), the NCBI Gene resource, the multi-optosis pan-cancer gene set, XDeathDB, and two Elicit literature channels (the Phase 3 systematic review and the Alert review). These resources are compiled through five complementary channels: Channel A (programmatic PubMed Boolean searches) maximizes recall; Channel B (topic-specific database extraction) provides precision; Channel C (generative-AI-assisted literature screening) captures recent discoveries; Channel D (manual expert curation) serves as the final arbiter; and Channel E (Elicit Phase 3 systematic review) recovers gene–RCD associations from the full-text literature. Consolidation normalizes the 62 original database name strings into 53 canonicalized RCD-related entities, yielding 22,473 gene-RCD association rows across 9,265 unique human genes. The consolidated matrix then enters an independent validation stage in which three mutually independent analyses are applied in execution order. The first is the DeepSeek chain-of-thought classifier (Phases 2A through 2F), </w:t>
       </w:r>
       <w:r>
         <w:rPr>
           <w:bCs/>
           <w:szCs w:val="24"/>
         </w:rPr>
-        <w:t>which performs two-call abstract validation, full-text recovery, deep retrieval-augmented generation and a full-matrix chain-of-thought classification that annotates every pair with four columns (</w:t>
       </w:r>
       <w:r>
         <w:rPr>
@@ -11659,14 +11491,12 @@
           <w:i/>
           <w:szCs w:val="24"/>
         </w:rPr>
-        <w:t>cot_role</w:t>
       </w:r>
       <w:r>
         <w:rPr>
           <w:bCs/>
           <w:szCs w:val="24"/>
         </w:rPr>
-        <w:t xml:space="preserve">, </w:t>
       </w:r>
       <w:r>
         <w:rPr>
@@ -11675,14 +11505,12 @@
           <w:i/>
           <w:szCs w:val="24"/>
         </w:rPr>
-        <w:t>cot_direction</w:t>
       </w:r>
       <w:r>
         <w:rPr>
           <w:bCs/>
           <w:szCs w:val="24"/>
         </w:rPr>
-        <w:t xml:space="preserve">, </w:t>
       </w:r>
       <w:r>
         <w:rPr>
@@ -11691,14 +11519,12 @@
           <w:i/>
           <w:szCs w:val="24"/>
         </w:rPr>
-        <w:t>cot_mechanistic</w:t>
       </w:r>
       <w:r>
         <w:rPr>
           <w:bCs/>
           <w:szCs w:val="24"/>
         </w:rPr>
-        <w:t xml:space="preserve">, </w:t>
       </w:r>
       <w:r>
         <w:rPr>
@@ -11707,14 +11533,12 @@
           <w:i/>
           <w:szCs w:val="24"/>
         </w:rPr>
-        <w:t>cot_evidence</w:t>
       </w:r>
       <w:r>
         <w:rPr>
           <w:bCs/>
           <w:szCs w:val="24"/>
         </w:rPr>
-        <w:t>) encoding chain-of-thought role, direction, mechanistic verdict and evidence. The second is the Elicit systematic-review extraction (Phase 3), which assigns functional role and direction of regulation. The third is the Consensus evidence-channel classification (Phase 2G), which queries each pair with a neutral formulation, the gene symbol followed only by "cell death", so that evidence is retrieved without form-name priming. The three analyses are preserved in separate columns and are never conflated. The resulting consolidated matrix (22,473 rows and 82 columns) powers the RCDome web application, whose interface comprises the interactive dome, the Explore RCDome guide, the Gene Catalog, the RCD entities browser, the Network module and RCDchat. Boxes are color-coded for visual distinction, and arrows indicate the flow of data through the pipeline.</w:t>
       </w:r>
     </w:p>
     <w:p>
@@ -11741,7 +11565,7 @@
           <w:szCs w:val="24"/>
           <w:highlight w:val="green"/>
         </w:rPr>
-        <w:t>Figure 2</w:t>
+        <w:t>Figure 2. Benchmark evaluation of the three independent analyses. (A) DeepSeek model-selection benchmark against a fixed 26-pair benchmark set comprising 18 positive executor and regulator pairs and 8 form-mismatch negative controls: the baseline deepseek-chat model reached 81% combined accuracy with 38% false positives; chain-of-thought deepseek-reasoner reached 73% with 25% false positives; and the governance-augmented tool-call loop with a hand-curated reference, together with the self-provided chain-of-thought loop, each reached 100% combined accuracy with zero false positives, the self-provided loop was adopted because it requires no external reference. (B) Elicit post-export governance benchmark on the 784 records extracted across three forms (393 ferroptosis, 390 cuproptosis and 1 triaptosis): allow-list compliance improved from 75.4% to 100%, the unsupported EXECUTOR rate fell from 53% to 0%; after governance no unsupported EXECUTOR classification remained (all 192 were downgraded to REGULATOR), and publication traceability rose from 24% (PMID) to 98.3% (DOI). (C) Consensus query-formulation benchmark against the same 26-pair benchmark set: the form-biased query reached 92% combined accuracy with 12% false positives, whereas the neutral query, the gene symbol followed only by "cell death", reached 100% combined accuracy with zero false positives. Green bars denote combined accuracy (panels A and C) or post-governance values (panel B); salmon bars denote false positives (panels A and C) or pre-governance values (panel B).</w:t>
       </w:r>
       <w:r>
         <w:rPr>
@@ -11749,14 +11573,12 @@
           <w:b/>
           <w:szCs w:val="24"/>
         </w:rPr>
-        <w:t>. Benchmark evaluation of the three independent analyses.</w:t>
       </w:r>
       <w:r>
         <w:rPr>
           <w:bCs/>
           <w:szCs w:val="24"/>
         </w:rPr>
-        <w:t xml:space="preserve"> (A) DeepSeek model-selection benchmark against a fixed 26-pair benchmark set comprising 18 positive executor and regulator pairs and 8 form-mismatch negative controls: the baseline </w:t>
       </w:r>
       <w:r>
         <w:rPr>
@@ -11765,14 +11587,12 @@
           <w:i/>
           <w:szCs w:val="24"/>
         </w:rPr>
-        <w:t>deepseek-chat</w:t>
       </w:r>
       <w:r>
         <w:rPr>
           <w:bCs/>
           <w:szCs w:val="24"/>
         </w:rPr>
-        <w:t xml:space="preserve"> model reached 81% combined accuracy with 38% false positives; chain-of-thought </w:t>
       </w:r>
       <w:r>
         <w:rPr>
@@ -11781,14 +11601,12 @@
           <w:i/>
           <w:szCs w:val="24"/>
         </w:rPr>
-        <w:t>deepseek-reasoner</w:t>
       </w:r>
       <w:r>
         <w:rPr>
           <w:bCs/>
           <w:szCs w:val="24"/>
         </w:rPr>
-        <w:t xml:space="preserve"> reached 73% with 25% false positives; and the governance-augmented tool-call loop with a hand-curated reference, together with the self-provided chain-of-thought loop, each reached 100% combined accuracy with zero false positives, the self-provided loop was adopted because it requires no external reference. (B) Elicit post-export governance benchmark on the 784 records extracted across three forms (393 ferroptosis, 390 cuproptosis and 1 triaptosis): allow-list compliance improved from 75.4% to 100%, executor precision improved from 47% to 100%; after governance no unsupported EXECUTOR classification remained (all 192 were downgraded to REGULATOR), and publication traceability from 24% to 98%. (C) Consensus query-formulation benchmark against the same 26-pair benchmark set: the form-biased query reached 92% combined accuracy with 12% false positives, whereas the neutral query, the gene symbol followed only by "cell death", reached 100% combined accuracy with zero false positives. Green bars denote combined accuracy (panels A and C) or post-governance values (panel B); salmon bars denote false positives (panels A and C) or pre-governance values (panel B).</w:t>
       </w:r>
     </w:p>
     <w:p>
@@ -11817,7 +11635,7 @@
           <w:szCs w:val="24"/>
           <w:highlight w:val="green"/>
         </w:rPr>
-        <w:t>Figure 3</w:t>
+        <w:t>Figure 3. The death core and its regulatory network. (A) Role distribution across the 21,568 unique gene-RCD pairs classified by the DeepSeek chain-of-thought run: 11,783 unresolved, 9,311 regulators, 469 executors, and 5 markers. (B) Mechanistically-involved fraction by ontological level (L1 modalities, L2 subtypes, L3 triggers, L4 Functional/contextual categories, L5 Generic/umbrella/taxon concepts); the modalities carry the densest mechanistic signal (63.5%) while the Functional/contextual categories (L4) are the most dilute (22.9%), with the Generic/umbrella/taxon concepts at 30.2%. (C) Direction across all role-resolved associations: 5,025 promote and 4,755 protect (among the 9,311 regulators, 4,556 promote and 4,755 protect), a near-even balance. (D) The executor core (orange, 469) drawn area-proportionally inside the regulatory network (blue, 9,311) and the unresolved associations (grey, 11,783), illustrating that the death-executing machinery is small and the regulatory network is vast.</w:t>
       </w:r>
       <w:r>
         <w:rPr>
@@ -11825,7 +11643,6 @@
           <w:b/>
           <w:szCs w:val="24"/>
         </w:rPr>
-        <w:t xml:space="preserve">. The death core and its regulatory network. </w:t>
       </w:r>
       <w:r>
         <w:rPr>
@@ -11833,7 +11650,6 @@
           <w:bCs/>
           <w:szCs w:val="24"/>
         </w:rPr>
-        <w:t>(A) Role distribution across the 21,568 unique gene-RCD pairs classified by the DeepSeek chain-of-thought run: 11,783 unresolved, 9,311 regulators, 469 executors, and 5 markers. (B) Mechanistically-involved fraction by ontological level (L1 modalities, L2 subtypes, L3 triggers, L4 Functional/contextual categories, L5 Generic/umbrella/taxon concepts); the modalities carry the densest mechanistic signal (64.6%) while the Functional/contextual categories (L4) are the most dilute (23.6%), with the Generic/umbrella/taxon concepts at 31.5%. (C) Direction across all role-resolved associations: 5,070 promote and 4,755 protect (among the 9,311 regulators, 4,556 promote, 4,755 protect, and 178 have unclear direction), a near-even balance. (D) The executor core (orange, 469) drawn area-proportionally inside the regulatory network (blue, 9,311) and the unresolved associations (grey, 11,783), illustrating that the death-executing machinery is small and the regulatory network is vast.</w:t>
       </w:r>
     </w:p>
     <w:p>

</xml_diff>

<commit_message>
Fuse RCD Entity Deep Dive into RCD entities (module + cards + manuscript + Figure 1 + README); add cartoon download + click-to-zoom + preload
</commit_message>
<xml_diff>
--- a/docs/manuscript/RCDome_manuscript_governance_V027.docx
+++ b/docs/manuscript/RCDome_manuscript_governance_V027.docx
@@ -7260,7 +7260,7 @@
         </w:rPr>
       </w:pPr>
       <w:r>
-        <w:t>RCDome Platform Architecture. The RCDome web application is a pure R Shiny application; the compendium matrix is stored as an in-memory R data file (RDS), with no external microservice or database backend. The interface comprises a Home landing page (interactive dome of the 53 entities with a gene constellation), an Explore RCDome educational guide, and the data modules Operational Definitions, Compare Definitions, RCD entities (all 53 RCD-related entities, with modal descriptions), RCD Entity Deep Dive (the 53 audited descriptions with clickable PMID and DOI references), Gene Catalog (the complete matrix with a Genes view, a Direction/Role source selector, a death-core preset, and a per-entity comparison), Discrepancy Radar (the 7,895 arbitrated classifier disagreements, color-coded by concordance with GPT-4o arbitration), Discovery Timeline (the 53 entities by founding year and ontological level), 3D RCDome (a rotatable three-dimensional sphere of the entities and their gene constellations), the Digital Molecular RCD Board (an AI-assisted synthesis interface that generates governance-audited, provenance-traced reports for gene-RCD pairs, with a Q&amp;A submodule), and Network, plus an About page with data provenance.</w:t>
+        <w:t>RCDome Platform Architecture. The RCDome web application is a pure R Shiny application; the compendium matrix is stored as an in-memory R data file (RDS), with no external microservice or database backend. The interface comprises a Home landing page (interactive dome of the 53 entities with a gene constellation), an Explore RCDome educational guide, and the data modules Operational Definitions, Compare Definitions, RCD entities (the 53 audited descriptions with clickable PMID and DOI references), Gene Catalog (the complete matrix with a Genes view, a Direction/Role source selector, a death-core preset, and a per-entity comparison), Discrepancy Radar (the 7,895 arbitrated classifier disagreements, color-coded by concordance with GPT-4o arbitration), Discovery Timeline (the 53 entities by founding year and ontological level), 3D RCDome (a rotatable three-dimensional sphere of the entities and their gene constellations), the Digital Molecular RCD Board (an AI-assisted synthesis interface that generates governance-audited, provenance-traced reports for gene-RCD pairs, with a Q&amp;A submodule), and Network, plus an About page with data provenance.</w:t>
       </w:r>
     </w:p>
     <w:p>
@@ -9630,7 +9630,7 @@
           <w:rFonts w:asciiTheme="majorHAnsi" w:hAnsiTheme="majorHAnsi" w:cstheme="majorHAnsi"/>
           <w:szCs w:val="24"/>
         </w:rPr>
-        <w:t>The interface is built for both education and scientific accountability. Every column, filter, and control carries a hover explanation; pills are colored by concept (level, biotype, tier, role, direction); entity cards are level-colored; and every PMID shown as evidence resolves to a verified article title (10,141 curated titles, 100% accuracy against PubMed). The ten data modules, Operational Definitions, Compare Definitions, RCD entities, RCD Entity Deep Dive, Gene Catalog, Discrepancy Radar, Discovery Timeline, 3D RCDome, the Digital Molecular RCD Board, and Network, are exposed as cards on the Home page, with the interactive dome as the primary entry point.</w:t>
+        <w:t>The interface is built for both education and scientific accountability. Every column, filter, and control carries a hover explanation; pills are colored by concept (level, biotype, tier, role, direction); entity cards are level-colored; and every PMID shown as evidence resolves to a verified article title (10,141 curated titles, 100% accuracy against PubMed). The ten data modules, Operational Definitions, Compare Definitions, RCD entities, Gene Catalog, Discrepancy Radar, Discovery Timeline, 3D RCDome, the Digital Molecular RCD Board, and Network, are exposed as cards on the Home page, with the interactive dome as the primary entry point.</w:t>
       </w:r>
     </w:p>
     <w:p>
@@ -11455,7 +11455,7 @@
           <w:szCs w:val="24"/>
           <w:highlight w:val="green"/>
         </w:rPr>
-        <w:t>Figure 1. RCDome compilation and validation pipeline. RCDome is a human gene atlas of regulated cell death (RCD) assembled in a single top-to-bottom workflow. Twenty source databases constitute the input layer: ten RCD-specific curated resources (FerrDB version 3, RCDdb, iPCD, LncRCD, iLIR, HADb, HAMdb, ATD, AMT-DB and ncFO), five pathway and molecular databases (KEGG, Reactome, Gene Ontology, the Molecular Signatures Database and WikiPathways), the NCBI Gene resource, the multi-optosis pan-cancer gene set, XDeathDB, and two Elicit literature channels (the Phase 3 systematic review and the Alert review). These resources are compiled through five complementary channels: Channel A (programmatic PubMed Boolean searches) maximizes recall; Channel B (topic-specific database extraction) provides precision; Channel C (generative-AI-assisted literature screening) captures recent discoveries; Channel D (manual expert curation) serves as the final arbiter; and Channel E (Elicit Phase 3 systematic review) recovers gene-RCD associations from the full-text literature. Consolidation normalizes the 62 original database name strings into 53 canonicalized RCD-related entities, yielding 22,473 gene-RCD association rows across 9,265 unique human genes. The consolidated matrix then enters an independent validation stage in which three mutually independent analyses are applied in execution order. The first is the DeepSeek chain-of-thought classifier (Phases 2A through 2F), which performs two-call abstract validation, full-text recovery, deep retrieval-augmented generation and a full-matrix chain-of-thought classification that annotates every pair with four columns (cot_role, cot_direction, cot_mechanistic, cot_evidence) encoding chain-of-thought role, direction, mechanistic verdict and evidence. The second is the Elicit systematic-review extraction (Phase 3), which assigns functional role and direction of regulation. The third is the Consensus evidence-channel classification (Phase 2G), which queries each pair with a neutral formulation, the gene symbol followed only by "cell death", so that evidence is retrieved without form-name priming. The three analyses are preserved in separate columns and are never conflated. The resulting consolidated matrix (22,473 rows and 82 columns) powers the RCDome web application, whose interface comprises the interactive dome, the Explore RCDome guide, Operational Definitions, Compare Definitions, the RCD entities browser, the RCD Entity Deep Dive, the Gene Catalog, the Discrepancy Radar, the Discovery Timeline, the 3D RCDome, the Digital Molecular RCD Board, and the Network module. Boxes are color-coded for visual distinction, and arrows indicate the flow of data through the pipeline.</w:t>
+        <w:t>Figure 1. RCDome compilation and validation pipeline. RCDome is a human gene atlas of regulated cell death (RCD) assembled in a single top-to-bottom workflow. Twenty source databases constitute the input layer: ten RCD-specific curated resources (FerrDB version 3, RCDdb, iPCD, LncRCD, iLIR, HADb, HAMdb, ATD, AMT-DB and ncFO), five pathway and molecular databases (KEGG, Reactome, Gene Ontology, the Molecular Signatures Database and WikiPathways), the NCBI Gene resource, the multi-optosis pan-cancer gene set, XDeathDB, and two Elicit literature channels (the Phase 3 systematic review and the Alert review). These resources are compiled through five complementary channels: Channel A (programmatic PubMed Boolean searches) maximizes recall; Channel B (topic-specific database extraction) provides precision; Channel C (generative-AI-assisted literature screening) captures recent discoveries; Channel D (manual expert curation) serves as the final arbiter; and Channel E (Elicit Phase 3 systematic review) recovers gene-RCD associations from the full-text literature. Consolidation normalizes the 62 original database name strings into 53 canonicalized RCD-related entities, yielding 22,473 gene-RCD association rows across 9,265 unique human genes. The consolidated matrix then enters an independent validation stage in which three mutually independent analyses are applied in execution order. The first is the DeepSeek chain-of-thought classifier (Phases 2A through 2F), which performs two-call abstract validation, full-text recovery, deep retrieval-augmented generation and a full-matrix chain-of-thought classification that annotates every pair with four columns (cot_role, cot_direction, cot_mechanistic, cot_evidence) encoding chain-of-thought role, direction, mechanistic verdict and evidence. The second is the Elicit systematic-review extraction (Phase 3), which assigns functional role and direction of regulation. The third is the Consensus evidence-channel classification (Phase 2G), which queries each pair with a neutral formulation, the gene symbol followed only by "cell death", so that evidence is retrieved without form-name priming. The three analyses are preserved in separate columns and are never conflated. The resulting consolidated matrix (22,473 rows and 82 columns) powers the RCDome web application, whose interface comprises the interactive dome, the Explore RCDome guide, Operational Definitions, Compare Definitions, the RCD entities browser, the Gene Catalog, the Discrepancy Radar, the Discovery Timeline, the 3D RCDome, the Digital Molecular RCD Board, and the Network module. Boxes are color-coded for visual distinction, and arrows indicate the flow of data through the pipeline.</w:t>
       </w:r>
       <w:r>
         <w:rPr>

</xml_diff>

<commit_message>
Amend Figure 1 + SI 82->83 columns; regenerate Figure 1
</commit_message>
<xml_diff>
--- a/docs/manuscript/RCDome_manuscript_governance_V027.docx
+++ b/docs/manuscript/RCDome_manuscript_governance_V027.docx
@@ -116,105 +116,33 @@
         </w:rPr>
         <w:t>Emanuell Rodrigues de Souza†, Victor dos Santos Lopes†, Higor Almeida Cordeiro Nogueira, and Enrique Medina-Acosta*</w:t>
       </w:r>
-      <w:r>
-        <w:rPr>
-          <w:rFonts w:asciiTheme="majorHAnsi" w:hAnsiTheme="majorHAnsi" w:cstheme="majorHAnsi"/>
-          <w:b/>
-          <w:bCs/>
-          <w:szCs w:val="24"/>
-          <w:vertAlign w:val="superscript"/>
+    </w:p>
+    <w:p>
+      <w:pPr>
+        <w:spacing w:after="0" w:line="240" w:lineRule="auto"/>
+        <w:rPr>
+          <w:rFonts w:asciiTheme="majorHAnsi" w:hAnsiTheme="majorHAnsi" w:cstheme="majorHAnsi"/>
+          <w:szCs w:val="24"/>
           <w:lang w:val="pt-BR"/>
         </w:rPr>
-      </w:r>
-      <w:r>
+      </w:pPr>
+    </w:p>
+    <w:p>
+      <w:pPr>
+        <w:spacing w:after="0" w:line="240" w:lineRule="auto"/>
         <w:rPr>
           <w:rFonts w:asciiTheme="majorHAnsi" w:hAnsiTheme="majorHAnsi" w:cstheme="majorHAnsi"/>
           <w:szCs w:val="24"/>
           <w:lang w:val="pt-BR"/>
         </w:rPr>
-      </w:r>
-      <w:r>
-        <w:rPr>
-          <w:rFonts w:asciiTheme="majorHAnsi" w:hAnsiTheme="majorHAnsi" w:cstheme="majorHAnsi"/>
-          <w:b/>
-          <w:bCs/>
-          <w:szCs w:val="24"/>
-          <w:vertAlign w:val="superscript"/>
+      </w:pPr>
+      <w:r>
+        <w:rPr>
+          <w:rFonts w:asciiTheme="majorHAnsi" w:hAnsiTheme="majorHAnsi" w:cstheme="majorHAnsi"/>
+          <w:szCs w:val="24"/>
           <w:lang w:val="pt-BR"/>
         </w:rPr>
-      </w:r>
-      <w:r>
-        <w:rPr>
-          <w:rFonts w:asciiTheme="majorHAnsi" w:hAnsiTheme="majorHAnsi" w:cstheme="majorHAnsi"/>
-          <w:szCs w:val="24"/>
-          <w:lang w:val="pt-BR"/>
-        </w:rPr>
-      </w:r>
-      <w:r>
-        <w:rPr>
-          <w:rFonts w:asciiTheme="majorHAnsi" w:hAnsiTheme="majorHAnsi" w:cstheme="majorHAnsi"/>
-          <w:b/>
-          <w:bCs/>
-          <w:szCs w:val="24"/>
-          <w:vertAlign w:val="superscript"/>
-          <w:lang w:val="pt-BR"/>
-        </w:rPr>
-      </w:r>
-    </w:p>
-    <w:p>
-      <w:pPr>
-        <w:spacing w:after="0" w:line="240" w:lineRule="auto"/>
-        <w:rPr>
-          <w:rFonts w:asciiTheme="majorHAnsi" w:hAnsiTheme="majorHAnsi" w:cstheme="majorHAnsi"/>
-          <w:szCs w:val="24"/>
-          <w:lang w:val="pt-BR"/>
-        </w:rPr>
-      </w:pPr>
-    </w:p>
-    <w:p>
-      <w:pPr>
-        <w:spacing w:after="0" w:line="240" w:lineRule="auto"/>
-        <w:rPr>
-          <w:rFonts w:asciiTheme="majorHAnsi" w:hAnsiTheme="majorHAnsi" w:cstheme="majorHAnsi"/>
-          <w:szCs w:val="24"/>
-          <w:lang w:val="pt-BR"/>
-        </w:rPr>
-      </w:pPr>
-      <w:r>
-        <w:rPr>
-          <w:rFonts w:asciiTheme="majorHAnsi" w:hAnsiTheme="majorHAnsi" w:cstheme="majorHAnsi"/>
-          <w:szCs w:val="24"/>
-          <w:lang w:val="pt-BR"/>
-        </w:rPr>
         <w:t>Laboratório de Biotecnologia, Centro de Biociências e Biotecnologia, Universidade Estadual do Norte Fluminense, Campos dos Goytacazes, RJ, Brazil.</w:t>
-      </w:r>
-      <w:r>
-        <w:rPr>
-          <w:rFonts w:asciiTheme="majorHAnsi" w:hAnsiTheme="majorHAnsi" w:cstheme="majorHAnsi"/>
-          <w:szCs w:val="24"/>
-          <w:lang w:val="pt-BR"/>
-        </w:rPr>
-      </w:r>
-      <w:r>
-        <w:rPr>
-          <w:rFonts w:asciiTheme="majorHAnsi" w:hAnsiTheme="majorHAnsi" w:cstheme="majorHAnsi"/>
-          <w:szCs w:val="24"/>
-          <w:lang w:val="pt-BR"/>
-        </w:rPr>
-      </w:r>
-      <w:r>
-        <w:rPr>
-          <w:rFonts w:asciiTheme="majorHAnsi" w:hAnsiTheme="majorHAnsi" w:cstheme="majorHAnsi"/>
-          <w:szCs w:val="24"/>
-          <w:lang w:val="pt-BR"/>
-        </w:rPr>
-      </w:r>
-      <w:r>
-        <w:rPr>
-          <w:rFonts w:asciiTheme="majorHAnsi" w:hAnsiTheme="majorHAnsi" w:cstheme="majorHAnsi"/>
-          <w:szCs w:val="24"/>
-          <w:lang w:val="pt-BR"/>
-        </w:rPr>
       </w:r>
     </w:p>
     <w:p>
@@ -441,7 +369,7 @@
           <w:szCs w:val="24"/>
           <w:vertAlign w:val="superscript"/>
         </w:rPr>
-        <w:t>† These authors contributed equally to this work and share first authorship</w:t>
+        <w:t xml:space="preserve">† </w:t>
       </w:r>
       <w:r>
         <w:rPr>
@@ -450,22 +378,7 @@
           <w:bCs/>
           <w:szCs w:val="24"/>
         </w:rPr>
-      </w:r>
-      <w:r>
-        <w:rPr>
-          <w:rFonts w:asciiTheme="majorHAnsi" w:hAnsiTheme="majorHAnsi" w:cstheme="majorHAnsi"/>
-          <w:b/>
-          <w:bCs/>
-          <w:szCs w:val="24"/>
-        </w:rPr>
-      </w:r>
-      <w:r>
-        <w:rPr>
-          <w:rFonts w:asciiTheme="majorHAnsi" w:hAnsiTheme="majorHAnsi" w:cstheme="majorHAnsi"/>
-          <w:b/>
-          <w:bCs/>
-          <w:szCs w:val="24"/>
-        </w:rPr>
+        <w:t>These authors contributed equally to this work and share first authorship</w:t>
       </w:r>
     </w:p>
     <w:p>
@@ -601,9 +514,34 @@
         <w:rPr>
           <w:b/>
         </w:rPr>
-        <w:t xml:space="preserve">Methods: RCDome is a multi-database human gene atlas constructed through a staged architecture that integrates multi-source gene-RCD compilation, literature-based validation and evidence recovery, mechanistic classification, human-governed ontological adjudication, and deployment as an interactive web resource. Five complementary evidence channels, comprising PubMed Boolean search, curated databases, AI-assisted screening, manual curation, and Elicit systematic review, were integrated from 20 public databases and resources into a unified matrix. Sixty-two original name strings were canonicalized into 53 RCD-related entities, whose operational definitions and ontological levels were curator-adjudicated. gene-RCD associations were systematically evaluated through an independent two-call large language model (LLM) validation architecture, Europe PMC full-text recovery and deep evidence extraction, and an independent Consensus literature-search channel. Source-grounding controls rejected extracted evidence not found verbatim in the source document, while the governance contract was enforced as executable code. </w:t>
-      </w:r>
-      <w:r/>
+        <w:t xml:space="preserve">Methods: </w:t>
+      </w:r>
+      <w:r>
+        <w:rPr>
+          <w:bCs/>
+        </w:rPr>
+        <w:t xml:space="preserve">RCDome is a multi-database human gene atlas constructed through a staged architecture that integrates multi-source gene-RCD compilation, literature-based validation and evidence recovery, mechanistic classification, human-governed ontological adjudication, and deployment as an interactive web resource. Five complementary evidence channels, comprising PubMed Boolean search, curated databases, AI-assisted screening, manual curation, and </w:t>
+      </w:r>
+      <w:proofErr w:type="gramStart"/>
+      <w:r>
+        <w:rPr>
+          <w:bCs/>
+        </w:rPr>
+        <w:t>Elicit</w:t>
+      </w:r>
+      <w:proofErr w:type="gramEnd"/>
+      <w:r>
+        <w:rPr>
+          <w:bCs/>
+        </w:rPr>
+        <w:t xml:space="preserve"> systematic review, were integrated from 20 public databases and resources into a unified matrix. Sixty-two original name strings were canonicalized into 53 RCD-related entities, whose operational definitions and ontological levels were curator-adjudicated. gene-RCD associations were systematically evaluated through an independent two-call large language model (LLM) validation architecture, Europe PMC full-text recovery and deep evidence extraction, and an independent Consensus literature-search channel. Source-grounding controls rejected extracted evidence not found verbatim in the source document, while the governance contract was enforced as executable code.</w:t>
+      </w:r>
+      <w:r>
+        <w:rPr>
+          <w:b/>
+        </w:rPr>
+        <w:t xml:space="preserve"> </w:t>
+      </w:r>
     </w:p>
     <w:p>
       <w:pPr>
@@ -1236,14 +1174,15 @@
           <w:rFonts w:asciiTheme="majorHAnsi" w:hAnsiTheme="majorHAnsi" w:cstheme="majorHAnsi"/>
           <w:szCs w:val="24"/>
         </w:rPr>
-        <w:t xml:space="preserve">). The platform follows a layered, database-centered strategy in which each successive validation layer builds upon the database compilation foundation without overwriting earlier results: Layer 0 (Database Compilation), Layer 1 (National Center for Biotechnology Information (NCBI) + DeepSeek </w:t>
-      </w:r>
-      <w:r>
-        <w:rPr>
-          <w:rFonts w:asciiTheme="majorHAnsi" w:hAnsiTheme="majorHAnsi" w:cstheme="majorHAnsi"/>
-          <w:szCs w:val="24"/>
-        </w:rPr>
-        <w:t>Abstract Validation), Layer 2 (Europe PMC + DeepSeek Full-Text Recovery), Layer 3 (Europe PMC XML Deep Retrieval-Augmented Generation (RAG)), and Layer 4 (Elicit Independent Literature Mining). This layered architecture ensures that original database claims are preserved intact. The platform's development followed a four-phase strategy: (i) establishment of a canonicalized RCD-related entity vocabulary through systematic literature and database discovery; (ii) multi-channel gene compilation from 20 source resources organized into four compilation channels (A through D), with a fifth validation/literature-mining channel (E) added at validation; (iii) integration into a unified, traceability-compliant gene-RCD association matrix; and (iv) deployment as a publicly available interactive web platform.</w:t>
+        <w:t xml:space="preserve">). The platform follows a layered, database-centered strategy in which each successive validation layer builds upon the database compilation foundation without overwriting earlier results: Layer 0 (Database Compilation), Layer 1 (National Center for Biotechnology </w:t>
+      </w:r>
+      <w:r>
+        <w:rPr>
+          <w:rFonts w:asciiTheme="majorHAnsi" w:hAnsiTheme="majorHAnsi" w:cstheme="majorHAnsi"/>
+          <w:szCs w:val="24"/>
+        </w:rPr>
+        <w:lastRenderedPageBreak/>
+        <w:t>Information (NCBI) + DeepSeek Abstract Validation), Layer 2 (Europe PMC + DeepSeek Full-Text Recovery), Layer 3 (Europe PMC XML Deep Retrieval-Augmented Generation (RAG)), and Layer 4 (Elicit Independent Literature Mining). This layered architecture ensures that original database claims are preserved intact. The platform's development followed a four-phase strategy: (i) establishment of a canonicalized RCD-related entity vocabulary through systematic literature and database discovery; (ii) multi-channel gene compilation from 20 source resources organized into four compilation channels (A through D), with a fifth validation/literature-mining channel (E) added at validation; (iii) integration into a unified, traceability-compliant gene-RCD association matrix; and (iv) deployment as a publicly available interactive web platform.</w:t>
       </w:r>
     </w:p>
     <w:p>
@@ -1389,196 +1328,39 @@
         </w:rPr>
         <w:t>During database discovery, newly emerging RCD forms were encountered, demanding systematic expansion. We executed a multi-layered literature and database surveillance strategy: (a) forward-citation tracking of NCCD 2018 article {Galluzzi, 2018 #782025} to identify post-consensus RCD forms; (b) PubMed systematic searches using the "-ptosis" and "-osis" suffix patterns combined with "cell death" terminology; (c) surveillance of bioRxiv and medRxiv preprints (2024–2026); and (d) cross-referencing against the RCD form inventories of all 20 source databases and resources (Supplementary Table S2).</w:t>
       </w:r>
-      <w:r>
-        <w:rPr>
-          <w:rFonts w:asciiTheme="majorHAnsi" w:hAnsiTheme="majorHAnsi" w:cstheme="majorHAnsi"/>
-          <w:szCs w:val="24"/>
-          <w:highlight w:val="yellow"/>
-        </w:rPr>
-      </w:r>
-      <w:r>
-        <w:rPr>
-          <w:rFonts w:asciiTheme="majorHAnsi" w:hAnsiTheme="majorHAnsi" w:cstheme="majorHAnsi"/>
-          <w:szCs w:val="24"/>
-        </w:rPr>
-      </w:r>
-      <w:r>
-        <w:rPr>
-          <w:rFonts w:asciiTheme="majorHAnsi" w:hAnsiTheme="majorHAnsi" w:cstheme="majorHAnsi"/>
-          <w:szCs w:val="24"/>
-          <w:highlight w:val="green"/>
-        </w:rPr>
-      </w:r>
-      <w:r>
-        <w:rPr>
-          <w:rFonts w:asciiTheme="majorHAnsi" w:hAnsiTheme="majorHAnsi" w:cstheme="majorHAnsi"/>
-          <w:szCs w:val="24"/>
-          <w:highlight w:val="yellow"/>
-        </w:rPr>
-      </w:r>
-    </w:p>
-    <w:p>
-      <w:pPr>
-        <w:spacing w:after="0" w:line="240" w:lineRule="auto"/>
-        <w:rPr>
-          <w:rFonts w:asciiTheme="majorHAnsi" w:hAnsiTheme="majorHAnsi" w:cstheme="majorHAnsi"/>
-          <w:szCs w:val="24"/>
-        </w:rPr>
-      </w:pPr>
-    </w:p>
-    <w:p>
-      <w:pPr>
-        <w:spacing w:after="0" w:line="240" w:lineRule="auto"/>
-        <w:rPr>
-          <w:rFonts w:asciiTheme="majorHAnsi" w:hAnsiTheme="majorHAnsi" w:cstheme="majorHAnsi"/>
-          <w:szCs w:val="24"/>
-        </w:rPr>
-      </w:pPr>
-      <w:r>
-        <w:rPr>
-          <w:rFonts w:asciiTheme="majorHAnsi" w:hAnsiTheme="majorHAnsi" w:cstheme="majorHAnsi"/>
-          <w:szCs w:val="24"/>
-        </w:rPr>
-        <w:t>Candidate RCD forms were validated against five modality criteria (MC1–MC5) adapted from the NCCD framework {Galluzzi, 2018 #782025}: (MC1) possession of distinct molecular machinery not fully subsumed by another form; (MC2) an identifiable biochemical or biophysical trigger; (MC3) a characteristic and reproducible morphological phenotype; (MC4) explicit naming in at least one peer-reviewed publication; and (MC5) pharmacological or genetic distinguishability from other forms. Co-activation umbrellas (e.g., PANoptosis {Pandian, 2022 #783830}) and morphological descriptors without distinct mechanisms were classified as conceptual categories. Following the biological curation, admission to the modality level (L1) was additionally governed by hard biological gates (BG0–BG6) (whole-cell death, causal machinery, functional necessity/distinguishability, supportive phenotype, naming/provenance, replication/maturity, and species scope), which operationalize MC1–MC5 with BG1 (machinery) and BG2 (necessity) obligatory. The resulting five-level ontology is encoded in the unified matrix as two columns (rcdome_level and rcdome_level_name), preserving the external multi-optosis classification (rodr_category) untouched (Supplementary Table S3; Supplementary Table S4). Evidence grades in Tables S3 and S6 use the A–D scale: A, well-established (&gt;100 publications); B, established (10–100); C, emerging (2–10); D, proposed (1); N, not yet classified. The adjudication framework and its governance are documented in Supplementary Note S1; the complete evaluation architecture (RCD entity classification, gene-RCD association evidence, and pipeline quality gates) is summarized in Supplementary Figure S1. Discordance between the independent classification layers is adjudicated, on the labels they share, by an independent vote and a human curator verdict that never replaces the original labels; this benchmark and the repair of internal semantic contradictions are documented in Supplementary Note S2.</w:t>
-      </w:r>
-      <w:r>
-        <w:rPr>
-          <w:rFonts w:asciiTheme="majorHAnsi" w:hAnsiTheme="majorHAnsi" w:cstheme="majorHAnsi"/>
-          <w:szCs w:val="24"/>
-          <w:highlight w:val="yellow"/>
-        </w:rPr>
-      </w:r>
-      <w:r>
-        <w:rPr>
-          <w:rFonts w:asciiTheme="majorHAnsi" w:hAnsiTheme="majorHAnsi" w:cstheme="majorHAnsi"/>
-          <w:szCs w:val="24"/>
-        </w:rPr>
-      </w:r>
-      <w:r>
-        <w:rPr>
-          <w:rFonts w:asciiTheme="majorHAnsi" w:hAnsiTheme="majorHAnsi" w:cstheme="majorHAnsi"/>
-          <w:szCs w:val="24"/>
-          <w:highlight w:val="yellow"/>
-        </w:rPr>
-      </w:r>
-      <w:r>
-        <w:rPr>
-          <w:szCs w:val="24"/>
-        </w:rPr>
-      </w:r>
-      <w:r>
-        <w:rPr>
-          <w:rFonts w:ascii="Courier New" w:hAnsi="Courier New" w:cs="Courier New"/>
-          <w:i/>
-          <w:szCs w:val="24"/>
-        </w:rPr>
-      </w:r>
-      <w:r>
-        <w:rPr>
-          <w:szCs w:val="24"/>
-        </w:rPr>
-      </w:r>
-      <w:r>
-        <w:rPr>
-          <w:rFonts w:ascii="Courier New" w:hAnsi="Courier New" w:cs="Courier New"/>
-          <w:i/>
-          <w:szCs w:val="24"/>
-        </w:rPr>
-      </w:r>
-      <w:r>
-        <w:rPr>
-          <w:szCs w:val="24"/>
-        </w:rPr>
-      </w:r>
-      <w:r>
-        <w:rPr>
-          <w:szCs w:val="24"/>
-        </w:rPr>
-      </w:r>
-      <w:r>
-        <w:rPr>
-          <w:rFonts w:ascii="Courier New" w:hAnsi="Courier New" w:cs="Courier New"/>
-          <w:i/>
-          <w:szCs w:val="24"/>
-        </w:rPr>
-      </w:r>
-      <w:r>
-        <w:rPr>
-          <w:szCs w:val="24"/>
-        </w:rPr>
-      </w:r>
-      <w:r>
-        <w:rPr>
-          <w:rFonts w:asciiTheme="majorHAnsi" w:hAnsiTheme="majorHAnsi" w:cstheme="majorHAnsi"/>
-          <w:szCs w:val="24"/>
-          <w:highlight w:val="green"/>
-        </w:rPr>
-      </w:r>
-      <w:r>
-        <w:rPr>
-          <w:rFonts w:asciiTheme="majorHAnsi" w:hAnsiTheme="majorHAnsi" w:cstheme="majorHAnsi"/>
-          <w:szCs w:val="24"/>
-        </w:rPr>
-      </w:r>
-      <w:r>
-        <w:rPr>
-          <w:rFonts w:asciiTheme="majorHAnsi" w:hAnsiTheme="majorHAnsi" w:cstheme="majorHAnsi"/>
-          <w:szCs w:val="24"/>
-          <w:highlight w:val="green"/>
-        </w:rPr>
-      </w:r>
-      <w:r>
-        <w:rPr>
-          <w:rFonts w:asciiTheme="majorHAnsi" w:hAnsiTheme="majorHAnsi" w:cstheme="majorHAnsi"/>
-          <w:szCs w:val="24"/>
-        </w:rPr>
-      </w:r>
-      <w:r>
-        <w:rPr>
-          <w:rFonts w:asciiTheme="majorHAnsi" w:hAnsiTheme="majorHAnsi" w:cstheme="majorHAnsi"/>
-          <w:szCs w:val="24"/>
-          <w:highlight w:val="green"/>
-        </w:rPr>
-      </w:r>
-      <w:r>
-        <w:rPr>
-          <w:rFonts w:asciiTheme="majorHAnsi" w:hAnsiTheme="majorHAnsi" w:cstheme="majorHAnsi"/>
-          <w:szCs w:val="24"/>
-        </w:rPr>
-      </w:r>
-      <w:r>
-        <w:rPr>
-          <w:rFonts w:asciiTheme="majorHAnsi" w:hAnsiTheme="majorHAnsi" w:cstheme="majorHAnsi"/>
-          <w:szCs w:val="24"/>
-          <w:highlight w:val="green"/>
-        </w:rPr>
-      </w:r>
-      <w:r>
-        <w:rPr>
-          <w:rFonts w:asciiTheme="majorHAnsi" w:hAnsiTheme="majorHAnsi" w:cstheme="majorHAnsi"/>
-          <w:szCs w:val="24"/>
-        </w:rPr>
-      </w:r>
-      <w:r>
-        <w:rPr>
-          <w:rFonts w:asciiTheme="majorHAnsi" w:hAnsiTheme="majorHAnsi" w:cstheme="majorHAnsi"/>
-          <w:szCs w:val="24"/>
-          <w:highlight w:val="green"/>
-        </w:rPr>
-      </w:r>
-      <w:r>
-        <w:rPr>
-          <w:rFonts w:asciiTheme="majorHAnsi" w:hAnsiTheme="majorHAnsi" w:cstheme="majorHAnsi"/>
-          <w:szCs w:val="24"/>
-        </w:rPr>
-      </w:r>
-      <w:r/>
-      <w:r>
-        <w:rPr>
-          <w:highlight w:val="green"/>
-        </w:rPr>
-      </w:r>
-      <w:r/>
+    </w:p>
+    <w:p>
+      <w:pPr>
+        <w:spacing w:after="0" w:line="240" w:lineRule="auto"/>
+        <w:rPr>
+          <w:rFonts w:asciiTheme="majorHAnsi" w:hAnsiTheme="majorHAnsi" w:cstheme="majorHAnsi"/>
+          <w:szCs w:val="24"/>
+        </w:rPr>
+      </w:pPr>
+    </w:p>
+    <w:p>
+      <w:pPr>
+        <w:spacing w:after="0" w:line="240" w:lineRule="auto"/>
+        <w:rPr>
+          <w:rFonts w:asciiTheme="majorHAnsi" w:hAnsiTheme="majorHAnsi" w:cstheme="majorHAnsi"/>
+          <w:szCs w:val="24"/>
+        </w:rPr>
+      </w:pPr>
+      <w:r>
+        <w:rPr>
+          <w:rFonts w:asciiTheme="majorHAnsi" w:hAnsiTheme="majorHAnsi" w:cstheme="majorHAnsi"/>
+          <w:szCs w:val="24"/>
+        </w:rPr>
+        <w:t xml:space="preserve">Candidate RCD forms were validated against five modality criteria (MC1–MC5) adapted from the NCCD framework {Galluzzi, 2018 #782025}: (MC1) possession of distinct molecular machinery not fully subsumed by another form; (MC2) an identifiable biochemical or biophysical trigger; (MC3) a characteristic and reproducible morphological phenotype; (MC4) explicit naming in at least one peer-reviewed publication; and (MC5) pharmacological or genetic distinguishability from other forms. Co-activation umbrellas (e.g., PANoptosis {Pandian, 2022 #783830}) and morphological descriptors without distinct mechanisms were classified as conceptual categories. Following the biological curation, admission to the modality level (L1) was additionally governed by hard biological gates (BG0–BG6) (whole-cell death, causal machinery, functional necessity/distinguishability, supportive phenotype, naming/provenance, replication/maturity, and species scope), which operationalize MC1–MC5 with BG1 (machinery) and BG2 (necessity) obligatory. The resulting five-level ontology is encoded in the unified matrix as two columns (rcdome_level and rcdome_level_name), </w:t>
+      </w:r>
+      <w:r>
+        <w:rPr>
+          <w:rFonts w:asciiTheme="majorHAnsi" w:hAnsiTheme="majorHAnsi" w:cstheme="majorHAnsi"/>
+          <w:szCs w:val="24"/>
+        </w:rPr>
+        <w:lastRenderedPageBreak/>
+        <w:t>preserving the external multi-optosis classification (rodr_category) untouched (Supplementary Table S3; Supplementary Table S4). Evidence grades in Tables S3 and S6 use the A–D scale: A, well-established (&gt;100 publications); B, established (10–100); C, emerging (2–10); D, proposed (1); N, not yet classified. The adjudication framework and its governance are documented in Supplementary Note S1; the complete evaluation architecture (RCD entity classification, gene-RCD association evidence, and pipeline quality gates) is summarized in Supplementary Figure S1. Discordance between the independent classification layers is adjudicated, on the labels they share, by an independent vote and a human curator verdict that never replaces the original labels; this benchmark and the repair of internal semantic contradictions are documented in Supplementary Note S2.</w:t>
+      </w:r>
     </w:p>
     <w:p>
       <w:pPr>
@@ -1676,56 +1458,39 @@
           <w:rFonts w:asciiTheme="majorHAnsi" w:hAnsiTheme="majorHAnsi" w:cstheme="majorHAnsi"/>
           <w:szCs w:val="24"/>
         </w:rPr>
-        <w:t>The ontological classification of all 53 entities was curated individually by a primary curator (EM-A), who read, inspected, and approved each case separately (recorded per entity as ontology_curator_verified) during a single curation session rather than through unattended batch approval. For the 20 de novo RCDome-drafted operational definitions, the primary curator read and validated each definition against its founding evidence before marking it as approved; the one composite record (Senescence and Autophagy in Cancer) was validated by the provenance of its two parent entities rather than by a founding PMID of its own. The 20 NCCD committee definitions and the 12 multi-optosis (Rodrigues 2025) definitions remained byte-identical (LOCKED-VERBATIM). Field-level evidence was established through the systematic assistant-draft/human-approval review and the Knock Test. Each ontological classification was subsequently assessed independently by two additional curators (VdSL and HACN), each reviewing all 53 entities on an entity-by-entity basis. Cases requiring reconsideration or involving disagreement among the independent assessments were jointly adjudicated by the curators, with the resulting consensus classification recorded as the final ontological assignment.</w:t>
-      </w:r>
-      <w:r>
-        <w:rPr>
-          <w:rFonts w:ascii="Courier New" w:hAnsi="Courier New" w:cs="Courier New"/>
-          <w:i/>
-          <w:szCs w:val="24"/>
-        </w:rPr>
-      </w:r>
-      <w:r>
-        <w:rPr>
-          <w:szCs w:val="24"/>
-        </w:rPr>
-      </w:r>
-      <w:r>
-        <w:rPr>
-          <w:rFonts w:ascii="Courier New" w:hAnsi="Courier New" w:cs="Courier New"/>
-          <w:i/>
-          <w:szCs w:val="24"/>
-        </w:rPr>
-      </w:r>
-      <w:r>
-        <w:rPr>
-          <w:szCs w:val="24"/>
-        </w:rPr>
-      </w:r>
-    </w:p>
-    <w:p>
-      <w:pPr>
-        <w:spacing w:after="0" w:line="240" w:lineRule="auto"/>
-        <w:rPr>
-          <w:rFonts w:asciiTheme="majorHAnsi" w:hAnsiTheme="majorHAnsi" w:cstheme="majorHAnsi"/>
-          <w:szCs w:val="24"/>
-        </w:rPr>
-      </w:pPr>
-    </w:p>
-    <w:p>
-      <w:pPr>
-        <w:spacing w:after="0" w:line="240" w:lineRule="auto"/>
-        <w:rPr>
-          <w:rFonts w:asciiTheme="majorHAnsi" w:hAnsiTheme="majorHAnsi" w:cstheme="majorHAnsi"/>
-          <w:szCs w:val="24"/>
-        </w:rPr>
-      </w:pPr>
+        <w:t xml:space="preserve">The ontological classification of all 53 entities was curated individually by a primary curator (EM-A), who read, inspected, and approved each case separately (recorded per entity as ontology_curator_verified) during a single curation session rather than through unattended batch approval. For the 20 de novo RCDome-drafted operational definitions, the primary curator read and validated each definition against its founding evidence before marking it as approved; the one composite record (Senescence and Autophagy in Cancer) was validated by the provenance of its two parent entities rather than by a founding PMID of its own. The 20 NCCD committee definitions and the 12 multi-optosis (Rodrigues 2025) definitions remained byte-identical (LOCKED-VERBATIM). Field-level evidence was established through the systematic assistant-draft/human-approval review and the Knock Test. Each ontological classification was subsequently assessed independently by two additional curators (VdSL and HACN), each reviewing all 53 entities on an entity-by-entity basis. Cases requiring reconsideration or involving disagreement among the independent assessments were jointly </w:t>
+      </w:r>
       <w:r>
         <w:rPr>
           <w:rFonts w:asciiTheme="majorHAnsi" w:hAnsiTheme="majorHAnsi" w:cstheme="majorHAnsi"/>
           <w:szCs w:val="24"/>
         </w:rPr>
         <w:lastRenderedPageBreak/>
+        <w:t>adjudicated by the curators, with the resulting consensus classification recorded as the final ontological assignment.</w:t>
+      </w:r>
+    </w:p>
+    <w:p>
+      <w:pPr>
+        <w:spacing w:after="0" w:line="240" w:lineRule="auto"/>
+        <w:rPr>
+          <w:rFonts w:asciiTheme="majorHAnsi" w:hAnsiTheme="majorHAnsi" w:cstheme="majorHAnsi"/>
+          <w:szCs w:val="24"/>
+        </w:rPr>
+      </w:pPr>
+    </w:p>
+    <w:p>
+      <w:pPr>
+        <w:spacing w:after="0" w:line="240" w:lineRule="auto"/>
+        <w:rPr>
+          <w:rFonts w:asciiTheme="majorHAnsi" w:hAnsiTheme="majorHAnsi" w:cstheme="majorHAnsi"/>
+          <w:szCs w:val="24"/>
+        </w:rPr>
+      </w:pPr>
+      <w:r>
+        <w:rPr>
+          <w:rFonts w:asciiTheme="majorHAnsi" w:hAnsiTheme="majorHAnsi" w:cstheme="majorHAnsi"/>
+          <w:szCs w:val="24"/>
+        </w:rPr>
         <w:t xml:space="preserve">Each RCD entity is represented by a 38-field record comprising three evidence layers: (i) definition: the operational definition (prose), key molecules, inflammatory status, description of overlaps, category, and year of discovery; (ii) quantified ranking: the six ranking-score criteria (RS1–RS6) and the overall score S; and (iii) provenance: the founding PMID, reference PMID and citation, primary and secondary evidence PMIDs, the authoring </w:t>
       </w:r>
       <w:r>
@@ -2069,7 +1834,7 @@
           <w:rFonts w:asciiTheme="majorHAnsi" w:hAnsiTheme="majorHAnsi" w:cstheme="majorHAnsi"/>
           <w:szCs w:val="24"/>
         </w:rPr>
-        <w:t xml:space="preserve"> the multi-optosis definitions to their primary characterization PMIDs, and the de novo definitions to their founding PMID. The 25 multi-optosis entities additionally carry their full primary and secondary evidence PMIDs from the multi-optosis reference table. Each de novo definition was corroborated against independent evidence streams, coinage (a coining verb proximal to the entity name in the founding abstract), mechanism (the drafted key molecules appearing in the founding abstract), and PubMed consensus (a fresh search returning the founding PMID). Where a founding article was open-access, the full text (PMC) was used for claim-level validation; where no PMC full text was available, full-text recovery was additionally attempted via Europe PMC, and where the article remained paywalled the Consensus academic search </w:t>
+        <w:t xml:space="preserve"> the multi-optosis definitions to their primary characterization PMIDs, and the de novo definitions to their founding PMID. The 25 multi-optosis entities additionally carry their full primary and secondary evidence PMIDs from the multi-optosis reference table. Each de novo definition was corroborated against independent evidence streams, coinage (a coining verb proximal to the entity name in the founding abstract), mechanism (the drafted key molecules appearing in the founding abstract), and PubMed consensus (a fresh search returning the founding PMID). Where a </w:t>
       </w:r>
       <w:r>
         <w:rPr>
@@ -2077,7 +1842,7 @@
           <w:szCs w:val="24"/>
         </w:rPr>
         <w:lastRenderedPageBreak/>
-        <w:t>Application Programming Interface (API) provided a full-text-derived takeaway as the richest available evidence, so that no definition was rejected on an abstract gap alone. Definitions whose founding article does not yet describe the MC2 trigger or MC3 morphology required by the NCCD logic were flagged criterion-pending, and umbrella categories were flagged umbrella-scope rather than as errors.</w:t>
+        <w:t>founding article was open-access, the full text (PMC) was used for claim-level validation; where no PMC full text was available, full-text recovery was additionally attempted via Europe PMC, and where the article remained paywalled the Consensus academic search Application Programming Interface (API) provided a full-text-derived takeaway as the richest available evidence, so that no definition was rejected on an abstract gap alone. Definitions whose founding article does not yet describe the MC2 trigger or MC3 morphology required by the NCCD logic were flagged criterion-pending, and umbrella categories were flagged umbrella-scope rather than as errors.</w:t>
       </w:r>
     </w:p>
     <w:p>
@@ -2268,6 +2033,7 @@
           <w:rFonts w:asciiTheme="majorHAnsi" w:hAnsiTheme="majorHAnsi" w:cstheme="majorHAnsi"/>
           <w:szCs w:val="24"/>
         </w:rPr>
+        <w:lastRenderedPageBreak/>
         <w:t xml:space="preserve">Channel A: Programmatic PubMed Boolean Searches. The curated gene database from </w:t>
       </w:r>
       <w:r>
@@ -2289,14 +2055,7 @@
         <w:rPr>
           <w:szCs w:val="24"/>
         </w:rPr>
-        <w:t xml:space="preserve"> served as the gene universe for Boolean queries. For each gene in the Cancer Immunome and Beyond (CIB) database, we executed PubMed E-utilities queries pairing the gene symbol with each RCD </w:t>
-      </w:r>
-      <w:r>
-        <w:rPr>
-          <w:szCs w:val="24"/>
-        </w:rPr>
-        <w:lastRenderedPageBreak/>
-        <w:t>form term and cancer-relevant filters: "[GENE]"[Gene] AND ("[</w:t>
+        <w:t xml:space="preserve"> served as the gene universe for Boolean queries. For each gene in the Cancer Immunome and Beyond (CIB) database, we executed PubMed E-utilities queries pairing the gene symbol with each RCD form term and cancer-relevant filters: "[GENE]"[Gene] AND ("[</w:t>
       </w:r>
       <w:r>
         <w:rPr>
@@ -3244,35 +3003,6 @@
         </w:rPr>
         <w:t>MSigDB was extracted through a systematic, curated process rather than a fixed gene-set list. A manual, biologically oriented curation of all 53 RCD entities in MSigDB was performed (release 2026.1), searching each entity by its normalized name plus complementary terms (e.g., APOPTOTIC, NECROPTOTIC, PYROPTOTIC) to recover gene sets that a name-only search would miss. Each of the 360 candidate gene sets was individually classified as include (251: 238 new plus 13 already present in the matrix) or exclude (109) with a documented biological rationale (RCDome_MSigDB_Manual_Curation.xlsx): inclusion prioritized gene sets representing cell-death processes, executioner machinery, or form-specific signaling/regulation, while exclusion rejected drug, cancer-type, pathogen, or expression signatures that reflect context rather than RCD machinery. Of the 238 new inclusion sets, 236 matched the MSigDB 2026.1 release and were integrated; one set (REACTOME_EXTRINSIC_PATHWAY_FOR_APOPTOSIS) was archived as an obsolete Reactome build and excluded, while another (GOBP_ACTIVATION_OF_CYSTEINE_TYPE_ENDOPEPTIDASE_ACTIVITY_INVOLVED_IN_APOPTOTIC_PROCESS) had been renamed and was superseded by its successor (GOMF_CYSTEINE_TYPE_ENDOPEPTIDASE_ACTIVATOR_ACTIVITY_INVOLVED_IN_APOPTOTIC_PROCESS). This curation contributed 2,501 genes across 4,550 gene-RCD pairs: 1,832 pairs were created as MSigDB-only rows (spanning 1,701 genes), and 2,718 pairs corroborated already-present pairs (MSigDB appended as an additional source). The extraction code (channel_b_msigdb.py) was amended to read the curated list directly, making the selection reproducible and auditable.</w:t>
       </w:r>
-      <w:r>
-        <w:rPr>
-          <w:szCs w:val="24"/>
-        </w:rPr>
-      </w:r>
-      <w:r>
-        <w:rPr>
-          <w:rFonts w:ascii="Courier New" w:hAnsi="Courier New" w:cs="Courier New"/>
-          <w:i/>
-          <w:szCs w:val="24"/>
-        </w:rPr>
-      </w:r>
-      <w:r>
-        <w:rPr>
-          <w:szCs w:val="24"/>
-        </w:rPr>
-      </w:r>
-      <w:r>
-        <w:rPr>
-          <w:rFonts w:ascii="Courier New" w:hAnsi="Courier New" w:cs="Courier New"/>
-          <w:i/>
-          <w:szCs w:val="24"/>
-        </w:rPr>
-      </w:r>
-      <w:r>
-        <w:rPr>
-          <w:szCs w:val="24"/>
-        </w:rPr>
-      </w:r>
     </w:p>
     <w:p>
       <w:pPr>
@@ -3390,6 +3120,7 @@
           <w:rFonts w:asciiTheme="majorHAnsi" w:hAnsiTheme="majorHAnsi" w:cstheme="majorHAnsi"/>
           <w:szCs w:val="24"/>
         </w:rPr>
+        <w:lastRenderedPageBreak/>
         <w:t>For each database, extraction was performed using dedicated Python scripts (</w:t>
       </w:r>
       <w:r>
@@ -3431,7 +3162,6 @@
         <w:rPr>
           <w:szCs w:val="24"/>
         </w:rPr>
-        <w:lastRenderedPageBreak/>
         <w:t xml:space="preserve">Channel C: AI-Assisted Literature Exploration. The Consensus academic search engine </w:t>
       </w:r>
       <w:r>
@@ -3660,75 +3390,37 @@
         </w:rPr>
         <w:t>Outputs from the association-producing channels (A, B, and E) were merged into a unified gene-RCD association matrix using (gene_symbol, rcd_form) as the primary merge key, preserving the original RCD form name exactly as recorded in each source database. Channels C (AI-assisted literature screening) and D (manual expert curation and conflict adjudication) acted as governance steps on these records rather than as additional association sources. A parallel rcd_form_canonical column was reserved for subsequent expert-governed unification of synonymous form names (e.g., "Entosis" to "Entotic cell death").</w:t>
       </w:r>
+    </w:p>
+    <w:p>
+      <w:pPr>
+        <w:spacing w:after="0" w:line="240" w:lineRule="auto"/>
+        <w:rPr>
+          <w:rFonts w:asciiTheme="majorHAnsi" w:hAnsiTheme="majorHAnsi" w:cstheme="majorHAnsi"/>
+          <w:szCs w:val="24"/>
+        </w:rPr>
+      </w:pPr>
+    </w:p>
+    <w:p>
+      <w:pPr>
+        <w:spacing w:after="0" w:line="240" w:lineRule="auto"/>
+        <w:rPr>
+          <w:rFonts w:asciiTheme="majorHAnsi" w:hAnsiTheme="majorHAnsi" w:cstheme="majorHAnsi"/>
+          <w:szCs w:val="24"/>
+        </w:rPr>
+      </w:pPr>
+      <w:r>
+        <w:rPr>
+          <w:rFonts w:asciiTheme="majorHAnsi" w:hAnsiTheme="majorHAnsi" w:cstheme="majorHAnsi"/>
+          <w:szCs w:val="24"/>
+        </w:rPr>
+        <w:t xml:space="preserve">Each gene-RCD association was annotated with an </w:t>
+      </w:r>
       <w:r>
         <w:rPr>
           <w:rFonts w:ascii="Courier New" w:hAnsi="Courier New" w:cs="Courier New"/>
           <w:i/>
           <w:szCs w:val="24"/>
         </w:rPr>
-      </w:r>
-      <w:r>
-        <w:rPr>
-          <w:szCs w:val="24"/>
-        </w:rPr>
-      </w:r>
-      <w:r>
-        <w:rPr>
-          <w:rFonts w:ascii="Courier New" w:hAnsi="Courier New" w:cs="Courier New"/>
-          <w:i/>
-          <w:szCs w:val="24"/>
-        </w:rPr>
-      </w:r>
-      <w:r>
-        <w:rPr>
-          <w:rFonts w:asciiTheme="majorHAnsi" w:hAnsiTheme="majorHAnsi" w:cstheme="majorHAnsi"/>
-          <w:szCs w:val="24"/>
-        </w:rPr>
-      </w:r>
-      <w:r>
-        <w:rPr>
-          <w:rFonts w:ascii="Courier New" w:hAnsi="Courier New" w:cs="Courier New"/>
-          <w:i/>
-          <w:szCs w:val="24"/>
-        </w:rPr>
-      </w:r>
-      <w:r>
-        <w:rPr>
-          <w:rFonts w:asciiTheme="majorHAnsi" w:hAnsiTheme="majorHAnsi" w:cstheme="majorHAnsi"/>
-          <w:szCs w:val="24"/>
-        </w:rPr>
-      </w:r>
-    </w:p>
-    <w:p>
-      <w:pPr>
-        <w:spacing w:after="0" w:line="240" w:lineRule="auto"/>
-        <w:rPr>
-          <w:rFonts w:asciiTheme="majorHAnsi" w:hAnsiTheme="majorHAnsi" w:cstheme="majorHAnsi"/>
-          <w:szCs w:val="24"/>
-        </w:rPr>
-      </w:pPr>
-    </w:p>
-    <w:p>
-      <w:pPr>
-        <w:spacing w:after="0" w:line="240" w:lineRule="auto"/>
-        <w:rPr>
-          <w:rFonts w:asciiTheme="majorHAnsi" w:hAnsiTheme="majorHAnsi" w:cstheme="majorHAnsi"/>
-          <w:szCs w:val="24"/>
-        </w:rPr>
-      </w:pPr>
-      <w:r>
-        <w:rPr>
-          <w:rFonts w:asciiTheme="majorHAnsi" w:hAnsiTheme="majorHAnsi" w:cstheme="majorHAnsi"/>
-          <w:szCs w:val="24"/>
-        </w:rPr>
-        <w:t xml:space="preserve">Each gene-RCD association was annotated with an </w:t>
-      </w:r>
-      <w:r>
-        <w:rPr>
-          <w:rFonts w:ascii="Courier New" w:hAnsi="Courier New" w:cs="Courier New"/>
-          <w:i/>
-          <w:szCs w:val="24"/>
-        </w:rPr>
         <w:t>evidence_quality</w:t>
       </w:r>
       <w:r>
@@ -3736,7 +3428,15 @@
           <w:rFonts w:asciiTheme="majorHAnsi" w:hAnsiTheme="majorHAnsi" w:cstheme="majorHAnsi"/>
           <w:szCs w:val="24"/>
         </w:rPr>
-        <w:t xml:space="preserve"> classification reflecting the nature of the source evidence. Associations derived from manually curated databases (FerrDB, RCDdb, iPCD, LncRCD, iLIR, HADb, HAMdb, ATD, AMT-DB, KEGG, Reactome, GO, MSigDB, ncFO) and the multi-optosis dataset were classified as curated. Associations from the NCBI Gene E-utilities API, which uses keyword-based record matching rather than explicit curation, were classified as keyword. Rows supported exclusively by keyword evidence (n = 10,857) were excluded following a spot audit that revealed 0% overlap with known RCD executioner and regulator genes. Fifteen keyword-only rows for NECSO, a newly described entity whose gene associations were available solely through the NCBI Gene keyword search at compilation time, were retained and are flagged as such in the evidence_quality column. Rows with curated-only or mixed curated+keyword evidence were retained (n = 18,991). Subsequent database integrations through the external audit (Reactome pathway-specific gene sets, WikiPathways, and XDeathDB, all classified as curated) and the Elicit Phase 3 systematic review (classified as </w:t>
+        <w:t xml:space="preserve"> classification reflecting the nature of the source evidence. Associations derived from manually curated databases (FerrDB, RCDdb, iPCD, LncRCD, iLIR, HADb, HAMdb, ATD, AMT-DB, KEGG, Reactome, GO, MSigDB, ncFO) and the multi-optosis dataset were classified as curated. </w:t>
+      </w:r>
+      <w:r>
+        <w:rPr>
+          <w:rFonts w:asciiTheme="majorHAnsi" w:hAnsiTheme="majorHAnsi" w:cstheme="majorHAnsi"/>
+          <w:szCs w:val="24"/>
+        </w:rPr>
+        <w:lastRenderedPageBreak/>
+        <w:t xml:space="preserve">Associations from the NCBI Gene E-utilities API, which uses keyword-based record matching rather than explicit curation, were classified as keyword. Rows supported exclusively by keyword evidence (n = 10,857) were excluded following a spot audit that revealed 0% overlap with known RCD executioner and regulator genes. Fifteen keyword-only rows for NECSO, a newly described entity whose gene associations were available solely through the NCBI Gene keyword search at compilation time, were retained and are flagged as such in the evidence_quality column. Rows with curated-only or mixed curated+keyword evidence were retained (n = 18,991). Subsequent database integrations through the external audit (Reactome pathway-specific gene sets, WikiPathways, and XDeathDB, all classified as curated) and the Elicit Phase 3 systematic review (classified as </w:t>
       </w:r>
       <w:r>
         <w:rPr>
@@ -3921,31 +3621,34 @@
         </w:rPr>
         <w:t xml:space="preserve">During manuscript preparation, nine additional cell death-related terms were proposed for inclusion (NECSO, Triaptosis, Mitoxyperilysis, Eryptosis, Cobaltosis, Calcioptosis, Corneoptosis, plus Pyronecrosis and Spectosis already catalogued). Each was evaluated against the same five-criteria framework. Four met the threshold for inclusion in the controlled vocabulary (NECSO, Triaptosis, Mitoxyperilysis, Eryptosis). Three further forms encountered during database discovery (Floatptosis, Lysozincrosis, and Metalloptosis) were also admitted, Floatptosis and Lysozincrosis as a cell-type program (L4) and a subtype (L2), respectively, and Metalloptosis as an umbrella term, completing the 53-entity vocabulary. An external audit subsequently integrated three additional databases (Reactome pathway-specific gene sets, WikiPathways, and XDeathDB), which contributed association records to existing entities rather than new entities (Supplementary Table S3). </w:t>
       </w:r>
-      <w:r>
+    </w:p>
+    <w:p>
+      <w:pPr>
+        <w:spacing w:after="0" w:line="240" w:lineRule="auto"/>
         <w:rPr>
           <w:rFonts w:asciiTheme="majorHAnsi" w:hAnsiTheme="majorHAnsi" w:cstheme="majorHAnsi"/>
           <w:color w:val="auto"/>
           <w:szCs w:val="24"/>
-          <w:highlight w:val="green"/>
-        </w:rPr>
-      </w:r>
-      <w:r>
+        </w:rPr>
+      </w:pPr>
+    </w:p>
+    <w:p>
+      <w:pPr>
+        <w:spacing w:after="0" w:line="240" w:lineRule="auto"/>
         <w:rPr>
           <w:rFonts w:asciiTheme="majorHAnsi" w:hAnsiTheme="majorHAnsi" w:cstheme="majorHAnsi"/>
           <w:color w:val="auto"/>
           <w:szCs w:val="24"/>
         </w:rPr>
-      </w:r>
-    </w:p>
-    <w:p>
-      <w:pPr>
-        <w:spacing w:after="0" w:line="240" w:lineRule="auto"/>
+      </w:pPr>
+      <w:r>
         <w:rPr>
           <w:rFonts w:asciiTheme="majorHAnsi" w:hAnsiTheme="majorHAnsi" w:cstheme="majorHAnsi"/>
           <w:color w:val="auto"/>
           <w:szCs w:val="24"/>
         </w:rPr>
-      </w:pPr>
+        <w:t>Three proposals were formally excluded on fundamental grounds:</w:t>
+      </w:r>
     </w:p>
     <w:p>
       <w:pPr>
@@ -3956,144 +3659,126 @@
           <w:szCs w:val="24"/>
         </w:rPr>
       </w:pPr>
-      <w:r>
+    </w:p>
+    <w:p>
+      <w:pPr>
+        <w:spacing w:after="0" w:line="240" w:lineRule="auto"/>
         <w:rPr>
           <w:rFonts w:asciiTheme="majorHAnsi" w:hAnsiTheme="majorHAnsi" w:cstheme="majorHAnsi"/>
           <w:color w:val="auto"/>
           <w:szCs w:val="24"/>
         </w:rPr>
-        <w:t>Three proposals were formally excluded on fundamental grounds:</w:t>
-      </w:r>
-    </w:p>
-    <w:p>
-      <w:pPr>
-        <w:spacing w:after="0" w:line="240" w:lineRule="auto"/>
+      </w:pPr>
+      <w:r>
         <w:rPr>
           <w:rFonts w:asciiTheme="majorHAnsi" w:hAnsiTheme="majorHAnsi" w:cstheme="majorHAnsi"/>
           <w:color w:val="auto"/>
           <w:szCs w:val="24"/>
         </w:rPr>
-      </w:pPr>
-    </w:p>
-    <w:p>
-      <w:pPr>
-        <w:spacing w:after="0" w:line="240" w:lineRule="auto"/>
+        <w:t xml:space="preserve">1. </w:t>
+      </w:r>
+      <w:r>
         <w:rPr>
           <w:rFonts w:asciiTheme="majorHAnsi" w:hAnsiTheme="majorHAnsi" w:cstheme="majorHAnsi"/>
           <w:color w:val="auto"/>
           <w:szCs w:val="24"/>
         </w:rPr>
-      </w:pPr>
-      <w:r>
+        <w:t>Cobaltosis: This term describes systemic cobalt toxicity (cobaltism) from metal-on-metal hip implants, not a genetically encoded cell death program. The cellular damage is a consequence of heavy metal poisoning, not a regulated entity with distinct molecular machinery. No unique trigger, executioner, or inhibitor distinguishes it from general metal toxicity.</w:t>
+      </w:r>
+    </w:p>
+    <w:p>
+      <w:pPr>
+        <w:spacing w:after="0" w:line="240" w:lineRule="auto"/>
         <w:rPr>
           <w:rFonts w:asciiTheme="majorHAnsi" w:hAnsiTheme="majorHAnsi" w:cstheme="majorHAnsi"/>
           <w:color w:val="auto"/>
           <w:szCs w:val="24"/>
         </w:rPr>
-        <w:t xml:space="preserve">1. </w:t>
-      </w:r>
-      <w:r>
+      </w:pPr>
+    </w:p>
+    <w:p>
+      <w:pPr>
+        <w:spacing w:after="0" w:line="240" w:lineRule="auto"/>
         <w:rPr>
           <w:rFonts w:asciiTheme="majorHAnsi" w:hAnsiTheme="majorHAnsi" w:cstheme="majorHAnsi"/>
           <w:color w:val="auto"/>
           <w:szCs w:val="24"/>
         </w:rPr>
-        <w:t>Cobaltosis: This term describes systemic cobalt toxicity (cobaltism) from metal-on-metal hip implants, not a genetically encoded cell death program. The cellular damage is a consequence of heavy metal poisoning, not a regulated entity with distinct molecular machinery. No unique trigger, executioner, or inhibitor distinguishes it from general metal toxicity.</w:t>
-      </w:r>
-    </w:p>
-    <w:p>
-      <w:pPr>
-        <w:spacing w:after="0" w:line="240" w:lineRule="auto"/>
+      </w:pPr>
+      <w:r>
         <w:rPr>
           <w:rFonts w:asciiTheme="majorHAnsi" w:hAnsiTheme="majorHAnsi" w:cstheme="majorHAnsi"/>
           <w:color w:val="auto"/>
           <w:szCs w:val="24"/>
         </w:rPr>
-      </w:pPr>
-    </w:p>
-    <w:p>
-      <w:pPr>
-        <w:spacing w:after="0" w:line="240" w:lineRule="auto"/>
+        <w:lastRenderedPageBreak/>
+        <w:t xml:space="preserve">2. </w:t>
+      </w:r>
+      <w:r>
         <w:rPr>
           <w:rFonts w:asciiTheme="majorHAnsi" w:hAnsiTheme="majorHAnsi" w:cstheme="majorHAnsi"/>
           <w:color w:val="auto"/>
           <w:szCs w:val="24"/>
         </w:rPr>
-      </w:pPr>
-      <w:r>
+        <w:t>Calcioptosis: Calcium is a universal second messenger involved in the initiation of multiple RCD forms, including apoptosis (cytochrome c release), MPT-driven necrosis (mitochondrial permeability transition), excitotoxicity, and eryptosis. Naming a distinct death form after calcium overload conflates a shared trigger with a unique entity. No molecular machinery separates proposed calcioptosis from existing Ca2+-mediated death mechanisms.</w:t>
+      </w:r>
+    </w:p>
+    <w:p>
+      <w:pPr>
+        <w:spacing w:after="0" w:line="240" w:lineRule="auto"/>
         <w:rPr>
           <w:rFonts w:asciiTheme="majorHAnsi" w:hAnsiTheme="majorHAnsi" w:cstheme="majorHAnsi"/>
           <w:color w:val="auto"/>
           <w:szCs w:val="24"/>
         </w:rPr>
-        <w:t xml:space="preserve">2. </w:t>
-      </w:r>
-      <w:r>
+      </w:pPr>
+    </w:p>
+    <w:p>
+      <w:pPr>
+        <w:spacing w:after="0" w:line="240" w:lineRule="auto"/>
         <w:rPr>
           <w:rFonts w:asciiTheme="majorHAnsi" w:hAnsiTheme="majorHAnsi" w:cstheme="majorHAnsi"/>
           <w:color w:val="auto"/>
           <w:szCs w:val="24"/>
         </w:rPr>
-        <w:t>Calcioptosis: Calcium is a universal second messenger involved in the initiation of multiple RCD forms, including apoptosis (cytochrome c release), MPT-driven necrosis (mitochondrial permeability transition), excitotoxicity, and eryptosis. Naming a distinct death form after calcium overload conflates a shared trigger with a unique entity. No molecular machinery separates proposed calcioptosis from existing Ca2+-mediated death mechanisms.</w:t>
-      </w:r>
-    </w:p>
-    <w:p>
-      <w:pPr>
-        <w:spacing w:after="0" w:line="240" w:lineRule="auto"/>
+      </w:pPr>
+      <w:r>
         <w:rPr>
           <w:rFonts w:asciiTheme="majorHAnsi" w:hAnsiTheme="majorHAnsi" w:cstheme="majorHAnsi"/>
           <w:color w:val="auto"/>
           <w:szCs w:val="24"/>
         </w:rPr>
-      </w:pPr>
-    </w:p>
-    <w:p>
-      <w:pPr>
-        <w:spacing w:after="0" w:line="240" w:lineRule="auto"/>
+        <w:t xml:space="preserve">3. </w:t>
+      </w:r>
+      <w:r>
         <w:rPr>
           <w:rFonts w:asciiTheme="majorHAnsi" w:hAnsiTheme="majorHAnsi" w:cstheme="majorHAnsi"/>
           <w:color w:val="auto"/>
           <w:szCs w:val="24"/>
         </w:rPr>
-      </w:pPr>
-      <w:r>
+        <w:t>Corneoptosis: The supporting literature describes cell death in corneal tissue across a broad temporal range (1977-2026), consistent with apoptosis and necrosis occurring in a specific anatomical context rather than a distinct RCD form. Insufficient evidence exists for unique molecular machinery, trigger, or pharmacological distinguishability.</w:t>
+      </w:r>
+    </w:p>
+    <w:p>
+      <w:pPr>
+        <w:spacing w:after="0" w:line="240" w:lineRule="auto"/>
         <w:rPr>
           <w:rFonts w:asciiTheme="majorHAnsi" w:hAnsiTheme="majorHAnsi" w:cstheme="majorHAnsi"/>
           <w:color w:val="auto"/>
           <w:szCs w:val="24"/>
         </w:rPr>
-        <w:t xml:space="preserve">3. </w:t>
-      </w:r>
-      <w:r>
+      </w:pPr>
+    </w:p>
+    <w:p>
+      <w:pPr>
+        <w:spacing w:after="0" w:line="240" w:lineRule="auto"/>
         <w:rPr>
           <w:rFonts w:asciiTheme="majorHAnsi" w:hAnsiTheme="majorHAnsi" w:cstheme="majorHAnsi"/>
           <w:color w:val="auto"/>
           <w:szCs w:val="24"/>
         </w:rPr>
-        <w:t>Corneoptosis: The supporting literature describes cell death in corneal tissue across a broad temporal range (1977-2026), consistent with apoptosis and necrosis occurring in a specific anatomical context rather than a distinct RCD form. Insufficient evidence exists for unique molecular machinery, trigger, or pharmacological distinguishability.</w:t>
-      </w:r>
-    </w:p>
-    <w:p>
-      <w:pPr>
-        <w:spacing w:after="0" w:line="240" w:lineRule="auto"/>
-        <w:rPr>
-          <w:rFonts w:asciiTheme="majorHAnsi" w:hAnsiTheme="majorHAnsi" w:cstheme="majorHAnsi"/>
-          <w:color w:val="auto"/>
-          <w:szCs w:val="24"/>
-        </w:rPr>
-      </w:pPr>
-    </w:p>
-    <w:p>
-      <w:pPr>
-        <w:spacing w:after="0" w:line="240" w:lineRule="auto"/>
-        <w:rPr>
-          <w:rFonts w:asciiTheme="majorHAnsi" w:hAnsiTheme="majorHAnsi" w:cstheme="majorHAnsi"/>
-          <w:color w:val="auto"/>
-          <w:szCs w:val="24"/>
-        </w:rPr>
-      </w:pPr>
-      <w:r>
-        <w:lastRenderedPageBreak/>
+      </w:pPr>
+      <w:r>
         <w:t xml:space="preserve">Two further terms were surfaced by post-freeze literature surveillance, which included a news feature on the expanding cell death landscape </w:t>
       </w:r>
       <w:r>
@@ -4281,14 +3966,7 @@
           <w:rFonts w:asciiTheme="majorHAnsi" w:hAnsiTheme="majorHAnsi" w:cstheme="majorHAnsi"/>
           <w:szCs w:val="24"/>
         </w:rPr>
-        <w:t xml:space="preserve">) is added as a parallel column. All normalization decisions are registered in the extraction audit log and are fully reversible. Two original name strings are mapped source-dependently to preserve source-specific classification: 'Lysosomal cell death' is resolved to 'Lysosomal cell death' (subtype) for XDeathDB rows and to 'Lysosome-dependent cell death' (modality) for iPCD rows, while 'Mitotic death' is resolved to 'Mitotic catastrophe' (trigger) for FerrDB rows </w:t>
-      </w:r>
-      <w:r>
-        <w:rPr>
-          <w:rFonts w:asciiTheme="majorHAnsi" w:hAnsiTheme="majorHAnsi" w:cstheme="majorHAnsi"/>
-          <w:szCs w:val="24"/>
-        </w:rPr>
-        <w:t xml:space="preserve">and to 'Mitotic death' (subtype) for XDeathDB and Elicit rows. The two entities are not synonyms: mitotic catastrophe is the oncosuppressive process that is not an RCD form per se, and mitotic death is the RCD outcome driven by it. The 11 synonym renames are listed in </w:t>
+        <w:t xml:space="preserve">) is added as a parallel column. All normalization decisions are registered in the extraction audit log and are fully reversible. Two original name strings are mapped source-dependently to preserve source-specific classification: 'Lysosomal cell death' is resolved to 'Lysosomal cell death' (subtype) for XDeathDB rows and to 'Lysosome-dependent cell death' (modality) for iPCD rows, while 'Mitotic death' is resolved to 'Mitotic catastrophe' (trigger) for FerrDB rows and to 'Mitotic death' (subtype) for XDeathDB and Elicit rows. The two entities are not synonyms: mitotic catastrophe is the oncosuppressive process that is not an RCD form per se, and mitotic death is the RCD outcome driven by it. The 11 synonym renames are listed in </w:t>
       </w:r>
       <w:r>
         <w:rPr>
@@ -4553,6 +4231,7 @@
           <w:bCs/>
           <w:szCs w:val="24"/>
         </w:rPr>
+        <w:lastRenderedPageBreak/>
         <w:t>Two-Call Independent Validation Architecture</w:t>
       </w:r>
     </w:p>
@@ -4641,15 +4320,7 @@
           <w:rFonts w:asciiTheme="majorHAnsi" w:hAnsiTheme="majorHAnsi" w:cstheme="majorHAnsi"/>
           <w:szCs w:val="24"/>
         </w:rPr>
-        <w:t xml:space="preserve">: PubMed E-utilities API retrieves ALL available PMIDs via paginated E-utilities queries, with no arbitrary cap on paper count. Evidence force is derived from the total paper count returned by PubMed E-search (instant, no abstract fetch required). For content verification, the first 100 most relevant abstracts (5 batches of 20) are presented to the LLM. The full paper count serves as the quantitative evidence force metric, while the LLM verification of the top papers confirms the qualitative nature of the association. This design balances comprehensive evidence quantification with computational </w:t>
-      </w:r>
-      <w:r>
-        <w:rPr>
-          <w:rFonts w:asciiTheme="majorHAnsi" w:hAnsiTheme="majorHAnsi" w:cstheme="majorHAnsi"/>
-          <w:szCs w:val="24"/>
-        </w:rPr>
-        <w:lastRenderedPageBreak/>
-        <w:t>feasibility, and presents them to the LLM with the same question. The LLM responds CONFIRMED or UNCLEAR based solely on the abstract evidence.</w:t>
+        <w:t>: PubMed E-utilities API retrieves ALL available PMIDs via paginated E-utilities queries, with no arbitrary cap on paper count. Evidence force is derived from the total paper count returned by PubMed E-search (instant, no abstract fetch required). For content verification, the first 100 most relevant abstracts (5 batches of 20) are presented to the LLM. The full paper count serves as the quantitative evidence force metric, while the LLM verification of the top papers confirms the qualitative nature of the association. This design balances comprehensive evidence quantification with computational feasibility, and presents them to the LLM with the same question. The LLM responds CONFIRMED or UNCLEAR based solely on the abstract evidence.</w:t>
       </w:r>
     </w:p>
     <w:p>
@@ -4919,7 +4590,16 @@
           <w:color w:val="auto"/>
           <w:szCs w:val="24"/>
         </w:rPr>
-        <w:t>Separately, a confidence score was computed as a weighted sum of the compilation channels (Channel D = 4, Channel B = 3, Channel A = 1, Channel C = 1) and recorded as an independent confidence tier (CT1 = 7–9, CT2 = 4–6, CT3 = 2–3, CT4 = 0–1). This confidence tier is a metric distinct from the evidence tier (ET1–ET4) defined above and must not be conflated with it. This confidence score applied only to rows carrying compilation-channel evidence (Channels A through D). The 1,874 rows contributed solely by a single database or by the Elicit validation layer lay outside this scoring universe and therefore carried no confidence tier. No row reached a score of 7 to 9, so the CT1 tier remained unpopulated.</w:t>
+        <w:t xml:space="preserve">Separately, a confidence score was computed as a weighted sum of the compilation channels (Channel D = 4, Channel B = 3, Channel A = 1, Channel C = 1) and recorded as an </w:t>
+      </w:r>
+      <w:r>
+        <w:rPr>
+          <w:rFonts w:asciiTheme="majorHAnsi" w:hAnsiTheme="majorHAnsi" w:cstheme="majorHAnsi"/>
+          <w:color w:val="auto"/>
+          <w:szCs w:val="24"/>
+        </w:rPr>
+        <w:lastRenderedPageBreak/>
+        <w:t>independent confidence tier (CT1 = 7–9, CT2 = 4–6, CT3 = 2–3, CT4 = 0–1). This confidence tier is a metric distinct from the evidence tier (ET1–ET4) defined above and must not be conflated with it. This confidence score applied only to rows carrying compilation-channel evidence (Channels A through D). The 1,874 rows contributed solely by a single database or by the Elicit validation layer lay outside this scoring universe and therefore carried no confidence tier. No row reached a score of 7 to 9, so the CT1 tier remained unpopulated.</w:t>
       </w:r>
     </w:p>
     <w:p>
@@ -5162,7 +4842,15 @@
           <w:rFonts w:asciiTheme="majorHAnsi" w:hAnsiTheme="majorHAnsi" w:cstheme="majorHAnsi"/>
           <w:szCs w:val="24"/>
         </w:rPr>
-        <w:t>Europe PMC Full-Text Search. Europe PMC indexes both abstracts and full-text articles; Phase 2B queried the Europe PMC full-text index and processed 167,868 open-access full-text articles available for XML-based analysis, enabling retrieval of gene-RCD co-occurrences hidden from PubMed's (gene[Gene]) AND (rcd[Title/Abstract]) strategy. For each non-MECHANISTIC pair, the query ({gene}) AND ({rcd}) is executed against the full-text index, returning PMIDs, PMC IDs, and total hit counts.</w:t>
+        <w:t xml:space="preserve">Europe PMC Full-Text Search. Europe PMC indexes both abstracts and full-text articles; Phase 2B queried the Europe PMC full-text index and processed 167,868 open-access full-text articles available for XML-based analysis, enabling retrieval of gene-RCD co-occurrences </w:t>
+      </w:r>
+      <w:r>
+        <w:rPr>
+          <w:rFonts w:asciiTheme="majorHAnsi" w:hAnsiTheme="majorHAnsi" w:cstheme="majorHAnsi"/>
+          <w:szCs w:val="24"/>
+        </w:rPr>
+        <w:lastRenderedPageBreak/>
+        <w:t>hidden from PubMed's (gene[Gene]) AND (rcd[Title/Abstract]) strategy. For each non-MECHANISTIC pair, the query ({gene}) AND ({rcd}) is executed against the full-text index, returning PMIDs, PMC IDs, and total hit counts.</w:t>
       </w:r>
     </w:p>
     <w:p>
@@ -5311,7 +4999,6 @@
           <w:rFonts w:asciiTheme="majorHAnsi" w:hAnsiTheme="majorHAnsi" w:cstheme="majorHAnsi"/>
           <w:szCs w:val="24"/>
         </w:rPr>
-        <w:lastRenderedPageBreak/>
         <w:t>Task 2: RCD Form Detection. For chunks containing matched gene symbols, the LLM is asked which forms of regulated cell death are discussed and which genes are linked to each form. The prompt includes the complete list of 53 RCD-related entities to guide detection. Only chunks with confirmed gene-RCD associations proceed to Task 3.</w:t>
       </w:r>
     </w:p>
@@ -5484,7 +5171,14 @@
         <w:rPr>
           <w:szCs w:val="24"/>
         </w:rPr>
-        <w:t xml:space="preserve"> and flagged for manual review. Confidence is calculated as HIGH (5 or more papers with consensus role), MEDIUM (2 or more papers or at least one DIRECT_EXPERIMENTAL), or LOW (single paper without direct experimental support). </w:t>
+        <w:t xml:space="preserve"> and flagged for manual review. </w:t>
+      </w:r>
+      <w:r>
+        <w:rPr>
+          <w:szCs w:val="24"/>
+        </w:rPr>
+        <w:lastRenderedPageBreak/>
+        <w:t xml:space="preserve">Confidence is calculated as HIGH (5 or more papers with consensus role), MEDIUM (2 or more papers or at least one DIRECT_EXPERIMENTAL), or LOW (single paper without direct experimental support). </w:t>
       </w:r>
       <w:r>
         <w:rPr>
@@ -5776,14 +5470,7 @@
         <w:rPr>
           <w:szCs w:val="24"/>
         </w:rPr>
-        <w:t xml:space="preserve">) processes all 21,283 gene-RCD pairs carrying at least one PMID. PMID-to-PMCID conversion </w:t>
-      </w:r>
-      <w:r>
-        <w:rPr>
-          <w:szCs w:val="24"/>
-        </w:rPr>
-        <w:lastRenderedPageBreak/>
-        <w:t>yields open-</w:t>
+        <w:t>) processes all 21,283 gene-RCD pairs carrying at least one PMID. PMID-to-PMCID conversion yields open-</w:t>
       </w:r>
       <w:r>
         <w:rPr>
@@ -6188,7 +5875,14 @@
         <w:rPr>
           <w:szCs w:val="24"/>
         </w:rPr>
-        <w:t xml:space="preserve">) remain untouched, preserving full traceability of the validation provenance. The pipeline is implemented as </w:t>
+        <w:t xml:space="preserve">) remain untouched, preserving full </w:t>
+      </w:r>
+      <w:r>
+        <w:rPr>
+          <w:szCs w:val="24"/>
+        </w:rPr>
+        <w:lastRenderedPageBreak/>
+        <w:t xml:space="preserve">traceability of the validation provenance. The pipeline is implemented as </w:t>
       </w:r>
       <w:r>
         <w:rPr>
@@ -6310,14 +6004,7 @@
         <w:rPr>
           <w:szCs w:val="24"/>
         </w:rPr>
-        <w:t xml:space="preserve">. Phase 2D (NCBI+DeepSeek) validated the resulting 1,341 novel unique pairs, and Phase 2E (Europe PMC+DeepSeek) performed full-text recovery on the remaining </w:t>
-      </w:r>
-      <w:r>
-        <w:rPr>
-          <w:szCs w:val="24"/>
-        </w:rPr>
-        <w:lastRenderedPageBreak/>
-        <w:t>1,724 non-MECHANISTIC pairs, recovering 588 MECHANISTIC associations through Europe PMC full-text validation.</w:t>
+        <w:t>. Phase 2D (NCBI+DeepSeek) validated the resulting 1,341 novel unique pairs, and Phase 2E (Europe PMC+DeepSeek) performed full-text recovery on the remaining 1,724 non-MECHANISTIC pairs, recovering 588 MECHANISTIC associations through Europe PMC full-text validation.</w:t>
       </w:r>
     </w:p>
     <w:p>
@@ -6360,6 +6047,30 @@
           <w:szCs w:val="24"/>
         </w:rPr>
         <w:t>The full run classified all 21,566 unique (gene, RCD-related entity) pairs using the deepseek-v4-pro model with thinking enabled and reasoning effort set to maximum. The two late-added MSigDB pairs (NLRX1 and PPIF, MPT-driven necrosis) were classified separately: their chain-of-thought columns by a five-vote mini-run, and their seven-class mechanistic classification by the Phase 2A/D two-call, yielding the final 21,568 unique pairs.</w:t>
+      </w:r>
+    </w:p>
+    <w:p>
+      <w:pPr>
+        <w:spacing w:after="0" w:line="240" w:lineRule="auto"/>
+        <w:rPr>
+          <w:rFonts w:asciiTheme="majorHAnsi" w:hAnsiTheme="majorHAnsi" w:cstheme="majorHAnsi"/>
+          <w:szCs w:val="24"/>
+        </w:rPr>
+      </w:pPr>
+    </w:p>
+    <w:p>
+      <w:pPr>
+        <w:spacing w:after="0" w:line="240" w:lineRule="auto"/>
+        <w:rPr>
+          <w:rFonts w:asciiTheme="majorHAnsi" w:hAnsiTheme="majorHAnsi" w:cstheme="majorHAnsi"/>
+          <w:szCs w:val="24"/>
+        </w:rPr>
+      </w:pPr>
+      <w:r>
+        <w:rPr>
+          <w:szCs w:val="24"/>
+        </w:rPr>
+        <w:t xml:space="preserve">Four new columns were added to the unified matrix without overwriting any Phase 2A–2E values: </w:t>
       </w:r>
       <w:r>
         <w:rPr>
@@ -6367,78 +6078,13 @@
           <w:i/>
           <w:szCs w:val="24"/>
         </w:rPr>
-      </w:r>
-      <w:r>
-        <w:rPr>
-          <w:rFonts w:asciiTheme="majorHAnsi" w:hAnsiTheme="majorHAnsi" w:cstheme="majorHAnsi"/>
-          <w:szCs w:val="24"/>
-        </w:rPr>
-      </w:r>
-      <w:r>
-        <w:rPr>
-          <w:rFonts w:asciiTheme="majorHAnsi" w:hAnsiTheme="majorHAnsi" w:cstheme="majorHAnsi"/>
-          <w:i/>
-          <w:iCs/>
-          <w:szCs w:val="24"/>
-        </w:rPr>
-      </w:r>
-      <w:r>
-        <w:rPr>
-          <w:rFonts w:asciiTheme="majorHAnsi" w:hAnsiTheme="majorHAnsi" w:cstheme="majorHAnsi"/>
-          <w:szCs w:val="24"/>
-        </w:rPr>
-      </w:r>
-      <w:r>
-        <w:rPr>
-          <w:rFonts w:asciiTheme="majorHAnsi" w:hAnsiTheme="majorHAnsi" w:cstheme="majorHAnsi"/>
-          <w:i/>
-          <w:iCs/>
-          <w:szCs w:val="24"/>
-        </w:rPr>
-      </w:r>
-      <w:r>
-        <w:rPr>
-          <w:rFonts w:asciiTheme="majorHAnsi" w:hAnsiTheme="majorHAnsi" w:cstheme="majorHAnsi"/>
-          <w:szCs w:val="24"/>
-        </w:rPr>
-      </w:r>
-      <w:r>
-        <w:rPr>
-          <w:rFonts w:asciiTheme="majorHAnsi" w:hAnsiTheme="majorHAnsi" w:cstheme="majorHAnsi"/>
-          <w:i/>
-          <w:iCs/>
-          <w:szCs w:val="24"/>
-        </w:rPr>
-      </w:r>
-      <w:r>
-        <w:rPr>
-          <w:rFonts w:asciiTheme="majorHAnsi" w:hAnsiTheme="majorHAnsi" w:cstheme="majorHAnsi"/>
-          <w:szCs w:val="24"/>
-        </w:rPr>
-      </w:r>
-    </w:p>
-    <w:p>
-      <w:pPr>
-        <w:spacing w:after="0" w:line="240" w:lineRule="auto"/>
-        <w:rPr>
-          <w:rFonts w:asciiTheme="majorHAnsi" w:hAnsiTheme="majorHAnsi" w:cstheme="majorHAnsi"/>
-          <w:szCs w:val="24"/>
-        </w:rPr>
-      </w:pPr>
-    </w:p>
-    <w:p>
-      <w:pPr>
-        <w:spacing w:after="0" w:line="240" w:lineRule="auto"/>
-        <w:rPr>
-          <w:rFonts w:asciiTheme="majorHAnsi" w:hAnsiTheme="majorHAnsi" w:cstheme="majorHAnsi"/>
-          <w:szCs w:val="24"/>
-        </w:rPr>
-      </w:pPr>
-      <w:r>
-        <w:rPr>
-          <w:szCs w:val="24"/>
-        </w:rPr>
-        <w:t xml:space="preserve">Four new columns were added to the unified matrix without overwriting any Phase 2A–2E values: </w:t>
+        <w:t>cot_role</w:t>
+      </w:r>
+      <w:r>
+        <w:rPr>
+          <w:szCs w:val="24"/>
+        </w:rPr>
+        <w:t xml:space="preserve">, </w:t>
       </w:r>
       <w:r>
         <w:rPr>
@@ -6446,7 +6092,7 @@
           <w:i/>
           <w:szCs w:val="24"/>
         </w:rPr>
-        <w:t>cot_role</w:t>
+        <w:t>cot_direction</w:t>
       </w:r>
       <w:r>
         <w:rPr>
@@ -6460,13 +6106,13 @@
           <w:i/>
           <w:szCs w:val="24"/>
         </w:rPr>
-        <w:t>cot_direction</w:t>
-      </w:r>
-      <w:r>
-        <w:rPr>
-          <w:szCs w:val="24"/>
-        </w:rPr>
-        <w:t xml:space="preserve">, </w:t>
+        <w:t>cot_mechanistic</w:t>
+      </w:r>
+      <w:r>
+        <w:rPr>
+          <w:szCs w:val="24"/>
+        </w:rPr>
+        <w:t xml:space="preserve">, and </w:t>
       </w:r>
       <w:r>
         <w:rPr>
@@ -6474,20 +6120,6 @@
           <w:i/>
           <w:szCs w:val="24"/>
         </w:rPr>
-        <w:t>cot_mechanistic</w:t>
-      </w:r>
-      <w:r>
-        <w:rPr>
-          <w:szCs w:val="24"/>
-        </w:rPr>
-        <w:t xml:space="preserve">, and </w:t>
-      </w:r>
-      <w:r>
-        <w:rPr>
-          <w:rFonts w:ascii="Courier New" w:hAnsi="Courier New" w:cs="Courier New"/>
-          <w:i/>
-          <w:szCs w:val="24"/>
-        </w:rPr>
         <w:t>cot_evidence</w:t>
       </w:r>
       <w:r>
@@ -6521,60 +6153,6 @@
         </w:rPr>
         <w:t>Post-hoc reconciliation repaired 84 self-inconsistent rows (mechanistic NO with a confident role or direction), and 231 rows with genuine role/direction uncertainty, 178 regulators with unclear direction and 53 mechanistically-involved pairs with unresolved role, were retained as unresolved rather than forced into a confident category. Two gene-RCD pairs added to the matrix after the full run (NLRX1 and PPIF with MPT-driven necrosis) were classified separately with the same logic using a five-vote majority, completing 100% pair coverage (21,568/21,568).</w:t>
       </w:r>
-      <w:r>
-        <w:rPr>
-          <w:rFonts w:asciiTheme="majorHAnsi" w:hAnsiTheme="majorHAnsi" w:cstheme="majorHAnsi"/>
-          <w:szCs w:val="24"/>
-        </w:rPr>
-      </w:r>
-      <w:r>
-        <w:rPr>
-          <w:rFonts w:asciiTheme="majorHAnsi" w:hAnsiTheme="majorHAnsi" w:cstheme="majorHAnsi"/>
-          <w:szCs w:val="24"/>
-        </w:rPr>
-      </w:r>
-      <w:r>
-        <w:rPr>
-          <w:rFonts w:asciiTheme="majorHAnsi" w:hAnsiTheme="majorHAnsi" w:cstheme="majorHAnsi"/>
-          <w:i/>
-          <w:iCs/>
-          <w:szCs w:val="24"/>
-        </w:rPr>
-      </w:r>
-      <w:r>
-        <w:rPr>
-          <w:rFonts w:asciiTheme="majorHAnsi" w:hAnsiTheme="majorHAnsi" w:cstheme="majorHAnsi"/>
-          <w:szCs w:val="24"/>
-        </w:rPr>
-      </w:r>
-      <w:r>
-        <w:rPr>
-          <w:rFonts w:asciiTheme="majorHAnsi" w:hAnsiTheme="majorHAnsi" w:cstheme="majorHAnsi"/>
-          <w:i/>
-          <w:iCs/>
-          <w:szCs w:val="24"/>
-        </w:rPr>
-      </w:r>
-      <w:r>
-        <w:rPr>
-          <w:rFonts w:asciiTheme="majorHAnsi" w:hAnsiTheme="majorHAnsi" w:cstheme="majorHAnsi"/>
-          <w:szCs w:val="24"/>
-        </w:rPr>
-      </w:r>
-      <w:r>
-        <w:rPr>
-          <w:rFonts w:asciiTheme="majorHAnsi" w:hAnsiTheme="majorHAnsi" w:cstheme="majorHAnsi"/>
-          <w:i/>
-          <w:iCs/>
-          <w:szCs w:val="24"/>
-        </w:rPr>
-      </w:r>
-      <w:r>
-        <w:rPr>
-          <w:rFonts w:asciiTheme="majorHAnsi" w:hAnsiTheme="majorHAnsi" w:cstheme="majorHAnsi"/>
-          <w:szCs w:val="24"/>
-        </w:rPr>
-      </w:r>
     </w:p>
     <w:p>
       <w:pPr>
@@ -6615,7 +6193,15 @@
           <w:rFonts w:asciiTheme="majorHAnsi" w:hAnsiTheme="majorHAnsi" w:cstheme="majorHAnsi"/>
           <w:szCs w:val="24"/>
         </w:rPr>
-        <w:t>A third, fully independent evidence channel was added through the Consensus academic search engine API. Each gene-RCD pair is queried with a neutral formulation, the gene symbol followed only by "cell death", so that the model retrieves evidence without form-name priming. The channel returns a mechanistic verdict, role, and direction, benchmarked against the 26-pair benchmark set used for the DeepSeek model-selection benchmark; seven query formulations were evaluated, and the neutral-query rule reached 100% combined accuracy with zero false positives (</w:t>
+        <w:t xml:space="preserve">A third, fully independent evidence channel was added through the Consensus academic search engine API. Each gene-RCD pair is queried with a neutral formulation, the gene symbol followed only by "cell death", so that the model retrieves evidence without form-name priming. The channel returns a mechanistic verdict, role, and direction, benchmarked against the 26-pair benchmark set used for the DeepSeek model-selection benchmark; seven </w:t>
+      </w:r>
+      <w:r>
+        <w:rPr>
+          <w:rFonts w:asciiTheme="majorHAnsi" w:hAnsiTheme="majorHAnsi" w:cstheme="majorHAnsi"/>
+          <w:szCs w:val="24"/>
+        </w:rPr>
+        <w:lastRenderedPageBreak/>
+        <w:t>query formulations were evaluated, and the neutral-query rule reached 100% combined accuracy with zero false positives (</w:t>
       </w:r>
       <w:r>
         <w:rPr>
@@ -6741,16 +6327,7 @@
           <w:bCs/>
           <w:szCs w:val="24"/>
         </w:rPr>
-        <w:t xml:space="preserve">Three RCD forms were selected to span the range of gene-set complexity in the RCDome matrix: Ferroptosis (1,724 HGNC-validated genes; a large, mechanistically well-characterized form), Cuproptosis (77 genes; a moderately studied, mechanistically distinct form), and Triaptosis (3 genes; a newly recognized form with </w:t>
-      </w:r>
-      <w:r>
-        <w:rPr>
-          <w:rFonts w:asciiTheme="majorHAnsi" w:hAnsiTheme="majorHAnsi" w:cstheme="majorHAnsi"/>
-          <w:bCs/>
-          <w:szCs w:val="24"/>
-        </w:rPr>
-        <w:lastRenderedPageBreak/>
-        <w:t>minimal literature). Each form's target gene list was extracted from the unified gene-RCD matrix and served as the closed allow-list for that form's extraction (</w:t>
+        <w:t>Three RCD forms were selected to span the range of gene-set complexity in the RCDome matrix: Ferroptosis (1,724 HGNC-validated genes; a large, mechanistically well-characterized form), Cuproptosis (77 genes; a moderately studied, mechanistically distinct form), and Triaptosis (3 genes; a newly recognized form with minimal literature). Each form's target gene list was extracted from the unified gene-RCD matrix and served as the closed allow-list for that form's extraction (</w:t>
       </w:r>
       <w:r>
         <w:rPr>
@@ -6930,7 +6507,14 @@
         <w:rPr>
           <w:szCs w:val="24"/>
         </w:rPr>
-        <w:t xml:space="preserve"> = YES` was downgraded to REGULATOR, reflecting the NCCD criterion that executioner genes must be demonstrably necessary for the death process. (Rule 4) Deduplication: records were deduplicated on (DOI, </w:t>
+        <w:t xml:space="preserve"> = YES` was downgraded to REGULATOR, reflecting the NCCD criterion that executioner genes must be demonstrably necessary for the death process. </w:t>
+      </w:r>
+      <w:r>
+        <w:rPr>
+          <w:szCs w:val="24"/>
+        </w:rPr>
+        <w:lastRenderedPageBreak/>
+        <w:t xml:space="preserve">(Rule 4) Deduplication: records were deduplicated on (DOI, </w:t>
       </w:r>
       <w:r>
         <w:rPr>
@@ -7059,16 +6643,7 @@
           <w:bCs/>
           <w:szCs w:val="24"/>
         </w:rPr>
-        <w:t xml:space="preserve">Phase 3 Elicit systematic reviews are executed in three priority tiers defined by the number of allow-list genes per RCD form in the unified matrix: P1 (≥100 genes; 20 forms), P2 (25–99 genes; 14 forms), and P3 (1–24 genes; 18 forms). A post-run reconciliation against the 53-form registry identified "Regulated Necrosis" </w:t>
-      </w:r>
-      <w:r>
-        <w:rPr>
-          <w:rFonts w:asciiTheme="majorHAnsi" w:hAnsiTheme="majorHAnsi" w:cstheme="majorHAnsi"/>
-          <w:bCs/>
-          <w:szCs w:val="24"/>
-        </w:rPr>
-        <w:lastRenderedPageBreak/>
-        <w:t>as the omitted 53rd form, which was subsequently executed as a fourth batch (P4). Prioritization by gene count is justified because the allow-list size sets the gene-discovery ceiling per extraction: a form with a larger allow-list can yield more gene-RCD associations per Elicit review, and the largest forms (e.g., Apoptosis, 5,897 genes; Ferroptosis, 1,724 genes) carry the most associations awaiting independent validation.</w:t>
+        <w:t>Phase 3 Elicit systematic reviews are executed in three priority tiers defined by the number of allow-list genes per RCD form in the unified matrix: P1 (≥100 genes; 20 forms), P2 (25–99 genes; 14 forms), and P3 (1–24 genes; 18 forms). A post-run reconciliation against the 53-form registry identified "Regulated Necrosis" as the omitted 53rd form, which was subsequently executed as a fourth batch (P4). Prioritization by gene count is justified because the allow-list size sets the gene-discovery ceiling per extraction: a form with a larger allow-list can yield more gene-RCD associations per Elicit review, and the largest forms (e.g., Apoptosis, 5,897 genes; Ferroptosis, 1,724 genes) carry the most associations awaiting independent validation.</w:t>
       </w:r>
     </w:p>
     <w:p>
@@ -7260,6 +6835,7 @@
         </w:rPr>
       </w:pPr>
       <w:r>
+        <w:lastRenderedPageBreak/>
         <w:t>RCDome Platform Architecture. The RCDome web application is a pure R Shiny application; the compendium matrix is stored as an in-memory R data file (RDS), with no external microservice or database backend. The interface comprises a Home landing page (interactive dome of the 53 entities with a gene constellation), an Explore RCDome educational guide, and the data modules Operational Definitions, Compare Definitions, RCD entities (the 53 audited descriptions with clickable PMID and DOI references), Gene Catalog (the complete matrix with a Genes view, a Direction/Role source selector, a death-core preset, and a per-entity comparison), Discrepancy Radar (the 7,895 arbitrated classifier disagreements, color-coded by concordance with GPT-4o arbitration), Discovery Timeline (the 53 entities by founding year and ontological level), 3D RCDome (a rotatable three-dimensional sphere of the entities and their gene constellations), the Digital Molecular RCD Board (an AI-assisted synthesis interface that generates governance-audited, provenance-traced reports for gene-RCD pairs, with a Q&amp;A submodule), and Network, plus an About page with data provenance.</w:t>
       </w:r>
     </w:p>
@@ -7286,25 +6862,6 @@
           <w:szCs w:val="24"/>
         </w:rPr>
         <w:t>RCDome integrates all 53 RCD-related entities from 20 source resources into a single, queryable resource encompassing 9,265 HGNC-validated human genes and 22,473 individual gene-RCD claimed associations. Every association is traceable to its source database and verified against the published literature through an automated evidence-scoring framework that assigns confidence tiers (CT1–CT4). At its core lies a curated controlled vocabulary of 53 RCD-related entities, consolidated from 62 original name strings across 20 source resources through systematic literature and database surveillance. Supplementary Table S9 compares RCDome against FerrDB v3 and RCDdb across the resources' key features. The complete codebase is available for reproducibility and independent audit of every step from database extraction to evidence verification.</w:t>
-      </w:r>
-      <w:r>
-        <w:rPr>
-          <w:rFonts w:asciiTheme="majorHAnsi" w:hAnsiTheme="majorHAnsi" w:cstheme="majorHAnsi"/>
-          <w:szCs w:val="24"/>
-        </w:rPr>
-      </w:r>
-      <w:r>
-        <w:rPr>
-          <w:rFonts w:asciiTheme="majorHAnsi" w:hAnsiTheme="majorHAnsi" w:cstheme="majorHAnsi"/>
-          <w:szCs w:val="24"/>
-          <w:highlight w:val="green"/>
-        </w:rPr>
-      </w:r>
-      <w:r>
-        <w:rPr>
-          <w:rFonts w:asciiTheme="majorHAnsi" w:hAnsiTheme="majorHAnsi" w:cstheme="majorHAnsi"/>
-          <w:szCs w:val="24"/>
-        </w:rPr>
       </w:r>
     </w:p>
     <w:p>
@@ -7421,7 +6978,15 @@
           <w:rFonts w:asciiTheme="majorHAnsi" w:hAnsiTheme="majorHAnsi" w:cstheme="majorHAnsi"/>
           <w:szCs w:val="24"/>
         </w:rPr>
-        <w:t>). This step was restricted to organization and linguistic standardization of the supplied material and was not intended to introduce additional mechanisms, molecules, or references. The harmonization framework explicitly required preservation of mechanistic uncertainty, separation of established from emerging evidence, and retention of the references supporting the source description. Each harmonized description was saved as an entity-specific plain-text (.txt) file, named according to the corresponding RCD-related entity, while the associated reference record and RIS file were retained as provenance artifacts.</w:t>
+        <w:t xml:space="preserve">). This step was restricted to organization and linguistic standardization of the supplied material and was not intended to introduce additional mechanisms, molecules, or references. The harmonization framework explicitly required preservation of mechanistic uncertainty, separation of established from emerging evidence, and retention of the references supporting the source description. Each harmonized description was saved as an entity-specific plain-text (.txt) file, named according </w:t>
+      </w:r>
+      <w:r>
+        <w:rPr>
+          <w:rFonts w:asciiTheme="majorHAnsi" w:hAnsiTheme="majorHAnsi" w:cstheme="majorHAnsi"/>
+          <w:szCs w:val="24"/>
+        </w:rPr>
+        <w:lastRenderedPageBreak/>
+        <w:t>to the corresponding RCD-related entity, while the associated reference record and RIS file were retained as provenance artifacts.</w:t>
       </w:r>
     </w:p>
     <w:p>
@@ -7501,15 +7066,7 @@
           <w:rFonts w:asciiTheme="majorHAnsi" w:hAnsiTheme="majorHAnsi" w:cstheme="majorHAnsi"/>
           <w:szCs w:val="24"/>
         </w:rPr>
-        <w:t xml:space="preserve">. In the first audit stage, the mechanistic description and corresponding figure were evaluated with Claude (Anthropic; Sonnet 5) for conceptual and mechanistic inconsistencies, including errors in causal sequence, molecular identity or localization, activation/inhibition directionality, pathway crosstalk, labeling, visual representation, and omission of biologically relevant components. The audit generated explicit element-level corrections rather than a general </w:t>
-      </w:r>
-      <w:r>
-        <w:rPr>
-          <w:rFonts w:asciiTheme="majorHAnsi" w:hAnsiTheme="majorHAnsi" w:cstheme="majorHAnsi"/>
-          <w:szCs w:val="24"/>
-        </w:rPr>
-        <w:lastRenderedPageBreak/>
-        <w:t>assessment. The resulting audit report was returned to ChatGPT, together with the original mechanistic description and figure, and used to generate a corrected version.</w:t>
+        <w:t>. In the first audit stage, the mechanistic description and corresponding figure were evaluated with Claude (Anthropic; Sonnet 5) for conceptual and mechanistic inconsistencies, including errors in causal sequence, molecular identity or localization, activation/inhibition directionality, pathway crosstalk, labeling, visual representation, and omission of biologically relevant components. The audit generated explicit element-level corrections rather than a general assessment. The resulting audit report was returned to ChatGPT, together with the original mechanistic description and figure, and used to generate a corrected version.</w:t>
       </w:r>
     </w:p>
     <w:p>
@@ -7799,6 +7356,7 @@
           <w:rFonts w:asciiTheme="majorHAnsi" w:hAnsiTheme="majorHAnsi" w:cstheme="majorHAnsi"/>
           <w:szCs w:val="24"/>
         </w:rPr>
+        <w:lastRenderedPageBreak/>
         <w:t xml:space="preserve">six omic-annotation resources (TCGA, GEO, CPTAC, CCLE, GDSC, DepMap), supplemented by the AI-assisted Elicit extraction (20 source resources, </w:t>
       </w:r>
       <w:r>
@@ -7856,19 +7414,6 @@
           <w:szCs w:val="24"/>
         </w:rPr>
         <w:t>Read at the level of mechanism, the compendium reveals a remarkably small execution core: only 469 gene-RCD pairs (4.8% of the mechanistically-involved set) are executors, genes that directly pore, cleave, or permeabilize to kill the cell, while 9,311 pairs (95.2%) are regulators that promote or inhibit death without executing it (Figure 3A). Within the compiled RCDome association universe and under the CoT classification, the mechanistically involved set is dominated by regulatory associations surrounding a comparatively small executor subset.</w:t>
-      </w:r>
-      <w:r>
-        <w:rPr>
-          <w:rFonts w:asciiTheme="majorHAnsi" w:hAnsiTheme="majorHAnsi" w:cstheme="majorHAnsi"/>
-          <w:szCs w:val="24"/>
-          <w:highlight w:val="green"/>
-        </w:rPr>
-      </w:r>
-      <w:r>
-        <w:rPr>
-          <w:rFonts w:asciiTheme="majorHAnsi" w:hAnsiTheme="majorHAnsi" w:cstheme="majorHAnsi"/>
-          <w:szCs w:val="24"/>
-        </w:rPr>
       </w:r>
     </w:p>
     <w:p>
@@ -8186,7 +7731,97 @@
         <w:rPr>
           <w:szCs w:val="24"/>
         </w:rPr>
-        <w:t>Following the consolidation, 35 of 82 matrix columns are 100% populated with traceable data. This completeness profile reflects the multi-source architecture rather than a compilation gap: the fully populated columns are those applicable to every association (gene identity, ontological placement, and classification), whereas the remaining columns are source-specific evidence fields that were filled only where the corresponding source contributed evidence. Gene biotypes, Ensembl IDs, and UniProt IDs were filled via HGNC REST API mapping. Eight Elicit-derived ontology columns (rcd type, parent relationship, operational notes) classify all 53 RCD-related entities into an evidence-anchored taxonomy with literature-justified operational notes. Five multi-optosis operational definition columns provide PMID-referenced definitions for the 25 forms for all 9,265 unique genes. Ancillary annotation columns use the sentinel value NOT_AVAILABLE for non-protein-coding genes. The Europe PMC recovery pipeline (see Material and Methods) populated 22,187 of 22,473 rows (98.7%) with at least one traceable PMID across four evidence channels (pmid_list, llm_pmids, epmc_pmids, elicit_pmids). A targeted Phase 2E extension searched Europe PMC full-text with DeepSeek LLM for all pairs lacking a co-occurrence PMID; none showed additional evidence, confirming these 286 DATABASE_ONLY (1.3%) represent the irreducible uncertainty of RCD knowledge: gene-RCD associations from curated databases with no independent verification in the indexed literature. rcd_gene_type and pmid_list remain empty only for database-only rows outside the Elicit and deep-RAG layers (17,576 and 20,102 of 22,473, respectively). No critical analytical column is empty. A formal governance contract with matrix provenance protocol ensures traceability, reproducibility, and auditability of the compendium. Separately, 19,410 rows (86.4%) were classified as non-MECHANISTIC by Phase 2A/D, prompting the development of a full-text recovery pipeline to identify hidden evidence in the literature. As a refinement of the retrieval strategy, this pipeline replaces PubMed's gene-indexed search with Europe PMC's full-text search engine.</w:t>
+        <w:t xml:space="preserve">Following the consolidation, 35 of 82 matrix columns are 100% populated with traceable data. This completeness profile reflects the multi-source architecture rather than a compilation gap: the fully populated columns are those applicable to every association (gene identity, ontological placement, and classification), whereas the remaining columns are </w:t>
+      </w:r>
+      <w:r>
+        <w:rPr>
+          <w:szCs w:val="24"/>
+        </w:rPr>
+        <w:lastRenderedPageBreak/>
+        <w:t>source-specific evidence fields that were filled only where the corresponding source contributed evidence. Gene biotypes, Ensembl IDs, and UniProt IDs were filled via HGNC REST API mapping. Eight Elicit-derived ontology columns (rcd type, parent relationship, operational notes) classify all 53 RCD-related entities into an evidence-anchored taxonomy with literature-justified operational notes. Five multi-optosis operational definition columns provide PMID-referenced definitions for the 25 forms for all 9,265 unique genes. Ancillary annotation columns use the sentinel value NOT_AVAILABLE for non-protein-coding genes. The Europe PMC recovery pipeline (see Material and Methods) populated 22,187 of 22,473 rows (98.7%) with at least one traceable PMID across four evidence channels (pmid_list, llm_pmids, epmc_pmids, elicit_pmids). A targeted Phase 2E extension searched Europe PMC full-text with DeepSeek LLM for all pairs lacking a co-occurrence PMID; none showed additional evidence, confirming these 286 DATABASE_ONLY (1.3%) represent the irreducible uncertainty of RCD knowledge: gene-RCD associations from curated databases with no independent verification in the indexed literature. rcd_gene_type and pmid_list remain empty only for database-only rows outside the Elicit and deep-RAG layers (17,576 and 20,102 of 22,473, respectively). No critical analytical column is empty. A formal governance contract with matrix provenance protocol ensures traceability, reproducibility, and auditability of the compendium. Separately, 19,410 rows (86.4%) were classified as non-MECHANISTIC by Phase 2A/D, prompting the development of a full-text recovery pipeline to identify hidden evidence in the literature. As a refinement of the retrieval strategy, this pipeline replaces PubMed's gene-indexed search with Europe PMC's full-text search engine.</w:t>
+      </w:r>
+    </w:p>
+    <w:p>
+      <w:pPr>
+        <w:spacing w:after="0" w:line="240" w:lineRule="auto"/>
+        <w:rPr>
+          <w:rFonts w:asciiTheme="majorHAnsi" w:hAnsiTheme="majorHAnsi" w:cstheme="majorHAnsi"/>
+          <w:szCs w:val="24"/>
+        </w:rPr>
+      </w:pPr>
+    </w:p>
+    <w:p>
+      <w:pPr>
+        <w:spacing w:after="0" w:line="240" w:lineRule="auto"/>
+        <w:rPr>
+          <w:rFonts w:asciiTheme="majorHAnsi" w:hAnsiTheme="majorHAnsi" w:cstheme="majorHAnsi"/>
+          <w:szCs w:val="24"/>
+        </w:rPr>
+      </w:pPr>
+      <w:r>
+        <w:rPr>
+          <w:rFonts w:asciiTheme="majorHAnsi" w:hAnsiTheme="majorHAnsi" w:cstheme="majorHAnsi"/>
+          <w:b/>
+          <w:szCs w:val="24"/>
+        </w:rPr>
+        <w:t>Phase 2A/D Validation: Scale and Coverage</w:t>
+      </w:r>
+    </w:p>
+    <w:p>
+      <w:pPr>
+        <w:spacing w:after="0" w:line="240" w:lineRule="auto"/>
+        <w:rPr>
+          <w:rFonts w:asciiTheme="majorHAnsi" w:hAnsiTheme="majorHAnsi" w:cstheme="majorHAnsi"/>
+          <w:szCs w:val="24"/>
+        </w:rPr>
+      </w:pPr>
+      <w:r>
+        <w:rPr>
+          <w:rFonts w:asciiTheme="majorHAnsi" w:hAnsiTheme="majorHAnsi" w:cstheme="majorHAnsi"/>
+          <w:szCs w:val="24"/>
+        </w:rPr>
+        <w:t>Validation was performed on all 21,568 unique gene-RCD combinations. Of the compendium's 22,473 total rows, 22,187 carry PMIDs (98.7%), corresponding to 21,283 of these 21,568 unique combinations. Each was independently validated through a two-call LLM architecture against PubMed abstracts.</w:t>
+      </w:r>
+    </w:p>
+    <w:p>
+      <w:pPr>
+        <w:spacing w:after="0" w:line="240" w:lineRule="auto"/>
+        <w:rPr>
+          <w:rFonts w:asciiTheme="majorHAnsi" w:hAnsiTheme="majorHAnsi" w:cstheme="majorHAnsi"/>
+          <w:szCs w:val="24"/>
+        </w:rPr>
+      </w:pPr>
+    </w:p>
+    <w:p>
+      <w:pPr>
+        <w:spacing w:after="0" w:line="240" w:lineRule="auto"/>
+        <w:rPr>
+          <w:rFonts w:asciiTheme="majorHAnsi" w:hAnsiTheme="majorHAnsi" w:cstheme="majorHAnsi"/>
+          <w:szCs w:val="24"/>
+        </w:rPr>
+      </w:pPr>
+      <w:r>
+        <w:rPr>
+          <w:rFonts w:asciiTheme="majorHAnsi" w:hAnsiTheme="majorHAnsi" w:cstheme="majorHAnsi"/>
+          <w:b/>
+          <w:szCs w:val="24"/>
+        </w:rPr>
+        <w:t>Validation Performance</w:t>
+      </w:r>
+    </w:p>
+    <w:p>
+      <w:pPr>
+        <w:spacing w:after="0" w:line="240" w:lineRule="auto"/>
+        <w:rPr>
+          <w:rFonts w:asciiTheme="majorHAnsi" w:hAnsiTheme="majorHAnsi" w:cstheme="majorHAnsi"/>
+          <w:szCs w:val="24"/>
+        </w:rPr>
+      </w:pPr>
+      <w:r>
+        <w:rPr>
+          <w:szCs w:val="24"/>
+        </w:rPr>
+        <w:t xml:space="preserve">The two-call majority-vote architecture reclassified evidence tiers, and the </w:t>
       </w:r>
       <w:r>
         <w:rPr>
@@ -8194,16 +7829,13 @@
           <w:i/>
           <w:szCs w:val="24"/>
         </w:rPr>
-      </w:r>
-      <w:r>
-        <w:rPr>
-          <w:szCs w:val="24"/>
-        </w:rPr>
-      </w:r>
-      <w:r>
-        <w:rPr>
-          <w:szCs w:val="24"/>
-        </w:rPr>
+        <w:t>mechanistic_class</w:t>
+      </w:r>
+      <w:r>
+        <w:rPr>
+          <w:szCs w:val="24"/>
+        </w:rPr>
+        <w:t xml:space="preserve"> versus </w:t>
       </w:r>
       <w:r>
         <w:rPr>
@@ -8211,122 +7843,23 @@
           <w:i/>
           <w:szCs w:val="24"/>
         </w:rPr>
-      </w:r>
-      <w:r>
-        <w:rPr>
-          <w:szCs w:val="24"/>
-        </w:rPr>
-      </w:r>
-      <w:r>
-        <w:rPr>
-          <w:rFonts w:ascii="Courier New" w:hAnsi="Courier New" w:cs="Courier New"/>
-          <w:i/>
-          <w:szCs w:val="24"/>
-        </w:rPr>
-      </w:r>
-      <w:r>
-        <w:rPr>
-          <w:szCs w:val="24"/>
-        </w:rPr>
-      </w:r>
-      <w:r>
-        <w:rPr>
-          <w:rFonts w:ascii="Courier New" w:hAnsi="Courier New" w:cs="Courier New"/>
-          <w:i/>
-          <w:szCs w:val="24"/>
-        </w:rPr>
-      </w:r>
-      <w:r>
-        <w:rPr>
-          <w:szCs w:val="24"/>
-        </w:rPr>
-      </w:r>
-      <w:r>
-        <w:rPr>
-          <w:rFonts w:ascii="Courier New" w:hAnsi="Courier New" w:cs="Courier New"/>
-          <w:i/>
-          <w:szCs w:val="24"/>
-        </w:rPr>
-      </w:r>
-      <w:r>
-        <w:rPr>
-          <w:szCs w:val="24"/>
-        </w:rPr>
-      </w:r>
-      <w:r>
-        <w:rPr>
-          <w:rFonts w:ascii="Courier New" w:hAnsi="Courier New" w:cs="Courier New"/>
-          <w:i/>
-          <w:szCs w:val="24"/>
-        </w:rPr>
-      </w:r>
-      <w:r>
-        <w:rPr>
-          <w:szCs w:val="24"/>
-        </w:rPr>
-      </w:r>
-      <w:r>
-        <w:rPr>
-          <w:rFonts w:ascii="Courier New" w:hAnsi="Courier New" w:cs="Courier New"/>
-          <w:i/>
-          <w:szCs w:val="24"/>
-        </w:rPr>
-      </w:r>
-      <w:r>
-        <w:rPr>
-          <w:szCs w:val="24"/>
-        </w:rPr>
-      </w:r>
-    </w:p>
-    <w:p>
-      <w:pPr>
-        <w:spacing w:after="0" w:line="240" w:lineRule="auto"/>
-        <w:rPr>
-          <w:rFonts w:asciiTheme="majorHAnsi" w:hAnsiTheme="majorHAnsi" w:cstheme="majorHAnsi"/>
-          <w:szCs w:val="24"/>
-        </w:rPr>
-      </w:pPr>
-    </w:p>
-    <w:p>
-      <w:pPr>
-        <w:spacing w:after="0" w:line="240" w:lineRule="auto"/>
-        <w:rPr>
-          <w:rFonts w:asciiTheme="majorHAnsi" w:hAnsiTheme="majorHAnsi" w:cstheme="majorHAnsi"/>
-          <w:szCs w:val="24"/>
-        </w:rPr>
-      </w:pPr>
-      <w:r>
+        <w:t>evidence_tier</w:t>
+      </w:r>
+      <w:r>
+        <w:rPr>
+          <w:szCs w:val="24"/>
+        </w:rPr>
+        <w:t xml:space="preserve"> concordance was 79.2%. The resulting tier distribution is reported below. Up to the first 100 retrieved PMIDs per pair used for content verification are retained in the unified matrix, and the full retrieved paper count is stored separately as the evidence force.</w:t>
+      </w:r>
+    </w:p>
+    <w:p>
+      <w:pPr>
+        <w:spacing w:after="0" w:line="240" w:lineRule="auto"/>
         <w:rPr>
           <w:rFonts w:asciiTheme="majorHAnsi" w:hAnsiTheme="majorHAnsi" w:cstheme="majorHAnsi"/>
           <w:b/>
           <w:szCs w:val="24"/>
         </w:rPr>
-        <w:t>Phase 2A/D Validation: Scale and Coverage</w:t>
-      </w:r>
-    </w:p>
-    <w:p>
-      <w:pPr>
-        <w:spacing w:after="0" w:line="240" w:lineRule="auto"/>
-        <w:rPr>
-          <w:rFonts w:asciiTheme="majorHAnsi" w:hAnsiTheme="majorHAnsi" w:cstheme="majorHAnsi"/>
-          <w:szCs w:val="24"/>
-        </w:rPr>
-      </w:pPr>
-      <w:r>
-        <w:rPr>
-          <w:rFonts w:asciiTheme="majorHAnsi" w:hAnsiTheme="majorHAnsi" w:cstheme="majorHAnsi"/>
-          <w:szCs w:val="24"/>
-        </w:rPr>
-        <w:t>Validation was performed on all 21,568 unique gene-RCD combinations. Of the compendium's 22,473 total rows, 22,187 carry PMIDs (98.7%), corresponding to 21,283 of these 21,568 unique combinations. Each was independently validated through a two-call LLM architecture against PubMed abstracts.</w:t>
-      </w:r>
-    </w:p>
-    <w:p>
-      <w:pPr>
-        <w:spacing w:after="0" w:line="240" w:lineRule="auto"/>
-        <w:rPr>
-          <w:rFonts w:asciiTheme="majorHAnsi" w:hAnsiTheme="majorHAnsi" w:cstheme="majorHAnsi"/>
-          <w:szCs w:val="24"/>
-        </w:rPr>
       </w:pPr>
     </w:p>
     <w:p>
@@ -8343,50 +7876,87 @@
           <w:b/>
           <w:szCs w:val="24"/>
         </w:rPr>
-        <w:t>Validation Performance</w:t>
-      </w:r>
-    </w:p>
-    <w:p>
-      <w:pPr>
-        <w:spacing w:after="0" w:line="240" w:lineRule="auto"/>
-        <w:rPr>
-          <w:rFonts w:asciiTheme="majorHAnsi" w:hAnsiTheme="majorHAnsi" w:cstheme="majorHAnsi"/>
-          <w:szCs w:val="24"/>
-        </w:rPr>
-      </w:pPr>
-      <w:r>
-        <w:rPr>
-          <w:szCs w:val="24"/>
-        </w:rPr>
-        <w:t xml:space="preserve">The two-call majority-vote architecture reclassified evidence tiers, and the </w:t>
-      </w:r>
-      <w:r>
-        <w:rPr>
-          <w:rFonts w:ascii="Courier New" w:hAnsi="Courier New" w:cs="Courier New"/>
-          <w:i/>
-          <w:szCs w:val="24"/>
-        </w:rPr>
-        <w:t>mechanistic_class</w:t>
-      </w:r>
-      <w:r>
-        <w:rPr>
-          <w:szCs w:val="24"/>
-        </w:rPr>
-        <w:t xml:space="preserve"> versus </w:t>
-      </w:r>
-      <w:r>
-        <w:rPr>
-          <w:rFonts w:ascii="Courier New" w:hAnsi="Courier New" w:cs="Courier New"/>
-          <w:i/>
-          <w:szCs w:val="24"/>
-        </w:rPr>
-        <w:t>evidence_tier</w:t>
-      </w:r>
-      <w:r>
-        <w:rPr>
-          <w:szCs w:val="24"/>
-        </w:rPr>
-        <w:t xml:space="preserve"> concordance was 79.2%. The resulting tier distribution is reported below. Up to the first 100 retrieved PMIDs per pair used for content verification are retained in the unified matrix, and the full retrieved paper count is stored separately as the evidence force.</w:t>
+        <w:t>Evidence Tier Distribution</w:t>
+      </w:r>
+    </w:p>
+    <w:p>
+      <w:pPr>
+        <w:spacing w:after="0" w:line="240" w:lineRule="auto"/>
+        <w:rPr>
+          <w:rFonts w:asciiTheme="majorHAnsi" w:hAnsiTheme="majorHAnsi" w:cstheme="majorHAnsi"/>
+          <w:szCs w:val="24"/>
+        </w:rPr>
+      </w:pPr>
+      <w:r>
+        <w:rPr>
+          <w:rFonts w:asciiTheme="majorHAnsi" w:hAnsiTheme="majorHAnsi" w:cstheme="majorHAnsi"/>
+          <w:szCs w:val="24"/>
+        </w:rPr>
+        <w:t>After Phase 2A/D validation, the unified matrix evidence tiers (as defined in Methods, Evidence Tier Assignment) were distributed across the 22,473 matrix rows as follows:</w:t>
+      </w:r>
+    </w:p>
+    <w:p>
+      <w:pPr>
+        <w:spacing w:after="0" w:line="240" w:lineRule="auto"/>
+        <w:rPr>
+          <w:rFonts w:asciiTheme="majorHAnsi" w:hAnsiTheme="majorHAnsi" w:cstheme="majorHAnsi"/>
+          <w:szCs w:val="24"/>
+        </w:rPr>
+      </w:pPr>
+      <w:r>
+        <w:rPr>
+          <w:rFonts w:asciiTheme="majorHAnsi" w:hAnsiTheme="majorHAnsi" w:cstheme="majorHAnsi"/>
+          <w:szCs w:val="24"/>
+        </w:rPr>
+        <w:t>ET1 (Gold Standard), 2,864 rows (12.7%), reflects multi-database consensus with RCDdb PMID support</w:t>
+      </w:r>
+    </w:p>
+    <w:p>
+      <w:pPr>
+        <w:spacing w:after="0" w:line="240" w:lineRule="auto"/>
+        <w:rPr>
+          <w:rFonts w:asciiTheme="majorHAnsi" w:hAnsiTheme="majorHAnsi" w:cstheme="majorHAnsi"/>
+          <w:szCs w:val="24"/>
+        </w:rPr>
+      </w:pPr>
+      <w:r>
+        <w:rPr>
+          <w:rFonts w:asciiTheme="majorHAnsi" w:hAnsiTheme="majorHAnsi" w:cstheme="majorHAnsi"/>
+          <w:szCs w:val="24"/>
+        </w:rPr>
+        <w:t>ET2 (Strong Evidence), 5,686 rows (25.3%), reflects three or more independent sources or LLM-confirmed</w:t>
+      </w:r>
+    </w:p>
+    <w:p>
+      <w:pPr>
+        <w:spacing w:after="0" w:line="240" w:lineRule="auto"/>
+        <w:rPr>
+          <w:rFonts w:asciiTheme="majorHAnsi" w:hAnsiTheme="majorHAnsi" w:cstheme="majorHAnsi"/>
+          <w:szCs w:val="24"/>
+        </w:rPr>
+      </w:pPr>
+      <w:r>
+        <w:rPr>
+          <w:rFonts w:asciiTheme="majorHAnsi" w:hAnsiTheme="majorHAnsi" w:cstheme="majorHAnsi"/>
+          <w:szCs w:val="24"/>
+        </w:rPr>
+        <w:t>ET3 (Moderate Evidence), 8,212 rows (36.5%), reflects two sources with LLM partial confirmation</w:t>
+      </w:r>
+    </w:p>
+    <w:p>
+      <w:pPr>
+        <w:spacing w:after="0" w:line="240" w:lineRule="auto"/>
+        <w:rPr>
+          <w:rFonts w:asciiTheme="majorHAnsi" w:hAnsiTheme="majorHAnsi" w:cstheme="majorHAnsi"/>
+          <w:szCs w:val="24"/>
+        </w:rPr>
+      </w:pPr>
+      <w:r>
+        <w:rPr>
+          <w:rFonts w:asciiTheme="majorHAnsi" w:hAnsiTheme="majorHAnsi" w:cstheme="majorHAnsi"/>
+          <w:szCs w:val="24"/>
+        </w:rPr>
+        <w:t>ET4 (Weak Evidence), 5,711 rows (25.4%), reflects single source without LLM confirmation, or LLM unable to verify</w:t>
       </w:r>
     </w:p>
     <w:p>
@@ -8413,113 +7983,7 @@
           <w:b/>
           <w:szCs w:val="24"/>
         </w:rPr>
-        <w:t>Evidence Tier Distribution</w:t>
-      </w:r>
-    </w:p>
-    <w:p>
-      <w:pPr>
-        <w:spacing w:after="0" w:line="240" w:lineRule="auto"/>
-        <w:rPr>
-          <w:rFonts w:asciiTheme="majorHAnsi" w:hAnsiTheme="majorHAnsi" w:cstheme="majorHAnsi"/>
-          <w:szCs w:val="24"/>
-        </w:rPr>
-      </w:pPr>
-      <w:r>
-        <w:rPr>
-          <w:rFonts w:asciiTheme="majorHAnsi" w:hAnsiTheme="majorHAnsi" w:cstheme="majorHAnsi"/>
-          <w:szCs w:val="24"/>
-        </w:rPr>
-        <w:t>After Phase 2A/D validation, the unified matrix evidence tiers (as defined in Methods, Evidence Tier Assignment) were distributed across the 22,473 matrix rows as follows:</w:t>
-      </w:r>
-    </w:p>
-    <w:p>
-      <w:pPr>
-        <w:spacing w:after="0" w:line="240" w:lineRule="auto"/>
-        <w:rPr>
-          <w:rFonts w:asciiTheme="majorHAnsi" w:hAnsiTheme="majorHAnsi" w:cstheme="majorHAnsi"/>
-          <w:szCs w:val="24"/>
-        </w:rPr>
-      </w:pPr>
-      <w:r>
-        <w:rPr>
-          <w:rFonts w:asciiTheme="majorHAnsi" w:hAnsiTheme="majorHAnsi" w:cstheme="majorHAnsi"/>
-          <w:szCs w:val="24"/>
-        </w:rPr>
-        <w:t>ET1 (Gold Standard), 2,864 rows (12.7%), reflects multi-database consensus with RCDdb PMID support</w:t>
-      </w:r>
-    </w:p>
-    <w:p>
-      <w:pPr>
-        <w:spacing w:after="0" w:line="240" w:lineRule="auto"/>
-        <w:rPr>
-          <w:rFonts w:asciiTheme="majorHAnsi" w:hAnsiTheme="majorHAnsi" w:cstheme="majorHAnsi"/>
-          <w:szCs w:val="24"/>
-        </w:rPr>
-      </w:pPr>
-      <w:r>
-        <w:rPr>
-          <w:rFonts w:asciiTheme="majorHAnsi" w:hAnsiTheme="majorHAnsi" w:cstheme="majorHAnsi"/>
-          <w:szCs w:val="24"/>
-        </w:rPr>
-        <w:t>ET2 (Strong Evidence), 5,686 rows (25.3%), reflects three or more independent sources or LLM-confirmed</w:t>
-      </w:r>
-    </w:p>
-    <w:p>
-      <w:pPr>
-        <w:spacing w:after="0" w:line="240" w:lineRule="auto"/>
-        <w:rPr>
-          <w:rFonts w:asciiTheme="majorHAnsi" w:hAnsiTheme="majorHAnsi" w:cstheme="majorHAnsi"/>
-          <w:szCs w:val="24"/>
-        </w:rPr>
-      </w:pPr>
-      <w:r>
-        <w:rPr>
-          <w:rFonts w:asciiTheme="majorHAnsi" w:hAnsiTheme="majorHAnsi" w:cstheme="majorHAnsi"/>
-          <w:szCs w:val="24"/>
-        </w:rPr>
-        <w:t>ET3 (Moderate Evidence), 8,212 rows (36.5%), reflects two sources with LLM partial confirmation</w:t>
-      </w:r>
-    </w:p>
-    <w:p>
-      <w:pPr>
-        <w:spacing w:after="0" w:line="240" w:lineRule="auto"/>
-        <w:rPr>
-          <w:rFonts w:asciiTheme="majorHAnsi" w:hAnsiTheme="majorHAnsi" w:cstheme="majorHAnsi"/>
-          <w:szCs w:val="24"/>
-        </w:rPr>
-      </w:pPr>
-      <w:r>
-        <w:rPr>
-          <w:rFonts w:asciiTheme="majorHAnsi" w:hAnsiTheme="majorHAnsi" w:cstheme="majorHAnsi"/>
-          <w:szCs w:val="24"/>
-        </w:rPr>
-        <w:t>ET4 (Weak Evidence), 5,711 rows (25.4%), reflects single source without LLM confirmation, or LLM unable to verify</w:t>
-      </w:r>
-    </w:p>
-    <w:p>
-      <w:pPr>
-        <w:spacing w:after="0" w:line="240" w:lineRule="auto"/>
-        <w:rPr>
-          <w:rFonts w:asciiTheme="majorHAnsi" w:hAnsiTheme="majorHAnsi" w:cstheme="majorHAnsi"/>
-          <w:b/>
-          <w:szCs w:val="24"/>
-        </w:rPr>
-      </w:pPr>
-    </w:p>
-    <w:p>
-      <w:pPr>
-        <w:spacing w:after="0" w:line="240" w:lineRule="auto"/>
-        <w:rPr>
-          <w:rFonts w:asciiTheme="majorHAnsi" w:hAnsiTheme="majorHAnsi" w:cstheme="majorHAnsi"/>
-          <w:szCs w:val="24"/>
-        </w:rPr>
-      </w:pPr>
-      <w:r>
-        <w:rPr>
-          <w:rFonts w:asciiTheme="majorHAnsi" w:hAnsiTheme="majorHAnsi" w:cstheme="majorHAnsi"/>
-          <w:b/>
-          <w:szCs w:val="24"/>
-        </w:rPr>
+        <w:lastRenderedPageBreak/>
         <w:t>Mechanistic Classification</w:t>
       </w:r>
     </w:p>
@@ -8544,11 +8008,7 @@
         <w:spacing w:after="0" w:line="240" w:lineRule="auto"/>
       </w:pPr>
       <w:r>
-        <w:t xml:space="preserve">Two numbers describe mechanism and are not interchangeable. The chain-of-thought classification labels a pair mechanistically involved when the model and the evidence agree, giving 45.4%. The stricter seven-class scheme reserves the label MECHANISTIC for rows </w:t>
-      </w:r>
-      <w:r>
-        <w:lastRenderedPageBreak/>
-        <w:t>validated by both LLM knowledge and PubMed abstracts in the abstract-level pass, giving 13.6%, and full-text recovery adds further mechanistic support in later phases. The difference is the stringency of the criterion, not a disagreement between the analyses. The per-row verdict shown in the Gene Catalog is the seven-class label; the 45.4% figure is an aggregate summary of the chain-of-thought run.</w:t>
+        <w:t>Two numbers describe mechanism and are not interchangeable. The chain-of-thought classification labels a pair mechanistically involved when the model and the evidence agree, giving 45.4%. The stricter seven-class scheme reserves the label MECHANISTIC for rows validated by both LLM knowledge and PubMed abstracts in the abstract-level pass, giving 13.6%, and full-text recovery adds further mechanistic support in later phases. The difference is the stringency of the criterion, not a disagreement between the analyses. The per-row verdict shown in the Gene Catalog is the seven-class label; the 45.4% figure is an aggregate summary of the chain-of-thought run.</w:t>
       </w:r>
     </w:p>
     <w:p>
@@ -8788,15 +8248,7 @@
           <w:bCs/>
           <w:szCs w:val="24"/>
         </w:rPr>
-        <w:t xml:space="preserve">). Allow-list compliance was 100%: no gene symbol outside the pre-specified form-specific lists entered the final record set, demonstrating that the post-export allow-list filter fully compensates for Elicit's tendency to extract genes beyond the instructed scope. Vocabulary compliance was 100%: all 784 records used only the permitted role vocabulary (EXECUTOR, REGULATOR, MARKER, UNCLEAR), with zero instances of non-standard terms such as SENSITIZER, RESISTANCE, or Suppressor entering the final audit. No </w:t>
-      </w:r>
-      <w:r>
-        <w:rPr>
-          <w:bCs/>
-          <w:szCs w:val="24"/>
-        </w:rPr>
-        <w:lastRenderedPageBreak/>
-        <w:t>unsupported EXECUTOR classification remained: all 192 records initially classified as EXECUTOR by Elicit were downgraded to REGULATOR by the `</w:t>
+        <w:t>). Allow-list compliance was 100%: no gene symbol outside the pre-specified form-specific lists entered the final record set, demonstrating that the post-export allow-list filter fully compensates for Elicit's tendency to extract genes beyond the instructed scope. Vocabulary compliance was 100%: all 784 records used only the permitted role vocabulary (EXECUTOR, REGULATOR, MARKER, UNCLEAR), with zero instances of non-standard terms such as SENSITIZER, RESISTANCE, or Suppressor entering the final audit. No unsupported EXECUTOR classification remained: all 192 records initially classified as EXECUTOR by Elicit were downgraded to REGULATOR by the `</w:t>
       </w:r>
       <w:r>
         <w:rPr>
@@ -8840,30 +8292,15 @@
           <w:b/>
           <w:szCs w:val="24"/>
         </w:rPr>
-        <w:t>Governance Impact. The 192 EXECUTOR downgrades (88 Ferroptosis, 104 Cuproptosis) represent the single most high-impact governance action. Without the `required_for_death` validation rule, the benchmark would have reported 192 EXECUTOR claims, none of which met the NCCD criterion of demonstrable necessity for the death process. This finding is consistent with the Cuproptosis pilot audit, where 53% of EXECUTOR classifications were inflated, and validates the utility of embedding NCCD-compliant definitions directly into the extraction governance layer rather than relying on post hoc expert review.</w:t>
-      </w:r>
-      <w:r>
-        <w:rPr>
-          <w:szCs w:val="24"/>
-        </w:rPr>
-      </w:r>
-      <w:r>
-        <w:rPr>
-          <w:rFonts w:ascii="Courier New" w:hAnsi="Courier New" w:cs="Courier New"/>
-          <w:i/>
-          <w:szCs w:val="24"/>
-        </w:rPr>
-      </w:r>
-      <w:r>
-        <w:rPr>
-          <w:szCs w:val="24"/>
-        </w:rPr>
-      </w:r>
-      <w:r>
-        <w:rPr>
-          <w:rFonts w:asciiTheme="majorHAnsi" w:hAnsiTheme="majorHAnsi" w:cstheme="majorHAnsi"/>
-          <w:szCs w:val="24"/>
-        </w:rPr>
+        <w:t xml:space="preserve">Governance Impact. </w:t>
+      </w:r>
+      <w:r>
+        <w:rPr>
+          <w:rFonts w:asciiTheme="majorHAnsi" w:hAnsiTheme="majorHAnsi" w:cstheme="majorHAnsi"/>
+          <w:bCs/>
+          <w:szCs w:val="24"/>
+        </w:rPr>
+        <w:t>The 192 EXECUTOR downgrades (88 Ferroptosis, 104 Cuproptosis) represent the single most high-impact governance action. Without the `required_for_death` validation rule, the benchmark would have reported 192 EXECUTOR claims, none of which met the NCCD criterion of demonstrable necessity for the death process. This finding is consistent with the Cuproptosis pilot audit, where 53% of EXECUTOR classifications were inflated, and validates the utility of embedding NCCD-compliant definitions directly into the extraction governance layer rather than relying on post hoc expert review.</w:t>
       </w:r>
     </w:p>
     <w:p>
@@ -9022,32 +8459,39 @@
           <w:rFonts w:asciiTheme="majorHAnsi" w:hAnsiTheme="majorHAnsi" w:cstheme="majorHAnsi"/>
           <w:szCs w:val="24"/>
         </w:rPr>
-        <w:t>To determine the production search depth, we measured how Elicit's paper yield scales with the maxResults parameter across a five-point series using Ferroptosis (1,724 allow-list genes) as the test form. Elicit's API documentation specifies a default of 200 results per search (valid range 1-10,000) subject to plan-specific limits; the Pro plan caps results at 1,000 per search and 5,000 total per review. Omitting maxResults therefore does not produce an uncapped search -- it silently applies the 200-result default. Elicit's semantic search uses vector-similarity retrieval, returning the top-N papers in descending relevance to the query.</w:t>
-      </w:r>
-    </w:p>
-    <w:p>
-      <w:pPr>
-        <w:spacing w:after="0" w:line="240" w:lineRule="auto"/>
-        <w:rPr>
-          <w:rFonts w:asciiTheme="majorHAnsi" w:hAnsiTheme="majorHAnsi" w:cstheme="majorHAnsi"/>
-          <w:szCs w:val="24"/>
-        </w:rPr>
-      </w:pPr>
-    </w:p>
-    <w:p>
-      <w:pPr>
-        <w:spacing w:after="0" w:line="240" w:lineRule="auto"/>
-        <w:rPr>
-          <w:rFonts w:asciiTheme="majorHAnsi" w:hAnsiTheme="majorHAnsi" w:cstheme="majorHAnsi"/>
-          <w:szCs w:val="24"/>
-        </w:rPr>
-      </w:pPr>
+        <w:t xml:space="preserve">To determine the production search depth, we measured how Elicit's paper yield scales with the maxResults parameter across a five-point series using Ferroptosis (1,724 allow-list genes) as the test form. Elicit's API documentation specifies a </w:t>
+      </w:r>
       <w:r>
         <w:rPr>
           <w:rFonts w:asciiTheme="majorHAnsi" w:hAnsiTheme="majorHAnsi" w:cstheme="majorHAnsi"/>
           <w:szCs w:val="24"/>
         </w:rPr>
         <w:lastRenderedPageBreak/>
+        <w:t>default of 200 results per search (valid range 1-10,000) subject to plan-specific limits; the Pro plan caps results at 1,000 per search and 5,000 total per review. Omitting maxResults therefore does not produce an uncapped search -- it silently applies the 200-result default. Elicit's semantic search uses vector-similarity retrieval, returning the top-N papers in descending relevance to the query.</w:t>
+      </w:r>
+    </w:p>
+    <w:p>
+      <w:pPr>
+        <w:spacing w:after="0" w:line="240" w:lineRule="auto"/>
+        <w:rPr>
+          <w:rFonts w:asciiTheme="majorHAnsi" w:hAnsiTheme="majorHAnsi" w:cstheme="majorHAnsi"/>
+          <w:szCs w:val="24"/>
+        </w:rPr>
+      </w:pPr>
+    </w:p>
+    <w:p>
+      <w:pPr>
+        <w:spacing w:after="0" w:line="240" w:lineRule="auto"/>
+        <w:rPr>
+          <w:rFonts w:asciiTheme="majorHAnsi" w:hAnsiTheme="majorHAnsi" w:cstheme="majorHAnsi"/>
+          <w:szCs w:val="24"/>
+        </w:rPr>
+      </w:pPr>
+      <w:r>
+        <w:rPr>
+          <w:rFonts w:asciiTheme="majorHAnsi" w:hAnsiTheme="majorHAnsi" w:cstheme="majorHAnsi"/>
+          <w:szCs w:val="24"/>
+        </w:rPr>
         <w:t>The series reveals steeply diminishing returns. The marginal gene yield declines monotonically with each depth increment: 50 to 100 adds 85 genes over 81 papers (1.05 new genes per paper), 100 to 200 adds 116 genes over 167 papers (0.69), 200 to 500 adds 212 genes over 561 papers (0.38), and 500 to 1,000 adds 157 genes over 852 papers (0.18). The default (200) captures 424 unique genes from 315 papers (1.35 genes per paper), while the Pro ceiling (1,000) captures 793 genes from 1,728 papers (0.46 genes per paper). Gene discovery therefore does not scale linearly with search depth; marginal papers increasingly re-confirm already-known associations. Production extraction was configured at maxResults=1,000 (the Pro ceiling) to maximize recall within plan limits, while noting that the default of 200 already captures 53% of the ceiling's gene yield (424/793) at 18% of the paper count (315/1,728).</w:t>
       </w:r>
     </w:p>
@@ -9073,6 +8517,185 @@
           <w:szCs w:val="24"/>
         </w:rPr>
         <w:t>The Elicit literature-mining layer yielded 4,601 gene-RCD associations across 50 RCD forms, triaged into 3,803 genuine (each carrying a body-level verbatim sentence and a DOI, with a PMID in 98.3% of cases) and 798 association_only (database-backed associations whose Elicit classification was not retained). The three forms without Elicit results were out of scope by design: Erebosis (Drosophila), Hypersensitive response (plant), and Regulated Necrosis (an umbrella term). Among the 3,803 genuine rows, the functional classification was dominated by regulators: REGULATOR 3,347; EXECUTOR 323; MARKER 119; UNCERTAIN 10; CANDIDATE_MODULE 3; and 1 unassigned. Direction of effect was predominantly PROMOTES (2,397) versus PROTECTS (963), with 1,392 genes required for death. Evidence type: GENETIC_PERTURBATION 2,079; EXPRESSION_CORRELATION 801; PHARMACOLOGICAL 670; CITATION_ONLY 3; and 250 (6.6%) unassigned, where the extraction model left the field blank because no clean evidence type was determinable from the source abstract.</w:t>
+      </w:r>
+    </w:p>
+    <w:p>
+      <w:pPr>
+        <w:spacing w:after="0" w:line="240" w:lineRule="auto"/>
+        <w:rPr>
+          <w:rFonts w:asciiTheme="majorHAnsi" w:hAnsiTheme="majorHAnsi" w:cstheme="majorHAnsi"/>
+          <w:szCs w:val="24"/>
+        </w:rPr>
+      </w:pPr>
+    </w:p>
+    <w:p>
+      <w:pPr>
+        <w:spacing w:after="0" w:line="240" w:lineRule="auto"/>
+        <w:rPr>
+          <w:rFonts w:asciiTheme="majorHAnsi" w:hAnsiTheme="majorHAnsi" w:cstheme="majorHAnsi"/>
+          <w:szCs w:val="24"/>
+        </w:rPr>
+      </w:pPr>
+      <w:r>
+        <w:rPr>
+          <w:rFonts w:asciiTheme="majorHAnsi" w:hAnsiTheme="majorHAnsi" w:cstheme="majorHAnsi"/>
+          <w:szCs w:val="24"/>
+        </w:rPr>
+        <w:t>Phase 2B processed 167,868 free PMC full-text articles across 21,283 gene-RCD pairs carrying at least one PMID, yielding deep evidence for 1,383 rows (1,118 unique pairs). Deep evidence is full-text, sentence-level support: for each pair, the pipeline recorded the papers examined (open-access versus paywalled), the strongest verbatim body sentence, the functional role, the evidence type, the direction of effect, a multi-paper confidence tier, and the proportion of papers with direct experimental support. Functional roles were dominated by regulators (878), followed by markers (297), interactors (88), executors (78), and substrates (42). Evidence strength was expression-correlation (529), genetic intervention (371), citation-only (304), direct experimental (139), and pharmacological (40). Confidence was low for 821 pairs, medium for 366, and high for 196. Direction was promoting (492) versus inhibiting (390), with 430 unknown, 70 context-dependent, and one row without a recorded direction. Because deep evidence only upgrades or confirms, never downgrades, it promoted 142 gene-RCD pairs from a moderate to a strong evidence tier and elevated 131 pairs from a literature-gap to a mechanistic classification. These promotions are conservative by design: the deep layer strengthens a claim only when the full-text body independently supports it, leaving all weaker or uncertain classifications untouched.</w:t>
+      </w:r>
+    </w:p>
+    <w:p>
+      <w:pPr>
+        <w:spacing w:after="0" w:line="240" w:lineRule="auto"/>
+        <w:rPr>
+          <w:rFonts w:asciiTheme="majorHAnsi" w:hAnsiTheme="majorHAnsi" w:cstheme="majorHAnsi"/>
+          <w:szCs w:val="24"/>
+        </w:rPr>
+      </w:pPr>
+    </w:p>
+    <w:p>
+      <w:pPr>
+        <w:spacing w:after="0" w:line="240" w:lineRule="auto"/>
+        <w:rPr>
+          <w:rFonts w:asciiTheme="majorHAnsi" w:hAnsiTheme="majorHAnsi" w:cstheme="majorHAnsi"/>
+          <w:szCs w:val="24"/>
+        </w:rPr>
+      </w:pPr>
+      <w:r>
+        <w:rPr>
+          <w:rFonts w:asciiTheme="majorHAnsi" w:hAnsiTheme="majorHAnsi" w:cstheme="majorHAnsi"/>
+          <w:szCs w:val="24"/>
+        </w:rPr>
+        <w:t>Phase 2C full-text Europe PMC recovery added 3,058 MECHANISTIC classifications, in addition to the 3,063 MECHANISTIC rows from Phase 2A/D abstract validation.</w:t>
+      </w:r>
+    </w:p>
+    <w:p>
+      <w:pPr>
+        <w:spacing w:after="0" w:line="240" w:lineRule="auto"/>
+        <w:rPr>
+          <w:rFonts w:asciiTheme="majorHAnsi" w:hAnsiTheme="majorHAnsi" w:cstheme="majorHAnsi"/>
+          <w:szCs w:val="24"/>
+        </w:rPr>
+      </w:pPr>
+      <w:r>
+        <w:rPr>
+          <w:rFonts w:asciiTheme="majorHAnsi" w:hAnsiTheme="majorHAnsi" w:cstheme="majorHAnsi"/>
+          <w:szCs w:val="24"/>
+        </w:rPr>
+        <w:t>Across the two evidence layers, the deep full-text pipeline and the Elicit systematic review corroborated 387 gene-RCD pairs jointly, out of 4,863 unique pairs covered by at least one of the two layers: 1,118 pairs had deep full-text evidence and 4,132 had Elicit evidence. The two layers drew on nearly disjoint literature, with 1,013 unique full-text papers in the deep layer versus 8,253 PMIDs and 9,146 DOIs in the Elicit layer, totaling 10,138 unique papers. Only 21 papers were cited by both layers, confirming that the 387 jointly corroborated pairs rest on independent rather than redundant literature. Overall, the AI evidence layers covered 4,169 gene-RCD pairs (19.3% of the compendium's unique pairs) with genuine verbatim support, rising to 4,863 (22.5%) when association-only claims are included.</w:t>
+      </w:r>
+    </w:p>
+    <w:p>
+      <w:pPr>
+        <w:spacing w:after="0" w:line="240" w:lineRule="auto"/>
+        <w:rPr>
+          <w:rFonts w:asciiTheme="majorHAnsi" w:hAnsiTheme="majorHAnsi" w:cstheme="majorHAnsi"/>
+          <w:szCs w:val="24"/>
+        </w:rPr>
+      </w:pPr>
+    </w:p>
+    <w:p>
+      <w:pPr>
+        <w:spacing w:after="0" w:line="240" w:lineRule="auto"/>
+        <w:rPr>
+          <w:rFonts w:asciiTheme="majorHAnsi" w:hAnsiTheme="majorHAnsi" w:cstheme="majorHAnsi"/>
+          <w:szCs w:val="24"/>
+        </w:rPr>
+      </w:pPr>
+      <w:r>
+        <w:rPr>
+          <w:rFonts w:asciiTheme="majorHAnsi" w:hAnsiTheme="majorHAnsi" w:cstheme="majorHAnsi"/>
+          <w:szCs w:val="24"/>
+        </w:rPr>
+        <w:t>The 387 jointly corroborated pairs were strongly enriched for high confidence: 211 (54.5%) carried the strongest evidence tier and 235 (60.7%) were classified as mechanistic, with 145 (37.5%) meeting both criteria simultaneously. Functional roles were dominated by regulators (243; 62.8%), followed by markers (79), executors (33), interactors (23), and substrates (9). Most (334; 86.3%) were genuine Elicit findings, with 53 (13.7%) association-only. Dual-layer agreement therefore concentrates the highest-confidence, mechanistically characterized links: a 4.3-fold enrichment of strong-tier and a 4.5-fold enrichment of mechanistic pairs relative to the compendium as a whole.</w:t>
+      </w:r>
+    </w:p>
+    <w:p>
+      <w:pPr>
+        <w:spacing w:after="0" w:line="240" w:lineRule="auto"/>
+        <w:rPr>
+          <w:rFonts w:asciiTheme="majorHAnsi" w:hAnsiTheme="majorHAnsi" w:cstheme="majorHAnsi"/>
+          <w:szCs w:val="24"/>
+        </w:rPr>
+      </w:pPr>
+    </w:p>
+    <w:p>
+      <w:pPr>
+        <w:spacing w:after="0" w:line="240" w:lineRule="auto"/>
+        <w:rPr>
+          <w:rFonts w:asciiTheme="majorHAnsi" w:hAnsiTheme="majorHAnsi" w:cstheme="majorHAnsi"/>
+          <w:color w:val="EE0000"/>
+          <w:szCs w:val="24"/>
+        </w:rPr>
+      </w:pPr>
+      <w:r>
+        <w:rPr>
+          <w:rFonts w:asciiTheme="majorHAnsi" w:hAnsiTheme="majorHAnsi" w:cstheme="majorHAnsi"/>
+          <w:b/>
+          <w:bCs/>
+          <w:szCs w:val="24"/>
+        </w:rPr>
+        <w:t>Governance Literature Survey Results</w:t>
+      </w:r>
+      <w:r>
+        <w:rPr>
+          <w:rFonts w:asciiTheme="majorHAnsi" w:hAnsiTheme="majorHAnsi" w:cstheme="majorHAnsi"/>
+          <w:szCs w:val="24"/>
+        </w:rPr>
+        <w:t>. The survey recovered 27,852 verbatim-anchored items from 1,308 papers, synthesized into 419 themes, of which 255 were AI-governance, 71 human-clinical (excluded), and 93 ambiguous. The AI-relevant literature converged on five recurring principles, evaluation and benchmarking, detection and mitigation, human oversight and accountability, transparency and explainability, and ethics and regulation, all of which RCDome implements (exact-string verification, curator flags, provenance traceability, the five-gate benchmark, and the governance contract). No single consensus framework exists: 78% of extracted themes appear in a single paper, positioning RCDome's explicit governance as an early, principled implementation rather than a follower of a mature standard. The full ranked governance framework (51 themes with supporting PMIDs) is provided in the study GitHub repository.</w:t>
+      </w:r>
+    </w:p>
+    <w:p>
+      <w:pPr>
+        <w:spacing w:after="0" w:line="240" w:lineRule="auto"/>
+        <w:rPr>
+          <w:rFonts w:asciiTheme="majorHAnsi" w:hAnsiTheme="majorHAnsi" w:cstheme="majorHAnsi"/>
+          <w:szCs w:val="24"/>
+        </w:rPr>
+      </w:pPr>
+    </w:p>
+    <w:p>
+      <w:pPr>
+        <w:spacing w:after="0" w:line="240" w:lineRule="auto"/>
+        <w:rPr>
+          <w:rFonts w:asciiTheme="majorHAnsi" w:hAnsiTheme="majorHAnsi" w:cstheme="majorHAnsi"/>
+          <w:color w:val="EE0000"/>
+          <w:szCs w:val="24"/>
+        </w:rPr>
+      </w:pPr>
+      <w:r>
+        <w:rPr>
+          <w:rFonts w:asciiTheme="majorHAnsi" w:hAnsiTheme="majorHAnsi" w:cstheme="majorHAnsi"/>
+          <w:b/>
+          <w:bCs/>
+          <w:szCs w:val="24"/>
+        </w:rPr>
+        <w:t>Model-selection benchmark (</w:t>
+      </w:r>
+      <w:r>
+        <w:rPr>
+          <w:rFonts w:asciiTheme="majorHAnsi" w:hAnsiTheme="majorHAnsi" w:cstheme="majorHAnsi"/>
+          <w:b/>
+          <w:bCs/>
+          <w:szCs w:val="24"/>
+          <w:highlight w:val="green"/>
+        </w:rPr>
+        <w:t>Supplementary Note S5</w:t>
+      </w:r>
+      <w:r>
+        <w:rPr>
+          <w:rFonts w:asciiTheme="majorHAnsi" w:hAnsiTheme="majorHAnsi" w:cstheme="majorHAnsi"/>
+          <w:b/>
+          <w:bCs/>
+          <w:szCs w:val="24"/>
+        </w:rPr>
+        <w:t xml:space="preserve">). </w:t>
+      </w:r>
+      <w:r>
+        <w:rPr>
+          <w:szCs w:val="24"/>
+        </w:rPr>
+        <w:t xml:space="preserve">To select the functional-role classifier, three models were benchmarked on 26 well-established gene-RCD pairs (10 executors, 8 regulators, and 8 negative controls): the baseline </w:t>
       </w:r>
       <w:r>
         <w:rPr>
@@ -9080,11 +8703,13 @@
           <w:i/>
           <w:szCs w:val="24"/>
         </w:rPr>
-      </w:r>
-      <w:r>
-        <w:rPr>
-          <w:szCs w:val="24"/>
-        </w:rPr>
+        <w:t>deepseek-chat</w:t>
+      </w:r>
+      <w:r>
+        <w:rPr>
+          <w:szCs w:val="24"/>
+        </w:rPr>
+        <w:t xml:space="preserve"> (81% combined accuracy, 38% false positives) and chain-of-thought </w:t>
       </w:r>
       <w:r>
         <w:rPr>
@@ -9092,226 +8717,20 @@
           <w:i/>
           <w:szCs w:val="24"/>
         </w:rPr>
-      </w:r>
-      <w:r>
-        <w:rPr>
-          <w:szCs w:val="24"/>
-        </w:rPr>
-      </w:r>
-    </w:p>
-    <w:p>
-      <w:pPr>
-        <w:spacing w:after="0" w:line="240" w:lineRule="auto"/>
-        <w:rPr>
-          <w:rFonts w:asciiTheme="majorHAnsi" w:hAnsiTheme="majorHAnsi" w:cstheme="majorHAnsi"/>
-          <w:szCs w:val="24"/>
-        </w:rPr>
-      </w:pPr>
-    </w:p>
-    <w:p>
-      <w:pPr>
-        <w:spacing w:after="0" w:line="240" w:lineRule="auto"/>
-        <w:rPr>
-          <w:rFonts w:asciiTheme="majorHAnsi" w:hAnsiTheme="majorHAnsi" w:cstheme="majorHAnsi"/>
-          <w:szCs w:val="24"/>
-        </w:rPr>
-      </w:pPr>
-      <w:r>
-        <w:rPr>
-          <w:rFonts w:asciiTheme="majorHAnsi" w:hAnsiTheme="majorHAnsi" w:cstheme="majorHAnsi"/>
-          <w:szCs w:val="24"/>
-        </w:rPr>
-        <w:t>Phase 2B processed 167,868 free PMC full-text articles across 21,283 gene-RCD pairs carrying at least one PMID, yielding deep evidence for 1,383 rows (1,118 unique pairs). Deep evidence is full-text, sentence-level support: for each pair, the pipeline recorded the papers examined (open-access versus paywalled), the strongest verbatim body sentence, the functional role, the evidence type, the direction of effect, a multi-paper confidence tier, and the proportion of papers with direct experimental support. Functional roles were dominated by regulators (878), followed by markers (297), interactors (88), executors (78), and substrates (42). Evidence strength was expression-correlation (529), genetic intervention (371), citation-only (304), direct experimental (139), and pharmacological (40). Confidence was low for 821 pairs, medium for 366, and high for 196. Direction was promoting (492) versus inhibiting (390), with 430 unknown, 70 context-dependent, and one row without a recorded direction. Because deep evidence only upgrades or confirms, never downgrades, it promoted 142 gene-RCD pairs from a moderate to a strong evidence tier and elevated 131 pairs from a literature-gap to a mechanistic classification. These promotions are conservative by design: the deep layer strengthens a claim only when the full-text body independently supports it, leaving all weaker or uncertain classifications untouched.</w:t>
-      </w:r>
-    </w:p>
-    <w:p>
-      <w:pPr>
-        <w:spacing w:after="0" w:line="240" w:lineRule="auto"/>
-        <w:rPr>
-          <w:rFonts w:asciiTheme="majorHAnsi" w:hAnsiTheme="majorHAnsi" w:cstheme="majorHAnsi"/>
-          <w:szCs w:val="24"/>
-        </w:rPr>
-      </w:pPr>
-    </w:p>
-    <w:p>
-      <w:pPr>
-        <w:spacing w:after="0" w:line="240" w:lineRule="auto"/>
-        <w:rPr>
-          <w:rFonts w:asciiTheme="majorHAnsi" w:hAnsiTheme="majorHAnsi" w:cstheme="majorHAnsi"/>
-          <w:szCs w:val="24"/>
-        </w:rPr>
-      </w:pPr>
-      <w:r>
-        <w:rPr>
-          <w:rFonts w:asciiTheme="majorHAnsi" w:hAnsiTheme="majorHAnsi" w:cstheme="majorHAnsi"/>
-          <w:szCs w:val="24"/>
-        </w:rPr>
-        <w:t>Phase 2C full-text Europe PMC recovery added 3,058 MECHANISTIC classifications, in addition to the 3,063 MECHANISTIC rows from Phase 2A/D abstract validation.</w:t>
-      </w:r>
-    </w:p>
-    <w:p>
-      <w:pPr>
-        <w:spacing w:after="0" w:line="240" w:lineRule="auto"/>
-        <w:rPr>
-          <w:rFonts w:asciiTheme="majorHAnsi" w:hAnsiTheme="majorHAnsi" w:cstheme="majorHAnsi"/>
-          <w:szCs w:val="24"/>
-        </w:rPr>
-      </w:pPr>
-      <w:r>
-        <w:rPr>
-          <w:rFonts w:asciiTheme="majorHAnsi" w:hAnsiTheme="majorHAnsi" w:cstheme="majorHAnsi"/>
-          <w:szCs w:val="24"/>
-        </w:rPr>
-        <w:t xml:space="preserve">Across the two evidence layers, the deep full-text pipeline and the Elicit systematic review corroborated 387 gene-RCD pairs jointly, out of 4,863 unique pairs covered by at least one of the two layers: 1,118 pairs had deep full-text evidence and 4,132 had Elicit evidence. The two layers drew on nearly disjoint literature, with 1,013 unique full-text papers in the deep layer versus 8,253 PMIDs and 9,146 DOIs in the Elicit layer, totaling 10,138 unique papers. </w:t>
-      </w:r>
-      <w:r>
-        <w:rPr>
-          <w:rFonts w:asciiTheme="majorHAnsi" w:hAnsiTheme="majorHAnsi" w:cstheme="majorHAnsi"/>
+        <w:t>deepseek-reasoner</w:t>
+      </w:r>
+      <w:r>
+        <w:rPr>
+          <w:szCs w:val="24"/>
+        </w:rPr>
+        <w:t xml:space="preserve"> (73%, 25%). A governance-augmented tool-call loop with a hand-curated reference covering the 18 unique positive genes achieved 100% combined accuracy and zero false positives on all 26 pairs (the 18 positives plus 8 form-mismatch negatives), but that reference covers only a small fraction of the compendium (about 5% of pairs have a complete role, direction, and mechanistic classification to reference). A self-provided version of the same loop, which instead makes the model state its own molecular mechanism, known RCD forms, and the specific form its role belongs to, then self-checks those statements, also achieved 100% combined accuracy and zero false positives without any external reference. Because it is fully independent and scalable, the self-provided loop was adopted as the role-classification </w:t>
+      </w:r>
+      <w:r>
+        <w:rPr>
           <w:szCs w:val="24"/>
         </w:rPr>
         <w:lastRenderedPageBreak/>
-        <w:t>Only 21 papers were cited by both layers, confirming that the 387 jointly corroborated pairs rest on independent rather than redundant literature. Overall, the AI evidence layers covered 4,169 gene-RCD pairs (19.3% of the compendium's unique pairs) with genuine verbatim support, rising to 4,863 (22.5%) when association-only claims are included.</w:t>
-      </w:r>
-    </w:p>
-    <w:p>
-      <w:pPr>
-        <w:spacing w:after="0" w:line="240" w:lineRule="auto"/>
-        <w:rPr>
-          <w:rFonts w:asciiTheme="majorHAnsi" w:hAnsiTheme="majorHAnsi" w:cstheme="majorHAnsi"/>
-          <w:szCs w:val="24"/>
-        </w:rPr>
-      </w:pPr>
-    </w:p>
-    <w:p>
-      <w:pPr>
-        <w:spacing w:after="0" w:line="240" w:lineRule="auto"/>
-        <w:rPr>
-          <w:rFonts w:asciiTheme="majorHAnsi" w:hAnsiTheme="majorHAnsi" w:cstheme="majorHAnsi"/>
-          <w:szCs w:val="24"/>
-        </w:rPr>
-      </w:pPr>
-      <w:r>
-        <w:rPr>
-          <w:rFonts w:asciiTheme="majorHAnsi" w:hAnsiTheme="majorHAnsi" w:cstheme="majorHAnsi"/>
-          <w:szCs w:val="24"/>
-        </w:rPr>
-        <w:t>The 387 jointly corroborated pairs were strongly enriched for high confidence: 211 (54.5%) carried the strongest evidence tier and 235 (60.7%) were classified as mechanistic, with 145 (37.5%) meeting both criteria simultaneously. Functional roles were dominated by regulators (243; 62.8%), followed by markers (79), executors (33), interactors (23), and substrates (9). Most (334; 86.3%) were genuine Elicit findings, with 53 (13.7%) association-only. Dual-layer agreement therefore concentrates the highest-confidence, mechanistically characterized links: a 4.3-fold enrichment of strong-tier and a 4.5-fold enrichment of mechanistic pairs relative to the compendium as a whole.</w:t>
-      </w:r>
-    </w:p>
-    <w:p>
-      <w:pPr>
-        <w:spacing w:after="0" w:line="240" w:lineRule="auto"/>
-        <w:rPr>
-          <w:rFonts w:asciiTheme="majorHAnsi" w:hAnsiTheme="majorHAnsi" w:cstheme="majorHAnsi"/>
-          <w:szCs w:val="24"/>
-        </w:rPr>
-      </w:pPr>
-    </w:p>
-    <w:p>
-      <w:pPr>
-        <w:spacing w:after="0" w:line="240" w:lineRule="auto"/>
-        <w:rPr>
-          <w:rFonts w:asciiTheme="majorHAnsi" w:hAnsiTheme="majorHAnsi" w:cstheme="majorHAnsi"/>
-          <w:color w:val="EE0000"/>
-          <w:szCs w:val="24"/>
-        </w:rPr>
-      </w:pPr>
-      <w:r>
-        <w:rPr>
-          <w:rFonts w:asciiTheme="majorHAnsi" w:hAnsiTheme="majorHAnsi" w:cstheme="majorHAnsi"/>
-          <w:b/>
-          <w:bCs/>
-          <w:szCs w:val="24"/>
-        </w:rPr>
-        <w:t>Governance Literature Survey Results</w:t>
-      </w:r>
-      <w:r>
-        <w:rPr>
-          <w:rFonts w:asciiTheme="majorHAnsi" w:hAnsiTheme="majorHAnsi" w:cstheme="majorHAnsi"/>
-          <w:szCs w:val="24"/>
-        </w:rPr>
-        <w:t>. The survey recovered 27,852 verbatim-anchored items from 1,308 papers, synthesized into 419 themes, of which 255 were AI-governance, 71 human-clinical (excluded), and 93 ambiguous. The AI-relevant literature converged on five recurring principles, evaluation and benchmarking, detection and mitigation, human oversight and accountability, transparency and explainability, and ethics and regulation, all of which RCDome implements (exact-string verification, curator flags, provenance traceability, the five-gate benchmark, and the governance contract). No single consensus framework exists: 78% of extracted themes appear in a single paper, positioning RCDome's explicit governance as an early, principled implementation rather than a follower of a mature standard. The full ranked governance framework (51 themes with supporting PMIDs) is provided in the study GitHub repository.</w:t>
-      </w:r>
-    </w:p>
-    <w:p>
-      <w:pPr>
-        <w:spacing w:after="0" w:line="240" w:lineRule="auto"/>
-        <w:rPr>
-          <w:rFonts w:asciiTheme="majorHAnsi" w:hAnsiTheme="majorHAnsi" w:cstheme="majorHAnsi"/>
-          <w:szCs w:val="24"/>
-        </w:rPr>
-      </w:pPr>
-    </w:p>
-    <w:p>
-      <w:pPr>
-        <w:spacing w:after="0" w:line="240" w:lineRule="auto"/>
-        <w:rPr>
-          <w:rFonts w:asciiTheme="majorHAnsi" w:hAnsiTheme="majorHAnsi" w:cstheme="majorHAnsi"/>
-          <w:color w:val="EE0000"/>
-          <w:szCs w:val="24"/>
-        </w:rPr>
-      </w:pPr>
-      <w:r>
-        <w:rPr>
-          <w:rFonts w:asciiTheme="majorHAnsi" w:hAnsiTheme="majorHAnsi" w:cstheme="majorHAnsi"/>
-          <w:b/>
-          <w:bCs/>
-          <w:szCs w:val="24"/>
-        </w:rPr>
-        <w:t>Model-selection benchmark (</w:t>
-      </w:r>
-      <w:r>
-        <w:rPr>
-          <w:rFonts w:asciiTheme="majorHAnsi" w:hAnsiTheme="majorHAnsi" w:cstheme="majorHAnsi"/>
-          <w:b/>
-          <w:bCs/>
-          <w:szCs w:val="24"/>
-          <w:highlight w:val="green"/>
-        </w:rPr>
-        <w:t>Supplementary Note S5</w:t>
-      </w:r>
-      <w:r>
-        <w:rPr>
-          <w:rFonts w:asciiTheme="majorHAnsi" w:hAnsiTheme="majorHAnsi" w:cstheme="majorHAnsi"/>
-          <w:b/>
-          <w:bCs/>
-          <w:szCs w:val="24"/>
-        </w:rPr>
-        <w:t xml:space="preserve">). </w:t>
-      </w:r>
-      <w:r>
-        <w:rPr>
-          <w:szCs w:val="24"/>
-        </w:rPr>
-        <w:t xml:space="preserve">To select the functional-role classifier, three models were benchmarked on 26 well-established gene-RCD pairs (10 executors, 8 regulators, and 8 negative controls): the baseline </w:t>
-      </w:r>
-      <w:r>
-        <w:rPr>
-          <w:rFonts w:ascii="Courier New" w:hAnsi="Courier New" w:cs="Courier New"/>
-          <w:i/>
-          <w:szCs w:val="24"/>
-        </w:rPr>
-        <w:t>deepseek-chat</w:t>
-      </w:r>
-      <w:r>
-        <w:rPr>
-          <w:szCs w:val="24"/>
-        </w:rPr>
-        <w:t xml:space="preserve"> (81% combined accuracy, 38% false positives) and chain-of-thought </w:t>
-      </w:r>
-      <w:r>
-        <w:rPr>
-          <w:rFonts w:ascii="Courier New" w:hAnsi="Courier New" w:cs="Courier New"/>
-          <w:i/>
-          <w:szCs w:val="24"/>
-        </w:rPr>
-        <w:t>deepseek-reasoner</w:t>
-      </w:r>
-      <w:r>
-        <w:rPr>
-          <w:szCs w:val="24"/>
-        </w:rPr>
-        <w:t xml:space="preserve"> (73%, 25%). A governance-augmented tool-call loop with a hand-curated reference covering the 18 unique positive genes achieved 100% combined accuracy and zero false positives on all 26 pairs (the 18 positives plus 8 form-mismatch negatives), but that reference covers only a small fraction of the compendium (about 5% of pairs have a complete role, direction, and mechanistic classification to reference). A self-provided version of the same loop, which instead makes the model state its own molecular mechanism, known RCD forms, and the specific form its role belongs to, then self-checks those statements, also achieved 100% combined accuracy and zero false positives without any external reference. Because it is fully independent and scalable, the self-provided loop was adopted as the role-classification engine for the full 22K-pair matrix. Structured-output mode (guaranteed JSON) was also adopted across the extraction pipeline to eliminate parsing failures.</w:t>
+        <w:t>engine for the full 22K-pair matrix. Structured-output mode (guaranteed JSON) was also adopted across the extraction pipeline to eliminate parsing failures.</w:t>
       </w:r>
     </w:p>
     <w:p>
@@ -9338,6 +8757,7 @@
         <w:spacing w:after="0" w:line="240" w:lineRule="auto"/>
         <w:rPr>
           <w:rFonts w:asciiTheme="majorHAnsi" w:hAnsiTheme="majorHAnsi" w:cstheme="majorHAnsi"/>
+          <w:bCs/>
           <w:szCs w:val="24"/>
         </w:rPr>
       </w:pPr>
@@ -9347,50 +8767,15 @@
           <w:b/>
           <w:szCs w:val="24"/>
         </w:rPr>
-        <w:t>Chain-of-Thought Classification of the Full Matrix. Chain-of-thought (CoT) classification was applied to the complete matrix to add a mechanistic verdict, functional role, and direction to every gene-RCD pair, information the two-call binary validation (Phase 2A/D) and the full-text recovery phases did not capture uniformly. Rather than a single model answer, each pair received three separately sampled chain-of-thought runs of the same production classifier with a self-governance check (verify-role), merged by majority vote, so that one inconsistent sample could not dominate the final verdict.</w:t>
-      </w:r>
-      <w:r>
-        <w:rPr>
-          <w:rFonts w:asciiTheme="majorHAnsi" w:hAnsiTheme="majorHAnsi" w:cstheme="majorHAnsi"/>
-          <w:b/>
-          <w:szCs w:val="24"/>
-        </w:rPr>
-      </w:r>
-      <w:r>
-        <w:rPr>
-          <w:rFonts w:asciiTheme="majorHAnsi" w:hAnsiTheme="majorHAnsi" w:cstheme="majorHAnsi"/>
-          <w:szCs w:val="24"/>
-        </w:rPr>
-      </w:r>
-      <w:r>
-        <w:rPr>
-          <w:rFonts w:asciiTheme="majorHAnsi" w:hAnsiTheme="majorHAnsi" w:cstheme="majorHAnsi"/>
-          <w:szCs w:val="24"/>
-        </w:rPr>
-      </w:r>
-      <w:r>
-        <w:rPr>
-          <w:rFonts w:asciiTheme="majorHAnsi" w:hAnsiTheme="majorHAnsi" w:cstheme="majorHAnsi"/>
-          <w:szCs w:val="24"/>
-        </w:rPr>
-      </w:r>
-      <w:r>
-        <w:rPr>
-          <w:rFonts w:asciiTheme="majorHAnsi" w:hAnsiTheme="majorHAnsi" w:cstheme="majorHAnsi"/>
-          <w:szCs w:val="24"/>
-        </w:rPr>
-      </w:r>
-      <w:r>
-        <w:rPr>
-          <w:rFonts w:asciiTheme="majorHAnsi" w:hAnsiTheme="majorHAnsi" w:cstheme="majorHAnsi"/>
-          <w:szCs w:val="24"/>
-        </w:rPr>
-      </w:r>
-      <w:r>
-        <w:rPr>
-          <w:rFonts w:asciiTheme="majorHAnsi" w:hAnsiTheme="majorHAnsi" w:cstheme="majorHAnsi"/>
-          <w:szCs w:val="24"/>
-        </w:rPr>
+        <w:t xml:space="preserve">Chain-of-Thought Classification of the Full Matrix. </w:t>
+      </w:r>
+      <w:r>
+        <w:rPr>
+          <w:rFonts w:asciiTheme="majorHAnsi" w:hAnsiTheme="majorHAnsi" w:cstheme="majorHAnsi"/>
+          <w:bCs/>
+          <w:szCs w:val="24"/>
+        </w:rPr>
+        <w:t>Chain-of-thought (CoT) classification was applied to the complete matrix to add a mechanistic verdict, functional role, and direction to every gene-RCD pair, information the two-call binary validation (Phase 2A/D) and the full-text recovery phases did not capture uniformly. Rather than a single model answer, each pair received three separately sampled chain-of-thought runs of the same production classifier with a self-governance check (verify-role), merged by majority vote, so that one inconsistent sample could not dominate the final verdict.</w:t>
       </w:r>
     </w:p>
     <w:p>
@@ -9417,19 +8802,6 @@
         </w:rPr>
         <w:t>Of the 21,568 unique gene-RCD pairs, 9,785 (45.4%) were classified as mechanistically involved (YES) and 11,783 (54.6%) as not mechanistically involved (NO). Among the mechanistically-involved pairs, 469 (4.8%) were executors, genes that directly execute the death pathway, and 9,311 (95.2%) were regulators that promote or inhibit it. Across the 21,568 unique gene-RCD pairs, roles resolved as 9,311 regulators, 469 executors, 5 markers, and 11,783 with an unresolved role; direction (across all role-resolved associations) resolved as PROMOTES for 5,025, PROTECTS for 4,755, and UNCLEAR for 5, a near-even pro-death versus anti-death balance. Overall, 5,826 of the 9,265 genes represented in RCDome (62.9%) had at least one mechanistically involved association. Classification yield varied markedly by source database: the fraction of associations classified as mechanistically involved ranged from 21.6% (XDeathDB) to 86.5% (WikiPathways) (Supplementary Figure S3).</w:t>
       </w:r>
-      <w:r>
-        <w:rPr>
-          <w:rFonts w:asciiTheme="majorHAnsi" w:hAnsiTheme="majorHAnsi" w:cstheme="majorHAnsi"/>
-          <w:szCs w:val="24"/>
-          <w:highlight w:val="green"/>
-        </w:rPr>
-      </w:r>
-      <w:r>
-        <w:rPr>
-          <w:rFonts w:asciiTheme="majorHAnsi" w:hAnsiTheme="majorHAnsi" w:cstheme="majorHAnsi"/>
-          <w:szCs w:val="24"/>
-        </w:rPr>
-      </w:r>
     </w:p>
     <w:p>
       <w:pPr>
@@ -9454,46 +8826,6 @@
           <w:szCs w:val="24"/>
         </w:rPr>
         <w:t>The classification was internally audited: 84 self-inconsistent rows (mechanistic NO with a confident role or direction) were repaired, and 231 rows with genuine uncertainty, 178 regulators with unclear direction and 53 mechanistically-involved pairs with unresolved role, were retained as unresolved rather than forced into a confident category. Two gene-RCD pairs (NLRX1 and PPIF with MPT-driven necrosis) were classified separately with a five-vote majority, completing full pair coverage (21,568/21,568).</w:t>
-      </w:r>
-      <w:r>
-        <w:rPr>
-          <w:rFonts w:asciiTheme="majorHAnsi" w:hAnsiTheme="majorHAnsi" w:cstheme="majorHAnsi"/>
-          <w:szCs w:val="24"/>
-        </w:rPr>
-      </w:r>
-      <w:r>
-        <w:rPr>
-          <w:rFonts w:asciiTheme="majorHAnsi" w:hAnsiTheme="majorHAnsi" w:cstheme="majorHAnsi"/>
-          <w:szCs w:val="24"/>
-        </w:rPr>
-      </w:r>
-      <w:r>
-        <w:rPr>
-          <w:rFonts w:asciiTheme="majorHAnsi" w:hAnsiTheme="majorHAnsi" w:cstheme="majorHAnsi"/>
-          <w:i/>
-          <w:iCs/>
-          <w:szCs w:val="24"/>
-        </w:rPr>
-      </w:r>
-      <w:r>
-        <w:rPr>
-          <w:rFonts w:asciiTheme="majorHAnsi" w:hAnsiTheme="majorHAnsi" w:cstheme="majorHAnsi"/>
-          <w:szCs w:val="24"/>
-        </w:rPr>
-      </w:r>
-      <w:r>
-        <w:rPr>
-          <w:rFonts w:asciiTheme="majorHAnsi" w:hAnsiTheme="majorHAnsi" w:cstheme="majorHAnsi"/>
-          <w:i/>
-          <w:iCs/>
-          <w:szCs w:val="24"/>
-        </w:rPr>
-      </w:r>
-      <w:r>
-        <w:rPr>
-          <w:rFonts w:asciiTheme="majorHAnsi" w:hAnsiTheme="majorHAnsi" w:cstheme="majorHAnsi"/>
-          <w:szCs w:val="24"/>
-        </w:rPr>
       </w:r>
     </w:p>
     <w:p>
@@ -9552,28 +8884,36 @@
           <w:rFonts w:asciiTheme="majorHAnsi" w:hAnsiTheme="majorHAnsi" w:cstheme="majorHAnsi"/>
           <w:szCs w:val="24"/>
         </w:rPr>
-        <w:t>The dome is the visual signature of the platform: its cupola rim carries the 53 canonicalized RCD-related entities as nodes colored by their adjudicated ontological level, L1 modalities (19, gold), L2 subtypes (7, blue), L3 triggers (2, green), L4 Functional/contextual (13, purple), and L5 Generic/umbrella/taxon (12, orange), over a constellation of the 9,265 HGNC-validated genes. This color-coding makes the ontology's core claim visible at a glance: only 19 of the 53 entities are bona fide RCD modalities; the remaining 34 are subtypes, triggers, contextual programs, or umbrella concepts, and their level color encodes that distinction.</w:t>
-      </w:r>
-    </w:p>
-    <w:p>
-      <w:pPr>
-        <w:spacing w:after="0" w:line="240" w:lineRule="auto"/>
-        <w:rPr>
-          <w:rFonts w:asciiTheme="majorHAnsi" w:hAnsiTheme="majorHAnsi" w:cstheme="majorHAnsi"/>
-          <w:szCs w:val="24"/>
-        </w:rPr>
-      </w:pPr>
-    </w:p>
-    <w:p>
-      <w:pPr>
-        <w:spacing w:after="0" w:line="240" w:lineRule="auto"/>
-        <w:rPr>
-          <w:rFonts w:asciiTheme="majorHAnsi" w:hAnsiTheme="majorHAnsi" w:cstheme="majorHAnsi"/>
-          <w:szCs w:val="24"/>
-        </w:rPr>
-      </w:pPr>
-      <w:r>
-        <w:t xml:space="preserve">The application source code and compendium are available at </w:t>
+        <w:t>The dome is the visual signature of the platform: its cupola rim carries the 53 canonicalized RCD-related entities as nodes colored by their adjudicated ontological level, L1 modalities (19, gold), L2 subtypes (7, blue), L3 triggers (2, green), L4 Functional/contextual (13, purple), and L5 Generic/umbrella/taxon (12, orange), over a constellation of the 9,265 HGNC-</w:t>
+      </w:r>
+      <w:r>
+        <w:rPr>
+          <w:rFonts w:asciiTheme="majorHAnsi" w:hAnsiTheme="majorHAnsi" w:cstheme="majorHAnsi"/>
+          <w:szCs w:val="24"/>
+        </w:rPr>
+        <w:lastRenderedPageBreak/>
+        <w:t>validated genes. This color-coding makes the ontology's core claim visible at a glance: only 19 of the 53 entities are bona fide RCD modalities; the remaining 34 are subtypes, triggers, contextual programs, or umbrella concepts, and their level color encodes that distinction.</w:t>
+      </w:r>
+    </w:p>
+    <w:p>
+      <w:pPr>
+        <w:spacing w:after="0" w:line="240" w:lineRule="auto"/>
+        <w:rPr>
+          <w:rFonts w:asciiTheme="majorHAnsi" w:hAnsiTheme="majorHAnsi" w:cstheme="majorHAnsi"/>
+          <w:szCs w:val="24"/>
+        </w:rPr>
+      </w:pPr>
+    </w:p>
+    <w:p>
+      <w:pPr>
+        <w:spacing w:after="0" w:line="240" w:lineRule="auto"/>
+        <w:rPr>
+          <w:rFonts w:asciiTheme="majorHAnsi" w:hAnsiTheme="majorHAnsi" w:cstheme="majorHAnsi"/>
+          <w:szCs w:val="24"/>
+        </w:rPr>
+      </w:pPr>
+      <w:r>
+        <w:t>The application source code and compendium are available at https://github.com/BioCancerInformatics/RCDome. The Gene Catalog module exposes the complete 22,473-row × 83-column matrix (Dataset S1) as a filterable, sortable table with ten columns, gene, biotype, RCD entity, cancer gene, confidence tier, mechanistic, role, direction, source databases, and evidence, and a Direction/Role source selector that switches the displayed annotation among the DeepSeek chain-of-thought classification, the Elicit extraction, and the Consensus classification. Each analysis is preserved in its own columns, so the interface never conflates provenance. A Death core preset filters to the 469 executor pairs; a per-entity comparison table presents Elicit versus DeepSeek executor and regulator counts side by side for all 53 entities; and four download buttons export the filtered table, the complete matrix, the entity comparison, and the death core.</w:t>
       </w:r>
       <w:hyperlink r:id="rId41" w:history="1">
         <w:r>
@@ -9583,15 +8923,8 @@
           <w:t>https://github.com/BioCancerInformatics/RCDome</w:t>
         </w:r>
       </w:hyperlink>
-      <w:r>
-        <w:t>.</w:t>
-      </w:r>
-      <w:r>
-        <w:t xml:space="preserve"> The Gene Catalog module exposes the complete 22,473-row × 82-column matrix (Dataset S1) as a filterable, sortable table with ten columns, gene, biotype, RCD entity, cancer gene, confidence tier, mechanistic, role, direction, source databases, and evidence, and a Direction/Role source selector that switches the displayed annotation among the DeepSeek chain-of-thought classification, the Elicit extraction, and the Consensus classification. </w:t>
-      </w:r>
-      <w:r>
-        <w:t>Each analysis is preserved in its own columns, so the interface never conflates provenance. A Death core preset filters to the 469 executor pairs; a per-entity comparison table presents Elicit versus DeepSeek executor and regulator counts side by side for all 53 entities; and four download buttons export the filtered table, the complete matrix, the entity comparison, and the death core.</w:t>
-      </w:r>
+      <w:r/>
+      <w:r/>
     </w:p>
     <w:p>
       <w:r>
@@ -9655,7 +8988,15 @@
           <w:rFonts w:asciiTheme="majorHAnsi" w:hAnsiTheme="majorHAnsi" w:cstheme="majorHAnsi"/>
           <w:szCs w:val="24"/>
         </w:rPr>
-        <w:t xml:space="preserve">The application was built iteratively with AI assistance (DeepSeek and Consensus classification, AI-generated pathway figures and descriptions) under the governance rules described in the Methods. Every value exposed in the interface was verified against the compendium matrix (Knock Test), and every AI-generated element is traceable to its source. Detailed AI usage, token, runtime, and cost figures for every AI-assisted phase are reported in </w:t>
+        <w:t xml:space="preserve">The application was built iteratively with AI assistance (DeepSeek and Consensus classification, AI-generated pathway figures and descriptions) under the governance rules </w:t>
+      </w:r>
+      <w:r>
+        <w:rPr>
+          <w:rFonts w:asciiTheme="majorHAnsi" w:hAnsiTheme="majorHAnsi" w:cstheme="majorHAnsi"/>
+          <w:szCs w:val="24"/>
+        </w:rPr>
+        <w:lastRenderedPageBreak/>
+        <w:t xml:space="preserve">described in the Methods. Every value exposed in the interface was verified against the compendium matrix (Knock Test), and every AI-generated element is traceable to its source. Detailed AI usage, token, runtime, and cost figures for every AI-assisted phase are reported in </w:t>
       </w:r>
       <w:r>
         <w:rPr>
@@ -9697,19 +9038,6 @@
           <w:szCs w:val="24"/>
         </w:rPr>
         <w:t>The application also includes a Digital Molecular RCD Board, a prose-synthesis module that answers gene-RCD queries strictly from the RCDome database and the RCDome decoder under the governance rules described in the Methods, with a retrieval-augmented Q&amp;A submodule that answers free-form questions across all 53 entities and all genes. A nine-test board benchmark (Supplementary Note S7) validated the board at 100% golden accuracy, 100% census accuracy, 100% fact-stability, a 0.047% governance violation rate, and 98.7% articulation conformity; a two-test Q&amp;A benchmark (n = 100 per test) validated the Q&amp;A at 100% positive accuracy and 100% negative controls, Wilson 95% confidence interval (CI) 96.3–100%, two-sided binomial p = 0.010.</w:t>
-      </w:r>
-      <w:r>
-        <w:rPr>
-          <w:rFonts w:asciiTheme="majorHAnsi" w:hAnsiTheme="majorHAnsi" w:cstheme="majorHAnsi"/>
-          <w:szCs w:val="24"/>
-          <w:highlight w:val="green"/>
-        </w:rPr>
-      </w:r>
-      <w:r>
-        <w:rPr>
-          <w:rFonts w:asciiTheme="majorHAnsi" w:hAnsiTheme="majorHAnsi" w:cstheme="majorHAnsi"/>
-          <w:szCs w:val="24"/>
-        </w:rPr>
       </w:r>
     </w:p>
     <w:p>
@@ -9926,13 +9254,15 @@
           <w:rFonts w:asciiTheme="majorHAnsi" w:hAnsiTheme="majorHAnsi" w:cstheme="majorHAnsi"/>
           <w:szCs w:val="24"/>
         </w:rPr>
-        <w:t>The disparity in gene coverage is striking. Apoptosis accounts for 6,229 association rows (5,897 unique genes). Pyronecrosis has one. This is not a flaw in the compilation; the coverage pattern likely reflects research intensity, field maturity, database representation, and source/indexing depth. Apoptosis has been studied for over fifty years. Several of the most recently described forms are known from a single discovery paper. The compendium makes this imbalance explicit, and it is sobering. The mechanistic classification produced an even more striking result. Of the 22,473 gene-RCD associations, only 3,063 (13.6% of the 22,473 validated rows) are MECHANISTIC, meaning both LLM knowledge and PubMed abstract evidence support a functional role. For the remaining 86.3% of validated rows, the literature is either insufficient, ambiguous, or silent. A further 2,416 rows (10.8%) reflect CO_OCCURRENCE: the gene and RCD term appear together in published articles, but without evidence of a functional relationship. For 9,019 rows (40.1%), the literature is insufficient to determine the nature of the association. An additional 1,519 rows (6.8%) represent a LITERATURE_GAP: the LLM recognizes the association, but PubMed abstracts lack explicit confirmation. In other words, for the vast majority of gene-RCD associations reported across 20 resources, the published record does not yet explain how the gene relates to the cell death form. Finally, 286 rows (1.3%) are classified as DATABASE_ONLY. These are gene-RCD associations contributed by 10 independent curated databases for which no supporting PMID was found in any indexed literature source, despite exhaustive search via NCBI PubMed, Europe PMC full-text recovery, and a targeted DeepSeek LLM campaign. They represent unresolved evidence gaps within the literature sources and retrieval strategy used in this study. They are flagged for expert manual review. Taken together, these findings suggest that the RCD field has outgrown its information infrastructure. Databases have accumulated associations faster than the literature has verified them. RCDome does not solve this problem, but it makes it quantitatively measurable.</w:t>
-      </w:r>
-      <w:r>
-        <w:rPr>
-          <w:rFonts w:asciiTheme="majorHAnsi" w:hAnsiTheme="majorHAnsi" w:cstheme="majorHAnsi"/>
-          <w:szCs w:val="24"/>
-        </w:rPr>
+        <w:t xml:space="preserve">The disparity in gene coverage is striking. Apoptosis accounts for 6,229 association rows (5,897 unique genes). Pyronecrosis has one. This is not a flaw in the compilation; the coverage pattern likely reflects research intensity, field maturity, database representation, and source/indexing depth. Apoptosis has been studied for over fifty years. Several of the most recently described forms are known from a single discovery paper. The compendium makes this imbalance explicit, and it is sobering. The mechanistic classification produced an even more striking result. Of the 22,473 gene-RCD associations, only 3,063 (13.6% of the 22,473 validated rows) are MECHANISTIC, meaning both LLM knowledge and PubMed abstract evidence support a functional role. For the remaining 86.3% of validated rows, the </w:t>
+      </w:r>
+      <w:r>
+        <w:rPr>
+          <w:rFonts w:asciiTheme="majorHAnsi" w:hAnsiTheme="majorHAnsi" w:cstheme="majorHAnsi"/>
+          <w:szCs w:val="24"/>
+        </w:rPr>
+        <w:lastRenderedPageBreak/>
+        <w:t>literature is either insufficient, ambiguous, or silent. A further 2,416 rows (10.8%) reflect CO_OCCURRENCE: the gene and RCD term appear together in published articles, but without evidence of a functional relationship. For 9,019 rows (40.1%), the literature is insufficient to determine the nature of the association. An additional 1,519 rows (6.8%) represent a LITERATURE_GAP: the LLM recognizes the association, but PubMed abstracts lack explicit confirmation. In other words, for the vast majority of gene-RCD associations reported across 20 resources, the published record does not yet explain how the gene relates to the cell death form. Finally, 286 rows (1.3%) are classified as DATABASE_ONLY. These are gene-RCD associations contributed by 10 independent curated databases for which no supporting PMID was found in any indexed literature source, despite exhaustive search via NCBI PubMed, Europe PMC full-text recovery, and a targeted DeepSeek LLM campaign. They represent unresolved evidence gaps within the literature sources and retrieval strategy used in this study. They are flagged for expert manual review. Taken together, these findings suggest that the RCD field has outgrown its information infrastructure. Databases have accumulated associations faster than the literature has verified them. RCDome does not solve this problem, but it makes it quantitatively measurable.</w:t>
       </w:r>
     </w:p>
     <w:p>
@@ -10026,74 +9356,38 @@
         </w:rPr>
         <w:t>The full-matrix classification, read as a whole, paints a picture that surprised us. The death-executing machinery is remarkably small: only 469 gene-RCD pairs (4.8% of the mechanistically-involved set) are executors, the genes that directly pore, cleave, or permeabilize to kill the cell. Among the mechanistically involved pairs classified in RCDome, 9,311 (95.2%) were regulators that promote or inhibit death without executing it. Within the compiled RCDome association universe and under the CoT classification, the mechanistically involved set is dominated by regulatory associations surrounding a comparatively small executor subset (Figure 3A).</w:t>
       </w:r>
-      <w:r>
-        <w:rPr>
-          <w:rFonts w:asciiTheme="majorHAnsi" w:hAnsiTheme="majorHAnsi" w:cstheme="majorHAnsi"/>
-          <w:szCs w:val="24"/>
-        </w:rPr>
-      </w:r>
-      <w:r>
-        <w:rPr>
-          <w:rFonts w:asciiTheme="majorHAnsi" w:hAnsiTheme="majorHAnsi" w:cstheme="majorHAnsi"/>
-          <w:szCs w:val="24"/>
-        </w:rPr>
-      </w:r>
-      <w:r>
-        <w:rPr>
-          <w:rFonts w:asciiTheme="majorHAnsi" w:hAnsiTheme="majorHAnsi" w:cstheme="majorHAnsi"/>
-          <w:szCs w:val="24"/>
-          <w:highlight w:val="green"/>
-        </w:rPr>
-      </w:r>
-      <w:r>
-        <w:rPr>
-          <w:rFonts w:asciiTheme="majorHAnsi" w:hAnsiTheme="majorHAnsi" w:cstheme="majorHAnsi"/>
-          <w:szCs w:val="24"/>
-        </w:rPr>
-      </w:r>
-    </w:p>
-    <w:p>
-      <w:pPr>
-        <w:spacing w:after="0" w:line="240" w:lineRule="auto"/>
-        <w:rPr>
-          <w:rFonts w:asciiTheme="majorHAnsi" w:hAnsiTheme="majorHAnsi" w:cstheme="majorHAnsi"/>
-          <w:szCs w:val="24"/>
-        </w:rPr>
-      </w:pPr>
-    </w:p>
-    <w:p>
-      <w:pPr>
-        <w:spacing w:after="0" w:line="240" w:lineRule="auto"/>
-        <w:rPr>
-          <w:rFonts w:asciiTheme="majorHAnsi" w:hAnsiTheme="majorHAnsi" w:cstheme="majorHAnsi"/>
-          <w:szCs w:val="24"/>
-        </w:rPr>
-      </w:pPr>
-      <w:r>
-        <w:rPr>
-          <w:rFonts w:asciiTheme="majorHAnsi" w:hAnsiTheme="majorHAnsi" w:cstheme="majorHAnsi"/>
-          <w:szCs w:val="24"/>
-        </w:rPr>
-        <w:t>The signal is sharply stratified by ontological level. The L1 modalities, the bona fide death forms, carry 63.5% of their pairs as mechanistically involved, whereas the L5 concepts (Autophagy, Programmed cell death) carry only 30.2%, despite being the largest association hubs. Most genes associated with autophagy are associated with the process, not with its lethal outcome; the DeepSeek layer makes that distinction explicit at this scale (Figure 3B). This stratification is biologically informative, but it should not be read as an independent validation of the ontology: L1 was defined precisely to concentrate mechanistic forms, so a higher mechanistic fraction in L1 is in part expected by construction.</w:t>
-      </w:r>
-      <w:r>
-        <w:rPr>
-          <w:rFonts w:asciiTheme="majorHAnsi" w:hAnsiTheme="majorHAnsi" w:cstheme="majorHAnsi"/>
-          <w:szCs w:val="24"/>
-          <w:highlight w:val="green"/>
-        </w:rPr>
-      </w:r>
-      <w:r>
-        <w:rPr>
-          <w:rFonts w:asciiTheme="majorHAnsi" w:hAnsiTheme="majorHAnsi" w:cstheme="majorHAnsi"/>
-          <w:szCs w:val="24"/>
-        </w:rPr>
-      </w:r>
-      <w:r>
-        <w:rPr>
-          <w:rFonts w:asciiTheme="majorHAnsi" w:hAnsiTheme="majorHAnsi" w:cstheme="majorHAnsi"/>
-          <w:szCs w:val="24"/>
-        </w:rPr>
+    </w:p>
+    <w:p>
+      <w:pPr>
+        <w:spacing w:after="0" w:line="240" w:lineRule="auto"/>
+        <w:rPr>
+          <w:rFonts w:asciiTheme="majorHAnsi" w:hAnsiTheme="majorHAnsi" w:cstheme="majorHAnsi"/>
+          <w:szCs w:val="24"/>
+        </w:rPr>
+      </w:pPr>
+    </w:p>
+    <w:p>
+      <w:pPr>
+        <w:spacing w:after="0" w:line="240" w:lineRule="auto"/>
+        <w:rPr>
+          <w:rFonts w:asciiTheme="majorHAnsi" w:hAnsiTheme="majorHAnsi" w:cstheme="majorHAnsi"/>
+          <w:szCs w:val="24"/>
+        </w:rPr>
+      </w:pPr>
+      <w:r>
+        <w:rPr>
+          <w:rFonts w:asciiTheme="majorHAnsi" w:hAnsiTheme="majorHAnsi" w:cstheme="majorHAnsi"/>
+          <w:szCs w:val="24"/>
+        </w:rPr>
+        <w:t xml:space="preserve">The signal is sharply stratified by ontological level. The L1 modalities, the bona fide death forms, carry 63.5% of their pairs as mechanistically involved, whereas the L5 concepts (Autophagy, Programmed cell death) carry only 30.2%, despite being the largest association hubs. Most genes associated with autophagy are associated with the process, not with its lethal outcome; the DeepSeek layer makes that distinction explicit at this scale (Figure 3B). </w:t>
+      </w:r>
+      <w:r>
+        <w:rPr>
+          <w:rFonts w:asciiTheme="majorHAnsi" w:hAnsiTheme="majorHAnsi" w:cstheme="majorHAnsi"/>
+          <w:szCs w:val="24"/>
+        </w:rPr>
+        <w:lastRenderedPageBreak/>
+        <w:t>This stratification is biologically informative, but it should not be read as an independent validation of the ontology: L1 was defined precisely to concentrate mechanistic forms, so a higher mechanistic fraction in L1 is in part expected by construction.</w:t>
       </w:r>
     </w:p>
     <w:p>
@@ -10161,19 +9455,7 @@
           <w:rFonts w:asciiTheme="majorHAnsi" w:hAnsiTheme="majorHAnsi" w:cstheme="majorHAnsi"/>
           <w:szCs w:val="24"/>
         </w:rPr>
-        <w:t>The three independent classifications, DeepSeek (the chain-of-thought full-matrix classification), Elicit (the original AI-assisted extraction), and Consensus (the third independent evidence channel), are preserved separately and can be compared. DeepSeek and Consensus each provide full 21,568-pair coverage; Elicit covers the subset where its literature-mining evidence is available. The DeepSeek run classified all 21,568 pairs: 9,785 (45.4%) mechanistically involved and 11,783 (54.6%) not, with 469 executors and 9,311 regulators. The RCDome interface exposes these side by side through a source selector, and a researcher can extract the filtered table, the complete 82-column matrix, the per-entity comparison, or the 469-pair death core for their own work.</w:t>
-      </w:r>
-      <w:r>
-        <w:rPr>
-          <w:rFonts w:asciiTheme="majorHAnsi" w:hAnsiTheme="majorHAnsi" w:cstheme="majorHAnsi"/>
-          <w:szCs w:val="24"/>
-        </w:rPr>
-      </w:r>
-      <w:r>
-        <w:rPr>
-          <w:rFonts w:asciiTheme="majorHAnsi" w:hAnsiTheme="majorHAnsi" w:cstheme="majorHAnsi"/>
-          <w:szCs w:val="24"/>
-        </w:rPr>
+        <w:t>The three independent classifications, DeepSeek (the chain-of-thought full-matrix classification), Elicit (the original AI-assisted extraction), and Consensus (the third independent evidence channel), are preserved separately and can be compared. DeepSeek and Consensus each provide full 21,568-pair coverage; Elicit covers the subset where its literature-mining evidence is available. The DeepSeek run classified all 21,568 pairs: 9,785 (45.4%) mechanistically involved and 11,783 (54.6%) not, with 469 executors and 9,311 regulators. The RCDome interface exposes these side by side through a source selector, and a researcher can extract the filtered table, the complete 83-column matrix, the per-entity comparison, or the 469-pair death core for their own work.</w:t>
       </w:r>
     </w:p>
     <w:p>
@@ -10249,15 +9531,8 @@
           <w:rFonts w:asciiTheme="majorHAnsi" w:hAnsiTheme="majorHAnsi" w:cstheme="majorHAnsi"/>
           <w:szCs w:val="24"/>
         </w:rPr>
-        <w:t xml:space="preserve">The 53 RCD-related entities are explicitly heterogeneous, and we therefore refer to them as RCD-related entities rather than 53 established human modalities. Several are comparative or cross-species programs (hypersensitive response, linker cell-type death, eryptosis, cornification), others are morphological outcomes or umbrellas (necrosis, oncosis, regulated </w:t>
-      </w:r>
-      <w:r>
-        <w:rPr>
-          <w:rFonts w:asciiTheme="majorHAnsi" w:hAnsiTheme="majorHAnsi" w:cstheme="majorHAnsi"/>
-          <w:szCs w:val="24"/>
-        </w:rPr>
         <w:lastRenderedPageBreak/>
-        <w:t>necrosis, metalloptosis), and others are emerging or legacy forms. Recognizing this heterogeneity strengthens rather than weakens the atlas: it reports the field as it is.</w:t>
+        <w:t>The 53 RCD-related entities are explicitly heterogeneous, and we therefore refer to them as RCD-related entities rather than 53 established human modalities. Several are comparative or cross-species programs (hypersensitive response, linker cell-type death, eryptosis, cornification), others are morphological outcomes or umbrellas (necrosis, oncosis, regulated necrosis, metalloptosis), and others are emerging or legacy forms. Recognizing this heterogeneity strengthens rather than weakens the atlas: it reports the field as it is.</w:t>
       </w:r>
     </w:p>
     <w:p>
@@ -10508,8 +9783,9 @@
         </w:rPr>
       </w:pPr>
       <w:r>
-        <w:t>The RCDome compendium matrix (Dataset S1; 22,473 rows × 82 columns; freeze date 2026-10-15), extraction pipeline, and the RCDome web application source code are available at https://github.com/BioCancerInformatics/RCDome. The 20 source databases and resources are publicly accessible at the URLs listed in Supplementary Table S2. All extraction scripts, integration code, and the RCDome Shiny application source code are available at https://github.com/BioCancerInformatics/RCDome. The complete extraction pipeline is orchestrated by master_extract.py, which executes all 21 channel_*.py extraction scripts in sequence, producing timestamped, traceability-compliant CSV outputs. The repository also includes automated smoke tests with continuous integration that verify the mechanistic classification mapping, the chain-of-thought governance rules, and the benchmark scoring.https://github.com/BioCancerInformatics/RCDomehttps://github.com/BioCancerInformatics/RCDomehttps://github.com/BioCancerInformatics/RCDomehttps://github.com/BioCancerInformatics/RCDome</w:t>
-      </w:r>
+        <w:t>The RCDome compendium matrix (Dataset S1; 22,473 rows × 83 columns; freeze date 2026-10-15), extraction pipeline, and the RCDome web application source code are available at https://github.com/BioCancerInformatics/RCDome. The 20 source databases and resources are publicly accessible at the URLs listed in Supplementary Table S2. All extraction scripts, integration code, and the RCDome Shiny application source code are available at https://github.com/BioCancerInformatics/RCDome. The complete extraction pipeline is orchestrated by master_extract.py, which executes all 21 channel_*.py extraction scripts in sequence, producing timestamped, traceability-compliant CSV outputs. The repository also includes automated smoke tests with continuous integration that verify the mechanistic classification mapping, the chain-of-thought governance rules, and the benchmark scoring.https://github.com/BioCancerInformatics/RCDomehttps://github.com/BioCancerInformatics/RCDomehttps://github.com/BioCancerInformatics/RCDomehttps://github.com/BioCancerInformatics/RCDomehttps://github.com/BioCancerInformatics/RCDomehttps://github.com/BioCancerInformatics/RCDome</w:t>
+      </w:r>
+      <w:r/>
       <w:hyperlink r:id="rId42" w:history="1">
         <w:r>
           <w:rPr>
@@ -10518,14 +9794,6 @@
           <w:t>https://github.com/BioCancerInformatics/RCDome</w:t>
         </w:r>
       </w:hyperlink>
-      <w:r/>
-      <w:r>
-        <w:rPr>
-          <w:highlight w:val="green"/>
-        </w:rPr>
-      </w:r>
-      <w:r/>
-      <w:r/>
       <w:hyperlink r:id="rId43" w:history="1">
         <w:r>
           <w:rPr>
@@ -10534,7 +9802,6 @@
           <w:t>https://github.com/BioCancerInformatics/RCDome</w:t>
         </w:r>
       </w:hyperlink>
-      <w:r/>
     </w:p>
     <w:p>
       <w:pPr>
@@ -10655,14 +9922,20 @@
         </w:rPr>
         <w:t>E.R.S. conceptualized the study; developed, validated, and implemented the R-based and Python computational pipeline; performed integrative analyses; contributed to manuscript revision; and developed the LLM-based RCD entity module of the Shiny application.</w:t>
       </w:r>
-      <w:r>
+    </w:p>
+    <w:p>
+      <w:pPr>
+        <w:shd w:val="clear" w:color="auto" w:fill="FFFFFF" w:themeFill="background1"/>
+        <w:spacing w:after="0" w:line="240" w:lineRule="auto"/>
+        <w:ind w:right="57"/>
+        <w:outlineLvl w:val="2"/>
         <w:rPr>
           <w:rFonts w:cstheme="minorHAnsi"/>
           <w:noProof/>
           <w:color w:val="auto"/>
           <w:szCs w:val="24"/>
         </w:rPr>
-      </w:r>
+      </w:pPr>
       <w:r>
         <w:rPr>
           <w:rFonts w:cstheme="minorHAnsi"/>
@@ -10670,15 +9943,22 @@
           <w:color w:val="auto"/>
           <w:szCs w:val="24"/>
         </w:rPr>
-      </w:r>
-      <w:r>
+        <w:t>V.dS.L. conceptualized the study, curated data, and edited the manuscript.</w:t>
+      </w:r>
+    </w:p>
+    <w:p>
+      <w:pPr>
+        <w:shd w:val="clear" w:color="auto" w:fill="FFFFFF" w:themeFill="background1"/>
+        <w:spacing w:after="0" w:line="240" w:lineRule="auto"/>
+        <w:ind w:right="57"/>
+        <w:outlineLvl w:val="2"/>
         <w:rPr>
           <w:rFonts w:cstheme="minorHAnsi"/>
           <w:noProof/>
           <w:color w:val="auto"/>
           <w:szCs w:val="24"/>
         </w:rPr>
-      </w:r>
+      </w:pPr>
       <w:r>
         <w:rPr>
           <w:rFonts w:cstheme="minorHAnsi"/>
@@ -10686,6 +9966,7 @@
           <w:color w:val="auto"/>
           <w:szCs w:val="24"/>
         </w:rPr>
+        <w:t>H.A.C.N. curated data and edited the manuscript.</w:t>
       </w:r>
     </w:p>
     <w:p>
@@ -10708,101 +9989,7 @@
           <w:color w:val="auto"/>
           <w:szCs w:val="24"/>
         </w:rPr>
-        <w:t>V.dS.L. conceptualized the study, curated data, and edited the manuscript.</w:t>
-      </w:r>
-    </w:p>
-    <w:p>
-      <w:pPr>
-        <w:shd w:val="clear" w:color="auto" w:fill="FFFFFF" w:themeFill="background1"/>
-        <w:spacing w:after="0" w:line="240" w:lineRule="auto"/>
-        <w:ind w:right="57"/>
-        <w:outlineLvl w:val="2"/>
-        <w:rPr>
-          <w:rFonts w:cstheme="minorHAnsi"/>
-          <w:noProof/>
-          <w:color w:val="auto"/>
-          <w:szCs w:val="24"/>
-        </w:rPr>
-      </w:pPr>
-      <w:r>
-        <w:rPr>
-          <w:rFonts w:cstheme="minorHAnsi"/>
-          <w:noProof/>
-          <w:color w:val="auto"/>
-          <w:szCs w:val="24"/>
-        </w:rPr>
-        <w:t>H.A.C.N. curated data and edited the manuscript.</w:t>
-      </w:r>
-      <w:r>
-        <w:rPr>
-          <w:rFonts w:cstheme="minorHAnsi"/>
-          <w:noProof/>
-          <w:color w:val="auto"/>
-          <w:szCs w:val="24"/>
-        </w:rPr>
-      </w:r>
-      <w:r>
-        <w:rPr>
-          <w:rFonts w:cstheme="minorHAnsi"/>
-          <w:noProof/>
-          <w:color w:val="auto"/>
-          <w:szCs w:val="24"/>
-        </w:rPr>
-      </w:r>
-      <w:r>
-        <w:rPr>
-          <w:rFonts w:cstheme="minorHAnsi"/>
-          <w:noProof/>
-          <w:color w:val="auto"/>
-          <w:szCs w:val="24"/>
-        </w:rPr>
-      </w:r>
-    </w:p>
-    <w:p>
-      <w:pPr>
-        <w:shd w:val="clear" w:color="auto" w:fill="FFFFFF" w:themeFill="background1"/>
-        <w:spacing w:after="0" w:line="240" w:lineRule="auto"/>
-        <w:ind w:right="57"/>
-        <w:outlineLvl w:val="2"/>
-        <w:rPr>
-          <w:rFonts w:cstheme="minorHAnsi"/>
-          <w:noProof/>
-          <w:color w:val="auto"/>
-          <w:szCs w:val="24"/>
-        </w:rPr>
-      </w:pPr>
-      <w:r>
-        <w:rPr>
-          <w:rFonts w:cstheme="minorHAnsi"/>
-          <w:noProof/>
-          <w:color w:val="auto"/>
-          <w:szCs w:val="24"/>
-        </w:rPr>
         <w:t xml:space="preserve">E.M.A. conceptualized and supervised the study; contributed to methodological design; developed, validated, and audited the computational pipeline; curated data; drafted the manuscript, generated the figures, and approved the final version. </w:t>
-      </w:r>
-      <w:r>
-        <w:rPr>
-          <w:rFonts w:cstheme="minorHAnsi"/>
-          <w:noProof/>
-          <w:color w:val="auto"/>
-          <w:szCs w:val="24"/>
-        </w:rPr>
-      </w:r>
-      <w:r>
-        <w:rPr>
-          <w:rFonts w:cstheme="minorHAnsi"/>
-          <w:noProof/>
-          <w:color w:val="auto"/>
-          <w:szCs w:val="24"/>
-        </w:rPr>
-      </w:r>
-      <w:r>
-        <w:rPr>
-          <w:rFonts w:cstheme="minorHAnsi"/>
-          <w:noProof/>
-          <w:color w:val="auto"/>
-          <w:szCs w:val="24"/>
-        </w:rPr>
       </w:r>
     </w:p>
     <w:p>
@@ -11044,6 +10231,7 @@
           <w:color w:val="auto"/>
           <w:szCs w:val="24"/>
         </w:rPr>
+        <w:lastRenderedPageBreak/>
         <w:tab/>
       </w:r>
     </w:p>
@@ -11186,7 +10374,11 @@
         <w:t>curator_verified</w:t>
       </w:r>
       <w:r>
-        <w:t xml:space="preserve"> false until manual expert review. The ontology of the 53 entities was adjudicated individually by the primary curator and independently reviewed entity-by-entity by two additional curators. The traceability contract, the hard-gate admission framework, and the anti-hallucination controls were enforced as executable code.</w:t>
+        <w:t xml:space="preserve"> false until manual expert review. The ontology of the 53 entities was adjudicated individually by the primary </w:t>
+      </w:r>
+      <w:r>
+        <w:lastRenderedPageBreak/>
+        <w:t>curator and independently reviewed entity-by-entity by two additional curators. The traceability contract, the hard-gate admission framework, and the anti-hallucination controls were enforced as executable code.</w:t>
       </w:r>
     </w:p>
     <w:p>
@@ -11373,6 +10565,7 @@
           <w:color w:val="auto"/>
           <w:szCs w:val="24"/>
         </w:rPr>
+        <w:lastRenderedPageBreak/>
         <w:t>The Supplementary Material for this article can be found online at</w:t>
       </w:r>
       <w:r>
@@ -11453,16 +10646,41 @@
           <w:rFonts w:asciiTheme="majorHAnsi" w:hAnsiTheme="majorHAnsi" w:cstheme="majorHAnsi"/>
           <w:b/>
           <w:szCs w:val="24"/>
-          <w:highlight w:val="green"/>
-        </w:rPr>
-        <w:t>Figure 1. RCDome compilation and validation pipeline. RCDome is a human gene atlas of regulated cell death (RCD) assembled in a single top-to-bottom workflow. Twenty source databases constitute the input layer: ten RCD-specific curated resources (FerrDB version 3, RCDdb, iPCD, LncRCD, iLIR, HADb, HAMdb, ATD, AMT-DB and ncFO), five pathway and molecular databases (KEGG, Reactome, Gene Ontology, the Molecular Signatures Database and WikiPathways), the NCBI Gene resource, the multi-optosis pan-cancer gene set, XDeathDB, and two Elicit literature channels (the Phase 3 systematic review and the Alert review). These resources are compiled through five complementary channels: Channel A (programmatic PubMed Boolean searches) maximizes recall; Channel B (topic-specific database extraction) provides precision; Channel C (generative-AI-assisted literature screening) captures recent discoveries; Channel D (manual expert curation) serves as the final arbiter; and Channel E (Elicit Phase 3 systematic review) recovers gene-RCD associations from the full-text literature. Consolidation normalizes the 62 original database name strings into 53 canonicalized RCD-related entities, yielding 22,473 gene-RCD association rows across 9,265 unique human genes. The consolidated matrix then enters an independent validation stage in which three mutually independent analyses are applied in execution order. The first is the DeepSeek chain-of-thought classifier (Phases 2A through 2F), which performs two-call abstract validation, full-text recovery, deep retrieval-augmented generation and a full-matrix chain-of-thought classification that annotates every pair with four columns (cot_role, cot_direction, cot_mechanistic, cot_evidence) encoding chain-of-thought role, direction, mechanistic verdict and evidence. The second is the Elicit systematic-review extraction (Phase 3), which assigns functional role and direction of regulation. The third is the Consensus evidence-channel classification (Phase 2G), which queries each pair with a neutral formulation, the gene symbol followed only by "cell death", so that evidence is retrieved without form-name priming. The three analyses are preserved in separate columns and are never conflated. The resulting consolidated matrix (22,473 rows and 82 columns) powers the RCDome web application, whose interface comprises the interactive dome, the Explore RCDome guide, Operational Definitions, Compare Definitions, the RCD entities browser, the Gene Catalog, the Discrepancy Radar, the Discovery Timeline, the 3D RCDome, the Digital Molecular RCD Board, and the Network module. Boxes are color-coded for visual distinction, and arrows indicate the flow of data through the pipeline.</w:t>
-      </w:r>
+        </w:rPr>
+        <w:t>Figure 1. RCDome compilation and validation pipeline. RCDome is a human gene atlas of regulated cell death (RCD) assembled in a single top-to-bottom workflow. Twenty source databases constitute the input layer: ten RCD-specific curated resources (FerrDB version 3, RCDdb, iPCD, LncRCD, iLIR, HADb, HAMdb, ATD, AMT-DB and ncFO), five pathway and molecular databases (KEGG, Reactome, Gene Ontology, the Molecular Signatures Database and WikiPathways), the NCBI Gene resource, the multi-optosis pan-cancer gene set, XDeathDB, and two Elicit literature channels (the Phase 3 systematic review and the Alert review). These resources are compiled through five complementary channels: Channel A (programmatic PubMed Boolean searches) maximizes recall; Channel B (topic-specific database extraction) provides precision; Channel C (generative-AI-assisted literature screening) captures recent discoveries; Channel D (manual expert curation) serves as the final arbiter; and Channel E (Elicit Phase 3 systematic review) recovers gene-RCD associations from the full-text literature. Consolidation normalizes the 62 original database name strings into 53 canonicalized RCD-related entities, yielding 22,473 gene-RCD association rows across 9,265 unique human genes. The consolidated matrix then enters an independent validation stage in which three mutually independent analyses are applied in execution order. The first is the DeepSeek chain-of-thought classifier (Phases 2A through 2F), which performs two-call abstract validation, full-text recovery, deep retrieval-augmented generation and a full-matrix chain-of-thought classification that annotates every pair with four columns (cot_role, cot_direction, cot_mechanistic, cot_evidence) encoding chain-of-thought role, direction, mechanistic verdict and evidence. The second is the Elicit systematic-review extraction (Phase 3), which assigns functional role and direction of regulation. The third is the Consensus evidence-channel classification (Phase 2G), which queries each pair with a neutral formulation, the gene symbol followed only by "cell death", so that evidence is retrieved without form-name priming. The three analyses are preserved in separate columns and are never conflated. The resulting consolidated matrix (22,473 rows and 83 columns) powers the RCDome web application, whose interface comprises the interactive dome, the Explore RCDome guide, Operational Definitions, Compare Definitions, the RCD entities browser, the Gene Catalog, the Discrepancy Radar, the Discovery Timeline, the 3D RCDome, the Digital Molecular RCD Board, and the Network module. Boxes are color-coded for visual distinction, and arrows indicate the flow of data through the pipeline.</w:t>
+      </w:r>
+      <w:r>
+        <w:rPr>
+          <w:rFonts w:asciiTheme="majorHAnsi" w:hAnsiTheme="majorHAnsi" w:cstheme="majorHAnsi"/>
+          <w:bCs/>
+          <w:szCs w:val="24"/>
+        </w:rPr>
+      </w:r>
+    </w:p>
+    <w:p>
+      <w:pPr>
+        <w:spacing w:after="0" w:line="240" w:lineRule="auto"/>
+        <w:rPr>
+          <w:rFonts w:asciiTheme="majorHAnsi" w:hAnsiTheme="majorHAnsi" w:cstheme="majorHAnsi"/>
+          <w:szCs w:val="24"/>
+        </w:rPr>
+      </w:pPr>
+    </w:p>
+    <w:p>
+      <w:pPr>
+        <w:spacing w:after="0" w:line="240" w:lineRule="auto"/>
+        <w:rPr>
+          <w:rFonts w:asciiTheme="majorHAnsi" w:hAnsiTheme="majorHAnsi" w:cstheme="majorHAnsi"/>
+          <w:szCs w:val="24"/>
+        </w:rPr>
+      </w:pPr>
       <w:r>
         <w:rPr>
           <w:rFonts w:asciiTheme="majorHAnsi" w:hAnsiTheme="majorHAnsi" w:cstheme="majorHAnsi"/>
           <w:b/>
           <w:szCs w:val="24"/>
         </w:rPr>
+        <w:t>Figure 2. Benchmark evaluation of the three independent analyses.</w:t>
       </w:r>
       <w:r>
         <w:rPr>
@@ -11470,6 +10688,7 @@
           <w:bCs/>
           <w:szCs w:val="24"/>
         </w:rPr>
+        <w:t xml:space="preserve"> (A) DeepSeek model-selection benchmark against a fixed 26-pair benchmark set comprising 18 positive executor and regulator pairs and 8 form-mismatch negative controls: the baseline deepseek-chat model reached 81% combined accuracy with 38% false positives; chain-of-thought deepseek-reasoner reached 73% with 25% false positives; and the governance-augmented tool-call loop with a hand-curated reference, together with the self-provided chain-of-thought loop, each reached 100% combined accuracy with zero false positives, the self-provided loop was adopted because it requires no external reference. (B) Elicit post-export governance benchmark on the 784 records extracted across three forms (393 ferroptosis, 390 cuproptosis and 1 triaptosis): allow-list compliance improved from 75.4% to 100%, the </w:t>
       </w:r>
       <w:r>
         <w:rPr>
@@ -11477,84 +10696,60 @@
           <w:bCs/>
           <w:szCs w:val="24"/>
         </w:rPr>
-      </w:r>
-      <w:r>
-        <w:rPr>
+        <w:lastRenderedPageBreak/>
+        <w:t>unsupported EXECUTOR rate fell from 53% to 0%; after governance no unsupported EXECUTOR classification remained (all 192 were downgraded to REGULATOR), and publication traceability rose from 24% (PMID) to 98.3% (DOI). (C) Consensus query-formulation benchmark against the same 26-pair benchmark set: the form-biased query reached 92% combined accuracy with 12% false positives, whereas the neutral query, the gene symbol followed only by "cell death", reached 100% combined accuracy with zero false positives. Green bars denote combined accuracy (panels A and C) or post-governance values (panel B); salmon bars denote false positives (panels A and C) or pre-governance values (panel B).</w:t>
+      </w:r>
+    </w:p>
+    <w:p>
+      <w:pPr>
+        <w:spacing w:after="0" w:line="240" w:lineRule="auto"/>
+        <w:rPr>
+          <w:rFonts w:asciiTheme="majorHAnsi" w:hAnsiTheme="majorHAnsi" w:cstheme="majorHAnsi"/>
+          <w:b/>
+          <w:szCs w:val="24"/>
+        </w:rPr>
+      </w:pPr>
+    </w:p>
+    <w:p>
+      <w:pPr>
+        <w:spacing w:after="0" w:line="240" w:lineRule="auto"/>
+        <w:rPr>
+          <w:rFonts w:asciiTheme="majorHAnsi" w:hAnsiTheme="majorHAnsi" w:cstheme="majorHAnsi"/>
           <w:bCs/>
           <w:szCs w:val="24"/>
         </w:rPr>
-      </w:r>
-      <w:r>
-        <w:rPr>
-          <w:rFonts w:ascii="Courier New" w:hAnsi="Courier New" w:cs="Courier New"/>
+      </w:pPr>
+      <w:r>
+        <w:rPr>
+          <w:rFonts w:asciiTheme="majorHAnsi" w:hAnsiTheme="majorHAnsi" w:cstheme="majorHAnsi"/>
+          <w:b/>
+          <w:szCs w:val="24"/>
+        </w:rPr>
+        <w:t xml:space="preserve">Figure 3. The death core and its regulatory network. </w:t>
+      </w:r>
+      <w:r>
+        <w:rPr>
+          <w:rFonts w:asciiTheme="majorHAnsi" w:hAnsiTheme="majorHAnsi" w:cstheme="majorHAnsi"/>
           <w:bCs/>
-          <w:i/>
-          <w:szCs w:val="24"/>
-        </w:rPr>
-      </w:r>
-      <w:r>
-        <w:rPr>
-          <w:bCs/>
-          <w:szCs w:val="24"/>
-        </w:rPr>
-      </w:r>
-      <w:r>
-        <w:rPr>
-          <w:rFonts w:ascii="Courier New" w:hAnsi="Courier New" w:cs="Courier New"/>
-          <w:bCs/>
-          <w:i/>
-          <w:szCs w:val="24"/>
-        </w:rPr>
-      </w:r>
-      <w:r>
-        <w:rPr>
-          <w:bCs/>
-          <w:szCs w:val="24"/>
-        </w:rPr>
-      </w:r>
-      <w:r>
-        <w:rPr>
-          <w:rFonts w:ascii="Courier New" w:hAnsi="Courier New" w:cs="Courier New"/>
-          <w:bCs/>
-          <w:i/>
-          <w:szCs w:val="24"/>
-        </w:rPr>
-      </w:r>
-      <w:r>
-        <w:rPr>
-          <w:bCs/>
-          <w:szCs w:val="24"/>
-        </w:rPr>
-      </w:r>
-      <w:r>
-        <w:rPr>
-          <w:rFonts w:ascii="Courier New" w:hAnsi="Courier New" w:cs="Courier New"/>
-          <w:bCs/>
-          <w:i/>
-          <w:szCs w:val="24"/>
-        </w:rPr>
-      </w:r>
-      <w:r>
-        <w:rPr>
-          <w:bCs/>
-          <w:szCs w:val="24"/>
-        </w:rPr>
-      </w:r>
-    </w:p>
-    <w:p>
-      <w:pPr>
-        <w:spacing w:after="0" w:line="240" w:lineRule="auto"/>
-        <w:rPr>
-          <w:rFonts w:asciiTheme="majorHAnsi" w:hAnsiTheme="majorHAnsi" w:cstheme="majorHAnsi"/>
-          <w:szCs w:val="24"/>
-        </w:rPr>
-      </w:pPr>
-    </w:p>
-    <w:p>
-      <w:pPr>
-        <w:spacing w:after="0" w:line="240" w:lineRule="auto"/>
-        <w:rPr>
-          <w:rFonts w:asciiTheme="majorHAnsi" w:hAnsiTheme="majorHAnsi" w:cstheme="majorHAnsi"/>
+          <w:szCs w:val="24"/>
+        </w:rPr>
+        <w:t>(A) Role distribution across the 21,568 unique gene-RCD pairs classified by the DeepSeek chain-of-thought run: 11,783 unresolved, 9,311 regulators, 469 executors, and 5 markers. (B) Mechanistically-involved fraction by ontological level (L1 modalities, L2 subtypes, L3 triggers, L4 Functional/contextual categories, L5 Generic/umbrella/taxon concepts); the modalities carry the densest mechanistic signal (63.5%) while the Functional/contextual categories (L4) are the most dilute (22.9%), with the Generic/umbrella/taxon concepts at 30.2%. (C) Direction across all role-resolved associations: 5,025 promote and 4,755 protect (among the 9,311 regulators, 4,556 promote and 4,755 protect), a near-even balance. (D) The executor core (orange, 469) drawn area-proportionally inside the regulatory network (blue, 9,311) and the unresolved associations (grey, 11,783), illustrating that the death-executing machinery is small and the regulatory network is vast.</w:t>
+      </w:r>
+    </w:p>
+    <w:p>
+      <w:pPr>
+        <w:spacing w:after="0" w:line="240" w:lineRule="auto"/>
+        <w:rPr>
+          <w:rFonts w:asciiTheme="majorHAnsi" w:hAnsiTheme="majorHAnsi" w:cstheme="majorHAnsi"/>
+          <w:szCs w:val="24"/>
+        </w:rPr>
+      </w:pPr>
+    </w:p>
+    <w:p>
+      <w:pPr>
+        <w:spacing w:after="0" w:line="240" w:lineRule="auto"/>
+        <w:rPr>
+          <w:rFonts w:cstheme="majorHAnsi"/>
           <w:szCs w:val="24"/>
         </w:rPr>
       </w:pPr>
@@ -11563,9 +10758,8 @@
           <w:rFonts w:asciiTheme="majorHAnsi" w:hAnsiTheme="majorHAnsi" w:cstheme="majorHAnsi"/>
           <w:b/>
           <w:szCs w:val="24"/>
-          <w:highlight w:val="green"/>
-        </w:rPr>
-        <w:t>Figure 2. Benchmark evaluation of the three independent analyses. (A) DeepSeek model-selection benchmark against a fixed 26-pair benchmark set comprising 18 positive executor and regulator pairs and 8 form-mismatch negative controls: the baseline deepseek-chat model reached 81% combined accuracy with 38% false positives; chain-of-thought deepseek-reasoner reached 73% with 25% false positives; and the governance-augmented tool-call loop with a hand-curated reference, together with the self-provided chain-of-thought loop, each reached 100% combined accuracy with zero false positives, the self-provided loop was adopted because it requires no external reference. (B) Elicit post-export governance benchmark on the 784 records extracted across three forms (393 ferroptosis, 390 cuproptosis and 1 triaptosis): allow-list compliance improved from 75.4% to 100%, the unsupported EXECUTOR rate fell from 53% to 0%; after governance no unsupported EXECUTOR classification remained (all 192 were downgraded to REGULATOR), and publication traceability rose from 24% (PMID) to 98.3% (DOI). (C) Consensus query-formulation benchmark against the same 26-pair benchmark set: the form-biased query reached 92% combined accuracy with 12% false positives, whereas the neutral query, the gene symbol followed only by "cell death", reached 100% combined accuracy with zero false positives. Green bars denote combined accuracy (panels A and C) or post-governance values (panel B); salmon bars denote false positives (panels A and C) or pre-governance values (panel B).</w:t>
+        </w:rPr>
+        <w:t>Figure 4. Gene</w:t>
       </w:r>
       <w:r>
         <w:rPr>
@@ -11573,118 +10767,7 @@
           <w:b/>
           <w:szCs w:val="24"/>
         </w:rPr>
-      </w:r>
-      <w:r>
-        <w:rPr>
-          <w:bCs/>
-          <w:szCs w:val="24"/>
-        </w:rPr>
-      </w:r>
-      <w:r>
-        <w:rPr>
-          <w:rFonts w:ascii="Courier New" w:hAnsi="Courier New" w:cs="Courier New"/>
-          <w:bCs/>
-          <w:i/>
-          <w:szCs w:val="24"/>
-        </w:rPr>
-      </w:r>
-      <w:r>
-        <w:rPr>
-          <w:bCs/>
-          <w:szCs w:val="24"/>
-        </w:rPr>
-      </w:r>
-      <w:r>
-        <w:rPr>
-          <w:rFonts w:ascii="Courier New" w:hAnsi="Courier New" w:cs="Courier New"/>
-          <w:bCs/>
-          <w:i/>
-          <w:szCs w:val="24"/>
-        </w:rPr>
-      </w:r>
-      <w:r>
-        <w:rPr>
-          <w:bCs/>
-          <w:szCs w:val="24"/>
-        </w:rPr>
-      </w:r>
-    </w:p>
-    <w:p>
-      <w:pPr>
-        <w:spacing w:after="0" w:line="240" w:lineRule="auto"/>
-        <w:rPr>
-          <w:rFonts w:asciiTheme="majorHAnsi" w:hAnsiTheme="majorHAnsi" w:cstheme="majorHAnsi"/>
-          <w:b/>
-          <w:szCs w:val="24"/>
-        </w:rPr>
-      </w:pPr>
-    </w:p>
-    <w:p>
-      <w:pPr>
-        <w:spacing w:after="0" w:line="240" w:lineRule="auto"/>
-        <w:rPr>
-          <w:rFonts w:asciiTheme="majorHAnsi" w:hAnsiTheme="majorHAnsi" w:cstheme="majorHAnsi"/>
-          <w:bCs/>
-          <w:szCs w:val="24"/>
-        </w:rPr>
-      </w:pPr>
-      <w:r>
-        <w:rPr>
-          <w:rFonts w:asciiTheme="majorHAnsi" w:hAnsiTheme="majorHAnsi" w:cstheme="majorHAnsi"/>
-          <w:b/>
-          <w:szCs w:val="24"/>
-          <w:highlight w:val="green"/>
-        </w:rPr>
-        <w:t>Figure 3. The death core and its regulatory network. (A) Role distribution across the 21,568 unique gene-RCD pairs classified by the DeepSeek chain-of-thought run: 11,783 unresolved, 9,311 regulators, 469 executors, and 5 markers. (B) Mechanistically-involved fraction by ontological level (L1 modalities, L2 subtypes, L3 triggers, L4 Functional/contextual categories, L5 Generic/umbrella/taxon concepts); the modalities carry the densest mechanistic signal (63.5%) while the Functional/contextual categories (L4) are the most dilute (22.9%), with the Generic/umbrella/taxon concepts at 30.2%. (C) Direction across all role-resolved associations: 5,025 promote and 4,755 protect (among the 9,311 regulators, 4,556 promote and 4,755 protect), a near-even balance. (D) The executor core (orange, 469) drawn area-proportionally inside the regulatory network (blue, 9,311) and the unresolved associations (grey, 11,783), illustrating that the death-executing machinery is small and the regulatory network is vast.</w:t>
-      </w:r>
-      <w:r>
-        <w:rPr>
-          <w:rFonts w:asciiTheme="majorHAnsi" w:hAnsiTheme="majorHAnsi" w:cstheme="majorHAnsi"/>
-          <w:b/>
-          <w:szCs w:val="24"/>
-        </w:rPr>
-      </w:r>
-      <w:r>
-        <w:rPr>
-          <w:rFonts w:asciiTheme="majorHAnsi" w:hAnsiTheme="majorHAnsi" w:cstheme="majorHAnsi"/>
-          <w:bCs/>
-          <w:szCs w:val="24"/>
-        </w:rPr>
-      </w:r>
-    </w:p>
-    <w:p>
-      <w:pPr>
-        <w:spacing w:after="0" w:line="240" w:lineRule="auto"/>
-        <w:rPr>
-          <w:rFonts w:asciiTheme="majorHAnsi" w:hAnsiTheme="majorHAnsi" w:cstheme="majorHAnsi"/>
-          <w:szCs w:val="24"/>
-        </w:rPr>
-      </w:pPr>
-    </w:p>
-    <w:p>
-      <w:pPr>
-        <w:spacing w:after="0" w:line="240" w:lineRule="auto"/>
-        <w:rPr>
-          <w:rFonts w:cstheme="majorHAnsi"/>
-          <w:szCs w:val="24"/>
-        </w:rPr>
-      </w:pPr>
-      <w:r>
-        <w:rPr>
-          <w:rFonts w:asciiTheme="majorHAnsi" w:hAnsiTheme="majorHAnsi" w:cstheme="majorHAnsi"/>
-          <w:b/>
-          <w:szCs w:val="24"/>
-          <w:highlight w:val="green"/>
-        </w:rPr>
-        <w:t>Figure 4</w:t>
-      </w:r>
-      <w:r>
-        <w:rPr>
-          <w:rFonts w:asciiTheme="majorHAnsi" w:hAnsiTheme="majorHAnsi" w:cstheme="majorHAnsi"/>
-          <w:b/>
-          <w:szCs w:val="24"/>
-        </w:rPr>
-        <w:t>. Gene coverage of the 53 canonicalized RCD-related entities.</w:t>
+        <w:t xml:space="preserve"> coverage of the 53 canonicalized RCD-related entities.</w:t>
       </w:r>
       <w:r>
         <w:rPr>

</xml_diff>